<commit_message>
step(2.7): expose the reminder rule and upcoming list as owner-scoped API
Learned: singleton resource routing, update-with-consequences in one UoW, self-describing schedule rows, second-lap permissions with pre-wired graphs, reading generated routes instead of guessing

Co-Authored-By: Claude Fable 5 <noreply@anthropic.com>
Claude-Session: https://claude.ai/code/session_01XCaaD2oSfQhWv3vNENZDue
</commit_message>
<xml_diff>
--- a/docs/deliverables/out/Api.docx
+++ b/docs/deliverables/out/Api.docx
@@ -242,6 +242,56 @@
           </w:p>
         </w:tc>
       </w:tr>
+      <w:tr>
+        <w:tc>
+          <w:tcPr/>
+          <w:p>
+            <w:pPr>
+              <w:pStyle w:val="Compact"/>
+              <w:jc w:val="left"/>
+            </w:pPr>
+            <w:r>
+              <w:t xml:space="preserve">0.1.1</w:t>
+            </w:r>
+          </w:p>
+        </w:tc>
+        <w:tc>
+          <w:tcPr/>
+          <w:p>
+            <w:pPr>
+              <w:pStyle w:val="Compact"/>
+              <w:jc w:val="left"/>
+            </w:pPr>
+            <w:r>
+              <w:t xml:space="preserve">2026-08-28</w:t>
+            </w:r>
+          </w:p>
+        </w:tc>
+        <w:tc>
+          <w:tcPr/>
+          <w:p>
+            <w:pPr>
+              <w:pStyle w:val="Compact"/>
+              <w:jc w:val="left"/>
+            </w:pPr>
+            <w:r>
+              <w:t xml:space="preserve">Abdulsalam</w:t>
+            </w:r>
+          </w:p>
+        </w:tc>
+        <w:tc>
+          <w:tcPr/>
+          <w:p>
+            <w:pPr>
+              <w:pStyle w:val="Compact"/>
+              <w:jc w:val="left"/>
+            </w:pPr>
+            <w:r>
+              <w:t xml:space="preserve">§5 Reminders module endpoints (rule singleton, upcoming list) from the regenerated spec; permission table extended (roadmap step 2.7)</w:t>
+            </w:r>
+          </w:p>
+        </w:tc>
+      </w:tr>
     </w:tbl>
     <w:p>
       <w:pPr>
@@ -589,7 +639,7 @@
               <w:jc w:val="left"/>
             </w:pPr>
             <w:r>
-              <w:t xml:space="preserve">46 (11 Documents module, 35 ABP infrastructure: account, identity admin, permissions, settings)</w:t>
+              <w:t xml:space="preserve">49 (11 Documents + 3 Reminders module, 35 ABP infrastructure: account, identity admin, permissions, settings)</w:t>
             </w:r>
           </w:p>
         </w:tc>
@@ -1498,6 +1548,106 @@
           </w:p>
         </w:tc>
       </w:tr>
+      <w:tr>
+        <w:tc>
+          <w:tcPr/>
+          <w:p>
+            <w:pPr>
+              <w:pStyle w:val="Compact"/>
+              <w:jc w:val="left"/>
+            </w:pPr>
+            <w:r>
+              <w:rPr>
+                <w:rStyle w:val="VerbatimChar"/>
+              </w:rPr>
+              <w:t xml:space="preserve">WathiqReminders.Rule</w:t>
+            </w:r>
+            <w:r>
+              <w:t xml:space="preserve"> </w:t>
+            </w:r>
+            <w:r>
+              <w:t xml:space="preserve">(+</w:t>
+            </w:r>
+            <w:r>
+              <w:t xml:space="preserve"> </w:t>
+            </w:r>
+            <w:r>
+              <w:rPr>
+                <w:rStyle w:val="VerbatimChar"/>
+              </w:rPr>
+              <w:t xml:space="preserve">.Update</w:t>
+            </w:r>
+            <w:r>
+              <w:t xml:space="preserve">)</w:t>
+            </w:r>
+          </w:p>
+        </w:tc>
+        <w:tc>
+          <w:tcPr/>
+          <w:p>
+            <w:pPr>
+              <w:pStyle w:val="Compact"/>
+              <w:jc w:val="left"/>
+            </w:pPr>
+            <w:r>
+              <w:t xml:space="preserve">yes</w:t>
+            </w:r>
+          </w:p>
+        </w:tc>
+        <w:tc>
+          <w:tcPr/>
+          <w:p>
+            <w:pPr>
+              <w:pStyle w:val="Compact"/>
+              <w:jc w:val="left"/>
+            </w:pPr>
+            <w:r>
+              <w:t xml:space="preserve">yes</w:t>
+            </w:r>
+          </w:p>
+        </w:tc>
+      </w:tr>
+      <w:tr>
+        <w:tc>
+          <w:tcPr/>
+          <w:p>
+            <w:pPr>
+              <w:pStyle w:val="Compact"/>
+              <w:jc w:val="left"/>
+            </w:pPr>
+            <w:r>
+              <w:rPr>
+                <w:rStyle w:val="VerbatimChar"/>
+              </w:rPr>
+              <w:t xml:space="preserve">WathiqReminders.Reminders</w:t>
+            </w:r>
+          </w:p>
+        </w:tc>
+        <w:tc>
+          <w:tcPr/>
+          <w:p>
+            <w:pPr>
+              <w:pStyle w:val="Compact"/>
+              <w:jc w:val="left"/>
+            </w:pPr>
+            <w:r>
+              <w:t xml:space="preserve">yes</w:t>
+            </w:r>
+          </w:p>
+        </w:tc>
+        <w:tc>
+          <w:tcPr/>
+          <w:p>
+            <w:pPr>
+              <w:pStyle w:val="Compact"/>
+              <w:jc w:val="left"/>
+            </w:pPr>
+            <w:r>
+              <w:t xml:space="preserve">yes</w:t>
+            </w:r>
+          </w:p>
+        </w:tc>
+      </w:tr>
     </w:tbl>
     <w:p>
       <w:pPr>
@@ -4104,7 +4254,7 @@
     </w:p>
     <w:bookmarkEnd w:id="35"/>
     <w:bookmarkEnd w:id="36"/>
-    <w:bookmarkStart w:id="37" w:name="error-model"/>
+    <w:bookmarkStart w:id="37" w:name="reminders-module-endpoints"/>
     <w:p>
       <w:pPr>
         <w:pStyle w:val="Heading1"/>
@@ -4119,7 +4269,7 @@
         <w:tab/>
       </w:r>
       <w:r>
-        <w:t xml:space="preserve">5. Error model</w:t>
+        <w:t xml:space="preserve">5. Reminders module endpoints</w:t>
       </w:r>
     </w:p>
     <w:p>
@@ -4127,19 +4277,53 @@
         <w:pStyle w:val="FirstParagraph"/>
       </w:pPr>
       <w:r>
-        <w:t xml:space="preserve">Every error is the ABP envelope</w:t>
-      </w:r>
-      <w:r>
-        <w:t xml:space="preserve"> </w:t>
-      </w:r>
-      <w:r>
-        <w:rPr>
-          <w:rStyle w:val="VerbatimChar"/>
-        </w:rPr>
-        <w:t xml:space="preserve">{ "error": { code, message, details, data, validationErrors } }</w:t>
-      </w:r>
-      <w:r>
-        <w:t xml:space="preserve">.</w:t>
+        <w:t xml:space="preserve">Route root</w:t>
+      </w:r>
+      <w:r>
+        <w:t xml:space="preserve"> </w:t>
+      </w:r>
+      <w:r>
+        <w:rPr>
+          <w:rStyle w:val="VerbatimChar"/>
+        </w:rPr>
+        <w:t xml:space="preserve">/api/reminders/*</w:t>
+      </w:r>
+      <w:r>
+        <w:t xml:space="preserve">. The rule is a</w:t>
+      </w:r>
+      <w:r>
+        <w:t xml:space="preserve"> </w:t>
+      </w:r>
+      <w:r>
+        <w:rPr>
+          <w:bCs/>
+          <w:b/>
+        </w:rPr>
+        <w:t xml:space="preserve">singleton resource</w:t>
+      </w:r>
+      <w:r>
+        <w:t xml:space="preserve"> </w:t>
+      </w:r>
+      <w:r>
+        <w:t xml:space="preserve">— one per user, so its</w:t>
+      </w:r>
+      <w:r>
+        <w:t xml:space="preserve"> </w:t>
+      </w:r>
+      <w:r>
+        <w:t xml:space="preserve">routes carry no</w:t>
+      </w:r>
+      <w:r>
+        <w:t xml:space="preserve"> </w:t>
+      </w:r>
+      <w:r>
+        <w:rPr>
+          <w:rStyle w:val="VerbatimChar"/>
+        </w:rPr>
+        <w:t xml:space="preserve">{id}</w:t>
+      </w:r>
+      <w:r>
+        <w:t xml:space="preserve">; the caller’s identity selects the row (created with defaults on first GET).</w:t>
       </w:r>
     </w:p>
     <w:tbl>
@@ -4166,40 +4350,31 @@
               <w:jc w:val="left"/>
             </w:pPr>
             <w:r>
-              <w:t xml:space="preserve">HTTP</w:t>
-            </w:r>
-          </w:p>
-        </w:tc>
-        <w:tc>
-          <w:tcPr/>
-          <w:p>
-            <w:pPr>
-              <w:pStyle w:val="Compact"/>
-              <w:jc w:val="left"/>
-            </w:pPr>
-            <w:r>
-              <w:t xml:space="preserve">When</w:t>
-            </w:r>
-          </w:p>
-        </w:tc>
-        <w:tc>
-          <w:tcPr/>
-          <w:p>
-            <w:pPr>
-              <w:pStyle w:val="Compact"/>
-              <w:jc w:val="left"/>
-            </w:pPr>
-            <w:r>
-              <w:rPr>
-                <w:rStyle w:val="VerbatimChar"/>
-              </w:rPr>
-              <w:t xml:space="preserve">error.code</w:t>
-            </w:r>
-            <w:r>
-              <w:t xml:space="preserve"> </w:t>
-            </w:r>
-            <w:r>
-              <w:t xml:space="preserve">example</w:t>
+              <w:t xml:space="preserve">Method &amp; path</w:t>
+            </w:r>
+          </w:p>
+        </w:tc>
+        <w:tc>
+          <w:tcPr/>
+          <w:p>
+            <w:pPr>
+              <w:pStyle w:val="Compact"/>
+              <w:jc w:val="left"/>
+            </w:pPr>
+            <w:r>
+              <w:t xml:space="preserve">Permission</w:t>
+            </w:r>
+          </w:p>
+        </w:tc>
+        <w:tc>
+          <w:tcPr/>
+          <w:p>
+            <w:pPr>
+              <w:pStyle w:val="Compact"/>
+              <w:jc w:val="left"/>
+            </w:pPr>
+            <w:r>
+              <w:t xml:space="preserve">Description</w:t>
             </w:r>
           </w:p>
         </w:tc>
@@ -4213,19 +4388,46 @@
               <w:jc w:val="left"/>
             </w:pPr>
             <w:r>
-              <w:t xml:space="preserve">400</w:t>
-            </w:r>
-          </w:p>
-        </w:tc>
-        <w:tc>
-          <w:tcPr/>
-          <w:p>
-            <w:pPr>
-              <w:pStyle w:val="Compact"/>
-              <w:jc w:val="left"/>
-            </w:pPr>
-            <w:r>
-              <w:t xml:space="preserve">DTO validation (missing/too long fields) —</w:t>
+              <w:rPr>
+                <w:rStyle w:val="VerbatimChar"/>
+              </w:rPr>
+              <w:t xml:space="preserve">GET /api/reminders/rule</w:t>
+            </w:r>
+          </w:p>
+        </w:tc>
+        <w:tc>
+          <w:tcPr/>
+          <w:p>
+            <w:pPr>
+              <w:pStyle w:val="Compact"/>
+              <w:jc w:val="left"/>
+            </w:pPr>
+            <w:r>
+              <w:rPr>
+                <w:rStyle w:val="VerbatimChar"/>
+              </w:rPr>
+              <w:t xml:space="preserve">WathiqReminders.Rule</w:t>
+            </w:r>
+          </w:p>
+        </w:tc>
+        <w:tc>
+          <w:tcPr/>
+          <w:p>
+            <w:pPr>
+              <w:pStyle w:val="Compact"/>
+              <w:jc w:val="left"/>
+            </w:pPr>
+            <w:r>
+              <w:t xml:space="preserve">The caller’s reminder settings; materialises the default (</w:t>
+            </w:r>
+            <w:r>
+              <w:rPr>
+                <w:rStyle w:val="VerbatimChar"/>
+              </w:rPr>
+              <w:t xml:space="preserve">90,30,7,1</w:t>
+            </w:r>
+            <w:r>
+              <w:t xml:space="preserve">, Email,</w:t>
             </w:r>
             <w:r>
               <w:t xml:space="preserve"> </w:t>
@@ -4234,25 +4436,10 @@
               <w:rPr>
                 <w:rStyle w:val="VerbatimChar"/>
               </w:rPr>
-              <w:t xml:space="preserve">validationErrors</w:t>
-            </w:r>
-            <w:r>
-              <w:t xml:space="preserve"> </w:t>
-            </w:r>
-            <w:r>
-              <w:t xml:space="preserve">lists each field</w:t>
-            </w:r>
-          </w:p>
-        </w:tc>
-        <w:tc>
-          <w:tcPr/>
-          <w:p>
-            <w:pPr>
-              <w:pStyle w:val="Compact"/>
-              <w:jc w:val="left"/>
-            </w:pPr>
-            <w:r>
-              <w:t xml:space="preserve">—</w:t>
+              <w:t xml:space="preserve">Asia/Riyadh</w:t>
+            </w:r>
+            <w:r>
+              <w:t xml:space="preserve">) on first call</w:t>
             </w:r>
           </w:p>
         </w:tc>
@@ -4266,31 +4453,65 @@
               <w:jc w:val="left"/>
             </w:pPr>
             <w:r>
-              <w:t xml:space="preserve">401</w:t>
-            </w:r>
-          </w:p>
-        </w:tc>
-        <w:tc>
-          <w:tcPr/>
-          <w:p>
-            <w:pPr>
-              <w:pStyle w:val="Compact"/>
-              <w:jc w:val="left"/>
-            </w:pPr>
-            <w:r>
-              <w:t xml:space="preserve">Missing/invalid token (JSON clients)</w:t>
-            </w:r>
-          </w:p>
-        </w:tc>
-        <w:tc>
-          <w:tcPr/>
-          <w:p>
-            <w:pPr>
-              <w:pStyle w:val="Compact"/>
-              <w:jc w:val="left"/>
-            </w:pPr>
-            <w:r>
-              <w:t xml:space="preserve">—</w:t>
+              <w:rPr>
+                <w:rStyle w:val="VerbatimChar"/>
+              </w:rPr>
+              <w:t xml:space="preserve">PUT /api/reminders/rule</w:t>
+            </w:r>
+          </w:p>
+        </w:tc>
+        <w:tc>
+          <w:tcPr/>
+          <w:p>
+            <w:pPr>
+              <w:pStyle w:val="Compact"/>
+              <w:jc w:val="left"/>
+            </w:pPr>
+            <w:r>
+              <w:rPr>
+                <w:rStyle w:val="VerbatimChar"/>
+              </w:rPr>
+              <w:t xml:space="preserve">…Rule.Update</w:t>
+            </w:r>
+          </w:p>
+        </w:tc>
+        <w:tc>
+          <w:tcPr/>
+          <w:p>
+            <w:pPr>
+              <w:pStyle w:val="Compact"/>
+              <w:jc w:val="left"/>
+            </w:pPr>
+            <w:r>
+              <w:t xml:space="preserve">Update settings;</w:t>
+            </w:r>
+            <w:r>
+              <w:t xml:space="preserve"> </w:t>
+            </w:r>
+            <w:r>
+              <w:rPr>
+                <w:bCs/>
+                <w:b/>
+              </w:rPr>
+              <w:t xml:space="preserve">resyncs existing reminders in the same transaction</w:t>
+            </w:r>
+            <w:r>
+              <w:t xml:space="preserve">, so</w:t>
+            </w:r>
+            <w:r>
+              <w:t xml:space="preserve"> </w:t>
+            </w:r>
+            <w:r>
+              <w:rPr>
+                <w:rStyle w:val="VerbatimChar"/>
+              </w:rPr>
+              <w:t xml:space="preserve">upcoming-list</w:t>
+            </w:r>
+            <w:r>
+              <w:t xml:space="preserve"> </w:t>
+            </w:r>
+            <w:r>
+              <w:t xml:space="preserve">immediately matches</w:t>
             </w:r>
           </w:p>
         </w:tc>
@@ -4304,82 +4525,70 @@
               <w:jc w:val="left"/>
             </w:pPr>
             <w:r>
-              <w:t xml:space="preserve">403</w:t>
-            </w:r>
-          </w:p>
-        </w:tc>
-        <w:tc>
-          <w:tcPr/>
-          <w:p>
-            <w:pPr>
-              <w:pStyle w:val="Compact"/>
-              <w:jc w:val="left"/>
-            </w:pPr>
-            <w:r>
-              <w:t xml:space="preserve">Permission denied, or a business rule rejected the request</w:t>
-            </w:r>
-          </w:p>
-        </w:tc>
-        <w:tc>
-          <w:tcPr/>
-          <w:p>
-            <w:pPr>
-              <w:pStyle w:val="Compact"/>
-              <w:jc w:val="left"/>
-            </w:pPr>
-            <w:r>
               <w:rPr>
                 <w:rStyle w:val="VerbatimChar"/>
               </w:rPr>
-              <w:t xml:space="preserve">Wathiq.Documents:ExpiryBeforeIssue</w:t>
-            </w:r>
-          </w:p>
-        </w:tc>
-      </w:tr>
-      <w:tr>
-        <w:tc>
-          <w:tcPr/>
-          <w:p>
-            <w:pPr>
-              <w:pStyle w:val="Compact"/>
-              <w:jc w:val="left"/>
-            </w:pPr>
-            <w:r>
-              <w:t xml:space="preserve">404</w:t>
-            </w:r>
-          </w:p>
-        </w:tc>
-        <w:tc>
-          <w:tcPr/>
-          <w:p>
-            <w:pPr>
-              <w:pStyle w:val="Compact"/>
-              <w:jc w:val="left"/>
-            </w:pPr>
-            <w:r>
-              <w:t xml:space="preserve">Row doesn’t exist</w:t>
+              <w:t xml:space="preserve">GET /api/reminders/reminders/upcoming-list</w:t>
+            </w:r>
+          </w:p>
+        </w:tc>
+        <w:tc>
+          <w:tcPr/>
+          <w:p>
+            <w:pPr>
+              <w:pStyle w:val="Compact"/>
+              <w:jc w:val="left"/>
+            </w:pPr>
+            <w:r>
+              <w:rPr>
+                <w:rStyle w:val="VerbatimChar"/>
+              </w:rPr>
+              <w:t xml:space="preserve">…Reminders</w:t>
+            </w:r>
+          </w:p>
+        </w:tc>
+        <w:tc>
+          <w:tcPr/>
+          <w:p>
+            <w:pPr>
+              <w:pStyle w:val="Compact"/>
+              <w:jc w:val="left"/>
+            </w:pPr>
+            <w:r>
+              <w:t xml:space="preserve">Pending reminders, soonest</w:t>
             </w:r>
             <w:r>
               <w:t xml:space="preserve"> </w:t>
             </w:r>
             <w:r>
               <w:rPr>
-                <w:bCs/>
-                <w:b/>
-              </w:rPr>
-              <w:t xml:space="preserve">or belongs to another user</w:t>
-            </w:r>
-          </w:p>
-        </w:tc>
-        <w:tc>
-          <w:tcPr/>
-          <w:p>
-            <w:pPr>
-              <w:pStyle w:val="Compact"/>
-              <w:jc w:val="left"/>
-            </w:pPr>
-            <w:r>
-              <w:t xml:space="preserve">—</w:t>
+                <w:rStyle w:val="VerbatimChar"/>
+              </w:rPr>
+              <w:t xml:space="preserve">dueDate</w:t>
+            </w:r>
+            <w:r>
+              <w:t xml:space="preserve"> </w:t>
+            </w:r>
+            <w:r>
+              <w:t xml:space="preserve">first; paged (</w:t>
+            </w:r>
+            <w:r>
+              <w:rPr>
+                <w:rStyle w:val="VerbatimChar"/>
+              </w:rPr>
+              <w:t xml:space="preserve">SkipCount</w:t>
+            </w:r>
+            <w:r>
+              <w:t xml:space="preserve">/</w:t>
+            </w:r>
+            <w:r>
+              <w:rPr>
+                <w:rStyle w:val="VerbatimChar"/>
+              </w:rPr>
+              <w:t xml:space="preserve">MaxResultCount</w:t>
+            </w:r>
+            <w:r>
+              <w:t xml:space="preserve">)</w:t>
             </w:r>
           </w:p>
         </w:tc>
@@ -4390,106 +4599,124 @@
         <w:pStyle w:val="BodyText"/>
       </w:pPr>
       <w:r>
-        <w:t xml:space="preserve">Business error codes of the Documents module (message localized via</w:t>
-      </w:r>
-      <w:r>
-        <w:t xml:space="preserve"> </w:t>
-      </w:r>
-      <w:r>
-        <w:rPr>
-          <w:rStyle w:val="VerbatimChar"/>
-        </w:rPr>
-        <w:t xml:space="preserve">Accept-Language</w:t>
-      </w:r>
-      <w:r>
-        <w:t xml:space="preserve">):</w:t>
-      </w:r>
-      <w:r>
-        <w:t xml:space="preserve"> </w:t>
-      </w:r>
-      <w:r>
-        <w:rPr>
-          <w:rStyle w:val="VerbatimChar"/>
-        </w:rPr>
-        <w:t xml:space="preserve">ExpiryBeforeIssue</w:t>
-      </w:r>
-      <w:r>
-        <w:t xml:space="preserve">,</w:t>
-      </w:r>
-      <w:r>
-        <w:t xml:space="preserve"> </w:t>
-      </w:r>
-      <w:r>
-        <w:rPr>
-          <w:rStyle w:val="VerbatimChar"/>
-        </w:rPr>
-        <w:t xml:space="preserve">HolderNotOwned</w:t>
-      </w:r>
-      <w:r>
-        <w:t xml:space="preserve">,</w:t>
-      </w:r>
-      <w:r>
-        <w:t xml:space="preserve"> </w:t>
-      </w:r>
-      <w:r>
-        <w:rPr>
-          <w:rStyle w:val="VerbatimChar"/>
-        </w:rPr>
-        <w:t xml:space="preserve">DocumentTypeNotActive</w:t>
-      </w:r>
-      <w:r>
-        <w:t xml:space="preserve">,</w:t>
-      </w:r>
-      <w:r>
-        <w:t xml:space="preserve"> </w:t>
-      </w:r>
-      <w:r>
-        <w:rPr>
-          <w:rStyle w:val="VerbatimChar"/>
-        </w:rPr>
-        <w:t xml:space="preserve">SelfHolderIsAutomatic</w:t>
-      </w:r>
-      <w:r>
-        <w:t xml:space="preserve">,</w:t>
-      </w:r>
-      <w:r>
-        <w:t xml:space="preserve"> </w:t>
-      </w:r>
-      <w:r>
-        <w:rPr>
-          <w:rStyle w:val="VerbatimChar"/>
-        </w:rPr>
-        <w:t xml:space="preserve">CannotDeleteSelfHolder</w:t>
-      </w:r>
-      <w:r>
-        <w:t xml:space="preserve">,</w:t>
-      </w:r>
-      <w:r>
-        <w:t xml:space="preserve"> </w:t>
-      </w:r>
-      <w:r>
-        <w:rPr>
-          <w:rStyle w:val="VerbatimChar"/>
-        </w:rPr>
-        <w:t xml:space="preserve">HolderHasDocuments</w:t>
-      </w:r>
-      <w:r>
-        <w:t xml:space="preserve"> </w:t>
-      </w:r>
-      <w:r>
-        <w:t xml:space="preserve">— all prefixed</w:t>
-      </w:r>
-      <w:r>
-        <w:t xml:space="preserve"> </w:t>
-      </w:r>
-      <w:r>
-        <w:rPr>
-          <w:rStyle w:val="VerbatimChar"/>
-        </w:rPr>
-        <w:t xml:space="preserve">Wathiq.Documents:</w:t>
-      </w:r>
-      <w:r>
-        <w:t xml:space="preserve">.</w:t>
+        <w:rPr>
+          <w:rStyle w:val="VerbatimChar"/>
+        </w:rPr>
+        <w:t xml:space="preserve">ReminderRuleDto</w:t>
+      </w:r>
+      <w:r>
+        <w:t xml:space="preserve"> </w:t>
+      </w:r>
+      <w:r>
+        <w:t xml:space="preserve">/</w:t>
+      </w:r>
+      <w:r>
+        <w:t xml:space="preserve"> </w:t>
+      </w:r>
+      <w:r>
+        <w:rPr>
+          <w:rStyle w:val="VerbatimChar"/>
+        </w:rPr>
+        <w:t xml:space="preserve">UpdateReminderRuleDto</w:t>
+      </w:r>
+      <w:r>
+        <w:t xml:space="preserve">:</w:t>
+      </w:r>
+      <w:r>
+        <w:t xml:space="preserve"> </w:t>
+      </w:r>
+      <w:r>
+        <w:rPr>
+          <w:rStyle w:val="VerbatimChar"/>
+        </w:rPr>
+        <w:t xml:space="preserve">offsetsDays</w:t>
+      </w:r>
+      <w:r>
+        <w:t xml:space="preserve"> </w:t>
+      </w:r>
+      <w:r>
+        <w:t xml:space="preserve">int[] (1–3650, ≤8 entries — the</w:t>
+      </w:r>
+      <w:r>
+        <w:t xml:space="preserve"> </w:t>
+      </w:r>
+      <w:r>
+        <w:t xml:space="preserve">server normalizes to descending distinct),</w:t>
+      </w:r>
+      <w:r>
+        <w:t xml:space="preserve"> </w:t>
+      </w:r>
+      <w:r>
+        <w:rPr>
+          <w:rStyle w:val="VerbatimChar"/>
+        </w:rPr>
+        <w:t xml:space="preserve">channels</w:t>
+      </w:r>
+      <w:r>
+        <w:t xml:space="preserve"> </w:t>
+      </w:r>
+      <w:r>
+        <w:t xml:space="preserve">(flags: 1 Email · 2 Push; 0 pauses),</w:t>
+      </w:r>
+      <w:r>
+        <w:t xml:space="preserve"> </w:t>
+      </w:r>
+      <w:r>
+        <w:rPr>
+          <w:rStyle w:val="VerbatimChar"/>
+        </w:rPr>
+        <w:t xml:space="preserve">quietFrom</w:t>
+      </w:r>
+      <w:r>
+        <w:t xml:space="preserve">/</w:t>
+      </w:r>
+      <w:r>
+        <w:rPr>
+          <w:rStyle w:val="VerbatimChar"/>
+        </w:rPr>
+        <w:t xml:space="preserve">quietTo</w:t>
+      </w:r>
+      <w:r>
+        <w:t xml:space="preserve"> </w:t>
+      </w:r>
+      <w:r>
+        <w:t xml:space="preserve">(</w:t>
+      </w:r>
+      <w:r>
+        <w:rPr>
+          <w:rStyle w:val="VerbatimChar"/>
+        </w:rPr>
+        <w:t xml:space="preserve">"22:00:00"</w:t>
+      </w:r>
+      <w:r>
+        <w:t xml:space="preserve">, both-or-neither; over-midnight windows allowed),</w:t>
+      </w:r>
+      <w:r>
+        <w:t xml:space="preserve"> </w:t>
+      </w:r>
+      <w:r>
+        <w:rPr>
+          <w:rStyle w:val="VerbatimChar"/>
+        </w:rPr>
+        <w:t xml:space="preserve">timeZoneId</w:t>
+      </w:r>
+      <w:r>
+        <w:t xml:space="preserve"> </w:t>
+      </w:r>
+      <w:r>
+        <w:t xml:space="preserve">(IANA, validated — unknown zones are rejected with</w:t>
+      </w:r>
+      <w:r>
+        <w:t xml:space="preserve"> </w:t>
+      </w:r>
+      <w:r>
+        <w:rPr>
+          <w:rStyle w:val="VerbatimChar"/>
+        </w:rPr>
+        <w:t xml:space="preserve">Wathiq.Reminders:UnknownTimeZone</w:t>
+      </w:r>
+      <w:r>
+        <w:t xml:space="preserve">).</w:t>
       </w:r>
     </w:p>
     <w:p>
@@ -4497,274 +4724,237 @@
         <w:pStyle w:val="BodyText"/>
       </w:pPr>
       <w:r>
-        <w:t xml:space="preserve">Live example (</w:t>
-      </w:r>
-      <w:r>
-        <w:rPr>
-          <w:rStyle w:val="VerbatimChar"/>
-        </w:rPr>
-        <w:t xml:space="preserve">Accept-Language: ar</w:t>
-      </w:r>
-      <w:r>
-        <w:t xml:space="preserve">, expiry before issue):</w:t>
+        <w:rPr>
+          <w:rStyle w:val="VerbatimChar"/>
+        </w:rPr>
+        <w:t xml:space="preserve">ReminderDto</w:t>
+      </w:r>
+      <w:r>
+        <w:t xml:space="preserve"> </w:t>
+      </w:r>
+      <w:r>
+        <w:t xml:space="preserve">(response):</w:t>
+      </w:r>
+      <w:r>
+        <w:t xml:space="preserve"> </w:t>
+      </w:r>
+      <w:r>
+        <w:rPr>
+          <w:rStyle w:val="VerbatimChar"/>
+        </w:rPr>
+        <w:t xml:space="preserve">id</w:t>
+      </w:r>
+      <w:r>
+        <w:t xml:space="preserve">,</w:t>
+      </w:r>
+      <w:r>
+        <w:t xml:space="preserve"> </w:t>
+      </w:r>
+      <w:r>
+        <w:rPr>
+          <w:rStyle w:val="VerbatimChar"/>
+        </w:rPr>
+        <w:t xml:space="preserve">documentId</w:t>
+      </w:r>
+      <w:r>
+        <w:t xml:space="preserve">,</w:t>
+      </w:r>
+      <w:r>
+        <w:t xml:space="preserve"> </w:t>
+      </w:r>
+      <w:r>
+        <w:rPr>
+          <w:rStyle w:val="VerbatimChar"/>
+        </w:rPr>
+        <w:t xml:space="preserve">offsetDays</w:t>
+      </w:r>
+      <w:r>
+        <w:t xml:space="preserve">,</w:t>
+      </w:r>
+      <w:r>
+        <w:t xml:space="preserve"> </w:t>
+      </w:r>
+      <w:r>
+        <w:rPr>
+          <w:rStyle w:val="VerbatimChar"/>
+        </w:rPr>
+        <w:t xml:space="preserve">dueDate</w:t>
+      </w:r>
+      <w:r>
+        <w:t xml:space="preserve">,</w:t>
+      </w:r>
+      <w:r>
+        <w:t xml:space="preserve"> </w:t>
+      </w:r>
+      <w:r>
+        <w:rPr>
+          <w:rStyle w:val="VerbatimChar"/>
+        </w:rPr>
+        <w:t xml:space="preserve">expiryDate</w:t>
+      </w:r>
+      <w:r>
+        <w:t xml:space="preserve"> </w:t>
+      </w:r>
+      <w:r>
+        <w:t xml:space="preserve">(server-computed:</w:t>
+      </w:r>
+      <w:r>
+        <w:t xml:space="preserve"> </w:t>
+      </w:r>
+      <w:r>
+        <w:rPr>
+          <w:rStyle w:val="VerbatimChar"/>
+        </w:rPr>
+        <w:t xml:space="preserve">dueDate + offsetDays</w:t>
+      </w:r>
+      <w:r>
+        <w:t xml:space="preserve">),</w:t>
+      </w:r>
+      <w:r>
+        <w:t xml:space="preserve"> </w:t>
+      </w:r>
+      <w:r>
+        <w:rPr>
+          <w:rStyle w:val="VerbatimChar"/>
+        </w:rPr>
+        <w:t xml:space="preserve">status</w:t>
+      </w:r>
+      <w:r>
+        <w:t xml:space="preserve"> </w:t>
+      </w:r>
+      <w:r>
+        <w:t xml:space="preserve">(0 Pending · 1 Sent · 2 Failed · 3</w:t>
+      </w:r>
+      <w:r>
+        <w:t xml:space="preserve"> </w:t>
+      </w:r>
+      <w:r>
+        <w:t xml:space="preserve">Cancelled),</w:t>
+      </w:r>
+      <w:r>
+        <w:t xml:space="preserve"> </w:t>
+      </w:r>
+      <w:r>
+        <w:rPr>
+          <w:rStyle w:val="VerbatimChar"/>
+        </w:rPr>
+        <w:t xml:space="preserve">sentAt?</w:t>
+      </w:r>
+      <w:r>
+        <w:t xml:space="preserve">.</w:t>
       </w:r>
     </w:p>
     <w:p>
       <w:pPr>
-        <w:pStyle w:val="SourceCode"/>
-      </w:pPr>
-      <w:r>
-        <w:rPr>
-          <w:rStyle w:val="FunctionTok"/>
-        </w:rPr>
-        <w:t xml:space="preserve">{</w:t>
-      </w:r>
-      <w:r>
-        <w:rPr>
-          <w:rStyle w:val="NormalTok"/>
-        </w:rPr>
-        <w:t xml:space="preserve"> </w:t>
-      </w:r>
-      <w:r>
-        <w:rPr>
-          <w:rStyle w:val="DataTypeTok"/>
-        </w:rPr>
-        <w:t xml:space="preserve">"error"</w:t>
-      </w:r>
-      <w:r>
-        <w:rPr>
-          <w:rStyle w:val="FunctionTok"/>
-        </w:rPr>
-        <w:t xml:space="preserve">:</w:t>
-      </w:r>
-      <w:r>
-        <w:rPr>
-          <w:rStyle w:val="NormalTok"/>
-        </w:rPr>
-        <w:t xml:space="preserve"> </w:t>
-      </w:r>
-      <w:r>
-        <w:rPr>
-          <w:rStyle w:val="FunctionTok"/>
-        </w:rPr>
-        <w:t xml:space="preserve">{</w:t>
-      </w:r>
-      <w:r>
-        <w:br/>
-      </w:r>
-      <w:r>
-        <w:rPr>
-          <w:rStyle w:val="NormalTok"/>
-        </w:rPr>
-        <w:t xml:space="preserve">    </w:t>
-      </w:r>
-      <w:r>
-        <w:rPr>
-          <w:rStyle w:val="DataTypeTok"/>
-        </w:rPr>
-        <w:t xml:space="preserve">"code"</w:t>
-      </w:r>
-      <w:r>
-        <w:rPr>
-          <w:rStyle w:val="FunctionTok"/>
-        </w:rPr>
-        <w:t xml:space="preserve">:</w:t>
-      </w:r>
-      <w:r>
-        <w:rPr>
-          <w:rStyle w:val="NormalTok"/>
-        </w:rPr>
-        <w:t xml:space="preserve"> </w:t>
-      </w:r>
-      <w:r>
-        <w:rPr>
-          <w:rStyle w:val="StringTok"/>
-        </w:rPr>
-        <w:t xml:space="preserve">"Wathiq.Documents:ExpiryBeforeIssue"</w:t>
-      </w:r>
-      <w:r>
-        <w:rPr>
-          <w:rStyle w:val="FunctionTok"/>
-        </w:rPr>
-        <w:t xml:space="preserve">,</w:t>
-      </w:r>
-      <w:r>
-        <w:br/>
-      </w:r>
-      <w:r>
-        <w:rPr>
-          <w:rStyle w:val="NormalTok"/>
-        </w:rPr>
-        <w:t xml:space="preserve">    </w:t>
-      </w:r>
-      <w:r>
-        <w:rPr>
-          <w:rStyle w:val="DataTypeTok"/>
-        </w:rPr>
-        <w:t xml:space="preserve">"message"</w:t>
-      </w:r>
-      <w:r>
-        <w:rPr>
-          <w:rStyle w:val="FunctionTok"/>
-        </w:rPr>
-        <w:t xml:space="preserve">:</w:t>
-      </w:r>
-      <w:r>
-        <w:rPr>
-          <w:rStyle w:val="NormalTok"/>
-        </w:rPr>
-        <w:t xml:space="preserve"> </w:t>
-      </w:r>
-      <w:r>
-        <w:rPr>
-          <w:rStyle w:val="StringTok"/>
-        </w:rPr>
-        <w:t xml:space="preserve">"لا يمكن أن يكون تاريخ الانتهاء قبل تاريخ الإصدار."</w:t>
-      </w:r>
-      <w:r>
-        <w:rPr>
-          <w:rStyle w:val="FunctionTok"/>
-        </w:rPr>
-        <w:t xml:space="preserve">,</w:t>
-      </w:r>
-      <w:r>
-        <w:br/>
-      </w:r>
-      <w:r>
-        <w:rPr>
-          <w:rStyle w:val="NormalTok"/>
-        </w:rPr>
-        <w:t xml:space="preserve">    </w:t>
-      </w:r>
-      <w:r>
-        <w:rPr>
-          <w:rStyle w:val="DataTypeTok"/>
-        </w:rPr>
-        <w:t xml:space="preserve">"data"</w:t>
-      </w:r>
-      <w:r>
-        <w:rPr>
-          <w:rStyle w:val="FunctionTok"/>
-        </w:rPr>
-        <w:t xml:space="preserve">:</w:t>
-      </w:r>
-      <w:r>
-        <w:rPr>
-          <w:rStyle w:val="NormalTok"/>
-        </w:rPr>
-        <w:t xml:space="preserve"> </w:t>
-      </w:r>
-      <w:r>
-        <w:rPr>
-          <w:rStyle w:val="FunctionTok"/>
-        </w:rPr>
-        <w:t xml:space="preserve">{</w:t>
-      </w:r>
-      <w:r>
-        <w:rPr>
-          <w:rStyle w:val="NormalTok"/>
-        </w:rPr>
-        <w:t xml:space="preserve"> </w:t>
-      </w:r>
-      <w:r>
-        <w:rPr>
-          <w:rStyle w:val="DataTypeTok"/>
-        </w:rPr>
-        <w:t xml:space="preserve">"IssueDate"</w:t>
-      </w:r>
-      <w:r>
-        <w:rPr>
-          <w:rStyle w:val="FunctionTok"/>
-        </w:rPr>
-        <w:t xml:space="preserve">:</w:t>
-      </w:r>
-      <w:r>
-        <w:rPr>
-          <w:rStyle w:val="NormalTok"/>
-        </w:rPr>
-        <w:t xml:space="preserve"> </w:t>
-      </w:r>
-      <w:r>
-        <w:rPr>
-          <w:rStyle w:val="StringTok"/>
-        </w:rPr>
-        <w:t xml:space="preserve">"2030-01-01"</w:t>
-      </w:r>
-      <w:r>
-        <w:rPr>
-          <w:rStyle w:val="FunctionTok"/>
-        </w:rPr>
-        <w:t xml:space="preserve">,</w:t>
-      </w:r>
-      <w:r>
-        <w:rPr>
-          <w:rStyle w:val="NormalTok"/>
-        </w:rPr>
-        <w:t xml:space="preserve"> </w:t>
-      </w:r>
-      <w:r>
-        <w:rPr>
-          <w:rStyle w:val="DataTypeTok"/>
-        </w:rPr>
-        <w:t xml:space="preserve">"ExpiryDate"</w:t>
-      </w:r>
-      <w:r>
-        <w:rPr>
-          <w:rStyle w:val="FunctionTok"/>
-        </w:rPr>
-        <w:t xml:space="preserve">:</w:t>
-      </w:r>
-      <w:r>
-        <w:rPr>
-          <w:rStyle w:val="NormalTok"/>
-        </w:rPr>
-        <w:t xml:space="preserve"> </w:t>
-      </w:r>
-      <w:r>
-        <w:rPr>
-          <w:rStyle w:val="StringTok"/>
-        </w:rPr>
-        <w:t xml:space="preserve">"2020-01-01"</w:t>
-      </w:r>
-      <w:r>
-        <w:rPr>
-          <w:rStyle w:val="NormalTok"/>
-        </w:rPr>
-        <w:t xml:space="preserve"> </w:t>
-      </w:r>
-      <w:r>
-        <w:rPr>
-          <w:rStyle w:val="FunctionTok"/>
-        </w:rPr>
-        <w:t xml:space="preserve">}</w:t>
-      </w:r>
-      <w:r>
-        <w:rPr>
-          <w:rStyle w:val="NormalTok"/>
-        </w:rPr>
-        <w:t xml:space="preserve"> </w:t>
-      </w:r>
-      <w:r>
-        <w:rPr>
-          <w:rStyle w:val="FunctionTok"/>
-        </w:rPr>
-        <w:t xml:space="preserve">}</w:t>
-      </w:r>
-      <w:r>
-        <w:rPr>
-          <w:rStyle w:val="NormalTok"/>
-        </w:rPr>
-        <w:t xml:space="preserve"> </w:t>
-      </w:r>
-      <w:r>
-        <w:rPr>
-          <w:rStyle w:val="FunctionTok"/>
-        </w:rPr>
-        <w:t xml:space="preserve">}</w:t>
+        <w:pStyle w:val="BodyText"/>
+      </w:pPr>
+      <w:r>
+        <w:t xml:space="preserve">Reminder rows are system-managed: they are (re)created by document changes and the rule update,</w:t>
+      </w:r>
+      <w:r>
+        <w:t xml:space="preserve"> </w:t>
+      </w:r>
+      <w:r>
+        <w:t xml:space="preserve">sent by the hourly dispatch job, and never edited directly — hence no POST/PUT/DELETE.</w:t>
+      </w:r>
+    </w:p>
+    <w:p>
+      <w:pPr>
+        <w:pStyle w:val="BodyText"/>
+      </w:pPr>
+      <w:r>
+        <w:t xml:space="preserve">Live example (recorded):</w:t>
+      </w:r>
+      <w:r>
+        <w:t xml:space="preserve"> </w:t>
+      </w:r>
+      <w:r>
+        <w:rPr>
+          <w:rStyle w:val="VerbatimChar"/>
+        </w:rPr>
+        <w:t xml:space="preserve">PUT /api/reminders/rule</w:t>
+      </w:r>
+      <w:r>
+        <w:t xml:space="preserve"> </w:t>
+      </w:r>
+      <w:r>
+        <w:t xml:space="preserve">with</w:t>
+      </w:r>
+      <w:r>
+        <w:t xml:space="preserve"> </w:t>
+      </w:r>
+      <w:r>
+        <w:rPr>
+          <w:rStyle w:val="VerbatimChar"/>
+        </w:rPr>
+        <w:t xml:space="preserve">{"offsetsDays":[45,3], …}</w:t>
+      </w:r>
+      <w:r>
+        <w:t xml:space="preserve"> </w:t>
+      </w:r>
+      <w:r>
+        <w:t xml:space="preserve">against an</w:t>
+      </w:r>
+      <w:r>
+        <w:t xml:space="preserve"> </w:t>
+      </w:r>
+      <w:r>
+        <w:t xml:space="preserve">account holding one document expiring</w:t>
+      </w:r>
+      <w:r>
+        <w:t xml:space="preserve"> </w:t>
+      </w:r>
+      <w:r>
+        <w:rPr>
+          <w:rStyle w:val="VerbatimChar"/>
+        </w:rPr>
+        <w:t xml:space="preserve">2026-09-04</w:t>
+      </w:r>
+      <w:r>
+        <w:t xml:space="preserve"> </w:t>
+      </w:r>
+      <w:r>
+        <w:t xml:space="preserve">left exactly one Pending row —</w:t>
+      </w:r>
+      <w:r>
+        <w:t xml:space="preserve"> </w:t>
+      </w:r>
+      <w:r>
+        <w:rPr>
+          <w:rStyle w:val="VerbatimChar"/>
+        </w:rPr>
+        <w:t xml:space="preserve">offsetDays: 3, dueDate: 2026-09-01, expiryDate: 2026-09-04</w:t>
+      </w:r>
+      <w:r>
+        <w:t xml:space="preserve"> </w:t>
+      </w:r>
+      <w:r>
+        <w:t xml:space="preserve">— the already-sent 7-day reminder</w:t>
+      </w:r>
+      <w:r>
+        <w:t xml:space="preserve"> </w:t>
+      </w:r>
+      <w:r>
+        <w:t xml:space="preserve">stayed</w:t>
+      </w:r>
+      <w:r>
+        <w:t xml:space="preserve"> </w:t>
+      </w:r>
+      <w:r>
+        <w:rPr>
+          <w:rStyle w:val="VerbatimChar"/>
+        </w:rPr>
+        <w:t xml:space="preserve">Sent</w:t>
+      </w:r>
+      <w:r>
+        <w:t xml:space="preserve"> </w:t>
+      </w:r>
+      <w:r>
+        <w:t xml:space="preserve">(history is immutable), the removed offsets were cancelled.</w:t>
       </w:r>
     </w:p>
     <w:bookmarkEnd w:id="37"/>
-    <w:bookmarkStart w:id="38" w:name="infrastructure-endpoints-abp-built-ins"/>
+    <w:bookmarkStart w:id="38" w:name="error-model"/>
     <w:p>
       <w:pPr>
         <w:pStyle w:val="Heading1"/>
@@ -4779,7 +4969,7 @@
         <w:tab/>
       </w:r>
       <w:r>
-        <w:t xml:space="preserve">6. Infrastructure endpoints (ABP built-ins)</w:t>
+        <w:t xml:space="preserve">6. Error model</w:t>
       </w:r>
     </w:p>
     <w:p>
@@ -4787,7 +4977,19 @@
         <w:pStyle w:val="FirstParagraph"/>
       </w:pPr>
       <w:r>
-        <w:t xml:space="preserve">Summarized — full detail is in Swagger. Admin-tagged groups require admin permissions.</w:t>
+        <w:t xml:space="preserve">Every error is the ABP envelope</w:t>
+      </w:r>
+      <w:r>
+        <w:t xml:space="preserve"> </w:t>
+      </w:r>
+      <w:r>
+        <w:rPr>
+          <w:rStyle w:val="VerbatimChar"/>
+        </w:rPr>
+        <w:t xml:space="preserve">{ "error": { code, message, details, data, validationErrors } }</w:t>
+      </w:r>
+      <w:r>
+        <w:t xml:space="preserve">.</w:t>
       </w:r>
     </w:p>
     <w:tbl>
@@ -4814,31 +5016,40 @@
               <w:jc w:val="left"/>
             </w:pPr>
             <w:r>
-              <w:t xml:space="preserve">Area</w:t>
-            </w:r>
-          </w:p>
-        </w:tc>
-        <w:tc>
-          <w:tcPr/>
-          <w:p>
-            <w:pPr>
-              <w:pStyle w:val="Compact"/>
-              <w:jc w:val="left"/>
-            </w:pPr>
-            <w:r>
-              <w:t xml:space="preserve">Root</w:t>
-            </w:r>
-          </w:p>
-        </w:tc>
-        <w:tc>
-          <w:tcPr/>
-          <w:p>
-            <w:pPr>
-              <w:pStyle w:val="Compact"/>
-              <w:jc w:val="left"/>
-            </w:pPr>
-            <w:r>
-              <w:t xml:space="preserve">Notes</w:t>
+              <w:t xml:space="preserve">HTTP</w:t>
+            </w:r>
+          </w:p>
+        </w:tc>
+        <w:tc>
+          <w:tcPr/>
+          <w:p>
+            <w:pPr>
+              <w:pStyle w:val="Compact"/>
+              <w:jc w:val="left"/>
+            </w:pPr>
+            <w:r>
+              <w:t xml:space="preserve">When</w:t>
+            </w:r>
+          </w:p>
+        </w:tc>
+        <w:tc>
+          <w:tcPr/>
+          <w:p>
+            <w:pPr>
+              <w:pStyle w:val="Compact"/>
+              <w:jc w:val="left"/>
+            </w:pPr>
+            <w:r>
+              <w:rPr>
+                <w:rStyle w:val="VerbatimChar"/>
+              </w:rPr>
+              <w:t xml:space="preserve">error.code</w:t>
+            </w:r>
+            <w:r>
+              <w:t xml:space="preserve"> </w:t>
+            </w:r>
+            <w:r>
+              <w:t xml:space="preserve">example</w:t>
             </w:r>
           </w:p>
         </w:tc>
@@ -4852,34 +5063,46 @@
               <w:jc w:val="left"/>
             </w:pPr>
             <w:r>
-              <w:t xml:space="preserve">Account</w:t>
-            </w:r>
-          </w:p>
-        </w:tc>
-        <w:tc>
-          <w:tcPr/>
-          <w:p>
-            <w:pPr>
-              <w:pStyle w:val="Compact"/>
-              <w:jc w:val="left"/>
-            </w:pPr>
+              <w:t xml:space="preserve">400</w:t>
+            </w:r>
+          </w:p>
+        </w:tc>
+        <w:tc>
+          <w:tcPr/>
+          <w:p>
+            <w:pPr>
+              <w:pStyle w:val="Compact"/>
+              <w:jc w:val="left"/>
+            </w:pPr>
+            <w:r>
+              <w:t xml:space="preserve">DTO validation (missing/too long fields) —</w:t>
+            </w:r>
+            <w:r>
+              <w:t xml:space="preserve"> </w:t>
+            </w:r>
             <w:r>
               <w:rPr>
                 <w:rStyle w:val="VerbatimChar"/>
               </w:rPr>
-              <w:t xml:space="preserve">/api/account/*</w:t>
-            </w:r>
-          </w:p>
-        </w:tc>
-        <w:tc>
-          <w:tcPr/>
-          <w:p>
-            <w:pPr>
-              <w:pStyle w:val="Compact"/>
-              <w:jc w:val="left"/>
-            </w:pPr>
-            <w:r>
-              <w:t xml:space="preserve">register, login/logout, reset-password, my-profile, change-password</w:t>
+              <w:t xml:space="preserve">validationErrors</w:t>
+            </w:r>
+            <w:r>
+              <w:t xml:space="preserve"> </w:t>
+            </w:r>
+            <w:r>
+              <w:t xml:space="preserve">lists each field</w:t>
+            </w:r>
+          </w:p>
+        </w:tc>
+        <w:tc>
+          <w:tcPr/>
+          <w:p>
+            <w:pPr>
+              <w:pStyle w:val="Compact"/>
+              <w:jc w:val="left"/>
+            </w:pPr>
+            <w:r>
+              <w:t xml:space="preserve">—</w:t>
             </w:r>
           </w:p>
         </w:tc>
@@ -4893,46 +5116,31 @@
               <w:jc w:val="left"/>
             </w:pPr>
             <w:r>
-              <w:t xml:space="preserve">Identity admin</w:t>
-            </w:r>
-          </w:p>
-        </w:tc>
-        <w:tc>
-          <w:tcPr/>
-          <w:p>
-            <w:pPr>
-              <w:pStyle w:val="Compact"/>
-              <w:jc w:val="left"/>
-            </w:pPr>
-            <w:r>
-              <w:rPr>
-                <w:rStyle w:val="VerbatimChar"/>
-              </w:rPr>
-              <w:t xml:space="preserve">/api/identity/users</w:t>
-            </w:r>
-            <w:r>
-              <w:t xml:space="preserve">,</w:t>
-            </w:r>
-            <w:r>
-              <w:t xml:space="preserve"> </w:t>
-            </w:r>
-            <w:r>
-              <w:rPr>
-                <w:rStyle w:val="VerbatimChar"/>
-              </w:rPr>
-              <w:t xml:space="preserve">/api/identity/roles</w:t>
-            </w:r>
-          </w:p>
-        </w:tc>
-        <w:tc>
-          <w:tcPr/>
-          <w:p>
-            <w:pPr>
-              <w:pStyle w:val="Compact"/>
-              <w:jc w:val="left"/>
-            </w:pPr>
-            <w:r>
-              <w:t xml:space="preserve">user/role CRUD (admin)</w:t>
+              <w:t xml:space="preserve">401</w:t>
+            </w:r>
+          </w:p>
+        </w:tc>
+        <w:tc>
+          <w:tcPr/>
+          <w:p>
+            <w:pPr>
+              <w:pStyle w:val="Compact"/>
+              <w:jc w:val="left"/>
+            </w:pPr>
+            <w:r>
+              <w:t xml:space="preserve">Missing/invalid token (JSON clients)</w:t>
+            </w:r>
+          </w:p>
+        </w:tc>
+        <w:tc>
+          <w:tcPr/>
+          <w:p>
+            <w:pPr>
+              <w:pStyle w:val="Compact"/>
+              <w:jc w:val="left"/>
+            </w:pPr>
+            <w:r>
+              <w:t xml:space="preserve">—</w:t>
             </w:r>
           </w:p>
         </w:tc>
@@ -4946,7 +5154,19 @@
               <w:jc w:val="left"/>
             </w:pPr>
             <w:r>
-              <w:t xml:space="preserve">Permission management</w:t>
+              <w:t xml:space="preserve">403</w:t>
+            </w:r>
+          </w:p>
+        </w:tc>
+        <w:tc>
+          <w:tcPr/>
+          <w:p>
+            <w:pPr>
+              <w:pStyle w:val="Compact"/>
+              <w:jc w:val="left"/>
+            </w:pPr>
+            <w:r>
+              <w:t xml:space="preserve">Permission denied, or a business rule rejected the request</w:t>
             </w:r>
           </w:p>
         </w:tc>
@@ -4961,19 +5181,7 @@
               <w:rPr>
                 <w:rStyle w:val="VerbatimChar"/>
               </w:rPr>
-              <w:t xml:space="preserve">/api/permission-management/permissions</w:t>
-            </w:r>
-          </w:p>
-        </w:tc>
-        <w:tc>
-          <w:tcPr/>
-          <w:p>
-            <w:pPr>
-              <w:pStyle w:val="Compact"/>
-              <w:jc w:val="left"/>
-            </w:pPr>
-            <w:r>
-              <w:t xml:space="preserve">read/update grants (admin)</w:t>
+              <w:t xml:space="preserve">Wathiq.Documents:ExpiryBeforeIssue</w:t>
             </w:r>
           </w:p>
         </w:tc>
@@ -4987,34 +5195,571 @@
               <w:jc w:val="left"/>
             </w:pPr>
             <w:r>
-              <w:t xml:space="preserve">App configuration</w:t>
-            </w:r>
-          </w:p>
-        </w:tc>
-        <w:tc>
-          <w:tcPr/>
-          <w:p>
-            <w:pPr>
-              <w:pStyle w:val="Compact"/>
-              <w:jc w:val="left"/>
-            </w:pPr>
-            <w:r>
-              <w:rPr>
-                <w:rStyle w:val="VerbatimChar"/>
-              </w:rPr>
-              <w:t xml:space="preserve">/api/abp/application-configuration</w:t>
-            </w:r>
-          </w:p>
-        </w:tc>
-        <w:tc>
-          <w:tcPr/>
-          <w:p>
-            <w:pPr>
-              <w:pStyle w:val="Compact"/>
-              <w:jc w:val="left"/>
-            </w:pPr>
-            <w:r>
-              <w:t xml:space="preserve">current user, permissions, localization — the client bootstrap call</w:t>
+              <w:t xml:space="preserve">404</w:t>
+            </w:r>
+          </w:p>
+        </w:tc>
+        <w:tc>
+          <w:tcPr/>
+          <w:p>
+            <w:pPr>
+              <w:pStyle w:val="Compact"/>
+              <w:jc w:val="left"/>
+            </w:pPr>
+            <w:r>
+              <w:t xml:space="preserve">Row doesn’t exist</w:t>
+            </w:r>
+            <w:r>
+              <w:t xml:space="preserve"> </w:t>
+            </w:r>
+            <w:r>
+              <w:rPr>
+                <w:bCs/>
+                <w:b/>
+              </w:rPr>
+              <w:t xml:space="preserve">or belongs to another user</w:t>
+            </w:r>
+          </w:p>
+        </w:tc>
+        <w:tc>
+          <w:tcPr/>
+          <w:p>
+            <w:pPr>
+              <w:pStyle w:val="Compact"/>
+              <w:jc w:val="left"/>
+            </w:pPr>
+            <w:r>
+              <w:t xml:space="preserve">—</w:t>
+            </w:r>
+          </w:p>
+        </w:tc>
+      </w:tr>
+    </w:tbl>
+    <w:p>
+      <w:pPr>
+        <w:pStyle w:val="BodyText"/>
+      </w:pPr>
+      <w:r>
+        <w:t xml:space="preserve">Reminders business codes:</w:t>
+      </w:r>
+      <w:r>
+        <w:t xml:space="preserve"> </w:t>
+      </w:r>
+      <w:r>
+        <w:rPr>
+          <w:rStyle w:val="VerbatimChar"/>
+        </w:rPr>
+        <w:t xml:space="preserve">InvalidOffsets</w:t>
+      </w:r>
+      <w:r>
+        <w:t xml:space="preserve">,</w:t>
+      </w:r>
+      <w:r>
+        <w:t xml:space="preserve"> </w:t>
+      </w:r>
+      <w:r>
+        <w:rPr>
+          <w:rStyle w:val="VerbatimChar"/>
+        </w:rPr>
+        <w:t xml:space="preserve">QuietHoursIncomplete</w:t>
+      </w:r>
+      <w:r>
+        <w:t xml:space="preserve">,</w:t>
+      </w:r>
+      <w:r>
+        <w:t xml:space="preserve"> </w:t>
+      </w:r>
+      <w:r>
+        <w:rPr>
+          <w:rStyle w:val="VerbatimChar"/>
+        </w:rPr>
+        <w:t xml:space="preserve">UnknownTimeZone</w:t>
+      </w:r>
+      <w:r>
+        <w:t xml:space="preserve">,</w:t>
+      </w:r>
+      <w:r>
+        <w:t xml:space="preserve"> </w:t>
+      </w:r>
+      <w:r>
+        <w:rPr>
+          <w:rStyle w:val="VerbatimChar"/>
+        </w:rPr>
+        <w:t xml:space="preserve">NoEmailAddress</w:t>
+      </w:r>
+      <w:r>
+        <w:t xml:space="preserve"> </w:t>
+      </w:r>
+      <w:r>
+        <w:t xml:space="preserve">— prefixed</w:t>
+      </w:r>
+      <w:r>
+        <w:t xml:space="preserve"> </w:t>
+      </w:r>
+      <w:r>
+        <w:rPr>
+          <w:rStyle w:val="VerbatimChar"/>
+        </w:rPr>
+        <w:t xml:space="preserve">Wathiq.Reminders:</w:t>
+      </w:r>
+      <w:r>
+        <w:t xml:space="preserve">.</w:t>
+      </w:r>
+    </w:p>
+    <w:p>
+      <w:pPr>
+        <w:pStyle w:val="BodyText"/>
+      </w:pPr>
+      <w:r>
+        <w:t xml:space="preserve">Business error codes of the Documents module (message localized via</w:t>
+      </w:r>
+      <w:r>
+        <w:t xml:space="preserve"> </w:t>
+      </w:r>
+      <w:r>
+        <w:rPr>
+          <w:rStyle w:val="VerbatimChar"/>
+        </w:rPr>
+        <w:t xml:space="preserve">Accept-Language</w:t>
+      </w:r>
+      <w:r>
+        <w:t xml:space="preserve">):</w:t>
+      </w:r>
+      <w:r>
+        <w:t xml:space="preserve"> </w:t>
+      </w:r>
+      <w:r>
+        <w:rPr>
+          <w:rStyle w:val="VerbatimChar"/>
+        </w:rPr>
+        <w:t xml:space="preserve">ExpiryBeforeIssue</w:t>
+      </w:r>
+      <w:r>
+        <w:t xml:space="preserve">,</w:t>
+      </w:r>
+      <w:r>
+        <w:t xml:space="preserve"> </w:t>
+      </w:r>
+      <w:r>
+        <w:rPr>
+          <w:rStyle w:val="VerbatimChar"/>
+        </w:rPr>
+        <w:t xml:space="preserve">HolderNotOwned</w:t>
+      </w:r>
+      <w:r>
+        <w:t xml:space="preserve">,</w:t>
+      </w:r>
+      <w:r>
+        <w:t xml:space="preserve"> </w:t>
+      </w:r>
+      <w:r>
+        <w:rPr>
+          <w:rStyle w:val="VerbatimChar"/>
+        </w:rPr>
+        <w:t xml:space="preserve">DocumentTypeNotActive</w:t>
+      </w:r>
+      <w:r>
+        <w:t xml:space="preserve">,</w:t>
+      </w:r>
+      <w:r>
+        <w:t xml:space="preserve"> </w:t>
+      </w:r>
+      <w:r>
+        <w:rPr>
+          <w:rStyle w:val="VerbatimChar"/>
+        </w:rPr>
+        <w:t xml:space="preserve">SelfHolderIsAutomatic</w:t>
+      </w:r>
+      <w:r>
+        <w:t xml:space="preserve">,</w:t>
+      </w:r>
+      <w:r>
+        <w:t xml:space="preserve"> </w:t>
+      </w:r>
+      <w:r>
+        <w:rPr>
+          <w:rStyle w:val="VerbatimChar"/>
+        </w:rPr>
+        <w:t xml:space="preserve">CannotDeleteSelfHolder</w:t>
+      </w:r>
+      <w:r>
+        <w:t xml:space="preserve">,</w:t>
+      </w:r>
+      <w:r>
+        <w:t xml:space="preserve"> </w:t>
+      </w:r>
+      <w:r>
+        <w:rPr>
+          <w:rStyle w:val="VerbatimChar"/>
+        </w:rPr>
+        <w:t xml:space="preserve">HolderHasDocuments</w:t>
+      </w:r>
+      <w:r>
+        <w:t xml:space="preserve"> </w:t>
+      </w:r>
+      <w:r>
+        <w:t xml:space="preserve">— all prefixed</w:t>
+      </w:r>
+      <w:r>
+        <w:t xml:space="preserve"> </w:t>
+      </w:r>
+      <w:r>
+        <w:rPr>
+          <w:rStyle w:val="VerbatimChar"/>
+        </w:rPr>
+        <w:t xml:space="preserve">Wathiq.Documents:</w:t>
+      </w:r>
+      <w:r>
+        <w:t xml:space="preserve">.</w:t>
+      </w:r>
+    </w:p>
+    <w:p>
+      <w:pPr>
+        <w:pStyle w:val="BodyText"/>
+      </w:pPr>
+      <w:r>
+        <w:t xml:space="preserve">Live example (</w:t>
+      </w:r>
+      <w:r>
+        <w:rPr>
+          <w:rStyle w:val="VerbatimChar"/>
+        </w:rPr>
+        <w:t xml:space="preserve">Accept-Language: ar</w:t>
+      </w:r>
+      <w:r>
+        <w:t xml:space="preserve">, expiry before issue):</w:t>
+      </w:r>
+    </w:p>
+    <w:p>
+      <w:pPr>
+        <w:pStyle w:val="SourceCode"/>
+      </w:pPr>
+      <w:r>
+        <w:rPr>
+          <w:rStyle w:val="FunctionTok"/>
+        </w:rPr>
+        <w:t xml:space="preserve">{</w:t>
+      </w:r>
+      <w:r>
+        <w:rPr>
+          <w:rStyle w:val="NormalTok"/>
+        </w:rPr>
+        <w:t xml:space="preserve"> </w:t>
+      </w:r>
+      <w:r>
+        <w:rPr>
+          <w:rStyle w:val="DataTypeTok"/>
+        </w:rPr>
+        <w:t xml:space="preserve">"error"</w:t>
+      </w:r>
+      <w:r>
+        <w:rPr>
+          <w:rStyle w:val="FunctionTok"/>
+        </w:rPr>
+        <w:t xml:space="preserve">:</w:t>
+      </w:r>
+      <w:r>
+        <w:rPr>
+          <w:rStyle w:val="NormalTok"/>
+        </w:rPr>
+        <w:t xml:space="preserve"> </w:t>
+      </w:r>
+      <w:r>
+        <w:rPr>
+          <w:rStyle w:val="FunctionTok"/>
+        </w:rPr>
+        <w:t xml:space="preserve">{</w:t>
+      </w:r>
+      <w:r>
+        <w:br/>
+      </w:r>
+      <w:r>
+        <w:rPr>
+          <w:rStyle w:val="NormalTok"/>
+        </w:rPr>
+        <w:t xml:space="preserve">    </w:t>
+      </w:r>
+      <w:r>
+        <w:rPr>
+          <w:rStyle w:val="DataTypeTok"/>
+        </w:rPr>
+        <w:t xml:space="preserve">"code"</w:t>
+      </w:r>
+      <w:r>
+        <w:rPr>
+          <w:rStyle w:val="FunctionTok"/>
+        </w:rPr>
+        <w:t xml:space="preserve">:</w:t>
+      </w:r>
+      <w:r>
+        <w:rPr>
+          <w:rStyle w:val="NormalTok"/>
+        </w:rPr>
+        <w:t xml:space="preserve"> </w:t>
+      </w:r>
+      <w:r>
+        <w:rPr>
+          <w:rStyle w:val="StringTok"/>
+        </w:rPr>
+        <w:t xml:space="preserve">"Wathiq.Documents:ExpiryBeforeIssue"</w:t>
+      </w:r>
+      <w:r>
+        <w:rPr>
+          <w:rStyle w:val="FunctionTok"/>
+        </w:rPr>
+        <w:t xml:space="preserve">,</w:t>
+      </w:r>
+      <w:r>
+        <w:br/>
+      </w:r>
+      <w:r>
+        <w:rPr>
+          <w:rStyle w:val="NormalTok"/>
+        </w:rPr>
+        <w:t xml:space="preserve">    </w:t>
+      </w:r>
+      <w:r>
+        <w:rPr>
+          <w:rStyle w:val="DataTypeTok"/>
+        </w:rPr>
+        <w:t xml:space="preserve">"message"</w:t>
+      </w:r>
+      <w:r>
+        <w:rPr>
+          <w:rStyle w:val="FunctionTok"/>
+        </w:rPr>
+        <w:t xml:space="preserve">:</w:t>
+      </w:r>
+      <w:r>
+        <w:rPr>
+          <w:rStyle w:val="NormalTok"/>
+        </w:rPr>
+        <w:t xml:space="preserve"> </w:t>
+      </w:r>
+      <w:r>
+        <w:rPr>
+          <w:rStyle w:val="StringTok"/>
+        </w:rPr>
+        <w:t xml:space="preserve">"لا يمكن أن يكون تاريخ الانتهاء قبل تاريخ الإصدار."</w:t>
+      </w:r>
+      <w:r>
+        <w:rPr>
+          <w:rStyle w:val="FunctionTok"/>
+        </w:rPr>
+        <w:t xml:space="preserve">,</w:t>
+      </w:r>
+      <w:r>
+        <w:br/>
+      </w:r>
+      <w:r>
+        <w:rPr>
+          <w:rStyle w:val="NormalTok"/>
+        </w:rPr>
+        <w:t xml:space="preserve">    </w:t>
+      </w:r>
+      <w:r>
+        <w:rPr>
+          <w:rStyle w:val="DataTypeTok"/>
+        </w:rPr>
+        <w:t xml:space="preserve">"data"</w:t>
+      </w:r>
+      <w:r>
+        <w:rPr>
+          <w:rStyle w:val="FunctionTok"/>
+        </w:rPr>
+        <w:t xml:space="preserve">:</w:t>
+      </w:r>
+      <w:r>
+        <w:rPr>
+          <w:rStyle w:val="NormalTok"/>
+        </w:rPr>
+        <w:t xml:space="preserve"> </w:t>
+      </w:r>
+      <w:r>
+        <w:rPr>
+          <w:rStyle w:val="FunctionTok"/>
+        </w:rPr>
+        <w:t xml:space="preserve">{</w:t>
+      </w:r>
+      <w:r>
+        <w:rPr>
+          <w:rStyle w:val="NormalTok"/>
+        </w:rPr>
+        <w:t xml:space="preserve"> </w:t>
+      </w:r>
+      <w:r>
+        <w:rPr>
+          <w:rStyle w:val="DataTypeTok"/>
+        </w:rPr>
+        <w:t xml:space="preserve">"IssueDate"</w:t>
+      </w:r>
+      <w:r>
+        <w:rPr>
+          <w:rStyle w:val="FunctionTok"/>
+        </w:rPr>
+        <w:t xml:space="preserve">:</w:t>
+      </w:r>
+      <w:r>
+        <w:rPr>
+          <w:rStyle w:val="NormalTok"/>
+        </w:rPr>
+        <w:t xml:space="preserve"> </w:t>
+      </w:r>
+      <w:r>
+        <w:rPr>
+          <w:rStyle w:val="StringTok"/>
+        </w:rPr>
+        <w:t xml:space="preserve">"2030-01-01"</w:t>
+      </w:r>
+      <w:r>
+        <w:rPr>
+          <w:rStyle w:val="FunctionTok"/>
+        </w:rPr>
+        <w:t xml:space="preserve">,</w:t>
+      </w:r>
+      <w:r>
+        <w:rPr>
+          <w:rStyle w:val="NormalTok"/>
+        </w:rPr>
+        <w:t xml:space="preserve"> </w:t>
+      </w:r>
+      <w:r>
+        <w:rPr>
+          <w:rStyle w:val="DataTypeTok"/>
+        </w:rPr>
+        <w:t xml:space="preserve">"ExpiryDate"</w:t>
+      </w:r>
+      <w:r>
+        <w:rPr>
+          <w:rStyle w:val="FunctionTok"/>
+        </w:rPr>
+        <w:t xml:space="preserve">:</w:t>
+      </w:r>
+      <w:r>
+        <w:rPr>
+          <w:rStyle w:val="NormalTok"/>
+        </w:rPr>
+        <w:t xml:space="preserve"> </w:t>
+      </w:r>
+      <w:r>
+        <w:rPr>
+          <w:rStyle w:val="StringTok"/>
+        </w:rPr>
+        <w:t xml:space="preserve">"2020-01-01"</w:t>
+      </w:r>
+      <w:r>
+        <w:rPr>
+          <w:rStyle w:val="NormalTok"/>
+        </w:rPr>
+        <w:t xml:space="preserve"> </w:t>
+      </w:r>
+      <w:r>
+        <w:rPr>
+          <w:rStyle w:val="FunctionTok"/>
+        </w:rPr>
+        <w:t xml:space="preserve">}</w:t>
+      </w:r>
+      <w:r>
+        <w:rPr>
+          <w:rStyle w:val="NormalTok"/>
+        </w:rPr>
+        <w:t xml:space="preserve"> </w:t>
+      </w:r>
+      <w:r>
+        <w:rPr>
+          <w:rStyle w:val="FunctionTok"/>
+        </w:rPr>
+        <w:t xml:space="preserve">}</w:t>
+      </w:r>
+      <w:r>
+        <w:rPr>
+          <w:rStyle w:val="NormalTok"/>
+        </w:rPr>
+        <w:t xml:space="preserve"> </w:t>
+      </w:r>
+      <w:r>
+        <w:rPr>
+          <w:rStyle w:val="FunctionTok"/>
+        </w:rPr>
+        <w:t xml:space="preserve">}</w:t>
+      </w:r>
+    </w:p>
+    <w:bookmarkEnd w:id="38"/>
+    <w:bookmarkStart w:id="39" w:name="infrastructure-endpoints-abp-built-ins"/>
+    <w:p>
+      <w:pPr>
+        <w:pStyle w:val="Heading1"/>
+      </w:pPr>
+      <w:r>
+        <w:rPr>
+          <w:rStyle w:val="SectionNumber"/>
+        </w:rPr>
+        <w:t xml:space="preserve">7</w:t>
+      </w:r>
+      <w:r>
+        <w:tab/>
+      </w:r>
+      <w:r>
+        <w:t xml:space="preserve">7. Infrastructure endpoints (ABP built-ins)</w:t>
+      </w:r>
+    </w:p>
+    <w:p>
+      <w:pPr>
+        <w:pStyle w:val="FirstParagraph"/>
+      </w:pPr>
+      <w:r>
+        <w:t xml:space="preserve">Summarized — full detail is in Swagger. Admin-tagged groups require admin permissions.</w:t>
+      </w:r>
+    </w:p>
+    <w:tbl>
+      <w:tblPr>
+        <w:tblStyle w:val="Table"/>
+        <w:tblW w:type="pct" w:w="5000"/>
+        <w:tblLook w:firstRow="1" w:lastRow="0" w:firstColumn="0" w:lastColumn="0" w:noHBand="0" w:noVBand="0" w:val="0020"/>
+        <w:jc w:val="start"/>
+      </w:tblPr>
+      <w:tblGrid>
+        <w:gridCol w:w="2640"/>
+        <w:gridCol w:w="2640"/>
+        <w:gridCol w:w="2640"/>
+      </w:tblGrid>
+      <w:tr>
+        <w:trPr>
+          <w:tblHeader w:val="true"/>
+        </w:trPr>
+        <w:tc>
+          <w:tcPr/>
+          <w:p>
+            <w:pPr>
+              <w:pStyle w:val="Compact"/>
+              <w:jc w:val="left"/>
+            </w:pPr>
+            <w:r>
+              <w:t xml:space="preserve">Area</w:t>
+            </w:r>
+          </w:p>
+        </w:tc>
+        <w:tc>
+          <w:tcPr/>
+          <w:p>
+            <w:pPr>
+              <w:pStyle w:val="Compact"/>
+              <w:jc w:val="left"/>
+            </w:pPr>
+            <w:r>
+              <w:t xml:space="preserve">Root</w:t>
+            </w:r>
+          </w:p>
+        </w:tc>
+        <w:tc>
+          <w:tcPr/>
+          <w:p>
+            <w:pPr>
+              <w:pStyle w:val="Compact"/>
+              <w:jc w:val="left"/>
+            </w:pPr>
+            <w:r>
+              <w:t xml:space="preserve">Notes</w:t>
             </w:r>
           </w:p>
         </w:tc>
@@ -5028,6 +5773,182 @@
               <w:jc w:val="left"/>
             </w:pPr>
             <w:r>
+              <w:t xml:space="preserve">Account</w:t>
+            </w:r>
+          </w:p>
+        </w:tc>
+        <w:tc>
+          <w:tcPr/>
+          <w:p>
+            <w:pPr>
+              <w:pStyle w:val="Compact"/>
+              <w:jc w:val="left"/>
+            </w:pPr>
+            <w:r>
+              <w:rPr>
+                <w:rStyle w:val="VerbatimChar"/>
+              </w:rPr>
+              <w:t xml:space="preserve">/api/account/*</w:t>
+            </w:r>
+          </w:p>
+        </w:tc>
+        <w:tc>
+          <w:tcPr/>
+          <w:p>
+            <w:pPr>
+              <w:pStyle w:val="Compact"/>
+              <w:jc w:val="left"/>
+            </w:pPr>
+            <w:r>
+              <w:t xml:space="preserve">register, login/logout, reset-password, my-profile, change-password</w:t>
+            </w:r>
+          </w:p>
+        </w:tc>
+      </w:tr>
+      <w:tr>
+        <w:tc>
+          <w:tcPr/>
+          <w:p>
+            <w:pPr>
+              <w:pStyle w:val="Compact"/>
+              <w:jc w:val="left"/>
+            </w:pPr>
+            <w:r>
+              <w:t xml:space="preserve">Identity admin</w:t>
+            </w:r>
+          </w:p>
+        </w:tc>
+        <w:tc>
+          <w:tcPr/>
+          <w:p>
+            <w:pPr>
+              <w:pStyle w:val="Compact"/>
+              <w:jc w:val="left"/>
+            </w:pPr>
+            <w:r>
+              <w:rPr>
+                <w:rStyle w:val="VerbatimChar"/>
+              </w:rPr>
+              <w:t xml:space="preserve">/api/identity/users</w:t>
+            </w:r>
+            <w:r>
+              <w:t xml:space="preserve">,</w:t>
+            </w:r>
+            <w:r>
+              <w:t xml:space="preserve"> </w:t>
+            </w:r>
+            <w:r>
+              <w:rPr>
+                <w:rStyle w:val="VerbatimChar"/>
+              </w:rPr>
+              <w:t xml:space="preserve">/api/identity/roles</w:t>
+            </w:r>
+          </w:p>
+        </w:tc>
+        <w:tc>
+          <w:tcPr/>
+          <w:p>
+            <w:pPr>
+              <w:pStyle w:val="Compact"/>
+              <w:jc w:val="left"/>
+            </w:pPr>
+            <w:r>
+              <w:t xml:space="preserve">user/role CRUD (admin)</w:t>
+            </w:r>
+          </w:p>
+        </w:tc>
+      </w:tr>
+      <w:tr>
+        <w:tc>
+          <w:tcPr/>
+          <w:p>
+            <w:pPr>
+              <w:pStyle w:val="Compact"/>
+              <w:jc w:val="left"/>
+            </w:pPr>
+            <w:r>
+              <w:t xml:space="preserve">Permission management</w:t>
+            </w:r>
+          </w:p>
+        </w:tc>
+        <w:tc>
+          <w:tcPr/>
+          <w:p>
+            <w:pPr>
+              <w:pStyle w:val="Compact"/>
+              <w:jc w:val="left"/>
+            </w:pPr>
+            <w:r>
+              <w:rPr>
+                <w:rStyle w:val="VerbatimChar"/>
+              </w:rPr>
+              <w:t xml:space="preserve">/api/permission-management/permissions</w:t>
+            </w:r>
+          </w:p>
+        </w:tc>
+        <w:tc>
+          <w:tcPr/>
+          <w:p>
+            <w:pPr>
+              <w:pStyle w:val="Compact"/>
+              <w:jc w:val="left"/>
+            </w:pPr>
+            <w:r>
+              <w:t xml:space="preserve">read/update grants (admin)</w:t>
+            </w:r>
+          </w:p>
+        </w:tc>
+      </w:tr>
+      <w:tr>
+        <w:tc>
+          <w:tcPr/>
+          <w:p>
+            <w:pPr>
+              <w:pStyle w:val="Compact"/>
+              <w:jc w:val="left"/>
+            </w:pPr>
+            <w:r>
+              <w:t xml:space="preserve">App configuration</w:t>
+            </w:r>
+          </w:p>
+        </w:tc>
+        <w:tc>
+          <w:tcPr/>
+          <w:p>
+            <w:pPr>
+              <w:pStyle w:val="Compact"/>
+              <w:jc w:val="left"/>
+            </w:pPr>
+            <w:r>
+              <w:rPr>
+                <w:rStyle w:val="VerbatimChar"/>
+              </w:rPr>
+              <w:t xml:space="preserve">/api/abp/application-configuration</w:t>
+            </w:r>
+          </w:p>
+        </w:tc>
+        <w:tc>
+          <w:tcPr/>
+          <w:p>
+            <w:pPr>
+              <w:pStyle w:val="Compact"/>
+              <w:jc w:val="left"/>
+            </w:pPr>
+            <w:r>
+              <w:t xml:space="preserve">current user, permissions, localization — the client bootstrap call</w:t>
+            </w:r>
+          </w:p>
+        </w:tc>
+      </w:tr>
+      <w:tr>
+        <w:tc>
+          <w:tcPr/>
+          <w:p>
+            <w:pPr>
+              <w:pStyle w:val="Compact"/>
+              <w:jc w:val="left"/>
+            </w:pPr>
+            <w:r>
               <w:t xml:space="preserve">Settings</w:t>
             </w:r>
           </w:p>
@@ -5061,8 +5982,8 @@
         </w:tc>
       </w:tr>
     </w:tbl>
-    <w:bookmarkEnd w:id="38"/>
-    <w:bookmarkStart w:id="39" w:name="planned"/>
+    <w:bookmarkEnd w:id="39"/>
+    <w:bookmarkStart w:id="40" w:name="planned"/>
     <w:p>
       <w:pPr>
         <w:pStyle w:val="Heading1"/>
@@ -5071,13 +5992,13 @@
         <w:rPr>
           <w:rStyle w:val="SectionNumber"/>
         </w:rPr>
-        <w:t xml:space="preserve">7</w:t>
+        <w:t xml:space="preserve">8</w:t>
       </w:r>
       <w:r>
         <w:tab/>
       </w:r>
       <w:r>
-        <w:t xml:space="preserve">7. Planned</w:t>
+        <w:t xml:space="preserve">8. Planned</w:t>
       </w:r>
     </w:p>
     <w:tbl>
@@ -5164,13 +6085,25 @@
               <w:jc w:val="left"/>
             </w:pPr>
             <w:r>
-              <w:t xml:space="preserve">Reminders endpoints (</w:t>
+              <w:t xml:space="preserve">Guides + chat endpoints (</w:t>
             </w:r>
             <w:r>
               <w:rPr>
                 <w:rStyle w:val="VerbatimChar"/>
               </w:rPr>
-              <w:t xml:space="preserve">/api/reminders/*</w:t>
+              <w:t xml:space="preserve">/api/guides/*</w:t>
+            </w:r>
+            <w:r>
+              <w:t xml:space="preserve">,</w:t>
+            </w:r>
+            <w:r>
+              <w:t xml:space="preserve"> </w:t>
+            </w:r>
+            <w:r>
+              <w:rPr>
+                <w:rStyle w:val="VerbatimChar"/>
+              </w:rPr>
+              <w:t xml:space="preserve">/api/ai/*</w:t>
             </w:r>
             <w:r>
               <w:t xml:space="preserve">)</w:t>
@@ -5185,7 +6118,7 @@
               <w:jc w:val="left"/>
             </w:pPr>
             <w:r>
-              <w:t xml:space="preserve">2</w:t>
+              <w:t xml:space="preserve">3–5</w:t>
             </w:r>
           </w:p>
         </w:tc>
@@ -5199,53 +6132,6 @@
               <w:jc w:val="left"/>
             </w:pPr>
             <w:r>
-              <w:t xml:space="preserve">Guides + chat endpoints (</w:t>
-            </w:r>
-            <w:r>
-              <w:rPr>
-                <w:rStyle w:val="VerbatimChar"/>
-              </w:rPr>
-              <w:t xml:space="preserve">/api/guides/*</w:t>
-            </w:r>
-            <w:r>
-              <w:t xml:space="preserve">,</w:t>
-            </w:r>
-            <w:r>
-              <w:t xml:space="preserve"> </w:t>
-            </w:r>
-            <w:r>
-              <w:rPr>
-                <w:rStyle w:val="VerbatimChar"/>
-              </w:rPr>
-              <w:t xml:space="preserve">/api/ai/*</w:t>
-            </w:r>
-            <w:r>
-              <w:t xml:space="preserve">)</w:t>
-            </w:r>
-          </w:p>
-        </w:tc>
-        <w:tc>
-          <w:tcPr/>
-          <w:p>
-            <w:pPr>
-              <w:pStyle w:val="Compact"/>
-              <w:jc w:val="left"/>
-            </w:pPr>
-            <w:r>
-              <w:t xml:space="preserve">3–5</w:t>
-            </w:r>
-          </w:p>
-        </w:tc>
-      </w:tr>
-      <w:tr>
-        <w:tc>
-          <w:tcPr/>
-          <w:p>
-            <w:pPr>
-              <w:pStyle w:val="Compact"/>
-              <w:jc w:val="left"/>
-            </w:pPr>
-            <w:r>
               <w:t xml:space="preserve">Rate limiting on auth + AI endpoints</w:t>
             </w:r>
           </w:p>
@@ -5264,7 +6150,7 @@
         </w:tc>
       </w:tr>
     </w:tbl>
-    <w:bookmarkEnd w:id="39"/>
+    <w:bookmarkEnd w:id="40"/>
     <w:sectPr>
       <w:footnotePr>
         <w:numRestart w:val="eachSect"/>

</xml_diff>

<commit_message>
step(3.1): add attachment upload, download and delete endpoints
Learned: IRemoteStreamContent both ways, MIME allow-lists before bytes, buffer-once hashing, post-commit deletes vs rollback compensation, privacy-lean DTOs, reading generated routes

Co-Authored-By: Claude Fable 5 <noreply@anthropic.com>
Claude-Session: https://claude.ai/code/session_01XCaaD2oSfQhWv3vNENZDue
</commit_message>
<xml_diff>
--- a/docs/deliverables/out/Api.docx
+++ b/docs/deliverables/out/Api.docx
@@ -292,6 +292,56 @@
           </w:p>
         </w:tc>
       </w:tr>
+      <w:tr>
+        <w:tc>
+          <w:tcPr/>
+          <w:p>
+            <w:pPr>
+              <w:pStyle w:val="Compact"/>
+              <w:jc w:val="left"/>
+            </w:pPr>
+            <w:r>
+              <w:t xml:space="preserve">0.1.2</w:t>
+            </w:r>
+          </w:p>
+        </w:tc>
+        <w:tc>
+          <w:tcPr/>
+          <w:p>
+            <w:pPr>
+              <w:pStyle w:val="Compact"/>
+              <w:jc w:val="left"/>
+            </w:pPr>
+            <w:r>
+              <w:t xml:space="preserve">2026-08-28</w:t>
+            </w:r>
+          </w:p>
+        </w:tc>
+        <w:tc>
+          <w:tcPr/>
+          <w:p>
+            <w:pPr>
+              <w:pStyle w:val="Compact"/>
+              <w:jc w:val="left"/>
+            </w:pPr>
+            <w:r>
+              <w:t xml:space="preserve">Abdulsalam</w:t>
+            </w:r>
+          </w:p>
+        </w:tc>
+        <w:tc>
+          <w:tcPr/>
+          <w:p>
+            <w:pPr>
+              <w:pStyle w:val="Compact"/>
+              <w:jc w:val="left"/>
+            </w:pPr>
+            <w:r>
+              <w:t xml:space="preserve">§4.4 attachment upload/download/delete endpoints from the regenerated spec (roadmap step 3.1)</w:t>
+            </w:r>
+          </w:p>
+        </w:tc>
+      </w:tr>
     </w:tbl>
     <w:p>
       <w:pPr>
@@ -639,7 +689,7 @@
               <w:jc w:val="left"/>
             </w:pPr>
             <w:r>
-              <w:t xml:space="preserve">49 (11 Documents + 3 Reminders module, 35 ABP infrastructure: account, identity admin, permissions, settings)</w:t>
+              <w:t xml:space="preserve">52 (14 Documents + 3 Reminders module, 35 ABP infrastructure: account, identity admin, permissions, settings)</w:t>
             </w:r>
           </w:p>
         </w:tc>
@@ -2281,7 +2331,7 @@
     </w:p>
     <w:bookmarkEnd w:id="30"/>
     <w:bookmarkEnd w:id="31"/>
-    <w:bookmarkStart w:id="36" w:name="documents-module-endpoints"/>
+    <w:bookmarkStart w:id="37" w:name="documents-module-endpoints"/>
     <w:p>
       <w:pPr>
         <w:pStyle w:val="Heading1"/>
@@ -3667,32 +3717,8 @@
         <w:t xml:space="preserve">.</w:t>
       </w:r>
     </w:p>
-    <w:p>
-      <w:pPr>
-        <w:pStyle w:val="BodyText"/>
-      </w:pPr>
-      <w:r>
-        <w:t xml:space="preserve">Attachment upload/download is</w:t>
-      </w:r>
-      <w:r>
-        <w:t xml:space="preserve"> </w:t>
-      </w:r>
-      <w:r>
-        <w:rPr>
-          <w:iCs/>
-          <w:i/>
-        </w:rPr>
-        <w:t xml:space="preserve">Planned</w:t>
-      </w:r>
-      <w:r>
-        <w:t xml:space="preserve"> </w:t>
-      </w:r>
-      <w:r>
-        <w:t xml:space="preserve">(arrives with extraction, Phase 3).</w:t>
-      </w:r>
-    </w:p>
     <w:bookmarkEnd w:id="34"/>
-    <w:bookmarkStart w:id="35" w:name="X88bdf6ce1de7c5c01445c063d9e61e1542223a6"/>
+    <w:bookmarkStart w:id="35" w:name="attachments-fr-doc-004-api-part"/>
     <w:p>
       <w:pPr>
         <w:pStyle w:val="Heading2"/>
@@ -3707,623 +3733,7 @@
         <w:tab/>
       </w:r>
       <w:r>
-        <w:t xml:space="preserve">4.4 Live example (recorded against the running host)</w:t>
-      </w:r>
-    </w:p>
-    <w:p>
-      <w:pPr>
-        <w:pStyle w:val="SourceCode"/>
-      </w:pPr>
-      <w:r>
-        <w:rPr>
-          <w:rStyle w:val="ExtensionTok"/>
-        </w:rPr>
-        <w:t xml:space="preserve">POST</w:t>
-      </w:r>
-      <w:r>
-        <w:rPr>
-          <w:rStyle w:val="NormalTok"/>
-        </w:rPr>
-        <w:t xml:space="preserve"> /api/documents/documents            Authorization: Bearer </w:t>
-      </w:r>
-      <w:r>
-        <w:rPr>
-          <w:rStyle w:val="OperatorTok"/>
-        </w:rPr>
-        <w:t xml:space="preserve">&lt;</w:t>
-      </w:r>
-      <w:r>
-        <w:rPr>
-          <w:rStyle w:val="NormalTok"/>
-        </w:rPr>
-        <w:t xml:space="preserve">user token</w:t>
-      </w:r>
-      <w:r>
-        <w:rPr>
-          <w:rStyle w:val="OperatorTok"/>
-        </w:rPr>
-        <w:t xml:space="preserve">&gt;</w:t>
-      </w:r>
-      <w:r>
-        <w:br/>
-      </w:r>
-      <w:r>
-        <w:rPr>
-          <w:rStyle w:val="KeywordTok"/>
-        </w:rPr>
-        <w:t xml:space="preserve">{</w:t>
-      </w:r>
-      <w:r>
-        <w:rPr>
-          <w:rStyle w:val="NormalTok"/>
-        </w:rPr>
-        <w:t xml:space="preserve"> </w:t>
-      </w:r>
-      <w:r>
-        <w:rPr>
-          <w:rStyle w:val="StringTok"/>
-        </w:rPr>
-        <w:t xml:space="preserve">"holderId"</w:t>
-      </w:r>
-      <w:r>
-        <w:rPr>
-          <w:rStyle w:val="ExtensionTok"/>
-        </w:rPr>
-        <w:t xml:space="preserve">:</w:t>
-      </w:r>
-      <w:r>
-        <w:rPr>
-          <w:rStyle w:val="NormalTok"/>
-        </w:rPr>
-        <w:t xml:space="preserve"> </w:t>
-      </w:r>
-      <w:r>
-        <w:rPr>
-          <w:rStyle w:val="StringTok"/>
-        </w:rPr>
-        <w:t xml:space="preserve">"6a3d8b35-…"</w:t>
-      </w:r>
-      <w:r>
-        <w:rPr>
-          <w:rStyle w:val="NormalTok"/>
-        </w:rPr>
-        <w:t xml:space="preserve">, </w:t>
-      </w:r>
-      <w:r>
-        <w:rPr>
-          <w:rStyle w:val="StringTok"/>
-        </w:rPr>
-        <w:t xml:space="preserve">"documentTypeId"</w:t>
-      </w:r>
-      <w:r>
-        <w:rPr>
-          <w:rStyle w:val="NormalTok"/>
-        </w:rPr>
-        <w:t xml:space="preserve">: </w:t>
-      </w:r>
-      <w:r>
-        <w:rPr>
-          <w:rStyle w:val="StringTok"/>
-        </w:rPr>
-        <w:t xml:space="preserve">"6ff4d4bc-…"</w:t>
-      </w:r>
-      <w:r>
-        <w:rPr>
-          <w:rStyle w:val="NormalTok"/>
-        </w:rPr>
-        <w:t xml:space="preserve">,</w:t>
-      </w:r>
-      <w:r>
-        <w:br/>
-      </w:r>
-      <w:r>
-        <w:rPr>
-          <w:rStyle w:val="NormalTok"/>
-        </w:rPr>
-        <w:t xml:space="preserve">  </w:t>
-      </w:r>
-      <w:r>
-        <w:rPr>
-          <w:rStyle w:val="StringTok"/>
-        </w:rPr>
-        <w:t xml:space="preserve">"number"</w:t>
-      </w:r>
-      <w:r>
-        <w:rPr>
-          <w:rStyle w:val="ExtensionTok"/>
-        </w:rPr>
-        <w:t xml:space="preserve">:</w:t>
-      </w:r>
-      <w:r>
-        <w:rPr>
-          <w:rStyle w:val="NormalTok"/>
-        </w:rPr>
-        <w:t xml:space="preserve"> </w:t>
-      </w:r>
-      <w:r>
-        <w:rPr>
-          <w:rStyle w:val="StringTok"/>
-        </w:rPr>
-        <w:t xml:space="preserve">"P1234567"</w:t>
-      </w:r>
-      <w:r>
-        <w:rPr>
-          <w:rStyle w:val="NormalTok"/>
-        </w:rPr>
-        <w:t xml:space="preserve">, </w:t>
-      </w:r>
-      <w:r>
-        <w:rPr>
-          <w:rStyle w:val="StringTok"/>
-        </w:rPr>
-        <w:t xml:space="preserve">"issueDate"</w:t>
-      </w:r>
-      <w:r>
-        <w:rPr>
-          <w:rStyle w:val="NormalTok"/>
-        </w:rPr>
-        <w:t xml:space="preserve">: </w:t>
-      </w:r>
-      <w:r>
-        <w:rPr>
-          <w:rStyle w:val="StringTok"/>
-        </w:rPr>
-        <w:t xml:space="preserve">"2020-09-01"</w:t>
-      </w:r>
-      <w:r>
-        <w:rPr>
-          <w:rStyle w:val="NormalTok"/>
-        </w:rPr>
-        <w:t xml:space="preserve">, </w:t>
-      </w:r>
-      <w:r>
-        <w:rPr>
-          <w:rStyle w:val="StringTok"/>
-        </w:rPr>
-        <w:t xml:space="preserve">"expiryDate"</w:t>
-      </w:r>
-      <w:r>
-        <w:rPr>
-          <w:rStyle w:val="NormalTok"/>
-        </w:rPr>
-        <w:t xml:space="preserve">: </w:t>
-      </w:r>
-      <w:r>
-        <w:rPr>
-          <w:rStyle w:val="StringTok"/>
-        </w:rPr>
-        <w:t xml:space="preserve">"2030-09-01"</w:t>
-      </w:r>
-      <w:r>
-        <w:rPr>
-          <w:rStyle w:val="NormalTok"/>
-        </w:rPr>
-        <w:t xml:space="preserve">,</w:t>
-      </w:r>
-      <w:r>
-        <w:br/>
-      </w:r>
-      <w:r>
-        <w:rPr>
-          <w:rStyle w:val="NormalTok"/>
-        </w:rPr>
-        <w:t xml:space="preserve">  </w:t>
-      </w:r>
-      <w:r>
-        <w:rPr>
-          <w:rStyle w:val="StringTok"/>
-        </w:rPr>
-        <w:t xml:space="preserve">"notes"</w:t>
-      </w:r>
-      <w:r>
-        <w:rPr>
-          <w:rStyle w:val="ExtensionTok"/>
-        </w:rPr>
-        <w:t xml:space="preserve">:</w:t>
-      </w:r>
-      <w:r>
-        <w:rPr>
-          <w:rStyle w:val="NormalTok"/>
-        </w:rPr>
-        <w:t xml:space="preserve"> </w:t>
-      </w:r>
-      <w:r>
-        <w:rPr>
-          <w:rStyle w:val="StringTok"/>
-        </w:rPr>
-        <w:t xml:space="preserve">"جواز سفر سالم"</w:t>
-      </w:r>
-      <w:r>
-        <w:rPr>
-          <w:rStyle w:val="NormalTok"/>
-        </w:rPr>
-        <w:t xml:space="preserve"> }</w:t>
-      </w:r>
-      <w:r>
-        <w:br/>
-      </w:r>
-      <w:r>
-        <w:br/>
-      </w:r>
-      <w:r>
-        <w:rPr>
-          <w:rStyle w:val="ExtensionTok"/>
-        </w:rPr>
-        <w:t xml:space="preserve">200</w:t>
-      </w:r>
-      <w:r>
-        <w:rPr>
-          <w:rStyle w:val="NormalTok"/>
-        </w:rPr>
-        <w:t xml:space="preserve"> OK</w:t>
-      </w:r>
-      <w:r>
-        <w:br/>
-      </w:r>
-      <w:r>
-        <w:rPr>
-          <w:rStyle w:val="KeywordTok"/>
-        </w:rPr>
-        <w:t xml:space="preserve">{</w:t>
-      </w:r>
-      <w:r>
-        <w:rPr>
-          <w:rStyle w:val="NormalTok"/>
-        </w:rPr>
-        <w:t xml:space="preserve"> </w:t>
-      </w:r>
-      <w:r>
-        <w:rPr>
-          <w:rStyle w:val="StringTok"/>
-        </w:rPr>
-        <w:t xml:space="preserve">"id"</w:t>
-      </w:r>
-      <w:r>
-        <w:rPr>
-          <w:rStyle w:val="ExtensionTok"/>
-        </w:rPr>
-        <w:t xml:space="preserve">:</w:t>
-      </w:r>
-      <w:r>
-        <w:rPr>
-          <w:rStyle w:val="NormalTok"/>
-        </w:rPr>
-        <w:t xml:space="preserve"> </w:t>
-      </w:r>
-      <w:r>
-        <w:rPr>
-          <w:rStyle w:val="StringTok"/>
-        </w:rPr>
-        <w:t xml:space="preserve">"5560255a-…"</w:t>
-      </w:r>
-      <w:r>
-        <w:rPr>
-          <w:rStyle w:val="NormalTok"/>
-        </w:rPr>
-        <w:t xml:space="preserve">, </w:t>
-      </w:r>
-      <w:r>
-        <w:rPr>
-          <w:rStyle w:val="StringTok"/>
-        </w:rPr>
-        <w:t xml:space="preserve">"holderId"</w:t>
-      </w:r>
-      <w:r>
-        <w:rPr>
-          <w:rStyle w:val="NormalTok"/>
-        </w:rPr>
-        <w:t xml:space="preserve">: </w:t>
-      </w:r>
-      <w:r>
-        <w:rPr>
-          <w:rStyle w:val="StringTok"/>
-        </w:rPr>
-        <w:t xml:space="preserve">"6a3d8b35-…"</w:t>
-      </w:r>
-      <w:r>
-        <w:rPr>
-          <w:rStyle w:val="NormalTok"/>
-        </w:rPr>
-        <w:t xml:space="preserve">, </w:t>
-      </w:r>
-      <w:r>
-        <w:rPr>
-          <w:rStyle w:val="StringTok"/>
-        </w:rPr>
-        <w:t xml:space="preserve">"documentTypeId"</w:t>
-      </w:r>
-      <w:r>
-        <w:rPr>
-          <w:rStyle w:val="NormalTok"/>
-        </w:rPr>
-        <w:t xml:space="preserve">: </w:t>
-      </w:r>
-      <w:r>
-        <w:rPr>
-          <w:rStyle w:val="StringTok"/>
-        </w:rPr>
-        <w:t xml:space="preserve">"6ff4d4bc-…"</w:t>
-      </w:r>
-      <w:r>
-        <w:rPr>
-          <w:rStyle w:val="NormalTok"/>
-        </w:rPr>
-        <w:t xml:space="preserve">,</w:t>
-      </w:r>
-      <w:r>
-        <w:br/>
-      </w:r>
-      <w:r>
-        <w:rPr>
-          <w:rStyle w:val="NormalTok"/>
-        </w:rPr>
-        <w:t xml:space="preserve">  </w:t>
-      </w:r>
-      <w:r>
-        <w:rPr>
-          <w:rStyle w:val="StringTok"/>
-        </w:rPr>
-        <w:t xml:space="preserve">"number"</w:t>
-      </w:r>
-      <w:r>
-        <w:rPr>
-          <w:rStyle w:val="ExtensionTok"/>
-        </w:rPr>
-        <w:t xml:space="preserve">:</w:t>
-      </w:r>
-      <w:r>
-        <w:rPr>
-          <w:rStyle w:val="NormalTok"/>
-        </w:rPr>
-        <w:t xml:space="preserve"> </w:t>
-      </w:r>
-      <w:r>
-        <w:rPr>
-          <w:rStyle w:val="StringTok"/>
-        </w:rPr>
-        <w:t xml:space="preserve">"P1234567"</w:t>
-      </w:r>
-      <w:r>
-        <w:rPr>
-          <w:rStyle w:val="NormalTok"/>
-        </w:rPr>
-        <w:t xml:space="preserve">, </w:t>
-      </w:r>
-      <w:r>
-        <w:rPr>
-          <w:rStyle w:val="StringTok"/>
-        </w:rPr>
-        <w:t xml:space="preserve">"issueDate"</w:t>
-      </w:r>
-      <w:r>
-        <w:rPr>
-          <w:rStyle w:val="NormalTok"/>
-        </w:rPr>
-        <w:t xml:space="preserve">: </w:t>
-      </w:r>
-      <w:r>
-        <w:rPr>
-          <w:rStyle w:val="StringTok"/>
-        </w:rPr>
-        <w:t xml:space="preserve">"2020-09-01"</w:t>
-      </w:r>
-      <w:r>
-        <w:rPr>
-          <w:rStyle w:val="NormalTok"/>
-        </w:rPr>
-        <w:t xml:space="preserve">, </w:t>
-      </w:r>
-      <w:r>
-        <w:rPr>
-          <w:rStyle w:val="StringTok"/>
-        </w:rPr>
-        <w:t xml:space="preserve">"expiryDate"</w:t>
-      </w:r>
-      <w:r>
-        <w:rPr>
-          <w:rStyle w:val="NormalTok"/>
-        </w:rPr>
-        <w:t xml:space="preserve">: </w:t>
-      </w:r>
-      <w:r>
-        <w:rPr>
-          <w:rStyle w:val="StringTok"/>
-        </w:rPr>
-        <w:t xml:space="preserve">"2030-09-01"</w:t>
-      </w:r>
-      <w:r>
-        <w:rPr>
-          <w:rStyle w:val="NormalTok"/>
-        </w:rPr>
-        <w:t xml:space="preserve">,</w:t>
-      </w:r>
-      <w:r>
-        <w:br/>
-      </w:r>
-      <w:r>
-        <w:rPr>
-          <w:rStyle w:val="NormalTok"/>
-        </w:rPr>
-        <w:t xml:space="preserve">  </w:t>
-      </w:r>
-      <w:r>
-        <w:rPr>
-          <w:rStyle w:val="StringTok"/>
-        </w:rPr>
-        <w:t xml:space="preserve">"status"</w:t>
-      </w:r>
-      <w:r>
-        <w:rPr>
-          <w:rStyle w:val="ExtensionTok"/>
-        </w:rPr>
-        <w:t xml:space="preserve">:</w:t>
-      </w:r>
-      <w:r>
-        <w:rPr>
-          <w:rStyle w:val="NormalTok"/>
-        </w:rPr>
-        <w:t xml:space="preserve"> 0, </w:t>
-      </w:r>
-      <w:r>
-        <w:rPr>
-          <w:rStyle w:val="StringTok"/>
-        </w:rPr>
-        <w:t xml:space="preserve">"notes"</w:t>
-      </w:r>
-      <w:r>
-        <w:rPr>
-          <w:rStyle w:val="NormalTok"/>
-        </w:rPr>
-        <w:t xml:space="preserve">: </w:t>
-      </w:r>
-      <w:r>
-        <w:rPr>
-          <w:rStyle w:val="StringTok"/>
-        </w:rPr>
-        <w:t xml:space="preserve">"جواز سفر سالم"</w:t>
-      </w:r>
-      <w:r>
-        <w:rPr>
-          <w:rStyle w:val="NormalTok"/>
-        </w:rPr>
-        <w:t xml:space="preserve">, </w:t>
-      </w:r>
-      <w:r>
-        <w:rPr>
-          <w:rStyle w:val="StringTok"/>
-        </w:rPr>
-        <w:t xml:space="preserve">"previousExpiryDate"</w:t>
-      </w:r>
-      <w:r>
-        <w:rPr>
-          <w:rStyle w:val="NormalTok"/>
-        </w:rPr>
-        <w:t xml:space="preserve">: null,</w:t>
-      </w:r>
-      <w:r>
-        <w:br/>
-      </w:r>
-      <w:r>
-        <w:rPr>
-          <w:rStyle w:val="NormalTok"/>
-        </w:rPr>
-        <w:t xml:space="preserve">  </w:t>
-      </w:r>
-      <w:r>
-        <w:rPr>
-          <w:rStyle w:val="StringTok"/>
-        </w:rPr>
-        <w:t xml:space="preserve">"daysUntilExpiry"</w:t>
-      </w:r>
-      <w:r>
-        <w:rPr>
-          <w:rStyle w:val="ExtensionTok"/>
-        </w:rPr>
-        <w:t xml:space="preserve">:</w:t>
-      </w:r>
-      <w:r>
-        <w:rPr>
-          <w:rStyle w:val="NormalTok"/>
-        </w:rPr>
-        <w:t xml:space="preserve"> 1466, </w:t>
-      </w:r>
-      <w:r>
-        <w:rPr>
-          <w:rStyle w:val="StringTok"/>
-        </w:rPr>
-        <w:t xml:space="preserve">"creationTime"</w:t>
-      </w:r>
-      <w:r>
-        <w:rPr>
-          <w:rStyle w:val="NormalTok"/>
-        </w:rPr>
-        <w:t xml:space="preserve">: </w:t>
-      </w:r>
-      <w:r>
-        <w:rPr>
-          <w:rStyle w:val="StringTok"/>
-        </w:rPr>
-        <w:t xml:space="preserve">"2026-08-27T14:18:16.58+00:00"</w:t>
-      </w:r>
-      <w:r>
-        <w:rPr>
-          <w:rStyle w:val="NormalTok"/>
-        </w:rPr>
-        <w:t xml:space="preserve"> }</w:t>
-      </w:r>
-    </w:p>
-    <w:bookmarkEnd w:id="35"/>
-    <w:bookmarkEnd w:id="36"/>
-    <w:bookmarkStart w:id="37" w:name="reminders-module-endpoints"/>
-    <w:p>
-      <w:pPr>
-        <w:pStyle w:val="Heading1"/>
-      </w:pPr>
-      <w:r>
-        <w:rPr>
-          <w:rStyle w:val="SectionNumber"/>
-        </w:rPr>
-        <w:t xml:space="preserve">5</w:t>
-      </w:r>
-      <w:r>
-        <w:tab/>
-      </w:r>
-      <w:r>
-        <w:t xml:space="preserve">5. Reminders module endpoints</w:t>
-      </w:r>
-    </w:p>
-    <w:p>
-      <w:pPr>
-        <w:pStyle w:val="FirstParagraph"/>
-      </w:pPr>
-      <w:r>
-        <w:t xml:space="preserve">Route root</w:t>
-      </w:r>
-      <w:r>
-        <w:t xml:space="preserve"> </w:t>
-      </w:r>
-      <w:r>
-        <w:rPr>
-          <w:rStyle w:val="VerbatimChar"/>
-        </w:rPr>
-        <w:t xml:space="preserve">/api/reminders/*</w:t>
-      </w:r>
-      <w:r>
-        <w:t xml:space="preserve">. The rule is a</w:t>
-      </w:r>
-      <w:r>
-        <w:t xml:space="preserve"> </w:t>
-      </w:r>
-      <w:r>
-        <w:rPr>
-          <w:bCs/>
-          <w:b/>
-        </w:rPr>
-        <w:t xml:space="preserve">singleton resource</w:t>
-      </w:r>
-      <w:r>
-        <w:t xml:space="preserve"> </w:t>
-      </w:r>
-      <w:r>
-        <w:t xml:space="preserve">— one per user, so its</w:t>
-      </w:r>
-      <w:r>
-        <w:t xml:space="preserve"> </w:t>
-      </w:r>
-      <w:r>
-        <w:t xml:space="preserve">routes carry no</w:t>
-      </w:r>
-      <w:r>
-        <w:t xml:space="preserve"> </w:t>
-      </w:r>
-      <w:r>
-        <w:rPr>
-          <w:rStyle w:val="VerbatimChar"/>
-        </w:rPr>
-        <w:t xml:space="preserve">{id}</w:t>
-      </w:r>
-      <w:r>
-        <w:t xml:space="preserve">; the caller’s identity selects the row (created with defaults on first GET).</w:t>
+        <w:t xml:space="preserve">4.4 Attachments (FR-DOC-004, API part)</w:t>
       </w:r>
     </w:p>
     <w:tbl>
@@ -4391,43 +3801,34 @@
               <w:rPr>
                 <w:rStyle w:val="VerbatimChar"/>
               </w:rPr>
-              <w:t xml:space="preserve">GET /api/reminders/rule</w:t>
-            </w:r>
-          </w:p>
-        </w:tc>
-        <w:tc>
-          <w:tcPr/>
-          <w:p>
-            <w:pPr>
-              <w:pStyle w:val="Compact"/>
-              <w:jc w:val="left"/>
-            </w:pPr>
-            <w:r>
-              <w:rPr>
-                <w:rStyle w:val="VerbatimChar"/>
-              </w:rPr>
-              <w:t xml:space="preserve">WathiqReminders.Rule</w:t>
-            </w:r>
-          </w:p>
-        </w:tc>
-        <w:tc>
-          <w:tcPr/>
-          <w:p>
-            <w:pPr>
-              <w:pStyle w:val="Compact"/>
-              <w:jc w:val="left"/>
-            </w:pPr>
-            <w:r>
-              <w:t xml:space="preserve">The caller’s reminder settings; materialises the default (</w:t>
-            </w:r>
-            <w:r>
-              <w:rPr>
-                <w:rStyle w:val="VerbatimChar"/>
-              </w:rPr>
-              <w:t xml:space="preserve">90,30,7,1</w:t>
-            </w:r>
-            <w:r>
-              <w:t xml:space="preserve">, Email,</w:t>
+              <w:t xml:space="preserve">POST /api/documents/documents/{id}/upload-attachment</w:t>
+            </w:r>
+          </w:p>
+        </w:tc>
+        <w:tc>
+          <w:tcPr/>
+          <w:p>
+            <w:pPr>
+              <w:pStyle w:val="Compact"/>
+              <w:jc w:val="left"/>
+            </w:pPr>
+            <w:r>
+              <w:rPr>
+                <w:rStyle w:val="VerbatimChar"/>
+              </w:rPr>
+              <w:t xml:space="preserve">…Documents.Update</w:t>
+            </w:r>
+          </w:p>
+        </w:tc>
+        <w:tc>
+          <w:tcPr/>
+          <w:p>
+            <w:pPr>
+              <w:pStyle w:val="Compact"/>
+              <w:jc w:val="left"/>
+            </w:pPr>
+            <w:r>
+              <w:t xml:space="preserve">Multipart form field</w:t>
             </w:r>
             <w:r>
               <w:t xml:space="preserve"> </w:t>
@@ -4436,10 +3837,73 @@
               <w:rPr>
                 <w:rStyle w:val="VerbatimChar"/>
               </w:rPr>
-              <w:t xml:space="preserve">Asia/Riyadh</w:t>
-            </w:r>
-            <w:r>
-              <w:t xml:space="preserve">) on first call</w:t>
+              <w:t xml:space="preserve">file</w:t>
+            </w:r>
+            <w:r>
+              <w:t xml:space="preserve">. Allow-list:</w:t>
+            </w:r>
+            <w:r>
+              <w:t xml:space="preserve"> </w:t>
+            </w:r>
+            <w:r>
+              <w:rPr>
+                <w:rStyle w:val="VerbatimChar"/>
+              </w:rPr>
+              <w:t xml:space="preserve">image/jpeg</w:t>
+            </w:r>
+            <w:r>
+              <w:t xml:space="preserve">,</w:t>
+            </w:r>
+            <w:r>
+              <w:t xml:space="preserve"> </w:t>
+            </w:r>
+            <w:r>
+              <w:rPr>
+                <w:rStyle w:val="VerbatimChar"/>
+              </w:rPr>
+              <w:t xml:space="preserve">image/png</w:t>
+            </w:r>
+            <w:r>
+              <w:t xml:space="preserve">,</w:t>
+            </w:r>
+            <w:r>
+              <w:t xml:space="preserve"> </w:t>
+            </w:r>
+            <w:r>
+              <w:rPr>
+                <w:rStyle w:val="VerbatimChar"/>
+              </w:rPr>
+              <w:t xml:space="preserve">application/pdf</w:t>
+            </w:r>
+            <w:r>
+              <w:t xml:space="preserve"> </w:t>
+            </w:r>
+            <w:r>
+              <w:t xml:space="preserve">(else 403</w:t>
+            </w:r>
+            <w:r>
+              <w:t xml:space="preserve"> </w:t>
+            </w:r>
+            <w:r>
+              <w:rPr>
+                <w:rStyle w:val="VerbatimChar"/>
+              </w:rPr>
+              <w:t xml:space="preserve">UnsupportedFileType</w:t>
+            </w:r>
+            <w:r>
+              <w:t xml:space="preserve">); max 20 MB (else 403</w:t>
+            </w:r>
+            <w:r>
+              <w:t xml:space="preserve"> </w:t>
+            </w:r>
+            <w:r>
+              <w:rPr>
+                <w:rStyle w:val="VerbatimChar"/>
+              </w:rPr>
+              <w:t xml:space="preserve">Wathiq.Shared:FileTooLarge</w:t>
+            </w:r>
+            <w:r>
+              <w:t xml:space="preserve">); sha256 computed server-side</w:t>
             </w:r>
           </w:p>
         </w:tc>
@@ -4456,62 +3920,34 @@
               <w:rPr>
                 <w:rStyle w:val="VerbatimChar"/>
               </w:rPr>
-              <w:t xml:space="preserve">PUT /api/reminders/rule</w:t>
-            </w:r>
-          </w:p>
-        </w:tc>
-        <w:tc>
-          <w:tcPr/>
-          <w:p>
-            <w:pPr>
-              <w:pStyle w:val="Compact"/>
-              <w:jc w:val="left"/>
-            </w:pPr>
-            <w:r>
-              <w:rPr>
-                <w:rStyle w:val="VerbatimChar"/>
-              </w:rPr>
-              <w:t xml:space="preserve">…Rule.Update</w:t>
-            </w:r>
-          </w:p>
-        </w:tc>
-        <w:tc>
-          <w:tcPr/>
-          <w:p>
-            <w:pPr>
-              <w:pStyle w:val="Compact"/>
-              <w:jc w:val="left"/>
-            </w:pPr>
-            <w:r>
-              <w:t xml:space="preserve">Update settings;</w:t>
-            </w:r>
-            <w:r>
-              <w:t xml:space="preserve"> </w:t>
-            </w:r>
-            <w:r>
-              <w:rPr>
-                <w:bCs/>
-                <w:b/>
-              </w:rPr>
-              <w:t xml:space="preserve">resyncs existing reminders in the same transaction</w:t>
-            </w:r>
-            <w:r>
-              <w:t xml:space="preserve">, so</w:t>
-            </w:r>
-            <w:r>
-              <w:t xml:space="preserve"> </w:t>
-            </w:r>
-            <w:r>
-              <w:rPr>
-                <w:rStyle w:val="VerbatimChar"/>
-              </w:rPr>
-              <w:t xml:space="preserve">upcoming-list</w:t>
-            </w:r>
-            <w:r>
-              <w:t xml:space="preserve"> </w:t>
-            </w:r>
-            <w:r>
-              <w:t xml:space="preserve">immediately matches</w:t>
+              <w:t xml:space="preserve">GET /api/documents/documents/{id}/attachment-content/{attachmentId}</w:t>
+            </w:r>
+          </w:p>
+        </w:tc>
+        <w:tc>
+          <w:tcPr/>
+          <w:p>
+            <w:pPr>
+              <w:pStyle w:val="Compact"/>
+              <w:jc w:val="left"/>
+            </w:pPr>
+            <w:r>
+              <w:rPr>
+                <w:rStyle w:val="VerbatimChar"/>
+              </w:rPr>
+              <w:t xml:space="preserve">…Documents</w:t>
+            </w:r>
+          </w:p>
+        </w:tc>
+        <w:tc>
+          <w:tcPr/>
+          <w:p>
+            <w:pPr>
+              <w:pStyle w:val="Compact"/>
+              <w:jc w:val="left"/>
+            </w:pPr>
+            <w:r>
+              <w:t xml:space="preserve">Streams the file back with its stored content type</w:t>
             </w:r>
           </w:p>
         </w:tc>
@@ -4528,67 +3964,34 @@
               <w:rPr>
                 <w:rStyle w:val="VerbatimChar"/>
               </w:rPr>
-              <w:t xml:space="preserve">GET /api/reminders/reminders/upcoming-list</w:t>
-            </w:r>
-          </w:p>
-        </w:tc>
-        <w:tc>
-          <w:tcPr/>
-          <w:p>
-            <w:pPr>
-              <w:pStyle w:val="Compact"/>
-              <w:jc w:val="left"/>
-            </w:pPr>
-            <w:r>
-              <w:rPr>
-                <w:rStyle w:val="VerbatimChar"/>
-              </w:rPr>
-              <w:t xml:space="preserve">…Reminders</w:t>
-            </w:r>
-          </w:p>
-        </w:tc>
-        <w:tc>
-          <w:tcPr/>
-          <w:p>
-            <w:pPr>
-              <w:pStyle w:val="Compact"/>
-              <w:jc w:val="left"/>
-            </w:pPr>
-            <w:r>
-              <w:t xml:space="preserve">Pending reminders, soonest</w:t>
-            </w:r>
-            <w:r>
-              <w:t xml:space="preserve"> </w:t>
-            </w:r>
-            <w:r>
-              <w:rPr>
-                <w:rStyle w:val="VerbatimChar"/>
-              </w:rPr>
-              <w:t xml:space="preserve">dueDate</w:t>
-            </w:r>
-            <w:r>
-              <w:t xml:space="preserve"> </w:t>
-            </w:r>
-            <w:r>
-              <w:t xml:space="preserve">first; paged (</w:t>
-            </w:r>
-            <w:r>
-              <w:rPr>
-                <w:rStyle w:val="VerbatimChar"/>
-              </w:rPr>
-              <w:t xml:space="preserve">SkipCount</w:t>
-            </w:r>
-            <w:r>
-              <w:t xml:space="preserve">/</w:t>
-            </w:r>
-            <w:r>
-              <w:rPr>
-                <w:rStyle w:val="VerbatimChar"/>
-              </w:rPr>
-              <w:t xml:space="preserve">MaxResultCount</w:t>
-            </w:r>
-            <w:r>
-              <w:t xml:space="preserve">)</w:t>
+              <w:t xml:space="preserve">DELETE /api/documents/documents/{id}/attachment/{attachmentId}</w:t>
+            </w:r>
+          </w:p>
+        </w:tc>
+        <w:tc>
+          <w:tcPr/>
+          <w:p>
+            <w:pPr>
+              <w:pStyle w:val="Compact"/>
+              <w:jc w:val="left"/>
+            </w:pPr>
+            <w:r>
+              <w:rPr>
+                <w:rStyle w:val="VerbatimChar"/>
+              </w:rPr>
+              <w:t xml:space="preserve">…Documents.Update</w:t>
+            </w:r>
+          </w:p>
+        </w:tc>
+        <w:tc>
+          <w:tcPr/>
+          <w:p>
+            <w:pPr>
+              <w:pStyle w:val="Compact"/>
+              <w:jc w:val="left"/>
+            </w:pPr>
+            <w:r>
+              <w:t xml:space="preserve">Removes the row; the blob is deleted only after the transaction commits</w:t>
             </w:r>
           </w:p>
         </w:tc>
@@ -4602,121 +4005,110 @@
         <w:rPr>
           <w:rStyle w:val="VerbatimChar"/>
         </w:rPr>
-        <w:t xml:space="preserve">ReminderRuleDto</w:t>
-      </w:r>
-      <w:r>
-        <w:t xml:space="preserve"> </w:t>
-      </w:r>
-      <w:r>
-        <w:t xml:space="preserve">/</w:t>
-      </w:r>
-      <w:r>
-        <w:t xml:space="preserve"> </w:t>
-      </w:r>
-      <w:r>
-        <w:rPr>
-          <w:rStyle w:val="VerbatimChar"/>
-        </w:rPr>
-        <w:t xml:space="preserve">UpdateReminderRuleDto</w:t>
-      </w:r>
-      <w:r>
-        <w:t xml:space="preserve">:</w:t>
-      </w:r>
-      <w:r>
-        <w:t xml:space="preserve"> </w:t>
-      </w:r>
-      <w:r>
-        <w:rPr>
-          <w:rStyle w:val="VerbatimChar"/>
-        </w:rPr>
-        <w:t xml:space="preserve">offsetsDays</w:t>
-      </w:r>
-      <w:r>
-        <w:t xml:space="preserve"> </w:t>
-      </w:r>
-      <w:r>
-        <w:t xml:space="preserve">int[] (1–3650, ≤8 entries — the</w:t>
-      </w:r>
-      <w:r>
-        <w:t xml:space="preserve"> </w:t>
-      </w:r>
-      <w:r>
-        <w:t xml:space="preserve">server normalizes to descending distinct),</w:t>
-      </w:r>
-      <w:r>
-        <w:t xml:space="preserve"> </w:t>
-      </w:r>
-      <w:r>
-        <w:rPr>
-          <w:rStyle w:val="VerbatimChar"/>
-        </w:rPr>
-        <w:t xml:space="preserve">channels</w:t>
-      </w:r>
-      <w:r>
-        <w:t xml:space="preserve"> </w:t>
-      </w:r>
-      <w:r>
-        <w:t xml:space="preserve">(flags: 1 Email · 2 Push; 0 pauses),</w:t>
-      </w:r>
-      <w:r>
-        <w:t xml:space="preserve"> </w:t>
-      </w:r>
-      <w:r>
-        <w:rPr>
-          <w:rStyle w:val="VerbatimChar"/>
-        </w:rPr>
-        <w:t xml:space="preserve">quietFrom</w:t>
-      </w:r>
-      <w:r>
-        <w:t xml:space="preserve">/</w:t>
-      </w:r>
-      <w:r>
-        <w:rPr>
-          <w:rStyle w:val="VerbatimChar"/>
-        </w:rPr>
-        <w:t xml:space="preserve">quietTo</w:t>
-      </w:r>
-      <w:r>
-        <w:t xml:space="preserve"> </w:t>
-      </w:r>
-      <w:r>
-        <w:t xml:space="preserve">(</w:t>
-      </w:r>
-      <w:r>
-        <w:rPr>
-          <w:rStyle w:val="VerbatimChar"/>
-        </w:rPr>
-        <w:t xml:space="preserve">"22:00:00"</w:t>
-      </w:r>
-      <w:r>
-        <w:t xml:space="preserve">, both-or-neither; over-midnight windows allowed),</w:t>
-      </w:r>
-      <w:r>
-        <w:t xml:space="preserve"> </w:t>
-      </w:r>
-      <w:r>
-        <w:rPr>
-          <w:rStyle w:val="VerbatimChar"/>
-        </w:rPr>
-        <w:t xml:space="preserve">timeZoneId</w:t>
-      </w:r>
-      <w:r>
-        <w:t xml:space="preserve"> </w:t>
-      </w:r>
-      <w:r>
-        <w:t xml:space="preserve">(IANA, validated — unknown zones are rejected with</w:t>
-      </w:r>
-      <w:r>
-        <w:t xml:space="preserve"> </w:t>
-      </w:r>
-      <w:r>
-        <w:rPr>
-          <w:rStyle w:val="VerbatimChar"/>
-        </w:rPr>
-        <w:t xml:space="preserve">Wathiq.Reminders:UnknownTimeZone</w:t>
-      </w:r>
-      <w:r>
-        <w:t xml:space="preserve">).</w:t>
+        <w:t xml:space="preserve">AttachmentDto</w:t>
+      </w:r>
+      <w:r>
+        <w:t xml:space="preserve"> </w:t>
+      </w:r>
+      <w:r>
+        <w:t xml:space="preserve">(response, also embedded as</w:t>
+      </w:r>
+      <w:r>
+        <w:t xml:space="preserve"> </w:t>
+      </w:r>
+      <w:r>
+        <w:rPr>
+          <w:rStyle w:val="VerbatimChar"/>
+        </w:rPr>
+        <w:t xml:space="preserve">attachments[]</w:t>
+      </w:r>
+      <w:r>
+        <w:t xml:space="preserve"> </w:t>
+      </w:r>
+      <w:r>
+        <w:t xml:space="preserve">in</w:t>
+      </w:r>
+      <w:r>
+        <w:t xml:space="preserve"> </w:t>
+      </w:r>
+      <w:r>
+        <w:rPr>
+          <w:rStyle w:val="VerbatimChar"/>
+        </w:rPr>
+        <w:t xml:space="preserve">DocumentDto</w:t>
+      </w:r>
+      <w:r>
+        <w:t xml:space="preserve">):</w:t>
+      </w:r>
+      <w:r>
+        <w:t xml:space="preserve"> </w:t>
+      </w:r>
+      <w:r>
+        <w:rPr>
+          <w:rStyle w:val="VerbatimChar"/>
+        </w:rPr>
+        <w:t xml:space="preserve">id</w:t>
+      </w:r>
+      <w:r>
+        <w:t xml:space="preserve">,</w:t>
+      </w:r>
+      <w:r>
+        <w:t xml:space="preserve"> </w:t>
+      </w:r>
+      <w:r>
+        <w:rPr>
+          <w:rStyle w:val="VerbatimChar"/>
+        </w:rPr>
+        <w:t xml:space="preserve">mimeType</w:t>
+      </w:r>
+      <w:r>
+        <w:t xml:space="preserve">,</w:t>
+      </w:r>
+      <w:r>
+        <w:t xml:space="preserve"> </w:t>
+      </w:r>
+      <w:r>
+        <w:rPr>
+          <w:rStyle w:val="VerbatimChar"/>
+        </w:rPr>
+        <w:t xml:space="preserve">sizeBytes</w:t>
+      </w:r>
+      <w:r>
+        <w:t xml:space="preserve">,</w:t>
+      </w:r>
+      <w:r>
+        <w:t xml:space="preserve"> </w:t>
+      </w:r>
+      <w:r>
+        <w:rPr>
+          <w:rStyle w:val="VerbatimChar"/>
+        </w:rPr>
+        <w:t xml:space="preserve">creationTime</w:t>
+      </w:r>
+      <w:r>
+        <w:t xml:space="preserve">. File names are not stored; blob keys never leave the server.</w:t>
+      </w:r>
+      <w:r>
+        <w:t xml:space="preserve"> </w:t>
+      </w:r>
+      <w:r>
+        <w:t xml:space="preserve">Encryption at rest is</w:t>
+      </w:r>
+      <w:r>
+        <w:t xml:space="preserve"> </w:t>
+      </w:r>
+      <w:r>
+        <w:rPr>
+          <w:iCs/>
+          <w:i/>
+        </w:rPr>
+        <w:t xml:space="preserve">Planned</w:t>
+      </w:r>
+      <w:r>
+        <w:t xml:space="preserve"> </w:t>
+      </w:r>
+      <w:r>
+        <w:t xml:space="preserve">(Phase 8); OCR text fills server-side in Phase 3.</w:t>
       </w:r>
     </w:p>
     <w:p>
@@ -4724,237 +4116,579 @@
         <w:pStyle w:val="BodyText"/>
       </w:pPr>
       <w:r>
-        <w:rPr>
-          <w:rStyle w:val="VerbatimChar"/>
-        </w:rPr>
-        <w:t xml:space="preserve">ReminderDto</w:t>
-      </w:r>
-      <w:r>
-        <w:t xml:space="preserve"> </w:t>
-      </w:r>
-      <w:r>
-        <w:t xml:space="preserve">(response):</w:t>
-      </w:r>
-      <w:r>
-        <w:t xml:space="preserve"> </w:t>
-      </w:r>
-      <w:r>
-        <w:rPr>
-          <w:rStyle w:val="VerbatimChar"/>
-        </w:rPr>
-        <w:t xml:space="preserve">id</w:t>
-      </w:r>
-      <w:r>
-        <w:t xml:space="preserve">,</w:t>
-      </w:r>
-      <w:r>
-        <w:t xml:space="preserve"> </w:t>
-      </w:r>
-      <w:r>
-        <w:rPr>
-          <w:rStyle w:val="VerbatimChar"/>
-        </w:rPr>
-        <w:t xml:space="preserve">documentId</w:t>
-      </w:r>
-      <w:r>
-        <w:t xml:space="preserve">,</w:t>
-      </w:r>
-      <w:r>
-        <w:t xml:space="preserve"> </w:t>
-      </w:r>
-      <w:r>
-        <w:rPr>
-          <w:rStyle w:val="VerbatimChar"/>
-        </w:rPr>
-        <w:t xml:space="preserve">offsetDays</w:t>
-      </w:r>
-      <w:r>
-        <w:t xml:space="preserve">,</w:t>
-      </w:r>
-      <w:r>
-        <w:t xml:space="preserve"> </w:t>
-      </w:r>
-      <w:r>
-        <w:rPr>
-          <w:rStyle w:val="VerbatimChar"/>
-        </w:rPr>
-        <w:t xml:space="preserve">dueDate</w:t>
-      </w:r>
-      <w:r>
-        <w:t xml:space="preserve">,</w:t>
-      </w:r>
-      <w:r>
-        <w:t xml:space="preserve"> </w:t>
-      </w:r>
-      <w:r>
-        <w:rPr>
-          <w:rStyle w:val="VerbatimChar"/>
-        </w:rPr>
-        <w:t xml:space="preserve">expiryDate</w:t>
-      </w:r>
-      <w:r>
-        <w:t xml:space="preserve"> </w:t>
-      </w:r>
-      <w:r>
-        <w:t xml:space="preserve">(server-computed:</w:t>
-      </w:r>
-      <w:r>
-        <w:t xml:space="preserve"> </w:t>
-      </w:r>
-      <w:r>
-        <w:rPr>
-          <w:rStyle w:val="VerbatimChar"/>
-        </w:rPr>
-        <w:t xml:space="preserve">dueDate + offsetDays</w:t>
-      </w:r>
-      <w:r>
-        <w:t xml:space="preserve">),</w:t>
-      </w:r>
-      <w:r>
-        <w:t xml:space="preserve"> </w:t>
-      </w:r>
-      <w:r>
-        <w:rPr>
-          <w:rStyle w:val="VerbatimChar"/>
-        </w:rPr>
-        <w:t xml:space="preserve">status</w:t>
-      </w:r>
-      <w:r>
-        <w:t xml:space="preserve"> </w:t>
-      </w:r>
-      <w:r>
-        <w:t xml:space="preserve">(0 Pending · 1 Sent · 2 Failed · 3</w:t>
-      </w:r>
-      <w:r>
-        <w:t xml:space="preserve"> </w:t>
-      </w:r>
-      <w:r>
-        <w:t xml:space="preserve">Cancelled),</w:t>
-      </w:r>
-      <w:r>
-        <w:t xml:space="preserve"> </w:t>
-      </w:r>
-      <w:r>
-        <w:rPr>
-          <w:rStyle w:val="VerbatimChar"/>
-        </w:rPr>
-        <w:t xml:space="preserve">sentAt?</w:t>
-      </w:r>
-      <w:r>
-        <w:t xml:space="preserve">.</w:t>
+        <w:t xml:space="preserve">Live example (recorded): a 35-byte PNG uploaded, downloaded byte-identical, deleted — the blob</w:t>
+      </w:r>
+      <w:r>
+        <w:t xml:space="preserve"> </w:t>
+      </w:r>
+      <w:r>
+        <w:t xml:space="preserve">file disappeared from the store after the 204.</w:t>
+      </w:r>
+    </w:p>
+    <w:bookmarkEnd w:id="35"/>
+    <w:bookmarkStart w:id="36" w:name="X88bdf6ce1de7c5c01445c063d9e61e1542223a6"/>
+    <w:p>
+      <w:pPr>
+        <w:pStyle w:val="Heading2"/>
+      </w:pPr>
+      <w:r>
+        <w:rPr>
+          <w:rStyle w:val="SectionNumber"/>
+        </w:rPr>
+        <w:t xml:space="preserve">4.5</w:t>
+      </w:r>
+      <w:r>
+        <w:tab/>
+      </w:r>
+      <w:r>
+        <w:t xml:space="preserve">4.5 Live example (recorded against the running host)</w:t>
       </w:r>
     </w:p>
     <w:p>
       <w:pPr>
-        <w:pStyle w:val="BodyText"/>
+        <w:pStyle w:val="SourceCode"/>
       </w:pPr>
       <w:r>
-        <w:t xml:space="preserve">Reminder rows are system-managed: they are (re)created by document changes and the rule update,</w:t>
-      </w:r>
-      <w:r>
-        <w:t xml:space="preserve"> </w:t>
-      </w:r>
-      <w:r>
-        <w:t xml:space="preserve">sent by the hourly dispatch job, and never edited directly — hence no POST/PUT/DELETE.</w:t>
+        <w:rPr>
+          <w:rStyle w:val="ExtensionTok"/>
+        </w:rPr>
+        <w:t xml:space="preserve">POST</w:t>
+      </w:r>
+      <w:r>
+        <w:rPr>
+          <w:rStyle w:val="NormalTok"/>
+        </w:rPr>
+        <w:t xml:space="preserve"> /api/documents/documents            Authorization: Bearer </w:t>
+      </w:r>
+      <w:r>
+        <w:rPr>
+          <w:rStyle w:val="OperatorTok"/>
+        </w:rPr>
+        <w:t xml:space="preserve">&lt;</w:t>
+      </w:r>
+      <w:r>
+        <w:rPr>
+          <w:rStyle w:val="NormalTok"/>
+        </w:rPr>
+        <w:t xml:space="preserve">user token</w:t>
+      </w:r>
+      <w:r>
+        <w:rPr>
+          <w:rStyle w:val="OperatorTok"/>
+        </w:rPr>
+        <w:t xml:space="preserve">&gt;</w:t>
+      </w:r>
+      <w:r>
+        <w:br/>
+      </w:r>
+      <w:r>
+        <w:rPr>
+          <w:rStyle w:val="KeywordTok"/>
+        </w:rPr>
+        <w:t xml:space="preserve">{</w:t>
+      </w:r>
+      <w:r>
+        <w:rPr>
+          <w:rStyle w:val="NormalTok"/>
+        </w:rPr>
+        <w:t xml:space="preserve"> </w:t>
+      </w:r>
+      <w:r>
+        <w:rPr>
+          <w:rStyle w:val="StringTok"/>
+        </w:rPr>
+        <w:t xml:space="preserve">"holderId"</w:t>
+      </w:r>
+      <w:r>
+        <w:rPr>
+          <w:rStyle w:val="ExtensionTok"/>
+        </w:rPr>
+        <w:t xml:space="preserve">:</w:t>
+      </w:r>
+      <w:r>
+        <w:rPr>
+          <w:rStyle w:val="NormalTok"/>
+        </w:rPr>
+        <w:t xml:space="preserve"> </w:t>
+      </w:r>
+      <w:r>
+        <w:rPr>
+          <w:rStyle w:val="StringTok"/>
+        </w:rPr>
+        <w:t xml:space="preserve">"6a3d8b35-…"</w:t>
+      </w:r>
+      <w:r>
+        <w:rPr>
+          <w:rStyle w:val="NormalTok"/>
+        </w:rPr>
+        <w:t xml:space="preserve">, </w:t>
+      </w:r>
+      <w:r>
+        <w:rPr>
+          <w:rStyle w:val="StringTok"/>
+        </w:rPr>
+        <w:t xml:space="preserve">"documentTypeId"</w:t>
+      </w:r>
+      <w:r>
+        <w:rPr>
+          <w:rStyle w:val="NormalTok"/>
+        </w:rPr>
+        <w:t xml:space="preserve">: </w:t>
+      </w:r>
+      <w:r>
+        <w:rPr>
+          <w:rStyle w:val="StringTok"/>
+        </w:rPr>
+        <w:t xml:space="preserve">"6ff4d4bc-…"</w:t>
+      </w:r>
+      <w:r>
+        <w:rPr>
+          <w:rStyle w:val="NormalTok"/>
+        </w:rPr>
+        <w:t xml:space="preserve">,</w:t>
+      </w:r>
+      <w:r>
+        <w:br/>
+      </w:r>
+      <w:r>
+        <w:rPr>
+          <w:rStyle w:val="NormalTok"/>
+        </w:rPr>
+        <w:t xml:space="preserve">  </w:t>
+      </w:r>
+      <w:r>
+        <w:rPr>
+          <w:rStyle w:val="StringTok"/>
+        </w:rPr>
+        <w:t xml:space="preserve">"number"</w:t>
+      </w:r>
+      <w:r>
+        <w:rPr>
+          <w:rStyle w:val="ExtensionTok"/>
+        </w:rPr>
+        <w:t xml:space="preserve">:</w:t>
+      </w:r>
+      <w:r>
+        <w:rPr>
+          <w:rStyle w:val="NormalTok"/>
+        </w:rPr>
+        <w:t xml:space="preserve"> </w:t>
+      </w:r>
+      <w:r>
+        <w:rPr>
+          <w:rStyle w:val="StringTok"/>
+        </w:rPr>
+        <w:t xml:space="preserve">"P1234567"</w:t>
+      </w:r>
+      <w:r>
+        <w:rPr>
+          <w:rStyle w:val="NormalTok"/>
+        </w:rPr>
+        <w:t xml:space="preserve">, </w:t>
+      </w:r>
+      <w:r>
+        <w:rPr>
+          <w:rStyle w:val="StringTok"/>
+        </w:rPr>
+        <w:t xml:space="preserve">"issueDate"</w:t>
+      </w:r>
+      <w:r>
+        <w:rPr>
+          <w:rStyle w:val="NormalTok"/>
+        </w:rPr>
+        <w:t xml:space="preserve">: </w:t>
+      </w:r>
+      <w:r>
+        <w:rPr>
+          <w:rStyle w:val="StringTok"/>
+        </w:rPr>
+        <w:t xml:space="preserve">"2020-09-01"</w:t>
+      </w:r>
+      <w:r>
+        <w:rPr>
+          <w:rStyle w:val="NormalTok"/>
+        </w:rPr>
+        <w:t xml:space="preserve">, </w:t>
+      </w:r>
+      <w:r>
+        <w:rPr>
+          <w:rStyle w:val="StringTok"/>
+        </w:rPr>
+        <w:t xml:space="preserve">"expiryDate"</w:t>
+      </w:r>
+      <w:r>
+        <w:rPr>
+          <w:rStyle w:val="NormalTok"/>
+        </w:rPr>
+        <w:t xml:space="preserve">: </w:t>
+      </w:r>
+      <w:r>
+        <w:rPr>
+          <w:rStyle w:val="StringTok"/>
+        </w:rPr>
+        <w:t xml:space="preserve">"2030-09-01"</w:t>
+      </w:r>
+      <w:r>
+        <w:rPr>
+          <w:rStyle w:val="NormalTok"/>
+        </w:rPr>
+        <w:t xml:space="preserve">,</w:t>
+      </w:r>
+      <w:r>
+        <w:br/>
+      </w:r>
+      <w:r>
+        <w:rPr>
+          <w:rStyle w:val="NormalTok"/>
+        </w:rPr>
+        <w:t xml:space="preserve">  </w:t>
+      </w:r>
+      <w:r>
+        <w:rPr>
+          <w:rStyle w:val="StringTok"/>
+        </w:rPr>
+        <w:t xml:space="preserve">"notes"</w:t>
+      </w:r>
+      <w:r>
+        <w:rPr>
+          <w:rStyle w:val="ExtensionTok"/>
+        </w:rPr>
+        <w:t xml:space="preserve">:</w:t>
+      </w:r>
+      <w:r>
+        <w:rPr>
+          <w:rStyle w:val="NormalTok"/>
+        </w:rPr>
+        <w:t xml:space="preserve"> </w:t>
+      </w:r>
+      <w:r>
+        <w:rPr>
+          <w:rStyle w:val="StringTok"/>
+        </w:rPr>
+        <w:t xml:space="preserve">"جواز سفر سالم"</w:t>
+      </w:r>
+      <w:r>
+        <w:rPr>
+          <w:rStyle w:val="NormalTok"/>
+        </w:rPr>
+        <w:t xml:space="preserve"> }</w:t>
+      </w:r>
+      <w:r>
+        <w:br/>
+      </w:r>
+      <w:r>
+        <w:br/>
+      </w:r>
+      <w:r>
+        <w:rPr>
+          <w:rStyle w:val="ExtensionTok"/>
+        </w:rPr>
+        <w:t xml:space="preserve">200</w:t>
+      </w:r>
+      <w:r>
+        <w:rPr>
+          <w:rStyle w:val="NormalTok"/>
+        </w:rPr>
+        <w:t xml:space="preserve"> OK</w:t>
+      </w:r>
+      <w:r>
+        <w:br/>
+      </w:r>
+      <w:r>
+        <w:rPr>
+          <w:rStyle w:val="KeywordTok"/>
+        </w:rPr>
+        <w:t xml:space="preserve">{</w:t>
+      </w:r>
+      <w:r>
+        <w:rPr>
+          <w:rStyle w:val="NormalTok"/>
+        </w:rPr>
+        <w:t xml:space="preserve"> </w:t>
+      </w:r>
+      <w:r>
+        <w:rPr>
+          <w:rStyle w:val="StringTok"/>
+        </w:rPr>
+        <w:t xml:space="preserve">"id"</w:t>
+      </w:r>
+      <w:r>
+        <w:rPr>
+          <w:rStyle w:val="ExtensionTok"/>
+        </w:rPr>
+        <w:t xml:space="preserve">:</w:t>
+      </w:r>
+      <w:r>
+        <w:rPr>
+          <w:rStyle w:val="NormalTok"/>
+        </w:rPr>
+        <w:t xml:space="preserve"> </w:t>
+      </w:r>
+      <w:r>
+        <w:rPr>
+          <w:rStyle w:val="StringTok"/>
+        </w:rPr>
+        <w:t xml:space="preserve">"5560255a-…"</w:t>
+      </w:r>
+      <w:r>
+        <w:rPr>
+          <w:rStyle w:val="NormalTok"/>
+        </w:rPr>
+        <w:t xml:space="preserve">, </w:t>
+      </w:r>
+      <w:r>
+        <w:rPr>
+          <w:rStyle w:val="StringTok"/>
+        </w:rPr>
+        <w:t xml:space="preserve">"holderId"</w:t>
+      </w:r>
+      <w:r>
+        <w:rPr>
+          <w:rStyle w:val="NormalTok"/>
+        </w:rPr>
+        <w:t xml:space="preserve">: </w:t>
+      </w:r>
+      <w:r>
+        <w:rPr>
+          <w:rStyle w:val="StringTok"/>
+        </w:rPr>
+        <w:t xml:space="preserve">"6a3d8b35-…"</w:t>
+      </w:r>
+      <w:r>
+        <w:rPr>
+          <w:rStyle w:val="NormalTok"/>
+        </w:rPr>
+        <w:t xml:space="preserve">, </w:t>
+      </w:r>
+      <w:r>
+        <w:rPr>
+          <w:rStyle w:val="StringTok"/>
+        </w:rPr>
+        <w:t xml:space="preserve">"documentTypeId"</w:t>
+      </w:r>
+      <w:r>
+        <w:rPr>
+          <w:rStyle w:val="NormalTok"/>
+        </w:rPr>
+        <w:t xml:space="preserve">: </w:t>
+      </w:r>
+      <w:r>
+        <w:rPr>
+          <w:rStyle w:val="StringTok"/>
+        </w:rPr>
+        <w:t xml:space="preserve">"6ff4d4bc-…"</w:t>
+      </w:r>
+      <w:r>
+        <w:rPr>
+          <w:rStyle w:val="NormalTok"/>
+        </w:rPr>
+        <w:t xml:space="preserve">,</w:t>
+      </w:r>
+      <w:r>
+        <w:br/>
+      </w:r>
+      <w:r>
+        <w:rPr>
+          <w:rStyle w:val="NormalTok"/>
+        </w:rPr>
+        <w:t xml:space="preserve">  </w:t>
+      </w:r>
+      <w:r>
+        <w:rPr>
+          <w:rStyle w:val="StringTok"/>
+        </w:rPr>
+        <w:t xml:space="preserve">"number"</w:t>
+      </w:r>
+      <w:r>
+        <w:rPr>
+          <w:rStyle w:val="ExtensionTok"/>
+        </w:rPr>
+        <w:t xml:space="preserve">:</w:t>
+      </w:r>
+      <w:r>
+        <w:rPr>
+          <w:rStyle w:val="NormalTok"/>
+        </w:rPr>
+        <w:t xml:space="preserve"> </w:t>
+      </w:r>
+      <w:r>
+        <w:rPr>
+          <w:rStyle w:val="StringTok"/>
+        </w:rPr>
+        <w:t xml:space="preserve">"P1234567"</w:t>
+      </w:r>
+      <w:r>
+        <w:rPr>
+          <w:rStyle w:val="NormalTok"/>
+        </w:rPr>
+        <w:t xml:space="preserve">, </w:t>
+      </w:r>
+      <w:r>
+        <w:rPr>
+          <w:rStyle w:val="StringTok"/>
+        </w:rPr>
+        <w:t xml:space="preserve">"issueDate"</w:t>
+      </w:r>
+      <w:r>
+        <w:rPr>
+          <w:rStyle w:val="NormalTok"/>
+        </w:rPr>
+        <w:t xml:space="preserve">: </w:t>
+      </w:r>
+      <w:r>
+        <w:rPr>
+          <w:rStyle w:val="StringTok"/>
+        </w:rPr>
+        <w:t xml:space="preserve">"2020-09-01"</w:t>
+      </w:r>
+      <w:r>
+        <w:rPr>
+          <w:rStyle w:val="NormalTok"/>
+        </w:rPr>
+        <w:t xml:space="preserve">, </w:t>
+      </w:r>
+      <w:r>
+        <w:rPr>
+          <w:rStyle w:val="StringTok"/>
+        </w:rPr>
+        <w:t xml:space="preserve">"expiryDate"</w:t>
+      </w:r>
+      <w:r>
+        <w:rPr>
+          <w:rStyle w:val="NormalTok"/>
+        </w:rPr>
+        <w:t xml:space="preserve">: </w:t>
+      </w:r>
+      <w:r>
+        <w:rPr>
+          <w:rStyle w:val="StringTok"/>
+        </w:rPr>
+        <w:t xml:space="preserve">"2030-09-01"</w:t>
+      </w:r>
+      <w:r>
+        <w:rPr>
+          <w:rStyle w:val="NormalTok"/>
+        </w:rPr>
+        <w:t xml:space="preserve">,</w:t>
+      </w:r>
+      <w:r>
+        <w:br/>
+      </w:r>
+      <w:r>
+        <w:rPr>
+          <w:rStyle w:val="NormalTok"/>
+        </w:rPr>
+        <w:t xml:space="preserve">  </w:t>
+      </w:r>
+      <w:r>
+        <w:rPr>
+          <w:rStyle w:val="StringTok"/>
+        </w:rPr>
+        <w:t xml:space="preserve">"status"</w:t>
+      </w:r>
+      <w:r>
+        <w:rPr>
+          <w:rStyle w:val="ExtensionTok"/>
+        </w:rPr>
+        <w:t xml:space="preserve">:</w:t>
+      </w:r>
+      <w:r>
+        <w:rPr>
+          <w:rStyle w:val="NormalTok"/>
+        </w:rPr>
+        <w:t xml:space="preserve"> 0, </w:t>
+      </w:r>
+      <w:r>
+        <w:rPr>
+          <w:rStyle w:val="StringTok"/>
+        </w:rPr>
+        <w:t xml:space="preserve">"notes"</w:t>
+      </w:r>
+      <w:r>
+        <w:rPr>
+          <w:rStyle w:val="NormalTok"/>
+        </w:rPr>
+        <w:t xml:space="preserve">: </w:t>
+      </w:r>
+      <w:r>
+        <w:rPr>
+          <w:rStyle w:val="StringTok"/>
+        </w:rPr>
+        <w:t xml:space="preserve">"جواز سفر سالم"</w:t>
+      </w:r>
+      <w:r>
+        <w:rPr>
+          <w:rStyle w:val="NormalTok"/>
+        </w:rPr>
+        <w:t xml:space="preserve">, </w:t>
+      </w:r>
+      <w:r>
+        <w:rPr>
+          <w:rStyle w:val="StringTok"/>
+        </w:rPr>
+        <w:t xml:space="preserve">"previousExpiryDate"</w:t>
+      </w:r>
+      <w:r>
+        <w:rPr>
+          <w:rStyle w:val="NormalTok"/>
+        </w:rPr>
+        <w:t xml:space="preserve">: null,</w:t>
+      </w:r>
+      <w:r>
+        <w:br/>
+      </w:r>
+      <w:r>
+        <w:rPr>
+          <w:rStyle w:val="NormalTok"/>
+        </w:rPr>
+        <w:t xml:space="preserve">  </w:t>
+      </w:r>
+      <w:r>
+        <w:rPr>
+          <w:rStyle w:val="StringTok"/>
+        </w:rPr>
+        <w:t xml:space="preserve">"daysUntilExpiry"</w:t>
+      </w:r>
+      <w:r>
+        <w:rPr>
+          <w:rStyle w:val="ExtensionTok"/>
+        </w:rPr>
+        <w:t xml:space="preserve">:</w:t>
+      </w:r>
+      <w:r>
+        <w:rPr>
+          <w:rStyle w:val="NormalTok"/>
+        </w:rPr>
+        <w:t xml:space="preserve"> 1466, </w:t>
+      </w:r>
+      <w:r>
+        <w:rPr>
+          <w:rStyle w:val="StringTok"/>
+        </w:rPr>
+        <w:t xml:space="preserve">"creationTime"</w:t>
+      </w:r>
+      <w:r>
+        <w:rPr>
+          <w:rStyle w:val="NormalTok"/>
+        </w:rPr>
+        <w:t xml:space="preserve">: </w:t>
+      </w:r>
+      <w:r>
+        <w:rPr>
+          <w:rStyle w:val="StringTok"/>
+        </w:rPr>
+        <w:t xml:space="preserve">"2026-08-27T14:18:16.58+00:00"</w:t>
+      </w:r>
+      <w:r>
+        <w:rPr>
+          <w:rStyle w:val="NormalTok"/>
+        </w:rPr>
+        <w:t xml:space="preserve"> }</w:t>
       </w:r>
     </w:p>
-    <w:p>
-      <w:pPr>
-        <w:pStyle w:val="BodyText"/>
-      </w:pPr>
-      <w:r>
-        <w:t xml:space="preserve">Live example (recorded):</w:t>
-      </w:r>
-      <w:r>
-        <w:t xml:space="preserve"> </w:t>
-      </w:r>
-      <w:r>
-        <w:rPr>
-          <w:rStyle w:val="VerbatimChar"/>
-        </w:rPr>
-        <w:t xml:space="preserve">PUT /api/reminders/rule</w:t>
-      </w:r>
-      <w:r>
-        <w:t xml:space="preserve"> </w:t>
-      </w:r>
-      <w:r>
-        <w:t xml:space="preserve">with</w:t>
-      </w:r>
-      <w:r>
-        <w:t xml:space="preserve"> </w:t>
-      </w:r>
-      <w:r>
-        <w:rPr>
-          <w:rStyle w:val="VerbatimChar"/>
-        </w:rPr>
-        <w:t xml:space="preserve">{"offsetsDays":[45,3], …}</w:t>
-      </w:r>
-      <w:r>
-        <w:t xml:space="preserve"> </w:t>
-      </w:r>
-      <w:r>
-        <w:t xml:space="preserve">against an</w:t>
-      </w:r>
-      <w:r>
-        <w:t xml:space="preserve"> </w:t>
-      </w:r>
-      <w:r>
-        <w:t xml:space="preserve">account holding one document expiring</w:t>
-      </w:r>
-      <w:r>
-        <w:t xml:space="preserve"> </w:t>
-      </w:r>
-      <w:r>
-        <w:rPr>
-          <w:rStyle w:val="VerbatimChar"/>
-        </w:rPr>
-        <w:t xml:space="preserve">2026-09-04</w:t>
-      </w:r>
-      <w:r>
-        <w:t xml:space="preserve"> </w:t>
-      </w:r>
-      <w:r>
-        <w:t xml:space="preserve">left exactly one Pending row —</w:t>
-      </w:r>
-      <w:r>
-        <w:t xml:space="preserve"> </w:t>
-      </w:r>
-      <w:r>
-        <w:rPr>
-          <w:rStyle w:val="VerbatimChar"/>
-        </w:rPr>
-        <w:t xml:space="preserve">offsetDays: 3, dueDate: 2026-09-01, expiryDate: 2026-09-04</w:t>
-      </w:r>
-      <w:r>
-        <w:t xml:space="preserve"> </w:t>
-      </w:r>
-      <w:r>
-        <w:t xml:space="preserve">— the already-sent 7-day reminder</w:t>
-      </w:r>
-      <w:r>
-        <w:t xml:space="preserve"> </w:t>
-      </w:r>
-      <w:r>
-        <w:t xml:space="preserve">stayed</w:t>
-      </w:r>
-      <w:r>
-        <w:t xml:space="preserve"> </w:t>
-      </w:r>
-      <w:r>
-        <w:rPr>
-          <w:rStyle w:val="VerbatimChar"/>
-        </w:rPr>
-        <w:t xml:space="preserve">Sent</w:t>
-      </w:r>
-      <w:r>
-        <w:t xml:space="preserve"> </w:t>
-      </w:r>
-      <w:r>
-        <w:t xml:space="preserve">(history is immutable), the removed offsets were cancelled.</w:t>
-      </w:r>
-    </w:p>
+    <w:bookmarkEnd w:id="36"/>
     <w:bookmarkEnd w:id="37"/>
-    <w:bookmarkStart w:id="38" w:name="error-model"/>
+    <w:bookmarkStart w:id="38" w:name="reminders-module-endpoints"/>
     <w:p>
       <w:pPr>
         <w:pStyle w:val="Heading1"/>
@@ -4963,13 +4697,13 @@
         <w:rPr>
           <w:rStyle w:val="SectionNumber"/>
         </w:rPr>
-        <w:t xml:space="preserve">6</w:t>
+        <w:t xml:space="preserve">5</w:t>
       </w:r>
       <w:r>
         <w:tab/>
       </w:r>
       <w:r>
-        <w:t xml:space="preserve">6. Error model</w:t>
+        <w:t xml:space="preserve">5. Reminders module endpoints</w:t>
       </w:r>
     </w:p>
     <w:p>
@@ -4977,19 +4711,53 @@
         <w:pStyle w:val="FirstParagraph"/>
       </w:pPr>
       <w:r>
-        <w:t xml:space="preserve">Every error is the ABP envelope</w:t>
-      </w:r>
-      <w:r>
-        <w:t xml:space="preserve"> </w:t>
-      </w:r>
-      <w:r>
-        <w:rPr>
-          <w:rStyle w:val="VerbatimChar"/>
-        </w:rPr>
-        <w:t xml:space="preserve">{ "error": { code, message, details, data, validationErrors } }</w:t>
-      </w:r>
-      <w:r>
-        <w:t xml:space="preserve">.</w:t>
+        <w:t xml:space="preserve">Route root</w:t>
+      </w:r>
+      <w:r>
+        <w:t xml:space="preserve"> </w:t>
+      </w:r>
+      <w:r>
+        <w:rPr>
+          <w:rStyle w:val="VerbatimChar"/>
+        </w:rPr>
+        <w:t xml:space="preserve">/api/reminders/*</w:t>
+      </w:r>
+      <w:r>
+        <w:t xml:space="preserve">. The rule is a</w:t>
+      </w:r>
+      <w:r>
+        <w:t xml:space="preserve"> </w:t>
+      </w:r>
+      <w:r>
+        <w:rPr>
+          <w:bCs/>
+          <w:b/>
+        </w:rPr>
+        <w:t xml:space="preserve">singleton resource</w:t>
+      </w:r>
+      <w:r>
+        <w:t xml:space="preserve"> </w:t>
+      </w:r>
+      <w:r>
+        <w:t xml:space="preserve">— one per user, so its</w:t>
+      </w:r>
+      <w:r>
+        <w:t xml:space="preserve"> </w:t>
+      </w:r>
+      <w:r>
+        <w:t xml:space="preserve">routes carry no</w:t>
+      </w:r>
+      <w:r>
+        <w:t xml:space="preserve"> </w:t>
+      </w:r>
+      <w:r>
+        <w:rPr>
+          <w:rStyle w:val="VerbatimChar"/>
+        </w:rPr>
+        <w:t xml:space="preserve">{id}</w:t>
+      </w:r>
+      <w:r>
+        <w:t xml:space="preserve">; the caller’s identity selects the row (created with defaults on first GET).</w:t>
       </w:r>
     </w:p>
     <w:tbl>
@@ -5016,40 +4784,31 @@
               <w:jc w:val="left"/>
             </w:pPr>
             <w:r>
-              <w:t xml:space="preserve">HTTP</w:t>
-            </w:r>
-          </w:p>
-        </w:tc>
-        <w:tc>
-          <w:tcPr/>
-          <w:p>
-            <w:pPr>
-              <w:pStyle w:val="Compact"/>
-              <w:jc w:val="left"/>
-            </w:pPr>
-            <w:r>
-              <w:t xml:space="preserve">When</w:t>
-            </w:r>
-          </w:p>
-        </w:tc>
-        <w:tc>
-          <w:tcPr/>
-          <w:p>
-            <w:pPr>
-              <w:pStyle w:val="Compact"/>
-              <w:jc w:val="left"/>
-            </w:pPr>
-            <w:r>
-              <w:rPr>
-                <w:rStyle w:val="VerbatimChar"/>
-              </w:rPr>
-              <w:t xml:space="preserve">error.code</w:t>
-            </w:r>
-            <w:r>
-              <w:t xml:space="preserve"> </w:t>
-            </w:r>
-            <w:r>
-              <w:t xml:space="preserve">example</w:t>
+              <w:t xml:space="preserve">Method &amp; path</w:t>
+            </w:r>
+          </w:p>
+        </w:tc>
+        <w:tc>
+          <w:tcPr/>
+          <w:p>
+            <w:pPr>
+              <w:pStyle w:val="Compact"/>
+              <w:jc w:val="left"/>
+            </w:pPr>
+            <w:r>
+              <w:t xml:space="preserve">Permission</w:t>
+            </w:r>
+          </w:p>
+        </w:tc>
+        <w:tc>
+          <w:tcPr/>
+          <w:p>
+            <w:pPr>
+              <w:pStyle w:val="Compact"/>
+              <w:jc w:val="left"/>
+            </w:pPr>
+            <w:r>
+              <w:t xml:space="preserve">Description</w:t>
             </w:r>
           </w:p>
         </w:tc>
@@ -5063,19 +4822,46 @@
               <w:jc w:val="left"/>
             </w:pPr>
             <w:r>
-              <w:t xml:space="preserve">400</w:t>
-            </w:r>
-          </w:p>
-        </w:tc>
-        <w:tc>
-          <w:tcPr/>
-          <w:p>
-            <w:pPr>
-              <w:pStyle w:val="Compact"/>
-              <w:jc w:val="left"/>
-            </w:pPr>
-            <w:r>
-              <w:t xml:space="preserve">DTO validation (missing/too long fields) —</w:t>
+              <w:rPr>
+                <w:rStyle w:val="VerbatimChar"/>
+              </w:rPr>
+              <w:t xml:space="preserve">GET /api/reminders/rule</w:t>
+            </w:r>
+          </w:p>
+        </w:tc>
+        <w:tc>
+          <w:tcPr/>
+          <w:p>
+            <w:pPr>
+              <w:pStyle w:val="Compact"/>
+              <w:jc w:val="left"/>
+            </w:pPr>
+            <w:r>
+              <w:rPr>
+                <w:rStyle w:val="VerbatimChar"/>
+              </w:rPr>
+              <w:t xml:space="preserve">WathiqReminders.Rule</w:t>
+            </w:r>
+          </w:p>
+        </w:tc>
+        <w:tc>
+          <w:tcPr/>
+          <w:p>
+            <w:pPr>
+              <w:pStyle w:val="Compact"/>
+              <w:jc w:val="left"/>
+            </w:pPr>
+            <w:r>
+              <w:t xml:space="preserve">The caller’s reminder settings; materialises the default (</w:t>
+            </w:r>
+            <w:r>
+              <w:rPr>
+                <w:rStyle w:val="VerbatimChar"/>
+              </w:rPr>
+              <w:t xml:space="preserve">90,30,7,1</w:t>
+            </w:r>
+            <w:r>
+              <w:t xml:space="preserve">, Email,</w:t>
             </w:r>
             <w:r>
               <w:t xml:space="preserve"> </w:t>
@@ -5084,25 +4870,10 @@
               <w:rPr>
                 <w:rStyle w:val="VerbatimChar"/>
               </w:rPr>
-              <w:t xml:space="preserve">validationErrors</w:t>
-            </w:r>
-            <w:r>
-              <w:t xml:space="preserve"> </w:t>
-            </w:r>
-            <w:r>
-              <w:t xml:space="preserve">lists each field</w:t>
-            </w:r>
-          </w:p>
-        </w:tc>
-        <w:tc>
-          <w:tcPr/>
-          <w:p>
-            <w:pPr>
-              <w:pStyle w:val="Compact"/>
-              <w:jc w:val="left"/>
-            </w:pPr>
-            <w:r>
-              <w:t xml:space="preserve">—</w:t>
+              <w:t xml:space="preserve">Asia/Riyadh</w:t>
+            </w:r>
+            <w:r>
+              <w:t xml:space="preserve">) on first call</w:t>
             </w:r>
           </w:p>
         </w:tc>
@@ -5116,31 +4887,65 @@
               <w:jc w:val="left"/>
             </w:pPr>
             <w:r>
-              <w:t xml:space="preserve">401</w:t>
-            </w:r>
-          </w:p>
-        </w:tc>
-        <w:tc>
-          <w:tcPr/>
-          <w:p>
-            <w:pPr>
-              <w:pStyle w:val="Compact"/>
-              <w:jc w:val="left"/>
-            </w:pPr>
-            <w:r>
-              <w:t xml:space="preserve">Missing/invalid token (JSON clients)</w:t>
-            </w:r>
-          </w:p>
-        </w:tc>
-        <w:tc>
-          <w:tcPr/>
-          <w:p>
-            <w:pPr>
-              <w:pStyle w:val="Compact"/>
-              <w:jc w:val="left"/>
-            </w:pPr>
-            <w:r>
-              <w:t xml:space="preserve">—</w:t>
+              <w:rPr>
+                <w:rStyle w:val="VerbatimChar"/>
+              </w:rPr>
+              <w:t xml:space="preserve">PUT /api/reminders/rule</w:t>
+            </w:r>
+          </w:p>
+        </w:tc>
+        <w:tc>
+          <w:tcPr/>
+          <w:p>
+            <w:pPr>
+              <w:pStyle w:val="Compact"/>
+              <w:jc w:val="left"/>
+            </w:pPr>
+            <w:r>
+              <w:rPr>
+                <w:rStyle w:val="VerbatimChar"/>
+              </w:rPr>
+              <w:t xml:space="preserve">…Rule.Update</w:t>
+            </w:r>
+          </w:p>
+        </w:tc>
+        <w:tc>
+          <w:tcPr/>
+          <w:p>
+            <w:pPr>
+              <w:pStyle w:val="Compact"/>
+              <w:jc w:val="left"/>
+            </w:pPr>
+            <w:r>
+              <w:t xml:space="preserve">Update settings;</w:t>
+            </w:r>
+            <w:r>
+              <w:t xml:space="preserve"> </w:t>
+            </w:r>
+            <w:r>
+              <w:rPr>
+                <w:bCs/>
+                <w:b/>
+              </w:rPr>
+              <w:t xml:space="preserve">resyncs existing reminders in the same transaction</w:t>
+            </w:r>
+            <w:r>
+              <w:t xml:space="preserve">, so</w:t>
+            </w:r>
+            <w:r>
+              <w:t xml:space="preserve"> </w:t>
+            </w:r>
+            <w:r>
+              <w:rPr>
+                <w:rStyle w:val="VerbatimChar"/>
+              </w:rPr>
+              <w:t xml:space="preserve">upcoming-list</w:t>
+            </w:r>
+            <w:r>
+              <w:t xml:space="preserve"> </w:t>
+            </w:r>
+            <w:r>
+              <w:t xml:space="preserve">immediately matches</w:t>
             </w:r>
           </w:p>
         </w:tc>
@@ -5154,82 +4959,70 @@
               <w:jc w:val="left"/>
             </w:pPr>
             <w:r>
-              <w:t xml:space="preserve">403</w:t>
-            </w:r>
-          </w:p>
-        </w:tc>
-        <w:tc>
-          <w:tcPr/>
-          <w:p>
-            <w:pPr>
-              <w:pStyle w:val="Compact"/>
-              <w:jc w:val="left"/>
-            </w:pPr>
-            <w:r>
-              <w:t xml:space="preserve">Permission denied, or a business rule rejected the request</w:t>
-            </w:r>
-          </w:p>
-        </w:tc>
-        <w:tc>
-          <w:tcPr/>
-          <w:p>
-            <w:pPr>
-              <w:pStyle w:val="Compact"/>
-              <w:jc w:val="left"/>
-            </w:pPr>
-            <w:r>
-              <w:rPr>
-                <w:rStyle w:val="VerbatimChar"/>
-              </w:rPr>
-              <w:t xml:space="preserve">Wathiq.Documents:ExpiryBeforeIssue</w:t>
-            </w:r>
-          </w:p>
-        </w:tc>
-      </w:tr>
-      <w:tr>
-        <w:tc>
-          <w:tcPr/>
-          <w:p>
-            <w:pPr>
-              <w:pStyle w:val="Compact"/>
-              <w:jc w:val="left"/>
-            </w:pPr>
-            <w:r>
-              <w:t xml:space="preserve">404</w:t>
-            </w:r>
-          </w:p>
-        </w:tc>
-        <w:tc>
-          <w:tcPr/>
-          <w:p>
-            <w:pPr>
-              <w:pStyle w:val="Compact"/>
-              <w:jc w:val="left"/>
-            </w:pPr>
-            <w:r>
-              <w:t xml:space="preserve">Row doesn’t exist</w:t>
+              <w:rPr>
+                <w:rStyle w:val="VerbatimChar"/>
+              </w:rPr>
+              <w:t xml:space="preserve">GET /api/reminders/reminders/upcoming-list</w:t>
+            </w:r>
+          </w:p>
+        </w:tc>
+        <w:tc>
+          <w:tcPr/>
+          <w:p>
+            <w:pPr>
+              <w:pStyle w:val="Compact"/>
+              <w:jc w:val="left"/>
+            </w:pPr>
+            <w:r>
+              <w:rPr>
+                <w:rStyle w:val="VerbatimChar"/>
+              </w:rPr>
+              <w:t xml:space="preserve">…Reminders</w:t>
+            </w:r>
+          </w:p>
+        </w:tc>
+        <w:tc>
+          <w:tcPr/>
+          <w:p>
+            <w:pPr>
+              <w:pStyle w:val="Compact"/>
+              <w:jc w:val="left"/>
+            </w:pPr>
+            <w:r>
+              <w:t xml:space="preserve">Pending reminders, soonest</w:t>
             </w:r>
             <w:r>
               <w:t xml:space="preserve"> </w:t>
             </w:r>
             <w:r>
               <w:rPr>
-                <w:bCs/>
-                <w:b/>
-              </w:rPr>
-              <w:t xml:space="preserve">or belongs to another user</w:t>
-            </w:r>
-          </w:p>
-        </w:tc>
-        <w:tc>
-          <w:tcPr/>
-          <w:p>
-            <w:pPr>
-              <w:pStyle w:val="Compact"/>
-              <w:jc w:val="left"/>
-            </w:pPr>
-            <w:r>
-              <w:t xml:space="preserve">—</w:t>
+                <w:rStyle w:val="VerbatimChar"/>
+              </w:rPr>
+              <w:t xml:space="preserve">dueDate</w:t>
+            </w:r>
+            <w:r>
+              <w:t xml:space="preserve"> </w:t>
+            </w:r>
+            <w:r>
+              <w:t xml:space="preserve">first; paged (</w:t>
+            </w:r>
+            <w:r>
+              <w:rPr>
+                <w:rStyle w:val="VerbatimChar"/>
+              </w:rPr>
+              <w:t xml:space="preserve">SkipCount</w:t>
+            </w:r>
+            <w:r>
+              <w:t xml:space="preserve">/</w:t>
+            </w:r>
+            <w:r>
+              <w:rPr>
+                <w:rStyle w:val="VerbatimChar"/>
+              </w:rPr>
+              <w:t xml:space="preserve">MaxResultCount</w:t>
+            </w:r>
+            <w:r>
+              <w:t xml:space="preserve">)</w:t>
             </w:r>
           </w:p>
         </w:tc>
@@ -5240,70 +5033,124 @@
         <w:pStyle w:val="BodyText"/>
       </w:pPr>
       <w:r>
-        <w:t xml:space="preserve">Reminders business codes:</w:t>
-      </w:r>
-      <w:r>
-        <w:t xml:space="preserve"> </w:t>
-      </w:r>
-      <w:r>
-        <w:rPr>
-          <w:rStyle w:val="VerbatimChar"/>
-        </w:rPr>
-        <w:t xml:space="preserve">InvalidOffsets</w:t>
-      </w:r>
-      <w:r>
-        <w:t xml:space="preserve">,</w:t>
-      </w:r>
-      <w:r>
-        <w:t xml:space="preserve"> </w:t>
-      </w:r>
-      <w:r>
-        <w:rPr>
-          <w:rStyle w:val="VerbatimChar"/>
-        </w:rPr>
-        <w:t xml:space="preserve">QuietHoursIncomplete</w:t>
-      </w:r>
-      <w:r>
-        <w:t xml:space="preserve">,</w:t>
-      </w:r>
-      <w:r>
-        <w:t xml:space="preserve"> </w:t>
-      </w:r>
-      <w:r>
-        <w:rPr>
-          <w:rStyle w:val="VerbatimChar"/>
-        </w:rPr>
-        <w:t xml:space="preserve">UnknownTimeZone</w:t>
-      </w:r>
-      <w:r>
-        <w:t xml:space="preserve">,</w:t>
-      </w:r>
-      <w:r>
-        <w:t xml:space="preserve"> </w:t>
-      </w:r>
-      <w:r>
-        <w:rPr>
-          <w:rStyle w:val="VerbatimChar"/>
-        </w:rPr>
-        <w:t xml:space="preserve">NoEmailAddress</w:t>
-      </w:r>
-      <w:r>
-        <w:t xml:space="preserve"> </w:t>
-      </w:r>
-      <w:r>
-        <w:t xml:space="preserve">— prefixed</w:t>
-      </w:r>
-      <w:r>
-        <w:t xml:space="preserve"> </w:t>
-      </w:r>
-      <w:r>
-        <w:rPr>
-          <w:rStyle w:val="VerbatimChar"/>
-        </w:rPr>
-        <w:t xml:space="preserve">Wathiq.Reminders:</w:t>
-      </w:r>
-      <w:r>
-        <w:t xml:space="preserve">.</w:t>
+        <w:rPr>
+          <w:rStyle w:val="VerbatimChar"/>
+        </w:rPr>
+        <w:t xml:space="preserve">ReminderRuleDto</w:t>
+      </w:r>
+      <w:r>
+        <w:t xml:space="preserve"> </w:t>
+      </w:r>
+      <w:r>
+        <w:t xml:space="preserve">/</w:t>
+      </w:r>
+      <w:r>
+        <w:t xml:space="preserve"> </w:t>
+      </w:r>
+      <w:r>
+        <w:rPr>
+          <w:rStyle w:val="VerbatimChar"/>
+        </w:rPr>
+        <w:t xml:space="preserve">UpdateReminderRuleDto</w:t>
+      </w:r>
+      <w:r>
+        <w:t xml:space="preserve">:</w:t>
+      </w:r>
+      <w:r>
+        <w:t xml:space="preserve"> </w:t>
+      </w:r>
+      <w:r>
+        <w:rPr>
+          <w:rStyle w:val="VerbatimChar"/>
+        </w:rPr>
+        <w:t xml:space="preserve">offsetsDays</w:t>
+      </w:r>
+      <w:r>
+        <w:t xml:space="preserve"> </w:t>
+      </w:r>
+      <w:r>
+        <w:t xml:space="preserve">int[] (1–3650, ≤8 entries — the</w:t>
+      </w:r>
+      <w:r>
+        <w:t xml:space="preserve"> </w:t>
+      </w:r>
+      <w:r>
+        <w:t xml:space="preserve">server normalizes to descending distinct),</w:t>
+      </w:r>
+      <w:r>
+        <w:t xml:space="preserve"> </w:t>
+      </w:r>
+      <w:r>
+        <w:rPr>
+          <w:rStyle w:val="VerbatimChar"/>
+        </w:rPr>
+        <w:t xml:space="preserve">channels</w:t>
+      </w:r>
+      <w:r>
+        <w:t xml:space="preserve"> </w:t>
+      </w:r>
+      <w:r>
+        <w:t xml:space="preserve">(flags: 1 Email · 2 Push; 0 pauses),</w:t>
+      </w:r>
+      <w:r>
+        <w:t xml:space="preserve"> </w:t>
+      </w:r>
+      <w:r>
+        <w:rPr>
+          <w:rStyle w:val="VerbatimChar"/>
+        </w:rPr>
+        <w:t xml:space="preserve">quietFrom</w:t>
+      </w:r>
+      <w:r>
+        <w:t xml:space="preserve">/</w:t>
+      </w:r>
+      <w:r>
+        <w:rPr>
+          <w:rStyle w:val="VerbatimChar"/>
+        </w:rPr>
+        <w:t xml:space="preserve">quietTo</w:t>
+      </w:r>
+      <w:r>
+        <w:t xml:space="preserve"> </w:t>
+      </w:r>
+      <w:r>
+        <w:t xml:space="preserve">(</w:t>
+      </w:r>
+      <w:r>
+        <w:rPr>
+          <w:rStyle w:val="VerbatimChar"/>
+        </w:rPr>
+        <w:t xml:space="preserve">"22:00:00"</w:t>
+      </w:r>
+      <w:r>
+        <w:t xml:space="preserve">, both-or-neither; over-midnight windows allowed),</w:t>
+      </w:r>
+      <w:r>
+        <w:t xml:space="preserve"> </w:t>
+      </w:r>
+      <w:r>
+        <w:rPr>
+          <w:rStyle w:val="VerbatimChar"/>
+        </w:rPr>
+        <w:t xml:space="preserve">timeZoneId</w:t>
+      </w:r>
+      <w:r>
+        <w:t xml:space="preserve"> </w:t>
+      </w:r>
+      <w:r>
+        <w:t xml:space="preserve">(IANA, validated — unknown zones are rejected with</w:t>
+      </w:r>
+      <w:r>
+        <w:t xml:space="preserve"> </w:t>
+      </w:r>
+      <w:r>
+        <w:rPr>
+          <w:rStyle w:val="VerbatimChar"/>
+        </w:rPr>
+        <w:t xml:space="preserve">Wathiq.Reminders:UnknownTimeZone</w:t>
+      </w:r>
+      <w:r>
+        <w:t xml:space="preserve">).</w:t>
       </w:r>
     </w:p>
     <w:p>
@@ -5311,28 +5158,25 @@
         <w:pStyle w:val="BodyText"/>
       </w:pPr>
       <w:r>
-        <w:t xml:space="preserve">Business error codes of the Documents module (message localized via</w:t>
-      </w:r>
-      <w:r>
-        <w:t xml:space="preserve"> </w:t>
-      </w:r>
-      <w:r>
-        <w:rPr>
-          <w:rStyle w:val="VerbatimChar"/>
-        </w:rPr>
-        <w:t xml:space="preserve">Accept-Language</w:t>
-      </w:r>
-      <w:r>
-        <w:t xml:space="preserve">):</w:t>
-      </w:r>
-      <w:r>
-        <w:t xml:space="preserve"> </w:t>
-      </w:r>
-      <w:r>
-        <w:rPr>
-          <w:rStyle w:val="VerbatimChar"/>
-        </w:rPr>
-        <w:t xml:space="preserve">ExpiryBeforeIssue</w:t>
+        <w:rPr>
+          <w:rStyle w:val="VerbatimChar"/>
+        </w:rPr>
+        <w:t xml:space="preserve">ReminderDto</w:t>
+      </w:r>
+      <w:r>
+        <w:t xml:space="preserve"> </w:t>
+      </w:r>
+      <w:r>
+        <w:t xml:space="preserve">(response):</w:t>
+      </w:r>
+      <w:r>
+        <w:t xml:space="preserve"> </w:t>
+      </w:r>
+      <w:r>
+        <w:rPr>
+          <w:rStyle w:val="VerbatimChar"/>
+        </w:rPr>
+        <w:t xml:space="preserve">id</w:t>
       </w:r>
       <w:r>
         <w:t xml:space="preserve">,</w:t>
@@ -5344,7 +5188,7 @@
         <w:rPr>
           <w:rStyle w:val="VerbatimChar"/>
         </w:rPr>
-        <w:t xml:space="preserve">HolderNotOwned</w:t>
+        <w:t xml:space="preserve">documentId</w:t>
       </w:r>
       <w:r>
         <w:t xml:space="preserve">,</w:t>
@@ -5356,7 +5200,7 @@
         <w:rPr>
           <w:rStyle w:val="VerbatimChar"/>
         </w:rPr>
-        <w:t xml:space="preserve">DocumentTypeNotActive</w:t>
+        <w:t xml:space="preserve">offsetDays</w:t>
       </w:r>
       <w:r>
         <w:t xml:space="preserve">,</w:t>
@@ -5368,7 +5212,7 @@
         <w:rPr>
           <w:rStyle w:val="VerbatimChar"/>
         </w:rPr>
-        <w:t xml:space="preserve">SelfHolderIsAutomatic</w:t>
+        <w:t xml:space="preserve">dueDate</w:t>
       </w:r>
       <w:r>
         <w:t xml:space="preserve">,</w:t>
@@ -5380,34 +5224,55 @@
         <w:rPr>
           <w:rStyle w:val="VerbatimChar"/>
         </w:rPr>
-        <w:t xml:space="preserve">CannotDeleteSelfHolder</w:t>
-      </w:r>
-      <w:r>
-        <w:t xml:space="preserve">,</w:t>
-      </w:r>
-      <w:r>
-        <w:t xml:space="preserve"> </w:t>
-      </w:r>
-      <w:r>
-        <w:rPr>
-          <w:rStyle w:val="VerbatimChar"/>
-        </w:rPr>
-        <w:t xml:space="preserve">HolderHasDocuments</w:t>
-      </w:r>
-      <w:r>
-        <w:t xml:space="preserve"> </w:t>
-      </w:r>
-      <w:r>
-        <w:t xml:space="preserve">— all prefixed</w:t>
-      </w:r>
-      <w:r>
-        <w:t xml:space="preserve"> </w:t>
-      </w:r>
-      <w:r>
-        <w:rPr>
-          <w:rStyle w:val="VerbatimChar"/>
-        </w:rPr>
-        <w:t xml:space="preserve">Wathiq.Documents:</w:t>
+        <w:t xml:space="preserve">expiryDate</w:t>
+      </w:r>
+      <w:r>
+        <w:t xml:space="preserve"> </w:t>
+      </w:r>
+      <w:r>
+        <w:t xml:space="preserve">(server-computed:</w:t>
+      </w:r>
+      <w:r>
+        <w:t xml:space="preserve"> </w:t>
+      </w:r>
+      <w:r>
+        <w:rPr>
+          <w:rStyle w:val="VerbatimChar"/>
+        </w:rPr>
+        <w:t xml:space="preserve">dueDate + offsetDays</w:t>
+      </w:r>
+      <w:r>
+        <w:t xml:space="preserve">),</w:t>
+      </w:r>
+      <w:r>
+        <w:t xml:space="preserve"> </w:t>
+      </w:r>
+      <w:r>
+        <w:rPr>
+          <w:rStyle w:val="VerbatimChar"/>
+        </w:rPr>
+        <w:t xml:space="preserve">status</w:t>
+      </w:r>
+      <w:r>
+        <w:t xml:space="preserve"> </w:t>
+      </w:r>
+      <w:r>
+        <w:t xml:space="preserve">(0 Pending · 1 Sent · 2 Failed · 3</w:t>
+      </w:r>
+      <w:r>
+        <w:t xml:space="preserve"> </w:t>
+      </w:r>
+      <w:r>
+        <w:t xml:space="preserve">Cancelled),</w:t>
+      </w:r>
+      <w:r>
+        <w:t xml:space="preserve"> </w:t>
+      </w:r>
+      <w:r>
+        <w:rPr>
+          <w:rStyle w:val="VerbatimChar"/>
+        </w:rPr>
+        <w:t xml:space="preserve">sentAt?</w:t>
       </w:r>
       <w:r>
         <w:t xml:space="preserve">.</w:t>
@@ -5418,274 +5283,112 @@
         <w:pStyle w:val="BodyText"/>
       </w:pPr>
       <w:r>
-        <w:t xml:space="preserve">Live example (</w:t>
-      </w:r>
-      <w:r>
-        <w:rPr>
-          <w:rStyle w:val="VerbatimChar"/>
-        </w:rPr>
-        <w:t xml:space="preserve">Accept-Language: ar</w:t>
-      </w:r>
-      <w:r>
-        <w:t xml:space="preserve">, expiry before issue):</w:t>
+        <w:t xml:space="preserve">Reminder rows are system-managed: they are (re)created by document changes and the rule update,</w:t>
+      </w:r>
+      <w:r>
+        <w:t xml:space="preserve"> </w:t>
+      </w:r>
+      <w:r>
+        <w:t xml:space="preserve">sent by the hourly dispatch job, and never edited directly — hence no POST/PUT/DELETE.</w:t>
       </w:r>
     </w:p>
     <w:p>
       <w:pPr>
-        <w:pStyle w:val="SourceCode"/>
+        <w:pStyle w:val="BodyText"/>
       </w:pPr>
       <w:r>
-        <w:rPr>
-          <w:rStyle w:val="FunctionTok"/>
-        </w:rPr>
-        <w:t xml:space="preserve">{</w:t>
-      </w:r>
-      <w:r>
-        <w:rPr>
-          <w:rStyle w:val="NormalTok"/>
-        </w:rPr>
-        <w:t xml:space="preserve"> </w:t>
-      </w:r>
-      <w:r>
-        <w:rPr>
-          <w:rStyle w:val="DataTypeTok"/>
-        </w:rPr>
-        <w:t xml:space="preserve">"error"</w:t>
-      </w:r>
-      <w:r>
-        <w:rPr>
-          <w:rStyle w:val="FunctionTok"/>
-        </w:rPr>
-        <w:t xml:space="preserve">:</w:t>
-      </w:r>
-      <w:r>
-        <w:rPr>
-          <w:rStyle w:val="NormalTok"/>
-        </w:rPr>
-        <w:t xml:space="preserve"> </w:t>
-      </w:r>
-      <w:r>
-        <w:rPr>
-          <w:rStyle w:val="FunctionTok"/>
-        </w:rPr>
-        <w:t xml:space="preserve">{</w:t>
-      </w:r>
-      <w:r>
-        <w:br/>
-      </w:r>
-      <w:r>
-        <w:rPr>
-          <w:rStyle w:val="NormalTok"/>
-        </w:rPr>
-        <w:t xml:space="preserve">    </w:t>
-      </w:r>
-      <w:r>
-        <w:rPr>
-          <w:rStyle w:val="DataTypeTok"/>
-        </w:rPr>
-        <w:t xml:space="preserve">"code"</w:t>
-      </w:r>
-      <w:r>
-        <w:rPr>
-          <w:rStyle w:val="FunctionTok"/>
-        </w:rPr>
-        <w:t xml:space="preserve">:</w:t>
-      </w:r>
-      <w:r>
-        <w:rPr>
-          <w:rStyle w:val="NormalTok"/>
-        </w:rPr>
-        <w:t xml:space="preserve"> </w:t>
-      </w:r>
-      <w:r>
-        <w:rPr>
-          <w:rStyle w:val="StringTok"/>
-        </w:rPr>
-        <w:t xml:space="preserve">"Wathiq.Documents:ExpiryBeforeIssue"</w:t>
-      </w:r>
-      <w:r>
-        <w:rPr>
-          <w:rStyle w:val="FunctionTok"/>
-        </w:rPr>
-        <w:t xml:space="preserve">,</w:t>
-      </w:r>
-      <w:r>
-        <w:br/>
-      </w:r>
-      <w:r>
-        <w:rPr>
-          <w:rStyle w:val="NormalTok"/>
-        </w:rPr>
-        <w:t xml:space="preserve">    </w:t>
-      </w:r>
-      <w:r>
-        <w:rPr>
-          <w:rStyle w:val="DataTypeTok"/>
-        </w:rPr>
-        <w:t xml:space="preserve">"message"</w:t>
-      </w:r>
-      <w:r>
-        <w:rPr>
-          <w:rStyle w:val="FunctionTok"/>
-        </w:rPr>
-        <w:t xml:space="preserve">:</w:t>
-      </w:r>
-      <w:r>
-        <w:rPr>
-          <w:rStyle w:val="NormalTok"/>
-        </w:rPr>
-        <w:t xml:space="preserve"> </w:t>
-      </w:r>
-      <w:r>
-        <w:rPr>
-          <w:rStyle w:val="StringTok"/>
-        </w:rPr>
-        <w:t xml:space="preserve">"لا يمكن أن يكون تاريخ الانتهاء قبل تاريخ الإصدار."</w:t>
-      </w:r>
-      <w:r>
-        <w:rPr>
-          <w:rStyle w:val="FunctionTok"/>
-        </w:rPr>
-        <w:t xml:space="preserve">,</w:t>
-      </w:r>
-      <w:r>
-        <w:br/>
-      </w:r>
-      <w:r>
-        <w:rPr>
-          <w:rStyle w:val="NormalTok"/>
-        </w:rPr>
-        <w:t xml:space="preserve">    </w:t>
-      </w:r>
-      <w:r>
-        <w:rPr>
-          <w:rStyle w:val="DataTypeTok"/>
-        </w:rPr>
-        <w:t xml:space="preserve">"data"</w:t>
-      </w:r>
-      <w:r>
-        <w:rPr>
-          <w:rStyle w:val="FunctionTok"/>
-        </w:rPr>
-        <w:t xml:space="preserve">:</w:t>
-      </w:r>
-      <w:r>
-        <w:rPr>
-          <w:rStyle w:val="NormalTok"/>
-        </w:rPr>
-        <w:t xml:space="preserve"> </w:t>
-      </w:r>
-      <w:r>
-        <w:rPr>
-          <w:rStyle w:val="FunctionTok"/>
-        </w:rPr>
-        <w:t xml:space="preserve">{</w:t>
-      </w:r>
-      <w:r>
-        <w:rPr>
-          <w:rStyle w:val="NormalTok"/>
-        </w:rPr>
-        <w:t xml:space="preserve"> </w:t>
-      </w:r>
-      <w:r>
-        <w:rPr>
-          <w:rStyle w:val="DataTypeTok"/>
-        </w:rPr>
-        <w:t xml:space="preserve">"IssueDate"</w:t>
-      </w:r>
-      <w:r>
-        <w:rPr>
-          <w:rStyle w:val="FunctionTok"/>
-        </w:rPr>
-        <w:t xml:space="preserve">:</w:t>
-      </w:r>
-      <w:r>
-        <w:rPr>
-          <w:rStyle w:val="NormalTok"/>
-        </w:rPr>
-        <w:t xml:space="preserve"> </w:t>
-      </w:r>
-      <w:r>
-        <w:rPr>
-          <w:rStyle w:val="StringTok"/>
-        </w:rPr>
-        <w:t xml:space="preserve">"2030-01-01"</w:t>
-      </w:r>
-      <w:r>
-        <w:rPr>
-          <w:rStyle w:val="FunctionTok"/>
-        </w:rPr>
-        <w:t xml:space="preserve">,</w:t>
-      </w:r>
-      <w:r>
-        <w:rPr>
-          <w:rStyle w:val="NormalTok"/>
-        </w:rPr>
-        <w:t xml:space="preserve"> </w:t>
-      </w:r>
-      <w:r>
-        <w:rPr>
-          <w:rStyle w:val="DataTypeTok"/>
-        </w:rPr>
-        <w:t xml:space="preserve">"ExpiryDate"</w:t>
-      </w:r>
-      <w:r>
-        <w:rPr>
-          <w:rStyle w:val="FunctionTok"/>
-        </w:rPr>
-        <w:t xml:space="preserve">:</w:t>
-      </w:r>
-      <w:r>
-        <w:rPr>
-          <w:rStyle w:val="NormalTok"/>
-        </w:rPr>
-        <w:t xml:space="preserve"> </w:t>
-      </w:r>
-      <w:r>
-        <w:rPr>
-          <w:rStyle w:val="StringTok"/>
-        </w:rPr>
-        <w:t xml:space="preserve">"2020-01-01"</w:t>
-      </w:r>
-      <w:r>
-        <w:rPr>
-          <w:rStyle w:val="NormalTok"/>
-        </w:rPr>
-        <w:t xml:space="preserve"> </w:t>
-      </w:r>
-      <w:r>
-        <w:rPr>
-          <w:rStyle w:val="FunctionTok"/>
-        </w:rPr>
-        <w:t xml:space="preserve">}</w:t>
-      </w:r>
-      <w:r>
-        <w:rPr>
-          <w:rStyle w:val="NormalTok"/>
-        </w:rPr>
-        <w:t xml:space="preserve"> </w:t>
-      </w:r>
-      <w:r>
-        <w:rPr>
-          <w:rStyle w:val="FunctionTok"/>
-        </w:rPr>
-        <w:t xml:space="preserve">}</w:t>
-      </w:r>
-      <w:r>
-        <w:rPr>
-          <w:rStyle w:val="NormalTok"/>
-        </w:rPr>
-        <w:t xml:space="preserve"> </w:t>
-      </w:r>
-      <w:r>
-        <w:rPr>
-          <w:rStyle w:val="FunctionTok"/>
-        </w:rPr>
-        <w:t xml:space="preserve">}</w:t>
+        <w:t xml:space="preserve">Live example (recorded):</w:t>
+      </w:r>
+      <w:r>
+        <w:t xml:space="preserve"> </w:t>
+      </w:r>
+      <w:r>
+        <w:rPr>
+          <w:rStyle w:val="VerbatimChar"/>
+        </w:rPr>
+        <w:t xml:space="preserve">PUT /api/reminders/rule</w:t>
+      </w:r>
+      <w:r>
+        <w:t xml:space="preserve"> </w:t>
+      </w:r>
+      <w:r>
+        <w:t xml:space="preserve">with</w:t>
+      </w:r>
+      <w:r>
+        <w:t xml:space="preserve"> </w:t>
+      </w:r>
+      <w:r>
+        <w:rPr>
+          <w:rStyle w:val="VerbatimChar"/>
+        </w:rPr>
+        <w:t xml:space="preserve">{"offsetsDays":[45,3], …}</w:t>
+      </w:r>
+      <w:r>
+        <w:t xml:space="preserve"> </w:t>
+      </w:r>
+      <w:r>
+        <w:t xml:space="preserve">against an</w:t>
+      </w:r>
+      <w:r>
+        <w:t xml:space="preserve"> </w:t>
+      </w:r>
+      <w:r>
+        <w:t xml:space="preserve">account holding one document expiring</w:t>
+      </w:r>
+      <w:r>
+        <w:t xml:space="preserve"> </w:t>
+      </w:r>
+      <w:r>
+        <w:rPr>
+          <w:rStyle w:val="VerbatimChar"/>
+        </w:rPr>
+        <w:t xml:space="preserve">2026-09-04</w:t>
+      </w:r>
+      <w:r>
+        <w:t xml:space="preserve"> </w:t>
+      </w:r>
+      <w:r>
+        <w:t xml:space="preserve">left exactly one Pending row —</w:t>
+      </w:r>
+      <w:r>
+        <w:t xml:space="preserve"> </w:t>
+      </w:r>
+      <w:r>
+        <w:rPr>
+          <w:rStyle w:val="VerbatimChar"/>
+        </w:rPr>
+        <w:t xml:space="preserve">offsetDays: 3, dueDate: 2026-09-01, expiryDate: 2026-09-04</w:t>
+      </w:r>
+      <w:r>
+        <w:t xml:space="preserve"> </w:t>
+      </w:r>
+      <w:r>
+        <w:t xml:space="preserve">— the already-sent 7-day reminder</w:t>
+      </w:r>
+      <w:r>
+        <w:t xml:space="preserve"> </w:t>
+      </w:r>
+      <w:r>
+        <w:t xml:space="preserve">stayed</w:t>
+      </w:r>
+      <w:r>
+        <w:t xml:space="preserve"> </w:t>
+      </w:r>
+      <w:r>
+        <w:rPr>
+          <w:rStyle w:val="VerbatimChar"/>
+        </w:rPr>
+        <w:t xml:space="preserve">Sent</w:t>
+      </w:r>
+      <w:r>
+        <w:t xml:space="preserve"> </w:t>
+      </w:r>
+      <w:r>
+        <w:t xml:space="preserve">(history is immutable), the removed offsets were cancelled.</w:t>
       </w:r>
     </w:p>
     <w:bookmarkEnd w:id="38"/>
-    <w:bookmarkStart w:id="39" w:name="infrastructure-endpoints-abp-built-ins"/>
+    <w:bookmarkStart w:id="39" w:name="error-model"/>
     <w:p>
       <w:pPr>
         <w:pStyle w:val="Heading1"/>
@@ -5694,13 +5397,13 @@
         <w:rPr>
           <w:rStyle w:val="SectionNumber"/>
         </w:rPr>
-        <w:t xml:space="preserve">7</w:t>
+        <w:t xml:space="preserve">6</w:t>
       </w:r>
       <w:r>
         <w:tab/>
       </w:r>
       <w:r>
-        <w:t xml:space="preserve">7. Infrastructure endpoints (ABP built-ins)</w:t>
+        <w:t xml:space="preserve">6. Error model</w:t>
       </w:r>
     </w:p>
     <w:p>
@@ -5708,7 +5411,19 @@
         <w:pStyle w:val="FirstParagraph"/>
       </w:pPr>
       <w:r>
-        <w:t xml:space="preserve">Summarized — full detail is in Swagger. Admin-tagged groups require admin permissions.</w:t>
+        <w:t xml:space="preserve">Every error is the ABP envelope</w:t>
+      </w:r>
+      <w:r>
+        <w:t xml:space="preserve"> </w:t>
+      </w:r>
+      <w:r>
+        <w:rPr>
+          <w:rStyle w:val="VerbatimChar"/>
+        </w:rPr>
+        <w:t xml:space="preserve">{ "error": { code, message, details, data, validationErrors } }</w:t>
+      </w:r>
+      <w:r>
+        <w:t xml:space="preserve">.</w:t>
       </w:r>
     </w:p>
     <w:tbl>
@@ -5735,31 +5450,40 @@
               <w:jc w:val="left"/>
             </w:pPr>
             <w:r>
-              <w:t xml:space="preserve">Area</w:t>
-            </w:r>
-          </w:p>
-        </w:tc>
-        <w:tc>
-          <w:tcPr/>
-          <w:p>
-            <w:pPr>
-              <w:pStyle w:val="Compact"/>
-              <w:jc w:val="left"/>
-            </w:pPr>
-            <w:r>
-              <w:t xml:space="preserve">Root</w:t>
-            </w:r>
-          </w:p>
-        </w:tc>
-        <w:tc>
-          <w:tcPr/>
-          <w:p>
-            <w:pPr>
-              <w:pStyle w:val="Compact"/>
-              <w:jc w:val="left"/>
-            </w:pPr>
-            <w:r>
-              <w:t xml:space="preserve">Notes</w:t>
+              <w:t xml:space="preserve">HTTP</w:t>
+            </w:r>
+          </w:p>
+        </w:tc>
+        <w:tc>
+          <w:tcPr/>
+          <w:p>
+            <w:pPr>
+              <w:pStyle w:val="Compact"/>
+              <w:jc w:val="left"/>
+            </w:pPr>
+            <w:r>
+              <w:t xml:space="preserve">When</w:t>
+            </w:r>
+          </w:p>
+        </w:tc>
+        <w:tc>
+          <w:tcPr/>
+          <w:p>
+            <w:pPr>
+              <w:pStyle w:val="Compact"/>
+              <w:jc w:val="left"/>
+            </w:pPr>
+            <w:r>
+              <w:rPr>
+                <w:rStyle w:val="VerbatimChar"/>
+              </w:rPr>
+              <w:t xml:space="preserve">error.code</w:t>
+            </w:r>
+            <w:r>
+              <w:t xml:space="preserve"> </w:t>
+            </w:r>
+            <w:r>
+              <w:t xml:space="preserve">example</w:t>
             </w:r>
           </w:p>
         </w:tc>
@@ -5773,34 +5497,46 @@
               <w:jc w:val="left"/>
             </w:pPr>
             <w:r>
-              <w:t xml:space="preserve">Account</w:t>
-            </w:r>
-          </w:p>
-        </w:tc>
-        <w:tc>
-          <w:tcPr/>
-          <w:p>
-            <w:pPr>
-              <w:pStyle w:val="Compact"/>
-              <w:jc w:val="left"/>
-            </w:pPr>
-            <w:r>
-              <w:rPr>
-                <w:rStyle w:val="VerbatimChar"/>
-              </w:rPr>
-              <w:t xml:space="preserve">/api/account/*</w:t>
-            </w:r>
-          </w:p>
-        </w:tc>
-        <w:tc>
-          <w:tcPr/>
-          <w:p>
-            <w:pPr>
-              <w:pStyle w:val="Compact"/>
-              <w:jc w:val="left"/>
-            </w:pPr>
-            <w:r>
-              <w:t xml:space="preserve">register, login/logout, reset-password, my-profile, change-password</w:t>
+              <w:t xml:space="preserve">400</w:t>
+            </w:r>
+          </w:p>
+        </w:tc>
+        <w:tc>
+          <w:tcPr/>
+          <w:p>
+            <w:pPr>
+              <w:pStyle w:val="Compact"/>
+              <w:jc w:val="left"/>
+            </w:pPr>
+            <w:r>
+              <w:t xml:space="preserve">DTO validation (missing/too long fields) —</w:t>
+            </w:r>
+            <w:r>
+              <w:t xml:space="preserve"> </w:t>
+            </w:r>
+            <w:r>
+              <w:rPr>
+                <w:rStyle w:val="VerbatimChar"/>
+              </w:rPr>
+              <w:t xml:space="preserve">validationErrors</w:t>
+            </w:r>
+            <w:r>
+              <w:t xml:space="preserve"> </w:t>
+            </w:r>
+            <w:r>
+              <w:t xml:space="preserve">lists each field</w:t>
+            </w:r>
+          </w:p>
+        </w:tc>
+        <w:tc>
+          <w:tcPr/>
+          <w:p>
+            <w:pPr>
+              <w:pStyle w:val="Compact"/>
+              <w:jc w:val="left"/>
+            </w:pPr>
+            <w:r>
+              <w:t xml:space="preserve">—</w:t>
             </w:r>
           </w:p>
         </w:tc>
@@ -5814,46 +5550,31 @@
               <w:jc w:val="left"/>
             </w:pPr>
             <w:r>
-              <w:t xml:space="preserve">Identity admin</w:t>
-            </w:r>
-          </w:p>
-        </w:tc>
-        <w:tc>
-          <w:tcPr/>
-          <w:p>
-            <w:pPr>
-              <w:pStyle w:val="Compact"/>
-              <w:jc w:val="left"/>
-            </w:pPr>
-            <w:r>
-              <w:rPr>
-                <w:rStyle w:val="VerbatimChar"/>
-              </w:rPr>
-              <w:t xml:space="preserve">/api/identity/users</w:t>
-            </w:r>
-            <w:r>
-              <w:t xml:space="preserve">,</w:t>
-            </w:r>
-            <w:r>
-              <w:t xml:space="preserve"> </w:t>
-            </w:r>
-            <w:r>
-              <w:rPr>
-                <w:rStyle w:val="VerbatimChar"/>
-              </w:rPr>
-              <w:t xml:space="preserve">/api/identity/roles</w:t>
-            </w:r>
-          </w:p>
-        </w:tc>
-        <w:tc>
-          <w:tcPr/>
-          <w:p>
-            <w:pPr>
-              <w:pStyle w:val="Compact"/>
-              <w:jc w:val="left"/>
-            </w:pPr>
-            <w:r>
-              <w:t xml:space="preserve">user/role CRUD (admin)</w:t>
+              <w:t xml:space="preserve">401</w:t>
+            </w:r>
+          </w:p>
+        </w:tc>
+        <w:tc>
+          <w:tcPr/>
+          <w:p>
+            <w:pPr>
+              <w:pStyle w:val="Compact"/>
+              <w:jc w:val="left"/>
+            </w:pPr>
+            <w:r>
+              <w:t xml:space="preserve">Missing/invalid token (JSON clients)</w:t>
+            </w:r>
+          </w:p>
+        </w:tc>
+        <w:tc>
+          <w:tcPr/>
+          <w:p>
+            <w:pPr>
+              <w:pStyle w:val="Compact"/>
+              <w:jc w:val="left"/>
+            </w:pPr>
+            <w:r>
+              <w:t xml:space="preserve">—</w:t>
             </w:r>
           </w:p>
         </w:tc>
@@ -5867,34 +5588,34 @@
               <w:jc w:val="left"/>
             </w:pPr>
             <w:r>
-              <w:t xml:space="preserve">Permission management</w:t>
-            </w:r>
-          </w:p>
-        </w:tc>
-        <w:tc>
-          <w:tcPr/>
-          <w:p>
-            <w:pPr>
-              <w:pStyle w:val="Compact"/>
-              <w:jc w:val="left"/>
-            </w:pPr>
-            <w:r>
-              <w:rPr>
-                <w:rStyle w:val="VerbatimChar"/>
-              </w:rPr>
-              <w:t xml:space="preserve">/api/permission-management/permissions</w:t>
-            </w:r>
-          </w:p>
-        </w:tc>
-        <w:tc>
-          <w:tcPr/>
-          <w:p>
-            <w:pPr>
-              <w:pStyle w:val="Compact"/>
-              <w:jc w:val="left"/>
-            </w:pPr>
-            <w:r>
-              <w:t xml:space="preserve">read/update grants (admin)</w:t>
+              <w:t xml:space="preserve">403</w:t>
+            </w:r>
+          </w:p>
+        </w:tc>
+        <w:tc>
+          <w:tcPr/>
+          <w:p>
+            <w:pPr>
+              <w:pStyle w:val="Compact"/>
+              <w:jc w:val="left"/>
+            </w:pPr>
+            <w:r>
+              <w:t xml:space="preserve">Permission denied, or a business rule rejected the request</w:t>
+            </w:r>
+          </w:p>
+        </w:tc>
+        <w:tc>
+          <w:tcPr/>
+          <w:p>
+            <w:pPr>
+              <w:pStyle w:val="Compact"/>
+              <w:jc w:val="left"/>
+            </w:pPr>
+            <w:r>
+              <w:rPr>
+                <w:rStyle w:val="VerbatimChar"/>
+              </w:rPr>
+              <w:t xml:space="preserve">Wathiq.Documents:ExpiryBeforeIssue</w:t>
             </w:r>
           </w:p>
         </w:tc>
@@ -5908,34 +5629,571 @@
               <w:jc w:val="left"/>
             </w:pPr>
             <w:r>
-              <w:t xml:space="preserve">App configuration</w:t>
-            </w:r>
-          </w:p>
-        </w:tc>
-        <w:tc>
-          <w:tcPr/>
-          <w:p>
-            <w:pPr>
-              <w:pStyle w:val="Compact"/>
-              <w:jc w:val="left"/>
-            </w:pPr>
-            <w:r>
-              <w:rPr>
-                <w:rStyle w:val="VerbatimChar"/>
-              </w:rPr>
-              <w:t xml:space="preserve">/api/abp/application-configuration</w:t>
-            </w:r>
-          </w:p>
-        </w:tc>
-        <w:tc>
-          <w:tcPr/>
-          <w:p>
-            <w:pPr>
-              <w:pStyle w:val="Compact"/>
-              <w:jc w:val="left"/>
-            </w:pPr>
-            <w:r>
-              <w:t xml:space="preserve">current user, permissions, localization — the client bootstrap call</w:t>
+              <w:t xml:space="preserve">404</w:t>
+            </w:r>
+          </w:p>
+        </w:tc>
+        <w:tc>
+          <w:tcPr/>
+          <w:p>
+            <w:pPr>
+              <w:pStyle w:val="Compact"/>
+              <w:jc w:val="left"/>
+            </w:pPr>
+            <w:r>
+              <w:t xml:space="preserve">Row doesn’t exist</w:t>
+            </w:r>
+            <w:r>
+              <w:t xml:space="preserve"> </w:t>
+            </w:r>
+            <w:r>
+              <w:rPr>
+                <w:bCs/>
+                <w:b/>
+              </w:rPr>
+              <w:t xml:space="preserve">or belongs to another user</w:t>
+            </w:r>
+          </w:p>
+        </w:tc>
+        <w:tc>
+          <w:tcPr/>
+          <w:p>
+            <w:pPr>
+              <w:pStyle w:val="Compact"/>
+              <w:jc w:val="left"/>
+            </w:pPr>
+            <w:r>
+              <w:t xml:space="preserve">—</w:t>
+            </w:r>
+          </w:p>
+        </w:tc>
+      </w:tr>
+    </w:tbl>
+    <w:p>
+      <w:pPr>
+        <w:pStyle w:val="BodyText"/>
+      </w:pPr>
+      <w:r>
+        <w:t xml:space="preserve">Reminders business codes:</w:t>
+      </w:r>
+      <w:r>
+        <w:t xml:space="preserve"> </w:t>
+      </w:r>
+      <w:r>
+        <w:rPr>
+          <w:rStyle w:val="VerbatimChar"/>
+        </w:rPr>
+        <w:t xml:space="preserve">InvalidOffsets</w:t>
+      </w:r>
+      <w:r>
+        <w:t xml:space="preserve">,</w:t>
+      </w:r>
+      <w:r>
+        <w:t xml:space="preserve"> </w:t>
+      </w:r>
+      <w:r>
+        <w:rPr>
+          <w:rStyle w:val="VerbatimChar"/>
+        </w:rPr>
+        <w:t xml:space="preserve">QuietHoursIncomplete</w:t>
+      </w:r>
+      <w:r>
+        <w:t xml:space="preserve">,</w:t>
+      </w:r>
+      <w:r>
+        <w:t xml:space="preserve"> </w:t>
+      </w:r>
+      <w:r>
+        <w:rPr>
+          <w:rStyle w:val="VerbatimChar"/>
+        </w:rPr>
+        <w:t xml:space="preserve">UnknownTimeZone</w:t>
+      </w:r>
+      <w:r>
+        <w:t xml:space="preserve">,</w:t>
+      </w:r>
+      <w:r>
+        <w:t xml:space="preserve"> </w:t>
+      </w:r>
+      <w:r>
+        <w:rPr>
+          <w:rStyle w:val="VerbatimChar"/>
+        </w:rPr>
+        <w:t xml:space="preserve">NoEmailAddress</w:t>
+      </w:r>
+      <w:r>
+        <w:t xml:space="preserve"> </w:t>
+      </w:r>
+      <w:r>
+        <w:t xml:space="preserve">— prefixed</w:t>
+      </w:r>
+      <w:r>
+        <w:t xml:space="preserve"> </w:t>
+      </w:r>
+      <w:r>
+        <w:rPr>
+          <w:rStyle w:val="VerbatimChar"/>
+        </w:rPr>
+        <w:t xml:space="preserve">Wathiq.Reminders:</w:t>
+      </w:r>
+      <w:r>
+        <w:t xml:space="preserve">.</w:t>
+      </w:r>
+    </w:p>
+    <w:p>
+      <w:pPr>
+        <w:pStyle w:val="BodyText"/>
+      </w:pPr>
+      <w:r>
+        <w:t xml:space="preserve">Business error codes of the Documents module (message localized via</w:t>
+      </w:r>
+      <w:r>
+        <w:t xml:space="preserve"> </w:t>
+      </w:r>
+      <w:r>
+        <w:rPr>
+          <w:rStyle w:val="VerbatimChar"/>
+        </w:rPr>
+        <w:t xml:space="preserve">Accept-Language</w:t>
+      </w:r>
+      <w:r>
+        <w:t xml:space="preserve">):</w:t>
+      </w:r>
+      <w:r>
+        <w:t xml:space="preserve"> </w:t>
+      </w:r>
+      <w:r>
+        <w:rPr>
+          <w:rStyle w:val="VerbatimChar"/>
+        </w:rPr>
+        <w:t xml:space="preserve">ExpiryBeforeIssue</w:t>
+      </w:r>
+      <w:r>
+        <w:t xml:space="preserve">,</w:t>
+      </w:r>
+      <w:r>
+        <w:t xml:space="preserve"> </w:t>
+      </w:r>
+      <w:r>
+        <w:rPr>
+          <w:rStyle w:val="VerbatimChar"/>
+        </w:rPr>
+        <w:t xml:space="preserve">HolderNotOwned</w:t>
+      </w:r>
+      <w:r>
+        <w:t xml:space="preserve">,</w:t>
+      </w:r>
+      <w:r>
+        <w:t xml:space="preserve"> </w:t>
+      </w:r>
+      <w:r>
+        <w:rPr>
+          <w:rStyle w:val="VerbatimChar"/>
+        </w:rPr>
+        <w:t xml:space="preserve">DocumentTypeNotActive</w:t>
+      </w:r>
+      <w:r>
+        <w:t xml:space="preserve">,</w:t>
+      </w:r>
+      <w:r>
+        <w:t xml:space="preserve"> </w:t>
+      </w:r>
+      <w:r>
+        <w:rPr>
+          <w:rStyle w:val="VerbatimChar"/>
+        </w:rPr>
+        <w:t xml:space="preserve">SelfHolderIsAutomatic</w:t>
+      </w:r>
+      <w:r>
+        <w:t xml:space="preserve">,</w:t>
+      </w:r>
+      <w:r>
+        <w:t xml:space="preserve"> </w:t>
+      </w:r>
+      <w:r>
+        <w:rPr>
+          <w:rStyle w:val="VerbatimChar"/>
+        </w:rPr>
+        <w:t xml:space="preserve">CannotDeleteSelfHolder</w:t>
+      </w:r>
+      <w:r>
+        <w:t xml:space="preserve">,</w:t>
+      </w:r>
+      <w:r>
+        <w:t xml:space="preserve"> </w:t>
+      </w:r>
+      <w:r>
+        <w:rPr>
+          <w:rStyle w:val="VerbatimChar"/>
+        </w:rPr>
+        <w:t xml:space="preserve">HolderHasDocuments</w:t>
+      </w:r>
+      <w:r>
+        <w:t xml:space="preserve"> </w:t>
+      </w:r>
+      <w:r>
+        <w:t xml:space="preserve">— all prefixed</w:t>
+      </w:r>
+      <w:r>
+        <w:t xml:space="preserve"> </w:t>
+      </w:r>
+      <w:r>
+        <w:rPr>
+          <w:rStyle w:val="VerbatimChar"/>
+        </w:rPr>
+        <w:t xml:space="preserve">Wathiq.Documents:</w:t>
+      </w:r>
+      <w:r>
+        <w:t xml:space="preserve">.</w:t>
+      </w:r>
+    </w:p>
+    <w:p>
+      <w:pPr>
+        <w:pStyle w:val="BodyText"/>
+      </w:pPr>
+      <w:r>
+        <w:t xml:space="preserve">Live example (</w:t>
+      </w:r>
+      <w:r>
+        <w:rPr>
+          <w:rStyle w:val="VerbatimChar"/>
+        </w:rPr>
+        <w:t xml:space="preserve">Accept-Language: ar</w:t>
+      </w:r>
+      <w:r>
+        <w:t xml:space="preserve">, expiry before issue):</w:t>
+      </w:r>
+    </w:p>
+    <w:p>
+      <w:pPr>
+        <w:pStyle w:val="SourceCode"/>
+      </w:pPr>
+      <w:r>
+        <w:rPr>
+          <w:rStyle w:val="FunctionTok"/>
+        </w:rPr>
+        <w:t xml:space="preserve">{</w:t>
+      </w:r>
+      <w:r>
+        <w:rPr>
+          <w:rStyle w:val="NormalTok"/>
+        </w:rPr>
+        <w:t xml:space="preserve"> </w:t>
+      </w:r>
+      <w:r>
+        <w:rPr>
+          <w:rStyle w:val="DataTypeTok"/>
+        </w:rPr>
+        <w:t xml:space="preserve">"error"</w:t>
+      </w:r>
+      <w:r>
+        <w:rPr>
+          <w:rStyle w:val="FunctionTok"/>
+        </w:rPr>
+        <w:t xml:space="preserve">:</w:t>
+      </w:r>
+      <w:r>
+        <w:rPr>
+          <w:rStyle w:val="NormalTok"/>
+        </w:rPr>
+        <w:t xml:space="preserve"> </w:t>
+      </w:r>
+      <w:r>
+        <w:rPr>
+          <w:rStyle w:val="FunctionTok"/>
+        </w:rPr>
+        <w:t xml:space="preserve">{</w:t>
+      </w:r>
+      <w:r>
+        <w:br/>
+      </w:r>
+      <w:r>
+        <w:rPr>
+          <w:rStyle w:val="NormalTok"/>
+        </w:rPr>
+        <w:t xml:space="preserve">    </w:t>
+      </w:r>
+      <w:r>
+        <w:rPr>
+          <w:rStyle w:val="DataTypeTok"/>
+        </w:rPr>
+        <w:t xml:space="preserve">"code"</w:t>
+      </w:r>
+      <w:r>
+        <w:rPr>
+          <w:rStyle w:val="FunctionTok"/>
+        </w:rPr>
+        <w:t xml:space="preserve">:</w:t>
+      </w:r>
+      <w:r>
+        <w:rPr>
+          <w:rStyle w:val="NormalTok"/>
+        </w:rPr>
+        <w:t xml:space="preserve"> </w:t>
+      </w:r>
+      <w:r>
+        <w:rPr>
+          <w:rStyle w:val="StringTok"/>
+        </w:rPr>
+        <w:t xml:space="preserve">"Wathiq.Documents:ExpiryBeforeIssue"</w:t>
+      </w:r>
+      <w:r>
+        <w:rPr>
+          <w:rStyle w:val="FunctionTok"/>
+        </w:rPr>
+        <w:t xml:space="preserve">,</w:t>
+      </w:r>
+      <w:r>
+        <w:br/>
+      </w:r>
+      <w:r>
+        <w:rPr>
+          <w:rStyle w:val="NormalTok"/>
+        </w:rPr>
+        <w:t xml:space="preserve">    </w:t>
+      </w:r>
+      <w:r>
+        <w:rPr>
+          <w:rStyle w:val="DataTypeTok"/>
+        </w:rPr>
+        <w:t xml:space="preserve">"message"</w:t>
+      </w:r>
+      <w:r>
+        <w:rPr>
+          <w:rStyle w:val="FunctionTok"/>
+        </w:rPr>
+        <w:t xml:space="preserve">:</w:t>
+      </w:r>
+      <w:r>
+        <w:rPr>
+          <w:rStyle w:val="NormalTok"/>
+        </w:rPr>
+        <w:t xml:space="preserve"> </w:t>
+      </w:r>
+      <w:r>
+        <w:rPr>
+          <w:rStyle w:val="StringTok"/>
+        </w:rPr>
+        <w:t xml:space="preserve">"لا يمكن أن يكون تاريخ الانتهاء قبل تاريخ الإصدار."</w:t>
+      </w:r>
+      <w:r>
+        <w:rPr>
+          <w:rStyle w:val="FunctionTok"/>
+        </w:rPr>
+        <w:t xml:space="preserve">,</w:t>
+      </w:r>
+      <w:r>
+        <w:br/>
+      </w:r>
+      <w:r>
+        <w:rPr>
+          <w:rStyle w:val="NormalTok"/>
+        </w:rPr>
+        <w:t xml:space="preserve">    </w:t>
+      </w:r>
+      <w:r>
+        <w:rPr>
+          <w:rStyle w:val="DataTypeTok"/>
+        </w:rPr>
+        <w:t xml:space="preserve">"data"</w:t>
+      </w:r>
+      <w:r>
+        <w:rPr>
+          <w:rStyle w:val="FunctionTok"/>
+        </w:rPr>
+        <w:t xml:space="preserve">:</w:t>
+      </w:r>
+      <w:r>
+        <w:rPr>
+          <w:rStyle w:val="NormalTok"/>
+        </w:rPr>
+        <w:t xml:space="preserve"> </w:t>
+      </w:r>
+      <w:r>
+        <w:rPr>
+          <w:rStyle w:val="FunctionTok"/>
+        </w:rPr>
+        <w:t xml:space="preserve">{</w:t>
+      </w:r>
+      <w:r>
+        <w:rPr>
+          <w:rStyle w:val="NormalTok"/>
+        </w:rPr>
+        <w:t xml:space="preserve"> </w:t>
+      </w:r>
+      <w:r>
+        <w:rPr>
+          <w:rStyle w:val="DataTypeTok"/>
+        </w:rPr>
+        <w:t xml:space="preserve">"IssueDate"</w:t>
+      </w:r>
+      <w:r>
+        <w:rPr>
+          <w:rStyle w:val="FunctionTok"/>
+        </w:rPr>
+        <w:t xml:space="preserve">:</w:t>
+      </w:r>
+      <w:r>
+        <w:rPr>
+          <w:rStyle w:val="NormalTok"/>
+        </w:rPr>
+        <w:t xml:space="preserve"> </w:t>
+      </w:r>
+      <w:r>
+        <w:rPr>
+          <w:rStyle w:val="StringTok"/>
+        </w:rPr>
+        <w:t xml:space="preserve">"2030-01-01"</w:t>
+      </w:r>
+      <w:r>
+        <w:rPr>
+          <w:rStyle w:val="FunctionTok"/>
+        </w:rPr>
+        <w:t xml:space="preserve">,</w:t>
+      </w:r>
+      <w:r>
+        <w:rPr>
+          <w:rStyle w:val="NormalTok"/>
+        </w:rPr>
+        <w:t xml:space="preserve"> </w:t>
+      </w:r>
+      <w:r>
+        <w:rPr>
+          <w:rStyle w:val="DataTypeTok"/>
+        </w:rPr>
+        <w:t xml:space="preserve">"ExpiryDate"</w:t>
+      </w:r>
+      <w:r>
+        <w:rPr>
+          <w:rStyle w:val="FunctionTok"/>
+        </w:rPr>
+        <w:t xml:space="preserve">:</w:t>
+      </w:r>
+      <w:r>
+        <w:rPr>
+          <w:rStyle w:val="NormalTok"/>
+        </w:rPr>
+        <w:t xml:space="preserve"> </w:t>
+      </w:r>
+      <w:r>
+        <w:rPr>
+          <w:rStyle w:val="StringTok"/>
+        </w:rPr>
+        <w:t xml:space="preserve">"2020-01-01"</w:t>
+      </w:r>
+      <w:r>
+        <w:rPr>
+          <w:rStyle w:val="NormalTok"/>
+        </w:rPr>
+        <w:t xml:space="preserve"> </w:t>
+      </w:r>
+      <w:r>
+        <w:rPr>
+          <w:rStyle w:val="FunctionTok"/>
+        </w:rPr>
+        <w:t xml:space="preserve">}</w:t>
+      </w:r>
+      <w:r>
+        <w:rPr>
+          <w:rStyle w:val="NormalTok"/>
+        </w:rPr>
+        <w:t xml:space="preserve"> </w:t>
+      </w:r>
+      <w:r>
+        <w:rPr>
+          <w:rStyle w:val="FunctionTok"/>
+        </w:rPr>
+        <w:t xml:space="preserve">}</w:t>
+      </w:r>
+      <w:r>
+        <w:rPr>
+          <w:rStyle w:val="NormalTok"/>
+        </w:rPr>
+        <w:t xml:space="preserve"> </w:t>
+      </w:r>
+      <w:r>
+        <w:rPr>
+          <w:rStyle w:val="FunctionTok"/>
+        </w:rPr>
+        <w:t xml:space="preserve">}</w:t>
+      </w:r>
+    </w:p>
+    <w:bookmarkEnd w:id="39"/>
+    <w:bookmarkStart w:id="40" w:name="infrastructure-endpoints-abp-built-ins"/>
+    <w:p>
+      <w:pPr>
+        <w:pStyle w:val="Heading1"/>
+      </w:pPr>
+      <w:r>
+        <w:rPr>
+          <w:rStyle w:val="SectionNumber"/>
+        </w:rPr>
+        <w:t xml:space="preserve">7</w:t>
+      </w:r>
+      <w:r>
+        <w:tab/>
+      </w:r>
+      <w:r>
+        <w:t xml:space="preserve">7. Infrastructure endpoints (ABP built-ins)</w:t>
+      </w:r>
+    </w:p>
+    <w:p>
+      <w:pPr>
+        <w:pStyle w:val="FirstParagraph"/>
+      </w:pPr>
+      <w:r>
+        <w:t xml:space="preserve">Summarized — full detail is in Swagger. Admin-tagged groups require admin permissions.</w:t>
+      </w:r>
+    </w:p>
+    <w:tbl>
+      <w:tblPr>
+        <w:tblStyle w:val="Table"/>
+        <w:tblW w:type="pct" w:w="5000"/>
+        <w:tblLook w:firstRow="1" w:lastRow="0" w:firstColumn="0" w:lastColumn="0" w:noHBand="0" w:noVBand="0" w:val="0020"/>
+        <w:jc w:val="start"/>
+      </w:tblPr>
+      <w:tblGrid>
+        <w:gridCol w:w="2640"/>
+        <w:gridCol w:w="2640"/>
+        <w:gridCol w:w="2640"/>
+      </w:tblGrid>
+      <w:tr>
+        <w:trPr>
+          <w:tblHeader w:val="true"/>
+        </w:trPr>
+        <w:tc>
+          <w:tcPr/>
+          <w:p>
+            <w:pPr>
+              <w:pStyle w:val="Compact"/>
+              <w:jc w:val="left"/>
+            </w:pPr>
+            <w:r>
+              <w:t xml:space="preserve">Area</w:t>
+            </w:r>
+          </w:p>
+        </w:tc>
+        <w:tc>
+          <w:tcPr/>
+          <w:p>
+            <w:pPr>
+              <w:pStyle w:val="Compact"/>
+              <w:jc w:val="left"/>
+            </w:pPr>
+            <w:r>
+              <w:t xml:space="preserve">Root</w:t>
+            </w:r>
+          </w:p>
+        </w:tc>
+        <w:tc>
+          <w:tcPr/>
+          <w:p>
+            <w:pPr>
+              <w:pStyle w:val="Compact"/>
+              <w:jc w:val="left"/>
+            </w:pPr>
+            <w:r>
+              <w:t xml:space="preserve">Notes</w:t>
             </w:r>
           </w:p>
         </w:tc>
@@ -5949,6 +6207,182 @@
               <w:jc w:val="left"/>
             </w:pPr>
             <w:r>
+              <w:t xml:space="preserve">Account</w:t>
+            </w:r>
+          </w:p>
+        </w:tc>
+        <w:tc>
+          <w:tcPr/>
+          <w:p>
+            <w:pPr>
+              <w:pStyle w:val="Compact"/>
+              <w:jc w:val="left"/>
+            </w:pPr>
+            <w:r>
+              <w:rPr>
+                <w:rStyle w:val="VerbatimChar"/>
+              </w:rPr>
+              <w:t xml:space="preserve">/api/account/*</w:t>
+            </w:r>
+          </w:p>
+        </w:tc>
+        <w:tc>
+          <w:tcPr/>
+          <w:p>
+            <w:pPr>
+              <w:pStyle w:val="Compact"/>
+              <w:jc w:val="left"/>
+            </w:pPr>
+            <w:r>
+              <w:t xml:space="preserve">register, login/logout, reset-password, my-profile, change-password</w:t>
+            </w:r>
+          </w:p>
+        </w:tc>
+      </w:tr>
+      <w:tr>
+        <w:tc>
+          <w:tcPr/>
+          <w:p>
+            <w:pPr>
+              <w:pStyle w:val="Compact"/>
+              <w:jc w:val="left"/>
+            </w:pPr>
+            <w:r>
+              <w:t xml:space="preserve">Identity admin</w:t>
+            </w:r>
+          </w:p>
+        </w:tc>
+        <w:tc>
+          <w:tcPr/>
+          <w:p>
+            <w:pPr>
+              <w:pStyle w:val="Compact"/>
+              <w:jc w:val="left"/>
+            </w:pPr>
+            <w:r>
+              <w:rPr>
+                <w:rStyle w:val="VerbatimChar"/>
+              </w:rPr>
+              <w:t xml:space="preserve">/api/identity/users</w:t>
+            </w:r>
+            <w:r>
+              <w:t xml:space="preserve">,</w:t>
+            </w:r>
+            <w:r>
+              <w:t xml:space="preserve"> </w:t>
+            </w:r>
+            <w:r>
+              <w:rPr>
+                <w:rStyle w:val="VerbatimChar"/>
+              </w:rPr>
+              <w:t xml:space="preserve">/api/identity/roles</w:t>
+            </w:r>
+          </w:p>
+        </w:tc>
+        <w:tc>
+          <w:tcPr/>
+          <w:p>
+            <w:pPr>
+              <w:pStyle w:val="Compact"/>
+              <w:jc w:val="left"/>
+            </w:pPr>
+            <w:r>
+              <w:t xml:space="preserve">user/role CRUD (admin)</w:t>
+            </w:r>
+          </w:p>
+        </w:tc>
+      </w:tr>
+      <w:tr>
+        <w:tc>
+          <w:tcPr/>
+          <w:p>
+            <w:pPr>
+              <w:pStyle w:val="Compact"/>
+              <w:jc w:val="left"/>
+            </w:pPr>
+            <w:r>
+              <w:t xml:space="preserve">Permission management</w:t>
+            </w:r>
+          </w:p>
+        </w:tc>
+        <w:tc>
+          <w:tcPr/>
+          <w:p>
+            <w:pPr>
+              <w:pStyle w:val="Compact"/>
+              <w:jc w:val="left"/>
+            </w:pPr>
+            <w:r>
+              <w:rPr>
+                <w:rStyle w:val="VerbatimChar"/>
+              </w:rPr>
+              <w:t xml:space="preserve">/api/permission-management/permissions</w:t>
+            </w:r>
+          </w:p>
+        </w:tc>
+        <w:tc>
+          <w:tcPr/>
+          <w:p>
+            <w:pPr>
+              <w:pStyle w:val="Compact"/>
+              <w:jc w:val="left"/>
+            </w:pPr>
+            <w:r>
+              <w:t xml:space="preserve">read/update grants (admin)</w:t>
+            </w:r>
+          </w:p>
+        </w:tc>
+      </w:tr>
+      <w:tr>
+        <w:tc>
+          <w:tcPr/>
+          <w:p>
+            <w:pPr>
+              <w:pStyle w:val="Compact"/>
+              <w:jc w:val="left"/>
+            </w:pPr>
+            <w:r>
+              <w:t xml:space="preserve">App configuration</w:t>
+            </w:r>
+          </w:p>
+        </w:tc>
+        <w:tc>
+          <w:tcPr/>
+          <w:p>
+            <w:pPr>
+              <w:pStyle w:val="Compact"/>
+              <w:jc w:val="left"/>
+            </w:pPr>
+            <w:r>
+              <w:rPr>
+                <w:rStyle w:val="VerbatimChar"/>
+              </w:rPr>
+              <w:t xml:space="preserve">/api/abp/application-configuration</w:t>
+            </w:r>
+          </w:p>
+        </w:tc>
+        <w:tc>
+          <w:tcPr/>
+          <w:p>
+            <w:pPr>
+              <w:pStyle w:val="Compact"/>
+              <w:jc w:val="left"/>
+            </w:pPr>
+            <w:r>
+              <w:t xml:space="preserve">current user, permissions, localization — the client bootstrap call</w:t>
+            </w:r>
+          </w:p>
+        </w:tc>
+      </w:tr>
+      <w:tr>
+        <w:tc>
+          <w:tcPr/>
+          <w:p>
+            <w:pPr>
+              <w:pStyle w:val="Compact"/>
+              <w:jc w:val="left"/>
+            </w:pPr>
+            <w:r>
               <w:t xml:space="preserve">Settings</w:t>
             </w:r>
           </w:p>
@@ -5982,8 +6416,8 @@
         </w:tc>
       </w:tr>
     </w:tbl>
-    <w:bookmarkEnd w:id="39"/>
-    <w:bookmarkStart w:id="40" w:name="planned"/>
+    <w:bookmarkEnd w:id="40"/>
+    <w:bookmarkStart w:id="41" w:name="planned"/>
     <w:p>
       <w:pPr>
         <w:pStyle w:val="Heading1"/>
@@ -6150,7 +6584,7 @@
         </w:tc>
       </w:tr>
     </w:tbl>
-    <w:bookmarkEnd w:id="40"/>
+    <w:bookmarkEnd w:id="41"/>
     <w:sectPr>
       <w:footnotePr>
         <w:numRestart w:val="eachSect"/>

</xml_diff>

<commit_message>
step(3.7): close the UC-01 loop with extract, review and confirm endpoints
Learned: draft-in-escrow API shape, re-parse over re-ask, Accepted/Edited as eval labels, requiresNew failure rows, cross-module payoff of aggregate-routed writes

Co-Authored-By: Claude Fable 5 <noreply@anthropic.com>
Claude-Session: https://claude.ai/code/session_01XCaaD2oSfQhWv3vNENZDue
</commit_message>
<xml_diff>
--- a/docs/deliverables/out/Api.docx
+++ b/docs/deliverables/out/Api.docx
@@ -342,6 +342,56 @@
           </w:p>
         </w:tc>
       </w:tr>
+      <w:tr>
+        <w:tc>
+          <w:tcPr/>
+          <w:p>
+            <w:pPr>
+              <w:pStyle w:val="Compact"/>
+              <w:jc w:val="left"/>
+            </w:pPr>
+            <w:r>
+              <w:t xml:space="preserve">0.1.3</w:t>
+            </w:r>
+          </w:p>
+        </w:tc>
+        <w:tc>
+          <w:tcPr/>
+          <w:p>
+            <w:pPr>
+              <w:pStyle w:val="Compact"/>
+              <w:jc w:val="left"/>
+            </w:pPr>
+            <w:r>
+              <w:t xml:space="preserve">2026-08-29</w:t>
+            </w:r>
+          </w:p>
+        </w:tc>
+        <w:tc>
+          <w:tcPr/>
+          <w:p>
+            <w:pPr>
+              <w:pStyle w:val="Compact"/>
+              <w:jc w:val="left"/>
+            </w:pPr>
+            <w:r>
+              <w:t xml:space="preserve">Abdulsalam</w:t>
+            </w:r>
+          </w:p>
+        </w:tc>
+        <w:tc>
+          <w:tcPr/>
+          <w:p>
+            <w:pPr>
+              <w:pStyle w:val="Compact"/>
+              <w:jc w:val="left"/>
+            </w:pPr>
+            <w:r>
+              <w:t xml:space="preserve">§4.5 extraction endpoints (trigger/latest/confirm/reject) from the regenerated spec; live failure-path example (roadmap step 3.7)</w:t>
+            </w:r>
+          </w:p>
+        </w:tc>
+      </w:tr>
     </w:tbl>
     <w:p>
       <w:pPr>
@@ -2331,7 +2381,7 @@
     </w:p>
     <w:bookmarkEnd w:id="30"/>
     <w:bookmarkEnd w:id="31"/>
-    <w:bookmarkStart w:id="37" w:name="documents-module-endpoints"/>
+    <w:bookmarkStart w:id="38" w:name="documents-module-endpoints"/>
     <w:p>
       <w:pPr>
         <w:pStyle w:val="Heading1"/>
@@ -4126,7 +4176,7 @@
       </w:r>
     </w:p>
     <w:bookmarkEnd w:id="35"/>
-    <w:bookmarkStart w:id="36" w:name="X88bdf6ce1de7c5c01445c063d9e61e1542223a6"/>
+    <w:bookmarkStart w:id="36" w:name="X9a050533f1c20d4c035e7f505b9eb6635d78ffd"/>
     <w:p>
       <w:pPr>
         <w:pStyle w:val="Heading2"/>
@@ -4141,569 +4191,7 @@
         <w:tab/>
       </w:r>
       <w:r>
-        <w:t xml:space="preserve">4.5 Live example (recorded against the running host)</w:t>
-      </w:r>
-    </w:p>
-    <w:p>
-      <w:pPr>
-        <w:pStyle w:val="SourceCode"/>
-      </w:pPr>
-      <w:r>
-        <w:rPr>
-          <w:rStyle w:val="ExtensionTok"/>
-        </w:rPr>
-        <w:t xml:space="preserve">POST</w:t>
-      </w:r>
-      <w:r>
-        <w:rPr>
-          <w:rStyle w:val="NormalTok"/>
-        </w:rPr>
-        <w:t xml:space="preserve"> /api/documents/documents            Authorization: Bearer </w:t>
-      </w:r>
-      <w:r>
-        <w:rPr>
-          <w:rStyle w:val="OperatorTok"/>
-        </w:rPr>
-        <w:t xml:space="preserve">&lt;</w:t>
-      </w:r>
-      <w:r>
-        <w:rPr>
-          <w:rStyle w:val="NormalTok"/>
-        </w:rPr>
-        <w:t xml:space="preserve">user token</w:t>
-      </w:r>
-      <w:r>
-        <w:rPr>
-          <w:rStyle w:val="OperatorTok"/>
-        </w:rPr>
-        <w:t xml:space="preserve">&gt;</w:t>
-      </w:r>
-      <w:r>
-        <w:br/>
-      </w:r>
-      <w:r>
-        <w:rPr>
-          <w:rStyle w:val="KeywordTok"/>
-        </w:rPr>
-        <w:t xml:space="preserve">{</w:t>
-      </w:r>
-      <w:r>
-        <w:rPr>
-          <w:rStyle w:val="NormalTok"/>
-        </w:rPr>
-        <w:t xml:space="preserve"> </w:t>
-      </w:r>
-      <w:r>
-        <w:rPr>
-          <w:rStyle w:val="StringTok"/>
-        </w:rPr>
-        <w:t xml:space="preserve">"holderId"</w:t>
-      </w:r>
-      <w:r>
-        <w:rPr>
-          <w:rStyle w:val="ExtensionTok"/>
-        </w:rPr>
-        <w:t xml:space="preserve">:</w:t>
-      </w:r>
-      <w:r>
-        <w:rPr>
-          <w:rStyle w:val="NormalTok"/>
-        </w:rPr>
-        <w:t xml:space="preserve"> </w:t>
-      </w:r>
-      <w:r>
-        <w:rPr>
-          <w:rStyle w:val="StringTok"/>
-        </w:rPr>
-        <w:t xml:space="preserve">"6a3d8b35-…"</w:t>
-      </w:r>
-      <w:r>
-        <w:rPr>
-          <w:rStyle w:val="NormalTok"/>
-        </w:rPr>
-        <w:t xml:space="preserve">, </w:t>
-      </w:r>
-      <w:r>
-        <w:rPr>
-          <w:rStyle w:val="StringTok"/>
-        </w:rPr>
-        <w:t xml:space="preserve">"documentTypeId"</w:t>
-      </w:r>
-      <w:r>
-        <w:rPr>
-          <w:rStyle w:val="NormalTok"/>
-        </w:rPr>
-        <w:t xml:space="preserve">: </w:t>
-      </w:r>
-      <w:r>
-        <w:rPr>
-          <w:rStyle w:val="StringTok"/>
-        </w:rPr>
-        <w:t xml:space="preserve">"6ff4d4bc-…"</w:t>
-      </w:r>
-      <w:r>
-        <w:rPr>
-          <w:rStyle w:val="NormalTok"/>
-        </w:rPr>
-        <w:t xml:space="preserve">,</w:t>
-      </w:r>
-      <w:r>
-        <w:br/>
-      </w:r>
-      <w:r>
-        <w:rPr>
-          <w:rStyle w:val="NormalTok"/>
-        </w:rPr>
-        <w:t xml:space="preserve">  </w:t>
-      </w:r>
-      <w:r>
-        <w:rPr>
-          <w:rStyle w:val="StringTok"/>
-        </w:rPr>
-        <w:t xml:space="preserve">"number"</w:t>
-      </w:r>
-      <w:r>
-        <w:rPr>
-          <w:rStyle w:val="ExtensionTok"/>
-        </w:rPr>
-        <w:t xml:space="preserve">:</w:t>
-      </w:r>
-      <w:r>
-        <w:rPr>
-          <w:rStyle w:val="NormalTok"/>
-        </w:rPr>
-        <w:t xml:space="preserve"> </w:t>
-      </w:r>
-      <w:r>
-        <w:rPr>
-          <w:rStyle w:val="StringTok"/>
-        </w:rPr>
-        <w:t xml:space="preserve">"P1234567"</w:t>
-      </w:r>
-      <w:r>
-        <w:rPr>
-          <w:rStyle w:val="NormalTok"/>
-        </w:rPr>
-        <w:t xml:space="preserve">, </w:t>
-      </w:r>
-      <w:r>
-        <w:rPr>
-          <w:rStyle w:val="StringTok"/>
-        </w:rPr>
-        <w:t xml:space="preserve">"issueDate"</w:t>
-      </w:r>
-      <w:r>
-        <w:rPr>
-          <w:rStyle w:val="NormalTok"/>
-        </w:rPr>
-        <w:t xml:space="preserve">: </w:t>
-      </w:r>
-      <w:r>
-        <w:rPr>
-          <w:rStyle w:val="StringTok"/>
-        </w:rPr>
-        <w:t xml:space="preserve">"2020-09-01"</w:t>
-      </w:r>
-      <w:r>
-        <w:rPr>
-          <w:rStyle w:val="NormalTok"/>
-        </w:rPr>
-        <w:t xml:space="preserve">, </w:t>
-      </w:r>
-      <w:r>
-        <w:rPr>
-          <w:rStyle w:val="StringTok"/>
-        </w:rPr>
-        <w:t xml:space="preserve">"expiryDate"</w:t>
-      </w:r>
-      <w:r>
-        <w:rPr>
-          <w:rStyle w:val="NormalTok"/>
-        </w:rPr>
-        <w:t xml:space="preserve">: </w:t>
-      </w:r>
-      <w:r>
-        <w:rPr>
-          <w:rStyle w:val="StringTok"/>
-        </w:rPr>
-        <w:t xml:space="preserve">"2030-09-01"</w:t>
-      </w:r>
-      <w:r>
-        <w:rPr>
-          <w:rStyle w:val="NormalTok"/>
-        </w:rPr>
-        <w:t xml:space="preserve">,</w:t>
-      </w:r>
-      <w:r>
-        <w:br/>
-      </w:r>
-      <w:r>
-        <w:rPr>
-          <w:rStyle w:val="NormalTok"/>
-        </w:rPr>
-        <w:t xml:space="preserve">  </w:t>
-      </w:r>
-      <w:r>
-        <w:rPr>
-          <w:rStyle w:val="StringTok"/>
-        </w:rPr>
-        <w:t xml:space="preserve">"notes"</w:t>
-      </w:r>
-      <w:r>
-        <w:rPr>
-          <w:rStyle w:val="ExtensionTok"/>
-        </w:rPr>
-        <w:t xml:space="preserve">:</w:t>
-      </w:r>
-      <w:r>
-        <w:rPr>
-          <w:rStyle w:val="NormalTok"/>
-        </w:rPr>
-        <w:t xml:space="preserve"> </w:t>
-      </w:r>
-      <w:r>
-        <w:rPr>
-          <w:rStyle w:val="StringTok"/>
-        </w:rPr>
-        <w:t xml:space="preserve">"جواز سفر سالم"</w:t>
-      </w:r>
-      <w:r>
-        <w:rPr>
-          <w:rStyle w:val="NormalTok"/>
-        </w:rPr>
-        <w:t xml:space="preserve"> }</w:t>
-      </w:r>
-      <w:r>
-        <w:br/>
-      </w:r>
-      <w:r>
-        <w:br/>
-      </w:r>
-      <w:r>
-        <w:rPr>
-          <w:rStyle w:val="ExtensionTok"/>
-        </w:rPr>
-        <w:t xml:space="preserve">200</w:t>
-      </w:r>
-      <w:r>
-        <w:rPr>
-          <w:rStyle w:val="NormalTok"/>
-        </w:rPr>
-        <w:t xml:space="preserve"> OK</w:t>
-      </w:r>
-      <w:r>
-        <w:br/>
-      </w:r>
-      <w:r>
-        <w:rPr>
-          <w:rStyle w:val="KeywordTok"/>
-        </w:rPr>
-        <w:t xml:space="preserve">{</w:t>
-      </w:r>
-      <w:r>
-        <w:rPr>
-          <w:rStyle w:val="NormalTok"/>
-        </w:rPr>
-        <w:t xml:space="preserve"> </w:t>
-      </w:r>
-      <w:r>
-        <w:rPr>
-          <w:rStyle w:val="StringTok"/>
-        </w:rPr>
-        <w:t xml:space="preserve">"id"</w:t>
-      </w:r>
-      <w:r>
-        <w:rPr>
-          <w:rStyle w:val="ExtensionTok"/>
-        </w:rPr>
-        <w:t xml:space="preserve">:</w:t>
-      </w:r>
-      <w:r>
-        <w:rPr>
-          <w:rStyle w:val="NormalTok"/>
-        </w:rPr>
-        <w:t xml:space="preserve"> </w:t>
-      </w:r>
-      <w:r>
-        <w:rPr>
-          <w:rStyle w:val="StringTok"/>
-        </w:rPr>
-        <w:t xml:space="preserve">"5560255a-…"</w:t>
-      </w:r>
-      <w:r>
-        <w:rPr>
-          <w:rStyle w:val="NormalTok"/>
-        </w:rPr>
-        <w:t xml:space="preserve">, </w:t>
-      </w:r>
-      <w:r>
-        <w:rPr>
-          <w:rStyle w:val="StringTok"/>
-        </w:rPr>
-        <w:t xml:space="preserve">"holderId"</w:t>
-      </w:r>
-      <w:r>
-        <w:rPr>
-          <w:rStyle w:val="NormalTok"/>
-        </w:rPr>
-        <w:t xml:space="preserve">: </w:t>
-      </w:r>
-      <w:r>
-        <w:rPr>
-          <w:rStyle w:val="StringTok"/>
-        </w:rPr>
-        <w:t xml:space="preserve">"6a3d8b35-…"</w:t>
-      </w:r>
-      <w:r>
-        <w:rPr>
-          <w:rStyle w:val="NormalTok"/>
-        </w:rPr>
-        <w:t xml:space="preserve">, </w:t>
-      </w:r>
-      <w:r>
-        <w:rPr>
-          <w:rStyle w:val="StringTok"/>
-        </w:rPr>
-        <w:t xml:space="preserve">"documentTypeId"</w:t>
-      </w:r>
-      <w:r>
-        <w:rPr>
-          <w:rStyle w:val="NormalTok"/>
-        </w:rPr>
-        <w:t xml:space="preserve">: </w:t>
-      </w:r>
-      <w:r>
-        <w:rPr>
-          <w:rStyle w:val="StringTok"/>
-        </w:rPr>
-        <w:t xml:space="preserve">"6ff4d4bc-…"</w:t>
-      </w:r>
-      <w:r>
-        <w:rPr>
-          <w:rStyle w:val="NormalTok"/>
-        </w:rPr>
-        <w:t xml:space="preserve">,</w:t>
-      </w:r>
-      <w:r>
-        <w:br/>
-      </w:r>
-      <w:r>
-        <w:rPr>
-          <w:rStyle w:val="NormalTok"/>
-        </w:rPr>
-        <w:t xml:space="preserve">  </w:t>
-      </w:r>
-      <w:r>
-        <w:rPr>
-          <w:rStyle w:val="StringTok"/>
-        </w:rPr>
-        <w:t xml:space="preserve">"number"</w:t>
-      </w:r>
-      <w:r>
-        <w:rPr>
-          <w:rStyle w:val="ExtensionTok"/>
-        </w:rPr>
-        <w:t xml:space="preserve">:</w:t>
-      </w:r>
-      <w:r>
-        <w:rPr>
-          <w:rStyle w:val="NormalTok"/>
-        </w:rPr>
-        <w:t xml:space="preserve"> </w:t>
-      </w:r>
-      <w:r>
-        <w:rPr>
-          <w:rStyle w:val="StringTok"/>
-        </w:rPr>
-        <w:t xml:space="preserve">"P1234567"</w:t>
-      </w:r>
-      <w:r>
-        <w:rPr>
-          <w:rStyle w:val="NormalTok"/>
-        </w:rPr>
-        <w:t xml:space="preserve">, </w:t>
-      </w:r>
-      <w:r>
-        <w:rPr>
-          <w:rStyle w:val="StringTok"/>
-        </w:rPr>
-        <w:t xml:space="preserve">"issueDate"</w:t>
-      </w:r>
-      <w:r>
-        <w:rPr>
-          <w:rStyle w:val="NormalTok"/>
-        </w:rPr>
-        <w:t xml:space="preserve">: </w:t>
-      </w:r>
-      <w:r>
-        <w:rPr>
-          <w:rStyle w:val="StringTok"/>
-        </w:rPr>
-        <w:t xml:space="preserve">"2020-09-01"</w:t>
-      </w:r>
-      <w:r>
-        <w:rPr>
-          <w:rStyle w:val="NormalTok"/>
-        </w:rPr>
-        <w:t xml:space="preserve">, </w:t>
-      </w:r>
-      <w:r>
-        <w:rPr>
-          <w:rStyle w:val="StringTok"/>
-        </w:rPr>
-        <w:t xml:space="preserve">"expiryDate"</w:t>
-      </w:r>
-      <w:r>
-        <w:rPr>
-          <w:rStyle w:val="NormalTok"/>
-        </w:rPr>
-        <w:t xml:space="preserve">: </w:t>
-      </w:r>
-      <w:r>
-        <w:rPr>
-          <w:rStyle w:val="StringTok"/>
-        </w:rPr>
-        <w:t xml:space="preserve">"2030-09-01"</w:t>
-      </w:r>
-      <w:r>
-        <w:rPr>
-          <w:rStyle w:val="NormalTok"/>
-        </w:rPr>
-        <w:t xml:space="preserve">,</w:t>
-      </w:r>
-      <w:r>
-        <w:br/>
-      </w:r>
-      <w:r>
-        <w:rPr>
-          <w:rStyle w:val="NormalTok"/>
-        </w:rPr>
-        <w:t xml:space="preserve">  </w:t>
-      </w:r>
-      <w:r>
-        <w:rPr>
-          <w:rStyle w:val="StringTok"/>
-        </w:rPr>
-        <w:t xml:space="preserve">"status"</w:t>
-      </w:r>
-      <w:r>
-        <w:rPr>
-          <w:rStyle w:val="ExtensionTok"/>
-        </w:rPr>
-        <w:t xml:space="preserve">:</w:t>
-      </w:r>
-      <w:r>
-        <w:rPr>
-          <w:rStyle w:val="NormalTok"/>
-        </w:rPr>
-        <w:t xml:space="preserve"> 0, </w:t>
-      </w:r>
-      <w:r>
-        <w:rPr>
-          <w:rStyle w:val="StringTok"/>
-        </w:rPr>
-        <w:t xml:space="preserve">"notes"</w:t>
-      </w:r>
-      <w:r>
-        <w:rPr>
-          <w:rStyle w:val="NormalTok"/>
-        </w:rPr>
-        <w:t xml:space="preserve">: </w:t>
-      </w:r>
-      <w:r>
-        <w:rPr>
-          <w:rStyle w:val="StringTok"/>
-        </w:rPr>
-        <w:t xml:space="preserve">"جواز سفر سالم"</w:t>
-      </w:r>
-      <w:r>
-        <w:rPr>
-          <w:rStyle w:val="NormalTok"/>
-        </w:rPr>
-        <w:t xml:space="preserve">, </w:t>
-      </w:r>
-      <w:r>
-        <w:rPr>
-          <w:rStyle w:val="StringTok"/>
-        </w:rPr>
-        <w:t xml:space="preserve">"previousExpiryDate"</w:t>
-      </w:r>
-      <w:r>
-        <w:rPr>
-          <w:rStyle w:val="NormalTok"/>
-        </w:rPr>
-        <w:t xml:space="preserve">: null,</w:t>
-      </w:r>
-      <w:r>
-        <w:br/>
-      </w:r>
-      <w:r>
-        <w:rPr>
-          <w:rStyle w:val="NormalTok"/>
-        </w:rPr>
-        <w:t xml:space="preserve">  </w:t>
-      </w:r>
-      <w:r>
-        <w:rPr>
-          <w:rStyle w:val="StringTok"/>
-        </w:rPr>
-        <w:t xml:space="preserve">"daysUntilExpiry"</w:t>
-      </w:r>
-      <w:r>
-        <w:rPr>
-          <w:rStyle w:val="ExtensionTok"/>
-        </w:rPr>
-        <w:t xml:space="preserve">:</w:t>
-      </w:r>
-      <w:r>
-        <w:rPr>
-          <w:rStyle w:val="NormalTok"/>
-        </w:rPr>
-        <w:t xml:space="preserve"> 1466, </w:t>
-      </w:r>
-      <w:r>
-        <w:rPr>
-          <w:rStyle w:val="StringTok"/>
-        </w:rPr>
-        <w:t xml:space="preserve">"creationTime"</w:t>
-      </w:r>
-      <w:r>
-        <w:rPr>
-          <w:rStyle w:val="NormalTok"/>
-        </w:rPr>
-        <w:t xml:space="preserve">: </w:t>
-      </w:r>
-      <w:r>
-        <w:rPr>
-          <w:rStyle w:val="StringTok"/>
-        </w:rPr>
-        <w:t xml:space="preserve">"2026-08-27T14:18:16.58+00:00"</w:t>
-      </w:r>
-      <w:r>
-        <w:rPr>
-          <w:rStyle w:val="NormalTok"/>
-        </w:rPr>
-        <w:t xml:space="preserve"> }</w:t>
-      </w:r>
-    </w:p>
-    <w:bookmarkEnd w:id="36"/>
-    <w:bookmarkEnd w:id="37"/>
-    <w:bookmarkStart w:id="38" w:name="reminders-module-endpoints"/>
-    <w:p>
-      <w:pPr>
-        <w:pStyle w:val="Heading1"/>
-      </w:pPr>
-      <w:r>
-        <w:rPr>
-          <w:rStyle w:val="SectionNumber"/>
-        </w:rPr>
-        <w:t xml:space="preserve">5</w:t>
-      </w:r>
-      <w:r>
-        <w:tab/>
-      </w:r>
-      <w:r>
-        <w:t xml:space="preserve">5. Reminders module endpoints</w:t>
+        <w:t xml:space="preserve">4.5 Extraction (FR-DOC-005, UC-01 review-confirm loop)</w:t>
       </w:r>
     </w:p>
     <w:p>
@@ -4711,53 +4199,53 @@
         <w:pStyle w:val="FirstParagraph"/>
       </w:pPr>
       <w:r>
-        <w:t xml:space="preserve">Route root</w:t>
-      </w:r>
-      <w:r>
-        <w:t xml:space="preserve"> </w:t>
-      </w:r>
-      <w:r>
-        <w:rPr>
-          <w:rStyle w:val="VerbatimChar"/>
-        </w:rPr>
-        <w:t xml:space="preserve">/api/reminders/*</w:t>
-      </w:r>
-      <w:r>
-        <w:t xml:space="preserve">. The rule is a</w:t>
-      </w:r>
-      <w:r>
-        <w:t xml:space="preserve"> </w:t>
-      </w:r>
-      <w:r>
-        <w:rPr>
-          <w:bCs/>
-          <w:b/>
-        </w:rPr>
-        <w:t xml:space="preserve">singleton resource</w:t>
-      </w:r>
-      <w:r>
-        <w:t xml:space="preserve"> </w:t>
-      </w:r>
-      <w:r>
-        <w:t xml:space="preserve">— one per user, so its</w:t>
-      </w:r>
-      <w:r>
-        <w:t xml:space="preserve"> </w:t>
-      </w:r>
-      <w:r>
-        <w:t xml:space="preserve">routes carry no</w:t>
-      </w:r>
-      <w:r>
-        <w:t xml:space="preserve"> </w:t>
-      </w:r>
-      <w:r>
-        <w:rPr>
-          <w:rStyle w:val="VerbatimChar"/>
-        </w:rPr>
-        <w:t xml:space="preserve">{id}</w:t>
-      </w:r>
-      <w:r>
-        <w:t xml:space="preserve">; the caller’s identity selects the row (created with defaults on first GET).</w:t>
+        <w:t xml:space="preserve">The AI’s output is a</w:t>
+      </w:r>
+      <w:r>
+        <w:t xml:space="preserve"> </w:t>
+      </w:r>
+      <w:r>
+        <w:rPr>
+          <w:iCs/>
+          <w:i/>
+        </w:rPr>
+        <w:t xml:space="preserve">draft in escrow</w:t>
+      </w:r>
+      <w:r>
+        <w:t xml:space="preserve">: extraction stores an</w:t>
+      </w:r>
+      <w:r>
+        <w:t xml:space="preserve"> </w:t>
+      </w:r>
+      <w:r>
+        <w:rPr>
+          <w:rStyle w:val="VerbatimChar"/>
+        </w:rPr>
+        <w:t xml:space="preserve">ExtractionResult</w:t>
+      </w:r>
+      <w:r>
+        <w:t xml:space="preserve"> </w:t>
+      </w:r>
+      <w:r>
+        <w:t xml:space="preserve">row and returns a</w:t>
+      </w:r>
+      <w:r>
+        <w:t xml:space="preserve"> </w:t>
+      </w:r>
+      <w:r>
+        <w:t xml:space="preserve">proposal; nothing touches the document until confirm, where normal domain validation (including</w:t>
+      </w:r>
+      <w:r>
+        <w:t xml:space="preserve"> </w:t>
+      </w:r>
+      <w:r>
+        <w:rPr>
+          <w:rStyle w:val="VerbatimChar"/>
+        </w:rPr>
+        <w:t xml:space="preserve">ExpiryBeforeIssue</w:t>
+      </w:r>
+      <w:r>
+        <w:t xml:space="preserve">) has the last word and the expiry-changed event resyncs reminders (§5).</w:t>
       </w:r>
     </w:p>
     <w:tbl>
@@ -4825,43 +4313,34 @@
               <w:rPr>
                 <w:rStyle w:val="VerbatimChar"/>
               </w:rPr>
-              <w:t xml:space="preserve">GET /api/reminders/rule</w:t>
-            </w:r>
-          </w:p>
-        </w:tc>
-        <w:tc>
-          <w:tcPr/>
-          <w:p>
-            <w:pPr>
-              <w:pStyle w:val="Compact"/>
-              <w:jc w:val="left"/>
-            </w:pPr>
-            <w:r>
-              <w:rPr>
-                <w:rStyle w:val="VerbatimChar"/>
-              </w:rPr>
-              <w:t xml:space="preserve">WathiqReminders.Rule</w:t>
-            </w:r>
-          </w:p>
-        </w:tc>
-        <w:tc>
-          <w:tcPr/>
-          <w:p>
-            <w:pPr>
-              <w:pStyle w:val="Compact"/>
-              <w:jc w:val="left"/>
-            </w:pPr>
-            <w:r>
-              <w:t xml:space="preserve">The caller’s reminder settings; materialises the default (</w:t>
-            </w:r>
-            <w:r>
-              <w:rPr>
-                <w:rStyle w:val="VerbatimChar"/>
-              </w:rPr>
-              <w:t xml:space="preserve">90,30,7,1</w:t>
-            </w:r>
-            <w:r>
-              <w:t xml:space="preserve">, Email,</w:t>
+              <w:t xml:space="preserve">POST /api/documents/document-extraction/{id}/extract/{attachmentId}</w:t>
+            </w:r>
+          </w:p>
+        </w:tc>
+        <w:tc>
+          <w:tcPr/>
+          <w:p>
+            <w:pPr>
+              <w:pStyle w:val="Compact"/>
+              <w:jc w:val="left"/>
+            </w:pPr>
+            <w:r>
+              <w:rPr>
+                <w:rStyle w:val="VerbatimChar"/>
+              </w:rPr>
+              <w:t xml:space="preserve">…Documents.Update</w:t>
+            </w:r>
+          </w:p>
+        </w:tc>
+        <w:tc>
+          <w:tcPr/>
+          <w:p>
+            <w:pPr>
+              <w:pStyle w:val="Compact"/>
+              <w:jc w:val="left"/>
+            </w:pPr>
+            <w:r>
+              <w:t xml:space="preserve">Runs the local model over the attachment’s OCR text. 403</w:t>
             </w:r>
             <w:r>
               <w:t xml:space="preserve"> </w:t>
@@ -4870,10 +4349,58 @@
               <w:rPr>
                 <w:rStyle w:val="VerbatimChar"/>
               </w:rPr>
-              <w:t xml:space="preserve">Asia/Riyadh</w:t>
-            </w:r>
-            <w:r>
-              <w:t xml:space="preserve">) on first call</w:t>
+              <w:t xml:space="preserve">ExtractionNotReady</w:t>
+            </w:r>
+            <w:r>
+              <w:t xml:space="preserve"> </w:t>
+            </w:r>
+            <w:r>
+              <w:t xml:space="preserve">if OCR hasn’t filled yet; 403</w:t>
+            </w:r>
+            <w:r>
+              <w:t xml:space="preserve"> </w:t>
+            </w:r>
+            <w:r>
+              <w:rPr>
+                <w:rStyle w:val="VerbatimChar"/>
+              </w:rPr>
+              <w:t xml:space="preserve">ExtractionFailed</w:t>
+            </w:r>
+            <w:r>
+              <w:t xml:space="preserve"> </w:t>
+            </w:r>
+            <w:r>
+              <w:t xml:space="preserve">if the model is unreachable (a</w:t>
+            </w:r>
+            <w:r>
+              <w:t xml:space="preserve"> </w:t>
+            </w:r>
+            <w:r>
+              <w:rPr>
+                <w:rStyle w:val="VerbatimChar"/>
+              </w:rPr>
+              <w:t xml:space="preserve">Failed</w:t>
+            </w:r>
+            <w:r>
+              <w:t xml:space="preserve"> </w:t>
+            </w:r>
+            <w:r>
+              <w:t xml:space="preserve">result row is still recorded); 403</w:t>
+            </w:r>
+            <w:r>
+              <w:t xml:space="preserve"> </w:t>
+            </w:r>
+            <w:r>
+              <w:rPr>
+                <w:rStyle w:val="VerbatimChar"/>
+              </w:rPr>
+              <w:t xml:space="preserve">Wathiq.Ai:DailyCapExceeded</w:t>
+            </w:r>
+            <w:r>
+              <w:t xml:space="preserve"> </w:t>
+            </w:r>
+            <w:r>
+              <w:t xml:space="preserve">past the per-user cap</w:t>
             </w:r>
           </w:p>
         </w:tc>
@@ -4890,62 +4417,49 @@
               <w:rPr>
                 <w:rStyle w:val="VerbatimChar"/>
               </w:rPr>
-              <w:t xml:space="preserve">PUT /api/reminders/rule</w:t>
-            </w:r>
-          </w:p>
-        </w:tc>
-        <w:tc>
-          <w:tcPr/>
-          <w:p>
-            <w:pPr>
-              <w:pStyle w:val="Compact"/>
-              <w:jc w:val="left"/>
-            </w:pPr>
-            <w:r>
-              <w:rPr>
-                <w:rStyle w:val="VerbatimChar"/>
-              </w:rPr>
-              <w:t xml:space="preserve">…Rule.Update</w:t>
-            </w:r>
-          </w:p>
-        </w:tc>
-        <w:tc>
-          <w:tcPr/>
-          <w:p>
-            <w:pPr>
-              <w:pStyle w:val="Compact"/>
-              <w:jc w:val="left"/>
-            </w:pPr>
-            <w:r>
-              <w:t xml:space="preserve">Update settings;</w:t>
+              <w:t xml:space="preserve">GET /api/documents/document-extraction/{id}/latest/{attachmentId}</w:t>
+            </w:r>
+          </w:p>
+        </w:tc>
+        <w:tc>
+          <w:tcPr/>
+          <w:p>
+            <w:pPr>
+              <w:pStyle w:val="Compact"/>
+              <w:jc w:val="left"/>
+            </w:pPr>
+            <w:r>
+              <w:rPr>
+                <w:rStyle w:val="VerbatimChar"/>
+              </w:rPr>
+              <w:t xml:space="preserve">…Documents</w:t>
+            </w:r>
+          </w:p>
+        </w:tc>
+        <w:tc>
+          <w:tcPr/>
+          <w:p>
+            <w:pPr>
+              <w:pStyle w:val="Compact"/>
+              <w:jc w:val="left"/>
+            </w:pPr>
+            <w:r>
+              <w:t xml:space="preserve">Latest result for the attachment (any outcome), proposal re-derived from the stored raw JSON — never re-asks the model.</w:t>
             </w:r>
             <w:r>
               <w:t xml:space="preserve"> </w:t>
             </w:r>
             <w:r>
               <w:rPr>
-                <w:bCs/>
-                <w:b/>
-              </w:rPr>
-              <w:t xml:space="preserve">resyncs existing reminders in the same transaction</w:t>
-            </w:r>
-            <w:r>
-              <w:t xml:space="preserve">, so</w:t>
+                <w:rStyle w:val="VerbatimChar"/>
+              </w:rPr>
+              <w:t xml:space="preserve">204/null</w:t>
             </w:r>
             <w:r>
               <w:t xml:space="preserve"> </w:t>
             </w:r>
             <w:r>
-              <w:rPr>
-                <w:rStyle w:val="VerbatimChar"/>
-              </w:rPr>
-              <w:t xml:space="preserve">upcoming-list</w:t>
-            </w:r>
-            <w:r>
-              <w:t xml:space="preserve"> </w:t>
-            </w:r>
-            <w:r>
-              <w:t xml:space="preserve">immediately matches</w:t>
+              <w:t xml:space="preserve">if never extracted</w:t>
             </w:r>
           </w:p>
         </w:tc>
@@ -4962,34 +4476,34 @@
               <w:rPr>
                 <w:rStyle w:val="VerbatimChar"/>
               </w:rPr>
-              <w:t xml:space="preserve">GET /api/reminders/reminders/upcoming-list</w:t>
-            </w:r>
-          </w:p>
-        </w:tc>
-        <w:tc>
-          <w:tcPr/>
-          <w:p>
-            <w:pPr>
-              <w:pStyle w:val="Compact"/>
-              <w:jc w:val="left"/>
-            </w:pPr>
-            <w:r>
-              <w:rPr>
-                <w:rStyle w:val="VerbatimChar"/>
-              </w:rPr>
-              <w:t xml:space="preserve">…Reminders</w:t>
-            </w:r>
-          </w:p>
-        </w:tc>
-        <w:tc>
-          <w:tcPr/>
-          <w:p>
-            <w:pPr>
-              <w:pStyle w:val="Compact"/>
-              <w:jc w:val="left"/>
-            </w:pPr>
-            <w:r>
-              <w:t xml:space="preserve">Pending reminders, soonest</w:t>
+              <w:t xml:space="preserve">POST /api/documents/document-extraction/{id}/confirm/{extractionResultId}</w:t>
+            </w:r>
+          </w:p>
+        </w:tc>
+        <w:tc>
+          <w:tcPr/>
+          <w:p>
+            <w:pPr>
+              <w:pStyle w:val="Compact"/>
+              <w:jc w:val="left"/>
+            </w:pPr>
+            <w:r>
+              <w:rPr>
+                <w:rStyle w:val="VerbatimChar"/>
+              </w:rPr>
+              <w:t xml:space="preserve">…Documents.Update</w:t>
+            </w:r>
+          </w:p>
+        </w:tc>
+        <w:tc>
+          <w:tcPr/>
+          <w:p>
+            <w:pPr>
+              <w:pStyle w:val="Compact"/>
+              <w:jc w:val="left"/>
+            </w:pPr>
+            <w:r>
+              <w:t xml:space="preserve">Body</w:t>
             </w:r>
             <w:r>
               <w:t xml:space="preserve"> </w:t>
@@ -4998,31 +4512,123 @@
               <w:rPr>
                 <w:rStyle w:val="VerbatimChar"/>
               </w:rPr>
-              <w:t xml:space="preserve">dueDate</w:t>
+              <w:t xml:space="preserve">{ number?, issueDate?, expiryDate? }</w:t>
             </w:r>
             <w:r>
               <w:t xml:space="preserve"> </w:t>
             </w:r>
             <w:r>
-              <w:t xml:space="preserve">first; paged (</w:t>
-            </w:r>
-            <w:r>
-              <w:rPr>
-                <w:rStyle w:val="VerbatimChar"/>
-              </w:rPr>
-              <w:t xml:space="preserve">SkipCount</w:t>
-            </w:r>
-            <w:r>
-              <w:t xml:space="preserve">/</w:t>
-            </w:r>
-            <w:r>
-              <w:rPr>
-                <w:rStyle w:val="VerbatimChar"/>
-              </w:rPr>
-              <w:t xml:space="preserve">MaxResultCount</w:t>
-            </w:r>
-            <w:r>
-              <w:t xml:space="preserve">)</w:t>
+              <w:t xml:space="preserve">— applies through the same domain methods as a manual edit and concludes the row</w:t>
+            </w:r>
+            <w:r>
+              <w:t xml:space="preserve"> </w:t>
+            </w:r>
+            <w:r>
+              <w:rPr>
+                <w:rStyle w:val="VerbatimChar"/>
+              </w:rPr>
+              <w:t xml:space="preserve">Accepted</w:t>
+            </w:r>
+            <w:r>
+              <w:t xml:space="preserve"> </w:t>
+            </w:r>
+            <w:r>
+              <w:t xml:space="preserve">(values kept as proposed) or</w:t>
+            </w:r>
+            <w:r>
+              <w:t xml:space="preserve"> </w:t>
+            </w:r>
+            <w:r>
+              <w:rPr>
+                <w:rStyle w:val="VerbatimChar"/>
+              </w:rPr>
+              <w:t xml:space="preserve">Edited</w:t>
+            </w:r>
+            <w:r>
+              <w:t xml:space="preserve">. Returns the updated</w:t>
+            </w:r>
+            <w:r>
+              <w:t xml:space="preserve"> </w:t>
+            </w:r>
+            <w:r>
+              <w:rPr>
+                <w:rStyle w:val="VerbatimChar"/>
+              </w:rPr>
+              <w:t xml:space="preserve">DocumentDto</w:t>
+            </w:r>
+            <w:r>
+              <w:t xml:space="preserve">. 403</w:t>
+            </w:r>
+            <w:r>
+              <w:t xml:space="preserve"> </w:t>
+            </w:r>
+            <w:r>
+              <w:rPr>
+                <w:rStyle w:val="VerbatimChar"/>
+              </w:rPr>
+              <w:t xml:space="preserve">ExtractionAlreadyConcluded</w:t>
+            </w:r>
+            <w:r>
+              <w:t xml:space="preserve"> </w:t>
+            </w:r>
+            <w:r>
+              <w:t xml:space="preserve">on a second verdict</w:t>
+            </w:r>
+          </w:p>
+        </w:tc>
+      </w:tr>
+      <w:tr>
+        <w:tc>
+          <w:tcPr/>
+          <w:p>
+            <w:pPr>
+              <w:pStyle w:val="Compact"/>
+              <w:jc w:val="left"/>
+            </w:pPr>
+            <w:r>
+              <w:rPr>
+                <w:rStyle w:val="VerbatimChar"/>
+              </w:rPr>
+              <w:t xml:space="preserve">POST /api/documents/document-extraction/{id}/reject/{extractionResultId}</w:t>
+            </w:r>
+          </w:p>
+        </w:tc>
+        <w:tc>
+          <w:tcPr/>
+          <w:p>
+            <w:pPr>
+              <w:pStyle w:val="Compact"/>
+              <w:jc w:val="left"/>
+            </w:pPr>
+            <w:r>
+              <w:rPr>
+                <w:rStyle w:val="VerbatimChar"/>
+              </w:rPr>
+              <w:t xml:space="preserve">…Documents.Update</w:t>
+            </w:r>
+          </w:p>
+        </w:tc>
+        <w:tc>
+          <w:tcPr/>
+          <w:p>
+            <w:pPr>
+              <w:pStyle w:val="Compact"/>
+              <w:jc w:val="left"/>
+            </w:pPr>
+            <w:r>
+              <w:t xml:space="preserve">Concludes</w:t>
+            </w:r>
+            <w:r>
+              <w:t xml:space="preserve"> </w:t>
+            </w:r>
+            <w:r>
+              <w:rPr>
+                <w:rStyle w:val="VerbatimChar"/>
+              </w:rPr>
+              <w:t xml:space="preserve">Rejected</w:t>
+            </w:r>
+            <w:r>
+              <w:t xml:space="preserve">; the document is untouched</w:t>
             </w:r>
           </w:p>
         </w:tc>
@@ -5036,79 +4642,166 @@
         <w:rPr>
           <w:rStyle w:val="VerbatimChar"/>
         </w:rPr>
-        <w:t xml:space="preserve">ReminderRuleDto</w:t>
-      </w:r>
-      <w:r>
-        <w:t xml:space="preserve"> </w:t>
-      </w:r>
-      <w:r>
-        <w:t xml:space="preserve">/</w:t>
-      </w:r>
-      <w:r>
-        <w:t xml:space="preserve"> </w:t>
-      </w:r>
-      <w:r>
-        <w:rPr>
-          <w:rStyle w:val="VerbatimChar"/>
-        </w:rPr>
-        <w:t xml:space="preserve">UpdateReminderRuleDto</w:t>
-      </w:r>
-      <w:r>
-        <w:t xml:space="preserve">:</w:t>
-      </w:r>
-      <w:r>
-        <w:t xml:space="preserve"> </w:t>
-      </w:r>
-      <w:r>
-        <w:rPr>
-          <w:rStyle w:val="VerbatimChar"/>
-        </w:rPr>
-        <w:t xml:space="preserve">offsetsDays</w:t>
-      </w:r>
-      <w:r>
-        <w:t xml:space="preserve"> </w:t>
-      </w:r>
-      <w:r>
-        <w:t xml:space="preserve">int[] (1–3650, ≤8 entries — the</w:t>
-      </w:r>
-      <w:r>
-        <w:t xml:space="preserve"> </w:t>
-      </w:r>
-      <w:r>
-        <w:t xml:space="preserve">server normalizes to descending distinct),</w:t>
-      </w:r>
-      <w:r>
-        <w:t xml:space="preserve"> </w:t>
-      </w:r>
-      <w:r>
-        <w:rPr>
-          <w:rStyle w:val="VerbatimChar"/>
-        </w:rPr>
-        <w:t xml:space="preserve">channels</w:t>
-      </w:r>
-      <w:r>
-        <w:t xml:space="preserve"> </w:t>
-      </w:r>
-      <w:r>
-        <w:t xml:space="preserve">(flags: 1 Email · 2 Push; 0 pauses),</w:t>
-      </w:r>
-      <w:r>
-        <w:t xml:space="preserve"> </w:t>
-      </w:r>
-      <w:r>
-        <w:rPr>
-          <w:rStyle w:val="VerbatimChar"/>
-        </w:rPr>
-        <w:t xml:space="preserve">quietFrom</w:t>
-      </w:r>
-      <w:r>
-        <w:t xml:space="preserve">/</w:t>
-      </w:r>
-      <w:r>
-        <w:rPr>
-          <w:rStyle w:val="VerbatimChar"/>
-        </w:rPr>
-        <w:t xml:space="preserve">quietTo</w:t>
+        <w:t xml:space="preserve">ExtractionProposalDto</w:t>
+      </w:r>
+      <w:r>
+        <w:t xml:space="preserve"> </w:t>
+      </w:r>
+      <w:r>
+        <w:t xml:space="preserve">(response):</w:t>
+      </w:r>
+      <w:r>
+        <w:t xml:space="preserve"> </w:t>
+      </w:r>
+      <w:r>
+        <w:rPr>
+          <w:rStyle w:val="VerbatimChar"/>
+        </w:rPr>
+        <w:t xml:space="preserve">extractionResultId</w:t>
+      </w:r>
+      <w:r>
+        <w:t xml:space="preserve">,</w:t>
+      </w:r>
+      <w:r>
+        <w:t xml:space="preserve"> </w:t>
+      </w:r>
+      <w:r>
+        <w:rPr>
+          <w:rStyle w:val="VerbatimChar"/>
+        </w:rPr>
+        <w:t xml:space="preserve">attachmentId</w:t>
+      </w:r>
+      <w:r>
+        <w:t xml:space="preserve">,</w:t>
+      </w:r>
+      <w:r>
+        <w:t xml:space="preserve"> </w:t>
+      </w:r>
+      <w:r>
+        <w:rPr>
+          <w:rStyle w:val="VerbatimChar"/>
+        </w:rPr>
+        <w:t xml:space="preserve">number?</w:t>
+      </w:r>
+      <w:r>
+        <w:t xml:space="preserve">,</w:t>
+      </w:r>
+      <w:r>
+        <w:t xml:space="preserve"> </w:t>
+      </w:r>
+      <w:r>
+        <w:rPr>
+          <w:rStyle w:val="VerbatimChar"/>
+        </w:rPr>
+        <w:t xml:space="preserve">issueDate?</w:t>
+      </w:r>
+      <w:r>
+        <w:t xml:space="preserve">,</w:t>
+      </w:r>
+      <w:r>
+        <w:t xml:space="preserve"> </w:t>
+      </w:r>
+      <w:r>
+        <w:rPr>
+          <w:rStyle w:val="VerbatimChar"/>
+        </w:rPr>
+        <w:t xml:space="preserve">expiryDate?</w:t>
+      </w:r>
+      <w:r>
+        <w:t xml:space="preserve">,</w:t>
+      </w:r>
+      <w:r>
+        <w:t xml:space="preserve"> </w:t>
+      </w:r>
+      <w:r>
+        <w:rPr>
+          <w:rStyle w:val="VerbatimChar"/>
+        </w:rPr>
+        <w:t xml:space="preserve">holderName?</w:t>
+      </w:r>
+      <w:r>
+        <w:t xml:space="preserve">,</w:t>
+      </w:r>
+      <w:r>
+        <w:t xml:space="preserve"> </w:t>
+      </w:r>
+      <w:r>
+        <w:rPr>
+          <w:rStyle w:val="VerbatimChar"/>
+        </w:rPr>
+        <w:t xml:space="preserve">documentKind?</w:t>
+      </w:r>
+      <w:r>
+        <w:t xml:space="preserve">,</w:t>
+      </w:r>
+      <w:r>
+        <w:t xml:space="preserve"> </w:t>
+      </w:r>
+      <w:r>
+        <w:rPr>
+          <w:rStyle w:val="VerbatimChar"/>
+        </w:rPr>
+        <w:t xml:space="preserve">confidence?</w:t>
+      </w:r>
+      <w:r>
+        <w:t xml:space="preserve"> </w:t>
+      </w:r>
+      <w:r>
+        <w:t xml:space="preserve">(0–1),</w:t>
+      </w:r>
+      <w:r>
+        <w:t xml:space="preserve"> </w:t>
+      </w:r>
+      <w:r>
+        <w:rPr>
+          <w:rStyle w:val="VerbatimChar"/>
+        </w:rPr>
+        <w:t xml:space="preserve">warnings[]</w:t>
+      </w:r>
+      <w:r>
+        <w:t xml:space="preserve"> </w:t>
+      </w:r>
+      <w:r>
+        <w:t xml:space="preserve">(why fields were</w:t>
+      </w:r>
+      <w:r>
+        <w:t xml:space="preserve"> </w:t>
+      </w:r>
+      <w:r>
+        <w:t xml:space="preserve">dropped — user-facing, FR-AI-003),</w:t>
+      </w:r>
+      <w:r>
+        <w:t xml:space="preserve"> </w:t>
+      </w:r>
+      <w:r>
+        <w:rPr>
+          <w:rStyle w:val="VerbatimChar"/>
+        </w:rPr>
+        <w:t xml:space="preserve">promptVersion</w:t>
+      </w:r>
+      <w:r>
+        <w:t xml:space="preserve">,</w:t>
+      </w:r>
+      <w:r>
+        <w:t xml:space="preserve"> </w:t>
+      </w:r>
+      <w:r>
+        <w:rPr>
+          <w:rStyle w:val="VerbatimChar"/>
+        </w:rPr>
+        <w:t xml:space="preserve">model</w:t>
+      </w:r>
+      <w:r>
+        <w:t xml:space="preserve">,</w:t>
+      </w:r>
+      <w:r>
+        <w:t xml:space="preserve"> </w:t>
+      </w:r>
+      <w:r>
+        <w:rPr>
+          <w:rStyle w:val="VerbatimChar"/>
+        </w:rPr>
+        <w:t xml:space="preserve">outcome</w:t>
       </w:r>
       <w:r>
         <w:t xml:space="preserve"> </w:t>
@@ -5120,37 +4813,22 @@
         <w:rPr>
           <w:rStyle w:val="VerbatimChar"/>
         </w:rPr>
-        <w:t xml:space="preserve">"22:00:00"</w:t>
-      </w:r>
-      <w:r>
-        <w:t xml:space="preserve">, both-or-neither; over-midnight windows allowed),</w:t>
-      </w:r>
-      <w:r>
-        <w:t xml:space="preserve"> </w:t>
-      </w:r>
-      <w:r>
-        <w:rPr>
-          <w:rStyle w:val="VerbatimChar"/>
-        </w:rPr>
-        <w:t xml:space="preserve">timeZoneId</w:t>
-      </w:r>
-      <w:r>
-        <w:t xml:space="preserve"> </w:t>
-      </w:r>
-      <w:r>
-        <w:t xml:space="preserve">(IANA, validated — unknown zones are rejected with</w:t>
-      </w:r>
-      <w:r>
-        <w:t xml:space="preserve"> </w:t>
-      </w:r>
-      <w:r>
-        <w:rPr>
-          <w:rStyle w:val="VerbatimChar"/>
-        </w:rPr>
-        <w:t xml:space="preserve">Wathiq.Reminders:UnknownTimeZone</w:t>
-      </w:r>
-      <w:r>
-        <w:t xml:space="preserve">).</w:t>
+        <w:t xml:space="preserve">Proposed=0, Accepted, Edited, Rejected, Failed</w:t>
+      </w:r>
+      <w:r>
+        <w:t xml:space="preserve">),</w:t>
+      </w:r>
+      <w:r>
+        <w:t xml:space="preserve"> </w:t>
+      </w:r>
+      <w:r>
+        <w:rPr>
+          <w:rStyle w:val="VerbatimChar"/>
+        </w:rPr>
+        <w:t xml:space="preserve">creationTime</w:t>
+      </w:r>
+      <w:r>
+        <w:t xml:space="preserve">.</w:t>
       </w:r>
     </w:p>
     <w:p>
@@ -5158,237 +4836,666 @@
         <w:pStyle w:val="BodyText"/>
       </w:pPr>
       <w:r>
-        <w:rPr>
-          <w:rStyle w:val="VerbatimChar"/>
-        </w:rPr>
-        <w:t xml:space="preserve">ReminderDto</w:t>
-      </w:r>
-      <w:r>
-        <w:t xml:space="preserve"> </w:t>
-      </w:r>
-      <w:r>
-        <w:t xml:space="preserve">(response):</w:t>
-      </w:r>
-      <w:r>
-        <w:t xml:space="preserve"> </w:t>
-      </w:r>
-      <w:r>
-        <w:rPr>
-          <w:rStyle w:val="VerbatimChar"/>
-        </w:rPr>
-        <w:t xml:space="preserve">id</w:t>
-      </w:r>
-      <w:r>
-        <w:t xml:space="preserve">,</w:t>
-      </w:r>
-      <w:r>
-        <w:t xml:space="preserve"> </w:t>
-      </w:r>
-      <w:r>
-        <w:rPr>
-          <w:rStyle w:val="VerbatimChar"/>
-        </w:rPr>
-        <w:t xml:space="preserve">documentId</w:t>
-      </w:r>
-      <w:r>
-        <w:t xml:space="preserve">,</w:t>
-      </w:r>
-      <w:r>
-        <w:t xml:space="preserve"> </w:t>
-      </w:r>
-      <w:r>
-        <w:rPr>
-          <w:rStyle w:val="VerbatimChar"/>
-        </w:rPr>
-        <w:t xml:space="preserve">offsetDays</w:t>
-      </w:r>
-      <w:r>
-        <w:t xml:space="preserve">,</w:t>
-      </w:r>
-      <w:r>
-        <w:t xml:space="preserve"> </w:t>
-      </w:r>
-      <w:r>
-        <w:rPr>
-          <w:rStyle w:val="VerbatimChar"/>
-        </w:rPr>
-        <w:t xml:space="preserve">dueDate</w:t>
-      </w:r>
-      <w:r>
-        <w:t xml:space="preserve">,</w:t>
-      </w:r>
-      <w:r>
-        <w:t xml:space="preserve"> </w:t>
-      </w:r>
-      <w:r>
-        <w:rPr>
-          <w:rStyle w:val="VerbatimChar"/>
-        </w:rPr>
-        <w:t xml:space="preserve">expiryDate</w:t>
-      </w:r>
-      <w:r>
-        <w:t xml:space="preserve"> </w:t>
-      </w:r>
-      <w:r>
-        <w:t xml:space="preserve">(server-computed:</w:t>
-      </w:r>
-      <w:r>
-        <w:t xml:space="preserve"> </w:t>
-      </w:r>
-      <w:r>
-        <w:rPr>
-          <w:rStyle w:val="VerbatimChar"/>
-        </w:rPr>
-        <w:t xml:space="preserve">dueDate + offsetDays</w:t>
-      </w:r>
-      <w:r>
-        <w:t xml:space="preserve">),</w:t>
-      </w:r>
-      <w:r>
-        <w:t xml:space="preserve"> </w:t>
-      </w:r>
-      <w:r>
-        <w:rPr>
-          <w:rStyle w:val="VerbatimChar"/>
-        </w:rPr>
-        <w:t xml:space="preserve">status</w:t>
-      </w:r>
-      <w:r>
-        <w:t xml:space="preserve"> </w:t>
-      </w:r>
-      <w:r>
-        <w:t xml:space="preserve">(0 Pending · 1 Sent · 2 Failed · 3</w:t>
-      </w:r>
-      <w:r>
-        <w:t xml:space="preserve"> </w:t>
-      </w:r>
-      <w:r>
-        <w:t xml:space="preserve">Cancelled),</w:t>
-      </w:r>
-      <w:r>
-        <w:t xml:space="preserve"> </w:t>
-      </w:r>
-      <w:r>
-        <w:rPr>
-          <w:rStyle w:val="VerbatimChar"/>
-        </w:rPr>
-        <w:t xml:space="preserve">sentAt?</w:t>
-      </w:r>
-      <w:r>
-        <w:t xml:space="preserve">.</w:t>
+        <w:t xml:space="preserve">Live example (recorded, this container has no model): extract on an OCR’d attachment returned</w:t>
+      </w:r>
+      <w:r>
+        <w:t xml:space="preserve"> </w:t>
+      </w:r>
+      <w:r>
+        <w:t xml:space="preserve">403</w:t>
+      </w:r>
+      <w:r>
+        <w:t xml:space="preserve"> </w:t>
+      </w:r>
+      <w:r>
+        <w:rPr>
+          <w:rStyle w:val="VerbatimChar"/>
+        </w:rPr>
+        <w:t xml:space="preserve">Wathiq.Documents:ExtractionFailed</w:t>
+      </w:r>
+      <w:r>
+        <w:t xml:space="preserve"> </w:t>
+      </w:r>
+      <w:r>
+        <w:t xml:space="preserve">with the localized message, and the</w:t>
+      </w:r>
+      <w:r>
+        <w:t xml:space="preserve"> </w:t>
+      </w:r>
+      <w:r>
+        <w:rPr>
+          <w:rStyle w:val="VerbatimChar"/>
+        </w:rPr>
+        <w:t xml:space="preserve">Failed</w:t>
+      </w:r>
+      <w:r>
+        <w:t xml:space="preserve"> </w:t>
+      </w:r>
+      <w:r>
+        <w:t xml:space="preserve">row</w:t>
+      </w:r>
+      <w:r>
+        <w:t xml:space="preserve"> </w:t>
+      </w:r>
+      <w:r>
+        <w:t xml:space="preserve">(</w:t>
+      </w:r>
+      <w:r>
+        <w:rPr>
+          <w:rStyle w:val="VerbatimChar"/>
+        </w:rPr>
+        <w:t xml:space="preserve">Provider=ollama, Model=unavailable, PromptVersion=extract-document@v1</w:t>
+      </w:r>
+      <w:r>
+        <w:t xml:space="preserve">) was persisted in its</w:t>
+      </w:r>
+      <w:r>
+        <w:t xml:space="preserve"> </w:t>
+      </w:r>
+      <w:r>
+        <w:t xml:space="preserve">own transaction — visible via the</w:t>
+      </w:r>
+      <w:r>
+        <w:t xml:space="preserve"> </w:t>
+      </w:r>
+      <w:r>
+        <w:rPr>
+          <w:rStyle w:val="VerbatimChar"/>
+        </w:rPr>
+        <w:t xml:space="preserve">latest</w:t>
+      </w:r>
+      <w:r>
+        <w:t xml:space="preserve"> </w:t>
+      </w:r>
+      <w:r>
+        <w:t xml:space="preserve">endpoint. The happy path runs on the dev box with</w:t>
+      </w:r>
+      <w:r>
+        <w:t xml:space="preserve"> </w:t>
+      </w:r>
+      <w:r>
+        <w:t xml:space="preserve">Ollama serving (see</w:t>
+      </w:r>
+      <w:r>
+        <w:t xml:space="preserve"> </w:t>
+      </w:r>
+      <w:r>
+        <w:rPr>
+          <w:rStyle w:val="VerbatimChar"/>
+        </w:rPr>
+        <w:t xml:space="preserve">backend/README.md</w:t>
+      </w:r>
+      <w:r>
+        <w:t xml:space="preserve"> </w:t>
+      </w:r>
+      <w:r>
+        <w:t xml:space="preserve">§AI runtime).</w:t>
+      </w:r>
+    </w:p>
+    <w:bookmarkEnd w:id="36"/>
+    <w:bookmarkStart w:id="37" w:name="X88bdf6ce1de7c5c01445c063d9e61e1542223a6"/>
+    <w:p>
+      <w:pPr>
+        <w:pStyle w:val="Heading2"/>
+      </w:pPr>
+      <w:r>
+        <w:rPr>
+          <w:rStyle w:val="SectionNumber"/>
+        </w:rPr>
+        <w:t xml:space="preserve">4.6</w:t>
+      </w:r>
+      <w:r>
+        <w:tab/>
+      </w:r>
+      <w:r>
+        <w:t xml:space="preserve">4.6 Live example (recorded against the running host)</w:t>
       </w:r>
     </w:p>
     <w:p>
       <w:pPr>
-        <w:pStyle w:val="BodyText"/>
+        <w:pStyle w:val="SourceCode"/>
       </w:pPr>
       <w:r>
-        <w:t xml:space="preserve">Reminder rows are system-managed: they are (re)created by document changes and the rule update,</w:t>
-      </w:r>
-      <w:r>
-        <w:t xml:space="preserve"> </w:t>
-      </w:r>
-      <w:r>
-        <w:t xml:space="preserve">sent by the hourly dispatch job, and never edited directly — hence no POST/PUT/DELETE.</w:t>
+        <w:rPr>
+          <w:rStyle w:val="ExtensionTok"/>
+        </w:rPr>
+        <w:t xml:space="preserve">POST</w:t>
+      </w:r>
+      <w:r>
+        <w:rPr>
+          <w:rStyle w:val="NormalTok"/>
+        </w:rPr>
+        <w:t xml:space="preserve"> /api/documents/documents            Authorization: Bearer </w:t>
+      </w:r>
+      <w:r>
+        <w:rPr>
+          <w:rStyle w:val="OperatorTok"/>
+        </w:rPr>
+        <w:t xml:space="preserve">&lt;</w:t>
+      </w:r>
+      <w:r>
+        <w:rPr>
+          <w:rStyle w:val="NormalTok"/>
+        </w:rPr>
+        <w:t xml:space="preserve">user token</w:t>
+      </w:r>
+      <w:r>
+        <w:rPr>
+          <w:rStyle w:val="OperatorTok"/>
+        </w:rPr>
+        <w:t xml:space="preserve">&gt;</w:t>
+      </w:r>
+      <w:r>
+        <w:br/>
+      </w:r>
+      <w:r>
+        <w:rPr>
+          <w:rStyle w:val="KeywordTok"/>
+        </w:rPr>
+        <w:t xml:space="preserve">{</w:t>
+      </w:r>
+      <w:r>
+        <w:rPr>
+          <w:rStyle w:val="NormalTok"/>
+        </w:rPr>
+        <w:t xml:space="preserve"> </w:t>
+      </w:r>
+      <w:r>
+        <w:rPr>
+          <w:rStyle w:val="StringTok"/>
+        </w:rPr>
+        <w:t xml:space="preserve">"holderId"</w:t>
+      </w:r>
+      <w:r>
+        <w:rPr>
+          <w:rStyle w:val="ExtensionTok"/>
+        </w:rPr>
+        <w:t xml:space="preserve">:</w:t>
+      </w:r>
+      <w:r>
+        <w:rPr>
+          <w:rStyle w:val="NormalTok"/>
+        </w:rPr>
+        <w:t xml:space="preserve"> </w:t>
+      </w:r>
+      <w:r>
+        <w:rPr>
+          <w:rStyle w:val="StringTok"/>
+        </w:rPr>
+        <w:t xml:space="preserve">"6a3d8b35-…"</w:t>
+      </w:r>
+      <w:r>
+        <w:rPr>
+          <w:rStyle w:val="NormalTok"/>
+        </w:rPr>
+        <w:t xml:space="preserve">, </w:t>
+      </w:r>
+      <w:r>
+        <w:rPr>
+          <w:rStyle w:val="StringTok"/>
+        </w:rPr>
+        <w:t xml:space="preserve">"documentTypeId"</w:t>
+      </w:r>
+      <w:r>
+        <w:rPr>
+          <w:rStyle w:val="NormalTok"/>
+        </w:rPr>
+        <w:t xml:space="preserve">: </w:t>
+      </w:r>
+      <w:r>
+        <w:rPr>
+          <w:rStyle w:val="StringTok"/>
+        </w:rPr>
+        <w:t xml:space="preserve">"6ff4d4bc-…"</w:t>
+      </w:r>
+      <w:r>
+        <w:rPr>
+          <w:rStyle w:val="NormalTok"/>
+        </w:rPr>
+        <w:t xml:space="preserve">,</w:t>
+      </w:r>
+      <w:r>
+        <w:br/>
+      </w:r>
+      <w:r>
+        <w:rPr>
+          <w:rStyle w:val="NormalTok"/>
+        </w:rPr>
+        <w:t xml:space="preserve">  </w:t>
+      </w:r>
+      <w:r>
+        <w:rPr>
+          <w:rStyle w:val="StringTok"/>
+        </w:rPr>
+        <w:t xml:space="preserve">"number"</w:t>
+      </w:r>
+      <w:r>
+        <w:rPr>
+          <w:rStyle w:val="ExtensionTok"/>
+        </w:rPr>
+        <w:t xml:space="preserve">:</w:t>
+      </w:r>
+      <w:r>
+        <w:rPr>
+          <w:rStyle w:val="NormalTok"/>
+        </w:rPr>
+        <w:t xml:space="preserve"> </w:t>
+      </w:r>
+      <w:r>
+        <w:rPr>
+          <w:rStyle w:val="StringTok"/>
+        </w:rPr>
+        <w:t xml:space="preserve">"P1234567"</w:t>
+      </w:r>
+      <w:r>
+        <w:rPr>
+          <w:rStyle w:val="NormalTok"/>
+        </w:rPr>
+        <w:t xml:space="preserve">, </w:t>
+      </w:r>
+      <w:r>
+        <w:rPr>
+          <w:rStyle w:val="StringTok"/>
+        </w:rPr>
+        <w:t xml:space="preserve">"issueDate"</w:t>
+      </w:r>
+      <w:r>
+        <w:rPr>
+          <w:rStyle w:val="NormalTok"/>
+        </w:rPr>
+        <w:t xml:space="preserve">: </w:t>
+      </w:r>
+      <w:r>
+        <w:rPr>
+          <w:rStyle w:val="StringTok"/>
+        </w:rPr>
+        <w:t xml:space="preserve">"2020-09-01"</w:t>
+      </w:r>
+      <w:r>
+        <w:rPr>
+          <w:rStyle w:val="NormalTok"/>
+        </w:rPr>
+        <w:t xml:space="preserve">, </w:t>
+      </w:r>
+      <w:r>
+        <w:rPr>
+          <w:rStyle w:val="StringTok"/>
+        </w:rPr>
+        <w:t xml:space="preserve">"expiryDate"</w:t>
+      </w:r>
+      <w:r>
+        <w:rPr>
+          <w:rStyle w:val="NormalTok"/>
+        </w:rPr>
+        <w:t xml:space="preserve">: </w:t>
+      </w:r>
+      <w:r>
+        <w:rPr>
+          <w:rStyle w:val="StringTok"/>
+        </w:rPr>
+        <w:t xml:space="preserve">"2030-09-01"</w:t>
+      </w:r>
+      <w:r>
+        <w:rPr>
+          <w:rStyle w:val="NormalTok"/>
+        </w:rPr>
+        <w:t xml:space="preserve">,</w:t>
+      </w:r>
+      <w:r>
+        <w:br/>
+      </w:r>
+      <w:r>
+        <w:rPr>
+          <w:rStyle w:val="NormalTok"/>
+        </w:rPr>
+        <w:t xml:space="preserve">  </w:t>
+      </w:r>
+      <w:r>
+        <w:rPr>
+          <w:rStyle w:val="StringTok"/>
+        </w:rPr>
+        <w:t xml:space="preserve">"notes"</w:t>
+      </w:r>
+      <w:r>
+        <w:rPr>
+          <w:rStyle w:val="ExtensionTok"/>
+        </w:rPr>
+        <w:t xml:space="preserve">:</w:t>
+      </w:r>
+      <w:r>
+        <w:rPr>
+          <w:rStyle w:val="NormalTok"/>
+        </w:rPr>
+        <w:t xml:space="preserve"> </w:t>
+      </w:r>
+      <w:r>
+        <w:rPr>
+          <w:rStyle w:val="StringTok"/>
+        </w:rPr>
+        <w:t xml:space="preserve">"جواز سفر سالم"</w:t>
+      </w:r>
+      <w:r>
+        <w:rPr>
+          <w:rStyle w:val="NormalTok"/>
+        </w:rPr>
+        <w:t xml:space="preserve"> }</w:t>
+      </w:r>
+      <w:r>
+        <w:br/>
+      </w:r>
+      <w:r>
+        <w:br/>
+      </w:r>
+      <w:r>
+        <w:rPr>
+          <w:rStyle w:val="ExtensionTok"/>
+        </w:rPr>
+        <w:t xml:space="preserve">200</w:t>
+      </w:r>
+      <w:r>
+        <w:rPr>
+          <w:rStyle w:val="NormalTok"/>
+        </w:rPr>
+        <w:t xml:space="preserve"> OK</w:t>
+      </w:r>
+      <w:r>
+        <w:br/>
+      </w:r>
+      <w:r>
+        <w:rPr>
+          <w:rStyle w:val="KeywordTok"/>
+        </w:rPr>
+        <w:t xml:space="preserve">{</w:t>
+      </w:r>
+      <w:r>
+        <w:rPr>
+          <w:rStyle w:val="NormalTok"/>
+        </w:rPr>
+        <w:t xml:space="preserve"> </w:t>
+      </w:r>
+      <w:r>
+        <w:rPr>
+          <w:rStyle w:val="StringTok"/>
+        </w:rPr>
+        <w:t xml:space="preserve">"id"</w:t>
+      </w:r>
+      <w:r>
+        <w:rPr>
+          <w:rStyle w:val="ExtensionTok"/>
+        </w:rPr>
+        <w:t xml:space="preserve">:</w:t>
+      </w:r>
+      <w:r>
+        <w:rPr>
+          <w:rStyle w:val="NormalTok"/>
+        </w:rPr>
+        <w:t xml:space="preserve"> </w:t>
+      </w:r>
+      <w:r>
+        <w:rPr>
+          <w:rStyle w:val="StringTok"/>
+        </w:rPr>
+        <w:t xml:space="preserve">"5560255a-…"</w:t>
+      </w:r>
+      <w:r>
+        <w:rPr>
+          <w:rStyle w:val="NormalTok"/>
+        </w:rPr>
+        <w:t xml:space="preserve">, </w:t>
+      </w:r>
+      <w:r>
+        <w:rPr>
+          <w:rStyle w:val="StringTok"/>
+        </w:rPr>
+        <w:t xml:space="preserve">"holderId"</w:t>
+      </w:r>
+      <w:r>
+        <w:rPr>
+          <w:rStyle w:val="NormalTok"/>
+        </w:rPr>
+        <w:t xml:space="preserve">: </w:t>
+      </w:r>
+      <w:r>
+        <w:rPr>
+          <w:rStyle w:val="StringTok"/>
+        </w:rPr>
+        <w:t xml:space="preserve">"6a3d8b35-…"</w:t>
+      </w:r>
+      <w:r>
+        <w:rPr>
+          <w:rStyle w:val="NormalTok"/>
+        </w:rPr>
+        <w:t xml:space="preserve">, </w:t>
+      </w:r>
+      <w:r>
+        <w:rPr>
+          <w:rStyle w:val="StringTok"/>
+        </w:rPr>
+        <w:t xml:space="preserve">"documentTypeId"</w:t>
+      </w:r>
+      <w:r>
+        <w:rPr>
+          <w:rStyle w:val="NormalTok"/>
+        </w:rPr>
+        <w:t xml:space="preserve">: </w:t>
+      </w:r>
+      <w:r>
+        <w:rPr>
+          <w:rStyle w:val="StringTok"/>
+        </w:rPr>
+        <w:t xml:space="preserve">"6ff4d4bc-…"</w:t>
+      </w:r>
+      <w:r>
+        <w:rPr>
+          <w:rStyle w:val="NormalTok"/>
+        </w:rPr>
+        <w:t xml:space="preserve">,</w:t>
+      </w:r>
+      <w:r>
+        <w:br/>
+      </w:r>
+      <w:r>
+        <w:rPr>
+          <w:rStyle w:val="NormalTok"/>
+        </w:rPr>
+        <w:t xml:space="preserve">  </w:t>
+      </w:r>
+      <w:r>
+        <w:rPr>
+          <w:rStyle w:val="StringTok"/>
+        </w:rPr>
+        <w:t xml:space="preserve">"number"</w:t>
+      </w:r>
+      <w:r>
+        <w:rPr>
+          <w:rStyle w:val="ExtensionTok"/>
+        </w:rPr>
+        <w:t xml:space="preserve">:</w:t>
+      </w:r>
+      <w:r>
+        <w:rPr>
+          <w:rStyle w:val="NormalTok"/>
+        </w:rPr>
+        <w:t xml:space="preserve"> </w:t>
+      </w:r>
+      <w:r>
+        <w:rPr>
+          <w:rStyle w:val="StringTok"/>
+        </w:rPr>
+        <w:t xml:space="preserve">"P1234567"</w:t>
+      </w:r>
+      <w:r>
+        <w:rPr>
+          <w:rStyle w:val="NormalTok"/>
+        </w:rPr>
+        <w:t xml:space="preserve">, </w:t>
+      </w:r>
+      <w:r>
+        <w:rPr>
+          <w:rStyle w:val="StringTok"/>
+        </w:rPr>
+        <w:t xml:space="preserve">"issueDate"</w:t>
+      </w:r>
+      <w:r>
+        <w:rPr>
+          <w:rStyle w:val="NormalTok"/>
+        </w:rPr>
+        <w:t xml:space="preserve">: </w:t>
+      </w:r>
+      <w:r>
+        <w:rPr>
+          <w:rStyle w:val="StringTok"/>
+        </w:rPr>
+        <w:t xml:space="preserve">"2020-09-01"</w:t>
+      </w:r>
+      <w:r>
+        <w:rPr>
+          <w:rStyle w:val="NormalTok"/>
+        </w:rPr>
+        <w:t xml:space="preserve">, </w:t>
+      </w:r>
+      <w:r>
+        <w:rPr>
+          <w:rStyle w:val="StringTok"/>
+        </w:rPr>
+        <w:t xml:space="preserve">"expiryDate"</w:t>
+      </w:r>
+      <w:r>
+        <w:rPr>
+          <w:rStyle w:val="NormalTok"/>
+        </w:rPr>
+        <w:t xml:space="preserve">: </w:t>
+      </w:r>
+      <w:r>
+        <w:rPr>
+          <w:rStyle w:val="StringTok"/>
+        </w:rPr>
+        <w:t xml:space="preserve">"2030-09-01"</w:t>
+      </w:r>
+      <w:r>
+        <w:rPr>
+          <w:rStyle w:val="NormalTok"/>
+        </w:rPr>
+        <w:t xml:space="preserve">,</w:t>
+      </w:r>
+      <w:r>
+        <w:br/>
+      </w:r>
+      <w:r>
+        <w:rPr>
+          <w:rStyle w:val="NormalTok"/>
+        </w:rPr>
+        <w:t xml:space="preserve">  </w:t>
+      </w:r>
+      <w:r>
+        <w:rPr>
+          <w:rStyle w:val="StringTok"/>
+        </w:rPr>
+        <w:t xml:space="preserve">"status"</w:t>
+      </w:r>
+      <w:r>
+        <w:rPr>
+          <w:rStyle w:val="ExtensionTok"/>
+        </w:rPr>
+        <w:t xml:space="preserve">:</w:t>
+      </w:r>
+      <w:r>
+        <w:rPr>
+          <w:rStyle w:val="NormalTok"/>
+        </w:rPr>
+        <w:t xml:space="preserve"> 0, </w:t>
+      </w:r>
+      <w:r>
+        <w:rPr>
+          <w:rStyle w:val="StringTok"/>
+        </w:rPr>
+        <w:t xml:space="preserve">"notes"</w:t>
+      </w:r>
+      <w:r>
+        <w:rPr>
+          <w:rStyle w:val="NormalTok"/>
+        </w:rPr>
+        <w:t xml:space="preserve">: </w:t>
+      </w:r>
+      <w:r>
+        <w:rPr>
+          <w:rStyle w:val="StringTok"/>
+        </w:rPr>
+        <w:t xml:space="preserve">"جواز سفر سالم"</w:t>
+      </w:r>
+      <w:r>
+        <w:rPr>
+          <w:rStyle w:val="NormalTok"/>
+        </w:rPr>
+        <w:t xml:space="preserve">, </w:t>
+      </w:r>
+      <w:r>
+        <w:rPr>
+          <w:rStyle w:val="StringTok"/>
+        </w:rPr>
+        <w:t xml:space="preserve">"previousExpiryDate"</w:t>
+      </w:r>
+      <w:r>
+        <w:rPr>
+          <w:rStyle w:val="NormalTok"/>
+        </w:rPr>
+        <w:t xml:space="preserve">: null,</w:t>
+      </w:r>
+      <w:r>
+        <w:br/>
+      </w:r>
+      <w:r>
+        <w:rPr>
+          <w:rStyle w:val="NormalTok"/>
+        </w:rPr>
+        <w:t xml:space="preserve">  </w:t>
+      </w:r>
+      <w:r>
+        <w:rPr>
+          <w:rStyle w:val="StringTok"/>
+        </w:rPr>
+        <w:t xml:space="preserve">"daysUntilExpiry"</w:t>
+      </w:r>
+      <w:r>
+        <w:rPr>
+          <w:rStyle w:val="ExtensionTok"/>
+        </w:rPr>
+        <w:t xml:space="preserve">:</w:t>
+      </w:r>
+      <w:r>
+        <w:rPr>
+          <w:rStyle w:val="NormalTok"/>
+        </w:rPr>
+        <w:t xml:space="preserve"> 1466, </w:t>
+      </w:r>
+      <w:r>
+        <w:rPr>
+          <w:rStyle w:val="StringTok"/>
+        </w:rPr>
+        <w:t xml:space="preserve">"creationTime"</w:t>
+      </w:r>
+      <w:r>
+        <w:rPr>
+          <w:rStyle w:val="NormalTok"/>
+        </w:rPr>
+        <w:t xml:space="preserve">: </w:t>
+      </w:r>
+      <w:r>
+        <w:rPr>
+          <w:rStyle w:val="StringTok"/>
+        </w:rPr>
+        <w:t xml:space="preserve">"2026-08-27T14:18:16.58+00:00"</w:t>
+      </w:r>
+      <w:r>
+        <w:rPr>
+          <w:rStyle w:val="NormalTok"/>
+        </w:rPr>
+        <w:t xml:space="preserve"> }</w:t>
       </w:r>
     </w:p>
-    <w:p>
-      <w:pPr>
-        <w:pStyle w:val="BodyText"/>
-      </w:pPr>
-      <w:r>
-        <w:t xml:space="preserve">Live example (recorded):</w:t>
-      </w:r>
-      <w:r>
-        <w:t xml:space="preserve"> </w:t>
-      </w:r>
-      <w:r>
-        <w:rPr>
-          <w:rStyle w:val="VerbatimChar"/>
-        </w:rPr>
-        <w:t xml:space="preserve">PUT /api/reminders/rule</w:t>
-      </w:r>
-      <w:r>
-        <w:t xml:space="preserve"> </w:t>
-      </w:r>
-      <w:r>
-        <w:t xml:space="preserve">with</w:t>
-      </w:r>
-      <w:r>
-        <w:t xml:space="preserve"> </w:t>
-      </w:r>
-      <w:r>
-        <w:rPr>
-          <w:rStyle w:val="VerbatimChar"/>
-        </w:rPr>
-        <w:t xml:space="preserve">{"offsetsDays":[45,3], …}</w:t>
-      </w:r>
-      <w:r>
-        <w:t xml:space="preserve"> </w:t>
-      </w:r>
-      <w:r>
-        <w:t xml:space="preserve">against an</w:t>
-      </w:r>
-      <w:r>
-        <w:t xml:space="preserve"> </w:t>
-      </w:r>
-      <w:r>
-        <w:t xml:space="preserve">account holding one document expiring</w:t>
-      </w:r>
-      <w:r>
-        <w:t xml:space="preserve"> </w:t>
-      </w:r>
-      <w:r>
-        <w:rPr>
-          <w:rStyle w:val="VerbatimChar"/>
-        </w:rPr>
-        <w:t xml:space="preserve">2026-09-04</w:t>
-      </w:r>
-      <w:r>
-        <w:t xml:space="preserve"> </w:t>
-      </w:r>
-      <w:r>
-        <w:t xml:space="preserve">left exactly one Pending row —</w:t>
-      </w:r>
-      <w:r>
-        <w:t xml:space="preserve"> </w:t>
-      </w:r>
-      <w:r>
-        <w:rPr>
-          <w:rStyle w:val="VerbatimChar"/>
-        </w:rPr>
-        <w:t xml:space="preserve">offsetDays: 3, dueDate: 2026-09-01, expiryDate: 2026-09-04</w:t>
-      </w:r>
-      <w:r>
-        <w:t xml:space="preserve"> </w:t>
-      </w:r>
-      <w:r>
-        <w:t xml:space="preserve">— the already-sent 7-day reminder</w:t>
-      </w:r>
-      <w:r>
-        <w:t xml:space="preserve"> </w:t>
-      </w:r>
-      <w:r>
-        <w:t xml:space="preserve">stayed</w:t>
-      </w:r>
-      <w:r>
-        <w:t xml:space="preserve"> </w:t>
-      </w:r>
-      <w:r>
-        <w:rPr>
-          <w:rStyle w:val="VerbatimChar"/>
-        </w:rPr>
-        <w:t xml:space="preserve">Sent</w:t>
-      </w:r>
-      <w:r>
-        <w:t xml:space="preserve"> </w:t>
-      </w:r>
-      <w:r>
-        <w:t xml:space="preserve">(history is immutable), the removed offsets were cancelled.</w:t>
-      </w:r>
-    </w:p>
+    <w:bookmarkEnd w:id="37"/>
     <w:bookmarkEnd w:id="38"/>
-    <w:bookmarkStart w:id="39" w:name="error-model"/>
+    <w:bookmarkStart w:id="39" w:name="reminders-module-endpoints"/>
     <w:p>
       <w:pPr>
         <w:pStyle w:val="Heading1"/>
@@ -5397,13 +5504,13 @@
         <w:rPr>
           <w:rStyle w:val="SectionNumber"/>
         </w:rPr>
-        <w:t xml:space="preserve">6</w:t>
+        <w:t xml:space="preserve">5</w:t>
       </w:r>
       <w:r>
         <w:tab/>
       </w:r>
       <w:r>
-        <w:t xml:space="preserve">6. Error model</w:t>
+        <w:t xml:space="preserve">5. Reminders module endpoints</w:t>
       </w:r>
     </w:p>
     <w:p>
@@ -5411,19 +5518,53 @@
         <w:pStyle w:val="FirstParagraph"/>
       </w:pPr>
       <w:r>
-        <w:t xml:space="preserve">Every error is the ABP envelope</w:t>
-      </w:r>
-      <w:r>
-        <w:t xml:space="preserve"> </w:t>
-      </w:r>
-      <w:r>
-        <w:rPr>
-          <w:rStyle w:val="VerbatimChar"/>
-        </w:rPr>
-        <w:t xml:space="preserve">{ "error": { code, message, details, data, validationErrors } }</w:t>
-      </w:r>
-      <w:r>
-        <w:t xml:space="preserve">.</w:t>
+        <w:t xml:space="preserve">Route root</w:t>
+      </w:r>
+      <w:r>
+        <w:t xml:space="preserve"> </w:t>
+      </w:r>
+      <w:r>
+        <w:rPr>
+          <w:rStyle w:val="VerbatimChar"/>
+        </w:rPr>
+        <w:t xml:space="preserve">/api/reminders/*</w:t>
+      </w:r>
+      <w:r>
+        <w:t xml:space="preserve">. The rule is a</w:t>
+      </w:r>
+      <w:r>
+        <w:t xml:space="preserve"> </w:t>
+      </w:r>
+      <w:r>
+        <w:rPr>
+          <w:bCs/>
+          <w:b/>
+        </w:rPr>
+        <w:t xml:space="preserve">singleton resource</w:t>
+      </w:r>
+      <w:r>
+        <w:t xml:space="preserve"> </w:t>
+      </w:r>
+      <w:r>
+        <w:t xml:space="preserve">— one per user, so its</w:t>
+      </w:r>
+      <w:r>
+        <w:t xml:space="preserve"> </w:t>
+      </w:r>
+      <w:r>
+        <w:t xml:space="preserve">routes carry no</w:t>
+      </w:r>
+      <w:r>
+        <w:t xml:space="preserve"> </w:t>
+      </w:r>
+      <w:r>
+        <w:rPr>
+          <w:rStyle w:val="VerbatimChar"/>
+        </w:rPr>
+        <w:t xml:space="preserve">{id}</w:t>
+      </w:r>
+      <w:r>
+        <w:t xml:space="preserve">; the caller’s identity selects the row (created with defaults on first GET).</w:t>
       </w:r>
     </w:p>
     <w:tbl>
@@ -5450,40 +5591,31 @@
               <w:jc w:val="left"/>
             </w:pPr>
             <w:r>
-              <w:t xml:space="preserve">HTTP</w:t>
-            </w:r>
-          </w:p>
-        </w:tc>
-        <w:tc>
-          <w:tcPr/>
-          <w:p>
-            <w:pPr>
-              <w:pStyle w:val="Compact"/>
-              <w:jc w:val="left"/>
-            </w:pPr>
-            <w:r>
-              <w:t xml:space="preserve">When</w:t>
-            </w:r>
-          </w:p>
-        </w:tc>
-        <w:tc>
-          <w:tcPr/>
-          <w:p>
-            <w:pPr>
-              <w:pStyle w:val="Compact"/>
-              <w:jc w:val="left"/>
-            </w:pPr>
-            <w:r>
-              <w:rPr>
-                <w:rStyle w:val="VerbatimChar"/>
-              </w:rPr>
-              <w:t xml:space="preserve">error.code</w:t>
-            </w:r>
-            <w:r>
-              <w:t xml:space="preserve"> </w:t>
-            </w:r>
-            <w:r>
-              <w:t xml:space="preserve">example</w:t>
+              <w:t xml:space="preserve">Method &amp; path</w:t>
+            </w:r>
+          </w:p>
+        </w:tc>
+        <w:tc>
+          <w:tcPr/>
+          <w:p>
+            <w:pPr>
+              <w:pStyle w:val="Compact"/>
+              <w:jc w:val="left"/>
+            </w:pPr>
+            <w:r>
+              <w:t xml:space="preserve">Permission</w:t>
+            </w:r>
+          </w:p>
+        </w:tc>
+        <w:tc>
+          <w:tcPr/>
+          <w:p>
+            <w:pPr>
+              <w:pStyle w:val="Compact"/>
+              <w:jc w:val="left"/>
+            </w:pPr>
+            <w:r>
+              <w:t xml:space="preserve">Description</w:t>
             </w:r>
           </w:p>
         </w:tc>
@@ -5497,19 +5629,46 @@
               <w:jc w:val="left"/>
             </w:pPr>
             <w:r>
-              <w:t xml:space="preserve">400</w:t>
-            </w:r>
-          </w:p>
-        </w:tc>
-        <w:tc>
-          <w:tcPr/>
-          <w:p>
-            <w:pPr>
-              <w:pStyle w:val="Compact"/>
-              <w:jc w:val="left"/>
-            </w:pPr>
-            <w:r>
-              <w:t xml:space="preserve">DTO validation (missing/too long fields) —</w:t>
+              <w:rPr>
+                <w:rStyle w:val="VerbatimChar"/>
+              </w:rPr>
+              <w:t xml:space="preserve">GET /api/reminders/rule</w:t>
+            </w:r>
+          </w:p>
+        </w:tc>
+        <w:tc>
+          <w:tcPr/>
+          <w:p>
+            <w:pPr>
+              <w:pStyle w:val="Compact"/>
+              <w:jc w:val="left"/>
+            </w:pPr>
+            <w:r>
+              <w:rPr>
+                <w:rStyle w:val="VerbatimChar"/>
+              </w:rPr>
+              <w:t xml:space="preserve">WathiqReminders.Rule</w:t>
+            </w:r>
+          </w:p>
+        </w:tc>
+        <w:tc>
+          <w:tcPr/>
+          <w:p>
+            <w:pPr>
+              <w:pStyle w:val="Compact"/>
+              <w:jc w:val="left"/>
+            </w:pPr>
+            <w:r>
+              <w:t xml:space="preserve">The caller’s reminder settings; materialises the default (</w:t>
+            </w:r>
+            <w:r>
+              <w:rPr>
+                <w:rStyle w:val="VerbatimChar"/>
+              </w:rPr>
+              <w:t xml:space="preserve">90,30,7,1</w:t>
+            </w:r>
+            <w:r>
+              <w:t xml:space="preserve">, Email,</w:t>
             </w:r>
             <w:r>
               <w:t xml:space="preserve"> </w:t>
@@ -5518,25 +5677,10 @@
               <w:rPr>
                 <w:rStyle w:val="VerbatimChar"/>
               </w:rPr>
-              <w:t xml:space="preserve">validationErrors</w:t>
-            </w:r>
-            <w:r>
-              <w:t xml:space="preserve"> </w:t>
-            </w:r>
-            <w:r>
-              <w:t xml:space="preserve">lists each field</w:t>
-            </w:r>
-          </w:p>
-        </w:tc>
-        <w:tc>
-          <w:tcPr/>
-          <w:p>
-            <w:pPr>
-              <w:pStyle w:val="Compact"/>
-              <w:jc w:val="left"/>
-            </w:pPr>
-            <w:r>
-              <w:t xml:space="preserve">—</w:t>
+              <w:t xml:space="preserve">Asia/Riyadh</w:t>
+            </w:r>
+            <w:r>
+              <w:t xml:space="preserve">) on first call</w:t>
             </w:r>
           </w:p>
         </w:tc>
@@ -5550,31 +5694,65 @@
               <w:jc w:val="left"/>
             </w:pPr>
             <w:r>
-              <w:t xml:space="preserve">401</w:t>
-            </w:r>
-          </w:p>
-        </w:tc>
-        <w:tc>
-          <w:tcPr/>
-          <w:p>
-            <w:pPr>
-              <w:pStyle w:val="Compact"/>
-              <w:jc w:val="left"/>
-            </w:pPr>
-            <w:r>
-              <w:t xml:space="preserve">Missing/invalid token (JSON clients)</w:t>
-            </w:r>
-          </w:p>
-        </w:tc>
-        <w:tc>
-          <w:tcPr/>
-          <w:p>
-            <w:pPr>
-              <w:pStyle w:val="Compact"/>
-              <w:jc w:val="left"/>
-            </w:pPr>
-            <w:r>
-              <w:t xml:space="preserve">—</w:t>
+              <w:rPr>
+                <w:rStyle w:val="VerbatimChar"/>
+              </w:rPr>
+              <w:t xml:space="preserve">PUT /api/reminders/rule</w:t>
+            </w:r>
+          </w:p>
+        </w:tc>
+        <w:tc>
+          <w:tcPr/>
+          <w:p>
+            <w:pPr>
+              <w:pStyle w:val="Compact"/>
+              <w:jc w:val="left"/>
+            </w:pPr>
+            <w:r>
+              <w:rPr>
+                <w:rStyle w:val="VerbatimChar"/>
+              </w:rPr>
+              <w:t xml:space="preserve">…Rule.Update</w:t>
+            </w:r>
+          </w:p>
+        </w:tc>
+        <w:tc>
+          <w:tcPr/>
+          <w:p>
+            <w:pPr>
+              <w:pStyle w:val="Compact"/>
+              <w:jc w:val="left"/>
+            </w:pPr>
+            <w:r>
+              <w:t xml:space="preserve">Update settings;</w:t>
+            </w:r>
+            <w:r>
+              <w:t xml:space="preserve"> </w:t>
+            </w:r>
+            <w:r>
+              <w:rPr>
+                <w:bCs/>
+                <w:b/>
+              </w:rPr>
+              <w:t xml:space="preserve">resyncs existing reminders in the same transaction</w:t>
+            </w:r>
+            <w:r>
+              <w:t xml:space="preserve">, so</w:t>
+            </w:r>
+            <w:r>
+              <w:t xml:space="preserve"> </w:t>
+            </w:r>
+            <w:r>
+              <w:rPr>
+                <w:rStyle w:val="VerbatimChar"/>
+              </w:rPr>
+              <w:t xml:space="preserve">upcoming-list</w:t>
+            </w:r>
+            <w:r>
+              <w:t xml:space="preserve"> </w:t>
+            </w:r>
+            <w:r>
+              <w:t xml:space="preserve">immediately matches</w:t>
             </w:r>
           </w:p>
         </w:tc>
@@ -5588,82 +5766,70 @@
               <w:jc w:val="left"/>
             </w:pPr>
             <w:r>
-              <w:t xml:space="preserve">403</w:t>
-            </w:r>
-          </w:p>
-        </w:tc>
-        <w:tc>
-          <w:tcPr/>
-          <w:p>
-            <w:pPr>
-              <w:pStyle w:val="Compact"/>
-              <w:jc w:val="left"/>
-            </w:pPr>
-            <w:r>
-              <w:t xml:space="preserve">Permission denied, or a business rule rejected the request</w:t>
-            </w:r>
-          </w:p>
-        </w:tc>
-        <w:tc>
-          <w:tcPr/>
-          <w:p>
-            <w:pPr>
-              <w:pStyle w:val="Compact"/>
-              <w:jc w:val="left"/>
-            </w:pPr>
-            <w:r>
-              <w:rPr>
-                <w:rStyle w:val="VerbatimChar"/>
-              </w:rPr>
-              <w:t xml:space="preserve">Wathiq.Documents:ExpiryBeforeIssue</w:t>
-            </w:r>
-          </w:p>
-        </w:tc>
-      </w:tr>
-      <w:tr>
-        <w:tc>
-          <w:tcPr/>
-          <w:p>
-            <w:pPr>
-              <w:pStyle w:val="Compact"/>
-              <w:jc w:val="left"/>
-            </w:pPr>
-            <w:r>
-              <w:t xml:space="preserve">404</w:t>
-            </w:r>
-          </w:p>
-        </w:tc>
-        <w:tc>
-          <w:tcPr/>
-          <w:p>
-            <w:pPr>
-              <w:pStyle w:val="Compact"/>
-              <w:jc w:val="left"/>
-            </w:pPr>
-            <w:r>
-              <w:t xml:space="preserve">Row doesn’t exist</w:t>
+              <w:rPr>
+                <w:rStyle w:val="VerbatimChar"/>
+              </w:rPr>
+              <w:t xml:space="preserve">GET /api/reminders/reminders/upcoming-list</w:t>
+            </w:r>
+          </w:p>
+        </w:tc>
+        <w:tc>
+          <w:tcPr/>
+          <w:p>
+            <w:pPr>
+              <w:pStyle w:val="Compact"/>
+              <w:jc w:val="left"/>
+            </w:pPr>
+            <w:r>
+              <w:rPr>
+                <w:rStyle w:val="VerbatimChar"/>
+              </w:rPr>
+              <w:t xml:space="preserve">…Reminders</w:t>
+            </w:r>
+          </w:p>
+        </w:tc>
+        <w:tc>
+          <w:tcPr/>
+          <w:p>
+            <w:pPr>
+              <w:pStyle w:val="Compact"/>
+              <w:jc w:val="left"/>
+            </w:pPr>
+            <w:r>
+              <w:t xml:space="preserve">Pending reminders, soonest</w:t>
             </w:r>
             <w:r>
               <w:t xml:space="preserve"> </w:t>
             </w:r>
             <w:r>
               <w:rPr>
-                <w:bCs/>
-                <w:b/>
-              </w:rPr>
-              <w:t xml:space="preserve">or belongs to another user</w:t>
-            </w:r>
-          </w:p>
-        </w:tc>
-        <w:tc>
-          <w:tcPr/>
-          <w:p>
-            <w:pPr>
-              <w:pStyle w:val="Compact"/>
-              <w:jc w:val="left"/>
-            </w:pPr>
-            <w:r>
-              <w:t xml:space="preserve">—</w:t>
+                <w:rStyle w:val="VerbatimChar"/>
+              </w:rPr>
+              <w:t xml:space="preserve">dueDate</w:t>
+            </w:r>
+            <w:r>
+              <w:t xml:space="preserve"> </w:t>
+            </w:r>
+            <w:r>
+              <w:t xml:space="preserve">first; paged (</w:t>
+            </w:r>
+            <w:r>
+              <w:rPr>
+                <w:rStyle w:val="VerbatimChar"/>
+              </w:rPr>
+              <w:t xml:space="preserve">SkipCount</w:t>
+            </w:r>
+            <w:r>
+              <w:t xml:space="preserve">/</w:t>
+            </w:r>
+            <w:r>
+              <w:rPr>
+                <w:rStyle w:val="VerbatimChar"/>
+              </w:rPr>
+              <w:t xml:space="preserve">MaxResultCount</w:t>
+            </w:r>
+            <w:r>
+              <w:t xml:space="preserve">)</w:t>
             </w:r>
           </w:p>
         </w:tc>
@@ -5674,70 +5840,124 @@
         <w:pStyle w:val="BodyText"/>
       </w:pPr>
       <w:r>
-        <w:t xml:space="preserve">Reminders business codes:</w:t>
-      </w:r>
-      <w:r>
-        <w:t xml:space="preserve"> </w:t>
-      </w:r>
-      <w:r>
-        <w:rPr>
-          <w:rStyle w:val="VerbatimChar"/>
-        </w:rPr>
-        <w:t xml:space="preserve">InvalidOffsets</w:t>
-      </w:r>
-      <w:r>
-        <w:t xml:space="preserve">,</w:t>
-      </w:r>
-      <w:r>
-        <w:t xml:space="preserve"> </w:t>
-      </w:r>
-      <w:r>
-        <w:rPr>
-          <w:rStyle w:val="VerbatimChar"/>
-        </w:rPr>
-        <w:t xml:space="preserve">QuietHoursIncomplete</w:t>
-      </w:r>
-      <w:r>
-        <w:t xml:space="preserve">,</w:t>
-      </w:r>
-      <w:r>
-        <w:t xml:space="preserve"> </w:t>
-      </w:r>
-      <w:r>
-        <w:rPr>
-          <w:rStyle w:val="VerbatimChar"/>
-        </w:rPr>
-        <w:t xml:space="preserve">UnknownTimeZone</w:t>
-      </w:r>
-      <w:r>
-        <w:t xml:space="preserve">,</w:t>
-      </w:r>
-      <w:r>
-        <w:t xml:space="preserve"> </w:t>
-      </w:r>
-      <w:r>
-        <w:rPr>
-          <w:rStyle w:val="VerbatimChar"/>
-        </w:rPr>
-        <w:t xml:space="preserve">NoEmailAddress</w:t>
-      </w:r>
-      <w:r>
-        <w:t xml:space="preserve"> </w:t>
-      </w:r>
-      <w:r>
-        <w:t xml:space="preserve">— prefixed</w:t>
-      </w:r>
-      <w:r>
-        <w:t xml:space="preserve"> </w:t>
-      </w:r>
-      <w:r>
-        <w:rPr>
-          <w:rStyle w:val="VerbatimChar"/>
-        </w:rPr>
-        <w:t xml:space="preserve">Wathiq.Reminders:</w:t>
-      </w:r>
-      <w:r>
-        <w:t xml:space="preserve">.</w:t>
+        <w:rPr>
+          <w:rStyle w:val="VerbatimChar"/>
+        </w:rPr>
+        <w:t xml:space="preserve">ReminderRuleDto</w:t>
+      </w:r>
+      <w:r>
+        <w:t xml:space="preserve"> </w:t>
+      </w:r>
+      <w:r>
+        <w:t xml:space="preserve">/</w:t>
+      </w:r>
+      <w:r>
+        <w:t xml:space="preserve"> </w:t>
+      </w:r>
+      <w:r>
+        <w:rPr>
+          <w:rStyle w:val="VerbatimChar"/>
+        </w:rPr>
+        <w:t xml:space="preserve">UpdateReminderRuleDto</w:t>
+      </w:r>
+      <w:r>
+        <w:t xml:space="preserve">:</w:t>
+      </w:r>
+      <w:r>
+        <w:t xml:space="preserve"> </w:t>
+      </w:r>
+      <w:r>
+        <w:rPr>
+          <w:rStyle w:val="VerbatimChar"/>
+        </w:rPr>
+        <w:t xml:space="preserve">offsetsDays</w:t>
+      </w:r>
+      <w:r>
+        <w:t xml:space="preserve"> </w:t>
+      </w:r>
+      <w:r>
+        <w:t xml:space="preserve">int[] (1–3650, ≤8 entries — the</w:t>
+      </w:r>
+      <w:r>
+        <w:t xml:space="preserve"> </w:t>
+      </w:r>
+      <w:r>
+        <w:t xml:space="preserve">server normalizes to descending distinct),</w:t>
+      </w:r>
+      <w:r>
+        <w:t xml:space="preserve"> </w:t>
+      </w:r>
+      <w:r>
+        <w:rPr>
+          <w:rStyle w:val="VerbatimChar"/>
+        </w:rPr>
+        <w:t xml:space="preserve">channels</w:t>
+      </w:r>
+      <w:r>
+        <w:t xml:space="preserve"> </w:t>
+      </w:r>
+      <w:r>
+        <w:t xml:space="preserve">(flags: 1 Email · 2 Push; 0 pauses),</w:t>
+      </w:r>
+      <w:r>
+        <w:t xml:space="preserve"> </w:t>
+      </w:r>
+      <w:r>
+        <w:rPr>
+          <w:rStyle w:val="VerbatimChar"/>
+        </w:rPr>
+        <w:t xml:space="preserve">quietFrom</w:t>
+      </w:r>
+      <w:r>
+        <w:t xml:space="preserve">/</w:t>
+      </w:r>
+      <w:r>
+        <w:rPr>
+          <w:rStyle w:val="VerbatimChar"/>
+        </w:rPr>
+        <w:t xml:space="preserve">quietTo</w:t>
+      </w:r>
+      <w:r>
+        <w:t xml:space="preserve"> </w:t>
+      </w:r>
+      <w:r>
+        <w:t xml:space="preserve">(</w:t>
+      </w:r>
+      <w:r>
+        <w:rPr>
+          <w:rStyle w:val="VerbatimChar"/>
+        </w:rPr>
+        <w:t xml:space="preserve">"22:00:00"</w:t>
+      </w:r>
+      <w:r>
+        <w:t xml:space="preserve">, both-or-neither; over-midnight windows allowed),</w:t>
+      </w:r>
+      <w:r>
+        <w:t xml:space="preserve"> </w:t>
+      </w:r>
+      <w:r>
+        <w:rPr>
+          <w:rStyle w:val="VerbatimChar"/>
+        </w:rPr>
+        <w:t xml:space="preserve">timeZoneId</w:t>
+      </w:r>
+      <w:r>
+        <w:t xml:space="preserve"> </w:t>
+      </w:r>
+      <w:r>
+        <w:t xml:space="preserve">(IANA, validated — unknown zones are rejected with</w:t>
+      </w:r>
+      <w:r>
+        <w:t xml:space="preserve"> </w:t>
+      </w:r>
+      <w:r>
+        <w:rPr>
+          <w:rStyle w:val="VerbatimChar"/>
+        </w:rPr>
+        <w:t xml:space="preserve">Wathiq.Reminders:UnknownTimeZone</w:t>
+      </w:r>
+      <w:r>
+        <w:t xml:space="preserve">).</w:t>
       </w:r>
     </w:p>
     <w:p>
@@ -5745,28 +5965,25 @@
         <w:pStyle w:val="BodyText"/>
       </w:pPr>
       <w:r>
-        <w:t xml:space="preserve">Business error codes of the Documents module (message localized via</w:t>
-      </w:r>
-      <w:r>
-        <w:t xml:space="preserve"> </w:t>
-      </w:r>
-      <w:r>
-        <w:rPr>
-          <w:rStyle w:val="VerbatimChar"/>
-        </w:rPr>
-        <w:t xml:space="preserve">Accept-Language</w:t>
-      </w:r>
-      <w:r>
-        <w:t xml:space="preserve">):</w:t>
-      </w:r>
-      <w:r>
-        <w:t xml:space="preserve"> </w:t>
-      </w:r>
-      <w:r>
-        <w:rPr>
-          <w:rStyle w:val="VerbatimChar"/>
-        </w:rPr>
-        <w:t xml:space="preserve">ExpiryBeforeIssue</w:t>
+        <w:rPr>
+          <w:rStyle w:val="VerbatimChar"/>
+        </w:rPr>
+        <w:t xml:space="preserve">ReminderDto</w:t>
+      </w:r>
+      <w:r>
+        <w:t xml:space="preserve"> </w:t>
+      </w:r>
+      <w:r>
+        <w:t xml:space="preserve">(response):</w:t>
+      </w:r>
+      <w:r>
+        <w:t xml:space="preserve"> </w:t>
+      </w:r>
+      <w:r>
+        <w:rPr>
+          <w:rStyle w:val="VerbatimChar"/>
+        </w:rPr>
+        <w:t xml:space="preserve">id</w:t>
       </w:r>
       <w:r>
         <w:t xml:space="preserve">,</w:t>
@@ -5778,7 +5995,7 @@
         <w:rPr>
           <w:rStyle w:val="VerbatimChar"/>
         </w:rPr>
-        <w:t xml:space="preserve">HolderNotOwned</w:t>
+        <w:t xml:space="preserve">documentId</w:t>
       </w:r>
       <w:r>
         <w:t xml:space="preserve">,</w:t>
@@ -5790,7 +6007,7 @@
         <w:rPr>
           <w:rStyle w:val="VerbatimChar"/>
         </w:rPr>
-        <w:t xml:space="preserve">DocumentTypeNotActive</w:t>
+        <w:t xml:space="preserve">offsetDays</w:t>
       </w:r>
       <w:r>
         <w:t xml:space="preserve">,</w:t>
@@ -5802,7 +6019,7 @@
         <w:rPr>
           <w:rStyle w:val="VerbatimChar"/>
         </w:rPr>
-        <w:t xml:space="preserve">SelfHolderIsAutomatic</w:t>
+        <w:t xml:space="preserve">dueDate</w:t>
       </w:r>
       <w:r>
         <w:t xml:space="preserve">,</w:t>
@@ -5814,34 +6031,55 @@
         <w:rPr>
           <w:rStyle w:val="VerbatimChar"/>
         </w:rPr>
-        <w:t xml:space="preserve">CannotDeleteSelfHolder</w:t>
-      </w:r>
-      <w:r>
-        <w:t xml:space="preserve">,</w:t>
-      </w:r>
-      <w:r>
-        <w:t xml:space="preserve"> </w:t>
-      </w:r>
-      <w:r>
-        <w:rPr>
-          <w:rStyle w:val="VerbatimChar"/>
-        </w:rPr>
-        <w:t xml:space="preserve">HolderHasDocuments</w:t>
-      </w:r>
-      <w:r>
-        <w:t xml:space="preserve"> </w:t>
-      </w:r>
-      <w:r>
-        <w:t xml:space="preserve">— all prefixed</w:t>
-      </w:r>
-      <w:r>
-        <w:t xml:space="preserve"> </w:t>
-      </w:r>
-      <w:r>
-        <w:rPr>
-          <w:rStyle w:val="VerbatimChar"/>
-        </w:rPr>
-        <w:t xml:space="preserve">Wathiq.Documents:</w:t>
+        <w:t xml:space="preserve">expiryDate</w:t>
+      </w:r>
+      <w:r>
+        <w:t xml:space="preserve"> </w:t>
+      </w:r>
+      <w:r>
+        <w:t xml:space="preserve">(server-computed:</w:t>
+      </w:r>
+      <w:r>
+        <w:t xml:space="preserve"> </w:t>
+      </w:r>
+      <w:r>
+        <w:rPr>
+          <w:rStyle w:val="VerbatimChar"/>
+        </w:rPr>
+        <w:t xml:space="preserve">dueDate + offsetDays</w:t>
+      </w:r>
+      <w:r>
+        <w:t xml:space="preserve">),</w:t>
+      </w:r>
+      <w:r>
+        <w:t xml:space="preserve"> </w:t>
+      </w:r>
+      <w:r>
+        <w:rPr>
+          <w:rStyle w:val="VerbatimChar"/>
+        </w:rPr>
+        <w:t xml:space="preserve">status</w:t>
+      </w:r>
+      <w:r>
+        <w:t xml:space="preserve"> </w:t>
+      </w:r>
+      <w:r>
+        <w:t xml:space="preserve">(0 Pending · 1 Sent · 2 Failed · 3</w:t>
+      </w:r>
+      <w:r>
+        <w:t xml:space="preserve"> </w:t>
+      </w:r>
+      <w:r>
+        <w:t xml:space="preserve">Cancelled),</w:t>
+      </w:r>
+      <w:r>
+        <w:t xml:space="preserve"> </w:t>
+      </w:r>
+      <w:r>
+        <w:rPr>
+          <w:rStyle w:val="VerbatimChar"/>
+        </w:rPr>
+        <w:t xml:space="preserve">sentAt?</w:t>
       </w:r>
       <w:r>
         <w:t xml:space="preserve">.</w:t>
@@ -5852,274 +6090,112 @@
         <w:pStyle w:val="BodyText"/>
       </w:pPr>
       <w:r>
-        <w:t xml:space="preserve">Live example (</w:t>
-      </w:r>
-      <w:r>
-        <w:rPr>
-          <w:rStyle w:val="VerbatimChar"/>
-        </w:rPr>
-        <w:t xml:space="preserve">Accept-Language: ar</w:t>
-      </w:r>
-      <w:r>
-        <w:t xml:space="preserve">, expiry before issue):</w:t>
+        <w:t xml:space="preserve">Reminder rows are system-managed: they are (re)created by document changes and the rule update,</w:t>
+      </w:r>
+      <w:r>
+        <w:t xml:space="preserve"> </w:t>
+      </w:r>
+      <w:r>
+        <w:t xml:space="preserve">sent by the hourly dispatch job, and never edited directly — hence no POST/PUT/DELETE.</w:t>
       </w:r>
     </w:p>
     <w:p>
       <w:pPr>
-        <w:pStyle w:val="SourceCode"/>
+        <w:pStyle w:val="BodyText"/>
       </w:pPr>
       <w:r>
-        <w:rPr>
-          <w:rStyle w:val="FunctionTok"/>
-        </w:rPr>
-        <w:t xml:space="preserve">{</w:t>
-      </w:r>
-      <w:r>
-        <w:rPr>
-          <w:rStyle w:val="NormalTok"/>
-        </w:rPr>
-        <w:t xml:space="preserve"> </w:t>
-      </w:r>
-      <w:r>
-        <w:rPr>
-          <w:rStyle w:val="DataTypeTok"/>
-        </w:rPr>
-        <w:t xml:space="preserve">"error"</w:t>
-      </w:r>
-      <w:r>
-        <w:rPr>
-          <w:rStyle w:val="FunctionTok"/>
-        </w:rPr>
-        <w:t xml:space="preserve">:</w:t>
-      </w:r>
-      <w:r>
-        <w:rPr>
-          <w:rStyle w:val="NormalTok"/>
-        </w:rPr>
-        <w:t xml:space="preserve"> </w:t>
-      </w:r>
-      <w:r>
-        <w:rPr>
-          <w:rStyle w:val="FunctionTok"/>
-        </w:rPr>
-        <w:t xml:space="preserve">{</w:t>
-      </w:r>
-      <w:r>
-        <w:br/>
-      </w:r>
-      <w:r>
-        <w:rPr>
-          <w:rStyle w:val="NormalTok"/>
-        </w:rPr>
-        <w:t xml:space="preserve">    </w:t>
-      </w:r>
-      <w:r>
-        <w:rPr>
-          <w:rStyle w:val="DataTypeTok"/>
-        </w:rPr>
-        <w:t xml:space="preserve">"code"</w:t>
-      </w:r>
-      <w:r>
-        <w:rPr>
-          <w:rStyle w:val="FunctionTok"/>
-        </w:rPr>
-        <w:t xml:space="preserve">:</w:t>
-      </w:r>
-      <w:r>
-        <w:rPr>
-          <w:rStyle w:val="NormalTok"/>
-        </w:rPr>
-        <w:t xml:space="preserve"> </w:t>
-      </w:r>
-      <w:r>
-        <w:rPr>
-          <w:rStyle w:val="StringTok"/>
-        </w:rPr>
-        <w:t xml:space="preserve">"Wathiq.Documents:ExpiryBeforeIssue"</w:t>
-      </w:r>
-      <w:r>
-        <w:rPr>
-          <w:rStyle w:val="FunctionTok"/>
-        </w:rPr>
-        <w:t xml:space="preserve">,</w:t>
-      </w:r>
-      <w:r>
-        <w:br/>
-      </w:r>
-      <w:r>
-        <w:rPr>
-          <w:rStyle w:val="NormalTok"/>
-        </w:rPr>
-        <w:t xml:space="preserve">    </w:t>
-      </w:r>
-      <w:r>
-        <w:rPr>
-          <w:rStyle w:val="DataTypeTok"/>
-        </w:rPr>
-        <w:t xml:space="preserve">"message"</w:t>
-      </w:r>
-      <w:r>
-        <w:rPr>
-          <w:rStyle w:val="FunctionTok"/>
-        </w:rPr>
-        <w:t xml:space="preserve">:</w:t>
-      </w:r>
-      <w:r>
-        <w:rPr>
-          <w:rStyle w:val="NormalTok"/>
-        </w:rPr>
-        <w:t xml:space="preserve"> </w:t>
-      </w:r>
-      <w:r>
-        <w:rPr>
-          <w:rStyle w:val="StringTok"/>
-        </w:rPr>
-        <w:t xml:space="preserve">"لا يمكن أن يكون تاريخ الانتهاء قبل تاريخ الإصدار."</w:t>
-      </w:r>
-      <w:r>
-        <w:rPr>
-          <w:rStyle w:val="FunctionTok"/>
-        </w:rPr>
-        <w:t xml:space="preserve">,</w:t>
-      </w:r>
-      <w:r>
-        <w:br/>
-      </w:r>
-      <w:r>
-        <w:rPr>
-          <w:rStyle w:val="NormalTok"/>
-        </w:rPr>
-        <w:t xml:space="preserve">    </w:t>
-      </w:r>
-      <w:r>
-        <w:rPr>
-          <w:rStyle w:val="DataTypeTok"/>
-        </w:rPr>
-        <w:t xml:space="preserve">"data"</w:t>
-      </w:r>
-      <w:r>
-        <w:rPr>
-          <w:rStyle w:val="FunctionTok"/>
-        </w:rPr>
-        <w:t xml:space="preserve">:</w:t>
-      </w:r>
-      <w:r>
-        <w:rPr>
-          <w:rStyle w:val="NormalTok"/>
-        </w:rPr>
-        <w:t xml:space="preserve"> </w:t>
-      </w:r>
-      <w:r>
-        <w:rPr>
-          <w:rStyle w:val="FunctionTok"/>
-        </w:rPr>
-        <w:t xml:space="preserve">{</w:t>
-      </w:r>
-      <w:r>
-        <w:rPr>
-          <w:rStyle w:val="NormalTok"/>
-        </w:rPr>
-        <w:t xml:space="preserve"> </w:t>
-      </w:r>
-      <w:r>
-        <w:rPr>
-          <w:rStyle w:val="DataTypeTok"/>
-        </w:rPr>
-        <w:t xml:space="preserve">"IssueDate"</w:t>
-      </w:r>
-      <w:r>
-        <w:rPr>
-          <w:rStyle w:val="FunctionTok"/>
-        </w:rPr>
-        <w:t xml:space="preserve">:</w:t>
-      </w:r>
-      <w:r>
-        <w:rPr>
-          <w:rStyle w:val="NormalTok"/>
-        </w:rPr>
-        <w:t xml:space="preserve"> </w:t>
-      </w:r>
-      <w:r>
-        <w:rPr>
-          <w:rStyle w:val="StringTok"/>
-        </w:rPr>
-        <w:t xml:space="preserve">"2030-01-01"</w:t>
-      </w:r>
-      <w:r>
-        <w:rPr>
-          <w:rStyle w:val="FunctionTok"/>
-        </w:rPr>
-        <w:t xml:space="preserve">,</w:t>
-      </w:r>
-      <w:r>
-        <w:rPr>
-          <w:rStyle w:val="NormalTok"/>
-        </w:rPr>
-        <w:t xml:space="preserve"> </w:t>
-      </w:r>
-      <w:r>
-        <w:rPr>
-          <w:rStyle w:val="DataTypeTok"/>
-        </w:rPr>
-        <w:t xml:space="preserve">"ExpiryDate"</w:t>
-      </w:r>
-      <w:r>
-        <w:rPr>
-          <w:rStyle w:val="FunctionTok"/>
-        </w:rPr>
-        <w:t xml:space="preserve">:</w:t>
-      </w:r>
-      <w:r>
-        <w:rPr>
-          <w:rStyle w:val="NormalTok"/>
-        </w:rPr>
-        <w:t xml:space="preserve"> </w:t>
-      </w:r>
-      <w:r>
-        <w:rPr>
-          <w:rStyle w:val="StringTok"/>
-        </w:rPr>
-        <w:t xml:space="preserve">"2020-01-01"</w:t>
-      </w:r>
-      <w:r>
-        <w:rPr>
-          <w:rStyle w:val="NormalTok"/>
-        </w:rPr>
-        <w:t xml:space="preserve"> </w:t>
-      </w:r>
-      <w:r>
-        <w:rPr>
-          <w:rStyle w:val="FunctionTok"/>
-        </w:rPr>
-        <w:t xml:space="preserve">}</w:t>
-      </w:r>
-      <w:r>
-        <w:rPr>
-          <w:rStyle w:val="NormalTok"/>
-        </w:rPr>
-        <w:t xml:space="preserve"> </w:t>
-      </w:r>
-      <w:r>
-        <w:rPr>
-          <w:rStyle w:val="FunctionTok"/>
-        </w:rPr>
-        <w:t xml:space="preserve">}</w:t>
-      </w:r>
-      <w:r>
-        <w:rPr>
-          <w:rStyle w:val="NormalTok"/>
-        </w:rPr>
-        <w:t xml:space="preserve"> </w:t>
-      </w:r>
-      <w:r>
-        <w:rPr>
-          <w:rStyle w:val="FunctionTok"/>
-        </w:rPr>
-        <w:t xml:space="preserve">}</w:t>
+        <w:t xml:space="preserve">Live example (recorded):</w:t>
+      </w:r>
+      <w:r>
+        <w:t xml:space="preserve"> </w:t>
+      </w:r>
+      <w:r>
+        <w:rPr>
+          <w:rStyle w:val="VerbatimChar"/>
+        </w:rPr>
+        <w:t xml:space="preserve">PUT /api/reminders/rule</w:t>
+      </w:r>
+      <w:r>
+        <w:t xml:space="preserve"> </w:t>
+      </w:r>
+      <w:r>
+        <w:t xml:space="preserve">with</w:t>
+      </w:r>
+      <w:r>
+        <w:t xml:space="preserve"> </w:t>
+      </w:r>
+      <w:r>
+        <w:rPr>
+          <w:rStyle w:val="VerbatimChar"/>
+        </w:rPr>
+        <w:t xml:space="preserve">{"offsetsDays":[45,3], …}</w:t>
+      </w:r>
+      <w:r>
+        <w:t xml:space="preserve"> </w:t>
+      </w:r>
+      <w:r>
+        <w:t xml:space="preserve">against an</w:t>
+      </w:r>
+      <w:r>
+        <w:t xml:space="preserve"> </w:t>
+      </w:r>
+      <w:r>
+        <w:t xml:space="preserve">account holding one document expiring</w:t>
+      </w:r>
+      <w:r>
+        <w:t xml:space="preserve"> </w:t>
+      </w:r>
+      <w:r>
+        <w:rPr>
+          <w:rStyle w:val="VerbatimChar"/>
+        </w:rPr>
+        <w:t xml:space="preserve">2026-09-04</w:t>
+      </w:r>
+      <w:r>
+        <w:t xml:space="preserve"> </w:t>
+      </w:r>
+      <w:r>
+        <w:t xml:space="preserve">left exactly one Pending row —</w:t>
+      </w:r>
+      <w:r>
+        <w:t xml:space="preserve"> </w:t>
+      </w:r>
+      <w:r>
+        <w:rPr>
+          <w:rStyle w:val="VerbatimChar"/>
+        </w:rPr>
+        <w:t xml:space="preserve">offsetDays: 3, dueDate: 2026-09-01, expiryDate: 2026-09-04</w:t>
+      </w:r>
+      <w:r>
+        <w:t xml:space="preserve"> </w:t>
+      </w:r>
+      <w:r>
+        <w:t xml:space="preserve">— the already-sent 7-day reminder</w:t>
+      </w:r>
+      <w:r>
+        <w:t xml:space="preserve"> </w:t>
+      </w:r>
+      <w:r>
+        <w:t xml:space="preserve">stayed</w:t>
+      </w:r>
+      <w:r>
+        <w:t xml:space="preserve"> </w:t>
+      </w:r>
+      <w:r>
+        <w:rPr>
+          <w:rStyle w:val="VerbatimChar"/>
+        </w:rPr>
+        <w:t xml:space="preserve">Sent</w:t>
+      </w:r>
+      <w:r>
+        <w:t xml:space="preserve"> </w:t>
+      </w:r>
+      <w:r>
+        <w:t xml:space="preserve">(history is immutable), the removed offsets were cancelled.</w:t>
       </w:r>
     </w:p>
     <w:bookmarkEnd w:id="39"/>
-    <w:bookmarkStart w:id="40" w:name="infrastructure-endpoints-abp-built-ins"/>
+    <w:bookmarkStart w:id="40" w:name="error-model"/>
     <w:p>
       <w:pPr>
         <w:pStyle w:val="Heading1"/>
@@ -6128,13 +6204,13 @@
         <w:rPr>
           <w:rStyle w:val="SectionNumber"/>
         </w:rPr>
-        <w:t xml:space="preserve">7</w:t>
+        <w:t xml:space="preserve">6</w:t>
       </w:r>
       <w:r>
         <w:tab/>
       </w:r>
       <w:r>
-        <w:t xml:space="preserve">7. Infrastructure endpoints (ABP built-ins)</w:t>
+        <w:t xml:space="preserve">6. Error model</w:t>
       </w:r>
     </w:p>
     <w:p>
@@ -6142,7 +6218,19 @@
         <w:pStyle w:val="FirstParagraph"/>
       </w:pPr>
       <w:r>
-        <w:t xml:space="preserve">Summarized — full detail is in Swagger. Admin-tagged groups require admin permissions.</w:t>
+        <w:t xml:space="preserve">Every error is the ABP envelope</w:t>
+      </w:r>
+      <w:r>
+        <w:t xml:space="preserve"> </w:t>
+      </w:r>
+      <w:r>
+        <w:rPr>
+          <w:rStyle w:val="VerbatimChar"/>
+        </w:rPr>
+        <w:t xml:space="preserve">{ "error": { code, message, details, data, validationErrors } }</w:t>
+      </w:r>
+      <w:r>
+        <w:t xml:space="preserve">.</w:t>
       </w:r>
     </w:p>
     <w:tbl>
@@ -6169,31 +6257,40 @@
               <w:jc w:val="left"/>
             </w:pPr>
             <w:r>
-              <w:t xml:space="preserve">Area</w:t>
-            </w:r>
-          </w:p>
-        </w:tc>
-        <w:tc>
-          <w:tcPr/>
-          <w:p>
-            <w:pPr>
-              <w:pStyle w:val="Compact"/>
-              <w:jc w:val="left"/>
-            </w:pPr>
-            <w:r>
-              <w:t xml:space="preserve">Root</w:t>
-            </w:r>
-          </w:p>
-        </w:tc>
-        <w:tc>
-          <w:tcPr/>
-          <w:p>
-            <w:pPr>
-              <w:pStyle w:val="Compact"/>
-              <w:jc w:val="left"/>
-            </w:pPr>
-            <w:r>
-              <w:t xml:space="preserve">Notes</w:t>
+              <w:t xml:space="preserve">HTTP</w:t>
+            </w:r>
+          </w:p>
+        </w:tc>
+        <w:tc>
+          <w:tcPr/>
+          <w:p>
+            <w:pPr>
+              <w:pStyle w:val="Compact"/>
+              <w:jc w:val="left"/>
+            </w:pPr>
+            <w:r>
+              <w:t xml:space="preserve">When</w:t>
+            </w:r>
+          </w:p>
+        </w:tc>
+        <w:tc>
+          <w:tcPr/>
+          <w:p>
+            <w:pPr>
+              <w:pStyle w:val="Compact"/>
+              <w:jc w:val="left"/>
+            </w:pPr>
+            <w:r>
+              <w:rPr>
+                <w:rStyle w:val="VerbatimChar"/>
+              </w:rPr>
+              <w:t xml:space="preserve">error.code</w:t>
+            </w:r>
+            <w:r>
+              <w:t xml:space="preserve"> </w:t>
+            </w:r>
+            <w:r>
+              <w:t xml:space="preserve">example</w:t>
             </w:r>
           </w:p>
         </w:tc>
@@ -6207,34 +6304,46 @@
               <w:jc w:val="left"/>
             </w:pPr>
             <w:r>
-              <w:t xml:space="preserve">Account</w:t>
-            </w:r>
-          </w:p>
-        </w:tc>
-        <w:tc>
-          <w:tcPr/>
-          <w:p>
-            <w:pPr>
-              <w:pStyle w:val="Compact"/>
-              <w:jc w:val="left"/>
-            </w:pPr>
-            <w:r>
-              <w:rPr>
-                <w:rStyle w:val="VerbatimChar"/>
-              </w:rPr>
-              <w:t xml:space="preserve">/api/account/*</w:t>
-            </w:r>
-          </w:p>
-        </w:tc>
-        <w:tc>
-          <w:tcPr/>
-          <w:p>
-            <w:pPr>
-              <w:pStyle w:val="Compact"/>
-              <w:jc w:val="left"/>
-            </w:pPr>
-            <w:r>
-              <w:t xml:space="preserve">register, login/logout, reset-password, my-profile, change-password</w:t>
+              <w:t xml:space="preserve">400</w:t>
+            </w:r>
+          </w:p>
+        </w:tc>
+        <w:tc>
+          <w:tcPr/>
+          <w:p>
+            <w:pPr>
+              <w:pStyle w:val="Compact"/>
+              <w:jc w:val="left"/>
+            </w:pPr>
+            <w:r>
+              <w:t xml:space="preserve">DTO validation (missing/too long fields) —</w:t>
+            </w:r>
+            <w:r>
+              <w:t xml:space="preserve"> </w:t>
+            </w:r>
+            <w:r>
+              <w:rPr>
+                <w:rStyle w:val="VerbatimChar"/>
+              </w:rPr>
+              <w:t xml:space="preserve">validationErrors</w:t>
+            </w:r>
+            <w:r>
+              <w:t xml:space="preserve"> </w:t>
+            </w:r>
+            <w:r>
+              <w:t xml:space="preserve">lists each field</w:t>
+            </w:r>
+          </w:p>
+        </w:tc>
+        <w:tc>
+          <w:tcPr/>
+          <w:p>
+            <w:pPr>
+              <w:pStyle w:val="Compact"/>
+              <w:jc w:val="left"/>
+            </w:pPr>
+            <w:r>
+              <w:t xml:space="preserve">—</w:t>
             </w:r>
           </w:p>
         </w:tc>
@@ -6248,46 +6357,31 @@
               <w:jc w:val="left"/>
             </w:pPr>
             <w:r>
-              <w:t xml:space="preserve">Identity admin</w:t>
-            </w:r>
-          </w:p>
-        </w:tc>
-        <w:tc>
-          <w:tcPr/>
-          <w:p>
-            <w:pPr>
-              <w:pStyle w:val="Compact"/>
-              <w:jc w:val="left"/>
-            </w:pPr>
-            <w:r>
-              <w:rPr>
-                <w:rStyle w:val="VerbatimChar"/>
-              </w:rPr>
-              <w:t xml:space="preserve">/api/identity/users</w:t>
-            </w:r>
-            <w:r>
-              <w:t xml:space="preserve">,</w:t>
-            </w:r>
-            <w:r>
-              <w:t xml:space="preserve"> </w:t>
-            </w:r>
-            <w:r>
-              <w:rPr>
-                <w:rStyle w:val="VerbatimChar"/>
-              </w:rPr>
-              <w:t xml:space="preserve">/api/identity/roles</w:t>
-            </w:r>
-          </w:p>
-        </w:tc>
-        <w:tc>
-          <w:tcPr/>
-          <w:p>
-            <w:pPr>
-              <w:pStyle w:val="Compact"/>
-              <w:jc w:val="left"/>
-            </w:pPr>
-            <w:r>
-              <w:t xml:space="preserve">user/role CRUD (admin)</w:t>
+              <w:t xml:space="preserve">401</w:t>
+            </w:r>
+          </w:p>
+        </w:tc>
+        <w:tc>
+          <w:tcPr/>
+          <w:p>
+            <w:pPr>
+              <w:pStyle w:val="Compact"/>
+              <w:jc w:val="left"/>
+            </w:pPr>
+            <w:r>
+              <w:t xml:space="preserve">Missing/invalid token (JSON clients)</w:t>
+            </w:r>
+          </w:p>
+        </w:tc>
+        <w:tc>
+          <w:tcPr/>
+          <w:p>
+            <w:pPr>
+              <w:pStyle w:val="Compact"/>
+              <w:jc w:val="left"/>
+            </w:pPr>
+            <w:r>
+              <w:t xml:space="preserve">—</w:t>
             </w:r>
           </w:p>
         </w:tc>
@@ -6301,34 +6395,34 @@
               <w:jc w:val="left"/>
             </w:pPr>
             <w:r>
-              <w:t xml:space="preserve">Permission management</w:t>
-            </w:r>
-          </w:p>
-        </w:tc>
-        <w:tc>
-          <w:tcPr/>
-          <w:p>
-            <w:pPr>
-              <w:pStyle w:val="Compact"/>
-              <w:jc w:val="left"/>
-            </w:pPr>
-            <w:r>
-              <w:rPr>
-                <w:rStyle w:val="VerbatimChar"/>
-              </w:rPr>
-              <w:t xml:space="preserve">/api/permission-management/permissions</w:t>
-            </w:r>
-          </w:p>
-        </w:tc>
-        <w:tc>
-          <w:tcPr/>
-          <w:p>
-            <w:pPr>
-              <w:pStyle w:val="Compact"/>
-              <w:jc w:val="left"/>
-            </w:pPr>
-            <w:r>
-              <w:t xml:space="preserve">read/update grants (admin)</w:t>
+              <w:t xml:space="preserve">403</w:t>
+            </w:r>
+          </w:p>
+        </w:tc>
+        <w:tc>
+          <w:tcPr/>
+          <w:p>
+            <w:pPr>
+              <w:pStyle w:val="Compact"/>
+              <w:jc w:val="left"/>
+            </w:pPr>
+            <w:r>
+              <w:t xml:space="preserve">Permission denied, or a business rule rejected the request</w:t>
+            </w:r>
+          </w:p>
+        </w:tc>
+        <w:tc>
+          <w:tcPr/>
+          <w:p>
+            <w:pPr>
+              <w:pStyle w:val="Compact"/>
+              <w:jc w:val="left"/>
+            </w:pPr>
+            <w:r>
+              <w:rPr>
+                <w:rStyle w:val="VerbatimChar"/>
+              </w:rPr>
+              <w:t xml:space="preserve">Wathiq.Documents:ExpiryBeforeIssue</w:t>
             </w:r>
           </w:p>
         </w:tc>
@@ -6342,34 +6436,571 @@
               <w:jc w:val="left"/>
             </w:pPr>
             <w:r>
-              <w:t xml:space="preserve">App configuration</w:t>
-            </w:r>
-          </w:p>
-        </w:tc>
-        <w:tc>
-          <w:tcPr/>
-          <w:p>
-            <w:pPr>
-              <w:pStyle w:val="Compact"/>
-              <w:jc w:val="left"/>
-            </w:pPr>
-            <w:r>
-              <w:rPr>
-                <w:rStyle w:val="VerbatimChar"/>
-              </w:rPr>
-              <w:t xml:space="preserve">/api/abp/application-configuration</w:t>
-            </w:r>
-          </w:p>
-        </w:tc>
-        <w:tc>
-          <w:tcPr/>
-          <w:p>
-            <w:pPr>
-              <w:pStyle w:val="Compact"/>
-              <w:jc w:val="left"/>
-            </w:pPr>
-            <w:r>
-              <w:t xml:space="preserve">current user, permissions, localization — the client bootstrap call</w:t>
+              <w:t xml:space="preserve">404</w:t>
+            </w:r>
+          </w:p>
+        </w:tc>
+        <w:tc>
+          <w:tcPr/>
+          <w:p>
+            <w:pPr>
+              <w:pStyle w:val="Compact"/>
+              <w:jc w:val="left"/>
+            </w:pPr>
+            <w:r>
+              <w:t xml:space="preserve">Row doesn’t exist</w:t>
+            </w:r>
+            <w:r>
+              <w:t xml:space="preserve"> </w:t>
+            </w:r>
+            <w:r>
+              <w:rPr>
+                <w:bCs/>
+                <w:b/>
+              </w:rPr>
+              <w:t xml:space="preserve">or belongs to another user</w:t>
+            </w:r>
+          </w:p>
+        </w:tc>
+        <w:tc>
+          <w:tcPr/>
+          <w:p>
+            <w:pPr>
+              <w:pStyle w:val="Compact"/>
+              <w:jc w:val="left"/>
+            </w:pPr>
+            <w:r>
+              <w:t xml:space="preserve">—</w:t>
+            </w:r>
+          </w:p>
+        </w:tc>
+      </w:tr>
+    </w:tbl>
+    <w:p>
+      <w:pPr>
+        <w:pStyle w:val="BodyText"/>
+      </w:pPr>
+      <w:r>
+        <w:t xml:space="preserve">Reminders business codes:</w:t>
+      </w:r>
+      <w:r>
+        <w:t xml:space="preserve"> </w:t>
+      </w:r>
+      <w:r>
+        <w:rPr>
+          <w:rStyle w:val="VerbatimChar"/>
+        </w:rPr>
+        <w:t xml:space="preserve">InvalidOffsets</w:t>
+      </w:r>
+      <w:r>
+        <w:t xml:space="preserve">,</w:t>
+      </w:r>
+      <w:r>
+        <w:t xml:space="preserve"> </w:t>
+      </w:r>
+      <w:r>
+        <w:rPr>
+          <w:rStyle w:val="VerbatimChar"/>
+        </w:rPr>
+        <w:t xml:space="preserve">QuietHoursIncomplete</w:t>
+      </w:r>
+      <w:r>
+        <w:t xml:space="preserve">,</w:t>
+      </w:r>
+      <w:r>
+        <w:t xml:space="preserve"> </w:t>
+      </w:r>
+      <w:r>
+        <w:rPr>
+          <w:rStyle w:val="VerbatimChar"/>
+        </w:rPr>
+        <w:t xml:space="preserve">UnknownTimeZone</w:t>
+      </w:r>
+      <w:r>
+        <w:t xml:space="preserve">,</w:t>
+      </w:r>
+      <w:r>
+        <w:t xml:space="preserve"> </w:t>
+      </w:r>
+      <w:r>
+        <w:rPr>
+          <w:rStyle w:val="VerbatimChar"/>
+        </w:rPr>
+        <w:t xml:space="preserve">NoEmailAddress</w:t>
+      </w:r>
+      <w:r>
+        <w:t xml:space="preserve"> </w:t>
+      </w:r>
+      <w:r>
+        <w:t xml:space="preserve">— prefixed</w:t>
+      </w:r>
+      <w:r>
+        <w:t xml:space="preserve"> </w:t>
+      </w:r>
+      <w:r>
+        <w:rPr>
+          <w:rStyle w:val="VerbatimChar"/>
+        </w:rPr>
+        <w:t xml:space="preserve">Wathiq.Reminders:</w:t>
+      </w:r>
+      <w:r>
+        <w:t xml:space="preserve">.</w:t>
+      </w:r>
+    </w:p>
+    <w:p>
+      <w:pPr>
+        <w:pStyle w:val="BodyText"/>
+      </w:pPr>
+      <w:r>
+        <w:t xml:space="preserve">Business error codes of the Documents module (message localized via</w:t>
+      </w:r>
+      <w:r>
+        <w:t xml:space="preserve"> </w:t>
+      </w:r>
+      <w:r>
+        <w:rPr>
+          <w:rStyle w:val="VerbatimChar"/>
+        </w:rPr>
+        <w:t xml:space="preserve">Accept-Language</w:t>
+      </w:r>
+      <w:r>
+        <w:t xml:space="preserve">):</w:t>
+      </w:r>
+      <w:r>
+        <w:t xml:space="preserve"> </w:t>
+      </w:r>
+      <w:r>
+        <w:rPr>
+          <w:rStyle w:val="VerbatimChar"/>
+        </w:rPr>
+        <w:t xml:space="preserve">ExpiryBeforeIssue</w:t>
+      </w:r>
+      <w:r>
+        <w:t xml:space="preserve">,</w:t>
+      </w:r>
+      <w:r>
+        <w:t xml:space="preserve"> </w:t>
+      </w:r>
+      <w:r>
+        <w:rPr>
+          <w:rStyle w:val="VerbatimChar"/>
+        </w:rPr>
+        <w:t xml:space="preserve">HolderNotOwned</w:t>
+      </w:r>
+      <w:r>
+        <w:t xml:space="preserve">,</w:t>
+      </w:r>
+      <w:r>
+        <w:t xml:space="preserve"> </w:t>
+      </w:r>
+      <w:r>
+        <w:rPr>
+          <w:rStyle w:val="VerbatimChar"/>
+        </w:rPr>
+        <w:t xml:space="preserve">DocumentTypeNotActive</w:t>
+      </w:r>
+      <w:r>
+        <w:t xml:space="preserve">,</w:t>
+      </w:r>
+      <w:r>
+        <w:t xml:space="preserve"> </w:t>
+      </w:r>
+      <w:r>
+        <w:rPr>
+          <w:rStyle w:val="VerbatimChar"/>
+        </w:rPr>
+        <w:t xml:space="preserve">SelfHolderIsAutomatic</w:t>
+      </w:r>
+      <w:r>
+        <w:t xml:space="preserve">,</w:t>
+      </w:r>
+      <w:r>
+        <w:t xml:space="preserve"> </w:t>
+      </w:r>
+      <w:r>
+        <w:rPr>
+          <w:rStyle w:val="VerbatimChar"/>
+        </w:rPr>
+        <w:t xml:space="preserve">CannotDeleteSelfHolder</w:t>
+      </w:r>
+      <w:r>
+        <w:t xml:space="preserve">,</w:t>
+      </w:r>
+      <w:r>
+        <w:t xml:space="preserve"> </w:t>
+      </w:r>
+      <w:r>
+        <w:rPr>
+          <w:rStyle w:val="VerbatimChar"/>
+        </w:rPr>
+        <w:t xml:space="preserve">HolderHasDocuments</w:t>
+      </w:r>
+      <w:r>
+        <w:t xml:space="preserve"> </w:t>
+      </w:r>
+      <w:r>
+        <w:t xml:space="preserve">— all prefixed</w:t>
+      </w:r>
+      <w:r>
+        <w:t xml:space="preserve"> </w:t>
+      </w:r>
+      <w:r>
+        <w:rPr>
+          <w:rStyle w:val="VerbatimChar"/>
+        </w:rPr>
+        <w:t xml:space="preserve">Wathiq.Documents:</w:t>
+      </w:r>
+      <w:r>
+        <w:t xml:space="preserve">.</w:t>
+      </w:r>
+    </w:p>
+    <w:p>
+      <w:pPr>
+        <w:pStyle w:val="BodyText"/>
+      </w:pPr>
+      <w:r>
+        <w:t xml:space="preserve">Live example (</w:t>
+      </w:r>
+      <w:r>
+        <w:rPr>
+          <w:rStyle w:val="VerbatimChar"/>
+        </w:rPr>
+        <w:t xml:space="preserve">Accept-Language: ar</w:t>
+      </w:r>
+      <w:r>
+        <w:t xml:space="preserve">, expiry before issue):</w:t>
+      </w:r>
+    </w:p>
+    <w:p>
+      <w:pPr>
+        <w:pStyle w:val="SourceCode"/>
+      </w:pPr>
+      <w:r>
+        <w:rPr>
+          <w:rStyle w:val="FunctionTok"/>
+        </w:rPr>
+        <w:t xml:space="preserve">{</w:t>
+      </w:r>
+      <w:r>
+        <w:rPr>
+          <w:rStyle w:val="NormalTok"/>
+        </w:rPr>
+        <w:t xml:space="preserve"> </w:t>
+      </w:r>
+      <w:r>
+        <w:rPr>
+          <w:rStyle w:val="DataTypeTok"/>
+        </w:rPr>
+        <w:t xml:space="preserve">"error"</w:t>
+      </w:r>
+      <w:r>
+        <w:rPr>
+          <w:rStyle w:val="FunctionTok"/>
+        </w:rPr>
+        <w:t xml:space="preserve">:</w:t>
+      </w:r>
+      <w:r>
+        <w:rPr>
+          <w:rStyle w:val="NormalTok"/>
+        </w:rPr>
+        <w:t xml:space="preserve"> </w:t>
+      </w:r>
+      <w:r>
+        <w:rPr>
+          <w:rStyle w:val="FunctionTok"/>
+        </w:rPr>
+        <w:t xml:space="preserve">{</w:t>
+      </w:r>
+      <w:r>
+        <w:br/>
+      </w:r>
+      <w:r>
+        <w:rPr>
+          <w:rStyle w:val="NormalTok"/>
+        </w:rPr>
+        <w:t xml:space="preserve">    </w:t>
+      </w:r>
+      <w:r>
+        <w:rPr>
+          <w:rStyle w:val="DataTypeTok"/>
+        </w:rPr>
+        <w:t xml:space="preserve">"code"</w:t>
+      </w:r>
+      <w:r>
+        <w:rPr>
+          <w:rStyle w:val="FunctionTok"/>
+        </w:rPr>
+        <w:t xml:space="preserve">:</w:t>
+      </w:r>
+      <w:r>
+        <w:rPr>
+          <w:rStyle w:val="NormalTok"/>
+        </w:rPr>
+        <w:t xml:space="preserve"> </w:t>
+      </w:r>
+      <w:r>
+        <w:rPr>
+          <w:rStyle w:val="StringTok"/>
+        </w:rPr>
+        <w:t xml:space="preserve">"Wathiq.Documents:ExpiryBeforeIssue"</w:t>
+      </w:r>
+      <w:r>
+        <w:rPr>
+          <w:rStyle w:val="FunctionTok"/>
+        </w:rPr>
+        <w:t xml:space="preserve">,</w:t>
+      </w:r>
+      <w:r>
+        <w:br/>
+      </w:r>
+      <w:r>
+        <w:rPr>
+          <w:rStyle w:val="NormalTok"/>
+        </w:rPr>
+        <w:t xml:space="preserve">    </w:t>
+      </w:r>
+      <w:r>
+        <w:rPr>
+          <w:rStyle w:val="DataTypeTok"/>
+        </w:rPr>
+        <w:t xml:space="preserve">"message"</w:t>
+      </w:r>
+      <w:r>
+        <w:rPr>
+          <w:rStyle w:val="FunctionTok"/>
+        </w:rPr>
+        <w:t xml:space="preserve">:</w:t>
+      </w:r>
+      <w:r>
+        <w:rPr>
+          <w:rStyle w:val="NormalTok"/>
+        </w:rPr>
+        <w:t xml:space="preserve"> </w:t>
+      </w:r>
+      <w:r>
+        <w:rPr>
+          <w:rStyle w:val="StringTok"/>
+        </w:rPr>
+        <w:t xml:space="preserve">"لا يمكن أن يكون تاريخ الانتهاء قبل تاريخ الإصدار."</w:t>
+      </w:r>
+      <w:r>
+        <w:rPr>
+          <w:rStyle w:val="FunctionTok"/>
+        </w:rPr>
+        <w:t xml:space="preserve">,</w:t>
+      </w:r>
+      <w:r>
+        <w:br/>
+      </w:r>
+      <w:r>
+        <w:rPr>
+          <w:rStyle w:val="NormalTok"/>
+        </w:rPr>
+        <w:t xml:space="preserve">    </w:t>
+      </w:r>
+      <w:r>
+        <w:rPr>
+          <w:rStyle w:val="DataTypeTok"/>
+        </w:rPr>
+        <w:t xml:space="preserve">"data"</w:t>
+      </w:r>
+      <w:r>
+        <w:rPr>
+          <w:rStyle w:val="FunctionTok"/>
+        </w:rPr>
+        <w:t xml:space="preserve">:</w:t>
+      </w:r>
+      <w:r>
+        <w:rPr>
+          <w:rStyle w:val="NormalTok"/>
+        </w:rPr>
+        <w:t xml:space="preserve"> </w:t>
+      </w:r>
+      <w:r>
+        <w:rPr>
+          <w:rStyle w:val="FunctionTok"/>
+        </w:rPr>
+        <w:t xml:space="preserve">{</w:t>
+      </w:r>
+      <w:r>
+        <w:rPr>
+          <w:rStyle w:val="NormalTok"/>
+        </w:rPr>
+        <w:t xml:space="preserve"> </w:t>
+      </w:r>
+      <w:r>
+        <w:rPr>
+          <w:rStyle w:val="DataTypeTok"/>
+        </w:rPr>
+        <w:t xml:space="preserve">"IssueDate"</w:t>
+      </w:r>
+      <w:r>
+        <w:rPr>
+          <w:rStyle w:val="FunctionTok"/>
+        </w:rPr>
+        <w:t xml:space="preserve">:</w:t>
+      </w:r>
+      <w:r>
+        <w:rPr>
+          <w:rStyle w:val="NormalTok"/>
+        </w:rPr>
+        <w:t xml:space="preserve"> </w:t>
+      </w:r>
+      <w:r>
+        <w:rPr>
+          <w:rStyle w:val="StringTok"/>
+        </w:rPr>
+        <w:t xml:space="preserve">"2030-01-01"</w:t>
+      </w:r>
+      <w:r>
+        <w:rPr>
+          <w:rStyle w:val="FunctionTok"/>
+        </w:rPr>
+        <w:t xml:space="preserve">,</w:t>
+      </w:r>
+      <w:r>
+        <w:rPr>
+          <w:rStyle w:val="NormalTok"/>
+        </w:rPr>
+        <w:t xml:space="preserve"> </w:t>
+      </w:r>
+      <w:r>
+        <w:rPr>
+          <w:rStyle w:val="DataTypeTok"/>
+        </w:rPr>
+        <w:t xml:space="preserve">"ExpiryDate"</w:t>
+      </w:r>
+      <w:r>
+        <w:rPr>
+          <w:rStyle w:val="FunctionTok"/>
+        </w:rPr>
+        <w:t xml:space="preserve">:</w:t>
+      </w:r>
+      <w:r>
+        <w:rPr>
+          <w:rStyle w:val="NormalTok"/>
+        </w:rPr>
+        <w:t xml:space="preserve"> </w:t>
+      </w:r>
+      <w:r>
+        <w:rPr>
+          <w:rStyle w:val="StringTok"/>
+        </w:rPr>
+        <w:t xml:space="preserve">"2020-01-01"</w:t>
+      </w:r>
+      <w:r>
+        <w:rPr>
+          <w:rStyle w:val="NormalTok"/>
+        </w:rPr>
+        <w:t xml:space="preserve"> </w:t>
+      </w:r>
+      <w:r>
+        <w:rPr>
+          <w:rStyle w:val="FunctionTok"/>
+        </w:rPr>
+        <w:t xml:space="preserve">}</w:t>
+      </w:r>
+      <w:r>
+        <w:rPr>
+          <w:rStyle w:val="NormalTok"/>
+        </w:rPr>
+        <w:t xml:space="preserve"> </w:t>
+      </w:r>
+      <w:r>
+        <w:rPr>
+          <w:rStyle w:val="FunctionTok"/>
+        </w:rPr>
+        <w:t xml:space="preserve">}</w:t>
+      </w:r>
+      <w:r>
+        <w:rPr>
+          <w:rStyle w:val="NormalTok"/>
+        </w:rPr>
+        <w:t xml:space="preserve"> </w:t>
+      </w:r>
+      <w:r>
+        <w:rPr>
+          <w:rStyle w:val="FunctionTok"/>
+        </w:rPr>
+        <w:t xml:space="preserve">}</w:t>
+      </w:r>
+    </w:p>
+    <w:bookmarkEnd w:id="40"/>
+    <w:bookmarkStart w:id="41" w:name="infrastructure-endpoints-abp-built-ins"/>
+    <w:p>
+      <w:pPr>
+        <w:pStyle w:val="Heading1"/>
+      </w:pPr>
+      <w:r>
+        <w:rPr>
+          <w:rStyle w:val="SectionNumber"/>
+        </w:rPr>
+        <w:t xml:space="preserve">7</w:t>
+      </w:r>
+      <w:r>
+        <w:tab/>
+      </w:r>
+      <w:r>
+        <w:t xml:space="preserve">7. Infrastructure endpoints (ABP built-ins)</w:t>
+      </w:r>
+    </w:p>
+    <w:p>
+      <w:pPr>
+        <w:pStyle w:val="FirstParagraph"/>
+      </w:pPr>
+      <w:r>
+        <w:t xml:space="preserve">Summarized — full detail is in Swagger. Admin-tagged groups require admin permissions.</w:t>
+      </w:r>
+    </w:p>
+    <w:tbl>
+      <w:tblPr>
+        <w:tblStyle w:val="Table"/>
+        <w:tblW w:type="pct" w:w="5000"/>
+        <w:tblLook w:firstRow="1" w:lastRow="0" w:firstColumn="0" w:lastColumn="0" w:noHBand="0" w:noVBand="0" w:val="0020"/>
+        <w:jc w:val="start"/>
+      </w:tblPr>
+      <w:tblGrid>
+        <w:gridCol w:w="2640"/>
+        <w:gridCol w:w="2640"/>
+        <w:gridCol w:w="2640"/>
+      </w:tblGrid>
+      <w:tr>
+        <w:trPr>
+          <w:tblHeader w:val="true"/>
+        </w:trPr>
+        <w:tc>
+          <w:tcPr/>
+          <w:p>
+            <w:pPr>
+              <w:pStyle w:val="Compact"/>
+              <w:jc w:val="left"/>
+            </w:pPr>
+            <w:r>
+              <w:t xml:space="preserve">Area</w:t>
+            </w:r>
+          </w:p>
+        </w:tc>
+        <w:tc>
+          <w:tcPr/>
+          <w:p>
+            <w:pPr>
+              <w:pStyle w:val="Compact"/>
+              <w:jc w:val="left"/>
+            </w:pPr>
+            <w:r>
+              <w:t xml:space="preserve">Root</w:t>
+            </w:r>
+          </w:p>
+        </w:tc>
+        <w:tc>
+          <w:tcPr/>
+          <w:p>
+            <w:pPr>
+              <w:pStyle w:val="Compact"/>
+              <w:jc w:val="left"/>
+            </w:pPr>
+            <w:r>
+              <w:t xml:space="preserve">Notes</w:t>
             </w:r>
           </w:p>
         </w:tc>
@@ -6383,6 +7014,182 @@
               <w:jc w:val="left"/>
             </w:pPr>
             <w:r>
+              <w:t xml:space="preserve">Account</w:t>
+            </w:r>
+          </w:p>
+        </w:tc>
+        <w:tc>
+          <w:tcPr/>
+          <w:p>
+            <w:pPr>
+              <w:pStyle w:val="Compact"/>
+              <w:jc w:val="left"/>
+            </w:pPr>
+            <w:r>
+              <w:rPr>
+                <w:rStyle w:val="VerbatimChar"/>
+              </w:rPr>
+              <w:t xml:space="preserve">/api/account/*</w:t>
+            </w:r>
+          </w:p>
+        </w:tc>
+        <w:tc>
+          <w:tcPr/>
+          <w:p>
+            <w:pPr>
+              <w:pStyle w:val="Compact"/>
+              <w:jc w:val="left"/>
+            </w:pPr>
+            <w:r>
+              <w:t xml:space="preserve">register, login/logout, reset-password, my-profile, change-password</w:t>
+            </w:r>
+          </w:p>
+        </w:tc>
+      </w:tr>
+      <w:tr>
+        <w:tc>
+          <w:tcPr/>
+          <w:p>
+            <w:pPr>
+              <w:pStyle w:val="Compact"/>
+              <w:jc w:val="left"/>
+            </w:pPr>
+            <w:r>
+              <w:t xml:space="preserve">Identity admin</w:t>
+            </w:r>
+          </w:p>
+        </w:tc>
+        <w:tc>
+          <w:tcPr/>
+          <w:p>
+            <w:pPr>
+              <w:pStyle w:val="Compact"/>
+              <w:jc w:val="left"/>
+            </w:pPr>
+            <w:r>
+              <w:rPr>
+                <w:rStyle w:val="VerbatimChar"/>
+              </w:rPr>
+              <w:t xml:space="preserve">/api/identity/users</w:t>
+            </w:r>
+            <w:r>
+              <w:t xml:space="preserve">,</w:t>
+            </w:r>
+            <w:r>
+              <w:t xml:space="preserve"> </w:t>
+            </w:r>
+            <w:r>
+              <w:rPr>
+                <w:rStyle w:val="VerbatimChar"/>
+              </w:rPr>
+              <w:t xml:space="preserve">/api/identity/roles</w:t>
+            </w:r>
+          </w:p>
+        </w:tc>
+        <w:tc>
+          <w:tcPr/>
+          <w:p>
+            <w:pPr>
+              <w:pStyle w:val="Compact"/>
+              <w:jc w:val="left"/>
+            </w:pPr>
+            <w:r>
+              <w:t xml:space="preserve">user/role CRUD (admin)</w:t>
+            </w:r>
+          </w:p>
+        </w:tc>
+      </w:tr>
+      <w:tr>
+        <w:tc>
+          <w:tcPr/>
+          <w:p>
+            <w:pPr>
+              <w:pStyle w:val="Compact"/>
+              <w:jc w:val="left"/>
+            </w:pPr>
+            <w:r>
+              <w:t xml:space="preserve">Permission management</w:t>
+            </w:r>
+          </w:p>
+        </w:tc>
+        <w:tc>
+          <w:tcPr/>
+          <w:p>
+            <w:pPr>
+              <w:pStyle w:val="Compact"/>
+              <w:jc w:val="left"/>
+            </w:pPr>
+            <w:r>
+              <w:rPr>
+                <w:rStyle w:val="VerbatimChar"/>
+              </w:rPr>
+              <w:t xml:space="preserve">/api/permission-management/permissions</w:t>
+            </w:r>
+          </w:p>
+        </w:tc>
+        <w:tc>
+          <w:tcPr/>
+          <w:p>
+            <w:pPr>
+              <w:pStyle w:val="Compact"/>
+              <w:jc w:val="left"/>
+            </w:pPr>
+            <w:r>
+              <w:t xml:space="preserve">read/update grants (admin)</w:t>
+            </w:r>
+          </w:p>
+        </w:tc>
+      </w:tr>
+      <w:tr>
+        <w:tc>
+          <w:tcPr/>
+          <w:p>
+            <w:pPr>
+              <w:pStyle w:val="Compact"/>
+              <w:jc w:val="left"/>
+            </w:pPr>
+            <w:r>
+              <w:t xml:space="preserve">App configuration</w:t>
+            </w:r>
+          </w:p>
+        </w:tc>
+        <w:tc>
+          <w:tcPr/>
+          <w:p>
+            <w:pPr>
+              <w:pStyle w:val="Compact"/>
+              <w:jc w:val="left"/>
+            </w:pPr>
+            <w:r>
+              <w:rPr>
+                <w:rStyle w:val="VerbatimChar"/>
+              </w:rPr>
+              <w:t xml:space="preserve">/api/abp/application-configuration</w:t>
+            </w:r>
+          </w:p>
+        </w:tc>
+        <w:tc>
+          <w:tcPr/>
+          <w:p>
+            <w:pPr>
+              <w:pStyle w:val="Compact"/>
+              <w:jc w:val="left"/>
+            </w:pPr>
+            <w:r>
+              <w:t xml:space="preserve">current user, permissions, localization — the client bootstrap call</w:t>
+            </w:r>
+          </w:p>
+        </w:tc>
+      </w:tr>
+      <w:tr>
+        <w:tc>
+          <w:tcPr/>
+          <w:p>
+            <w:pPr>
+              <w:pStyle w:val="Compact"/>
+              <w:jc w:val="left"/>
+            </w:pPr>
+            <w:r>
               <w:t xml:space="preserve">Settings</w:t>
             </w:r>
           </w:p>
@@ -6416,8 +7223,8 @@
         </w:tc>
       </w:tr>
     </w:tbl>
-    <w:bookmarkEnd w:id="40"/>
-    <w:bookmarkStart w:id="41" w:name="planned"/>
+    <w:bookmarkEnd w:id="41"/>
+    <w:bookmarkStart w:id="42" w:name="planned"/>
     <w:p>
       <w:pPr>
         <w:pStyle w:val="Heading1"/>
@@ -6584,7 +7391,7 @@
         </w:tc>
       </w:tr>
     </w:tbl>
-    <w:bookmarkEnd w:id="41"/>
+    <w:bookmarkEnd w:id="42"/>
     <w:sectPr>
       <w:footnotePr>
         <w:numRestart w:val="eachSect"/>

</xml_diff>

<commit_message>
step(4.3): generate the typed API client and render the catalogue via httpResource
Learned: OpenAPI codegen with committed contracts, httpResource as derived state, resource-aware test stability, base-URL injection with a dev proxy, anonymous-by-decision endpoints

Co-Authored-By: Claude Fable 5 <noreply@anthropic.com>
Claude-Session: https://claude.ai/code/session_01XCaaD2oSfQhWv3vNENZDue
</commit_message>
<xml_diff>
--- a/docs/deliverables/out/Api.docx
+++ b/docs/deliverables/out/Api.docx
@@ -392,6 +392,56 @@
           </w:p>
         </w:tc>
       </w:tr>
+      <w:tr>
+        <w:tc>
+          <w:tcPr/>
+          <w:p>
+            <w:pPr>
+              <w:pStyle w:val="Compact"/>
+              <w:jc w:val="left"/>
+            </w:pPr>
+            <w:r>
+              <w:t xml:space="preserve">0.1.4</w:t>
+            </w:r>
+          </w:p>
+        </w:tc>
+        <w:tc>
+          <w:tcPr/>
+          <w:p>
+            <w:pPr>
+              <w:pStyle w:val="Compact"/>
+              <w:jc w:val="left"/>
+            </w:pPr>
+            <w:r>
+              <w:t xml:space="preserve">2026-08-29</w:t>
+            </w:r>
+          </w:p>
+        </w:tc>
+        <w:tc>
+          <w:tcPr/>
+          <w:p>
+            <w:pPr>
+              <w:pStyle w:val="Compact"/>
+              <w:jc w:val="left"/>
+            </w:pPr>
+            <w:r>
+              <w:t xml:space="preserve">Abdulsalam</w:t>
+            </w:r>
+          </w:p>
+        </w:tc>
+        <w:tc>
+          <w:tcPr/>
+          <w:p>
+            <w:pPr>
+              <w:pStyle w:val="Compact"/>
+              <w:jc w:val="left"/>
+            </w:pPr>
+            <w:r>
+              <w:t xml:space="preserve">Document-types list made anonymous - public reference data for the portal shell and future landing page (roadmap step 4.3)</w:t>
+            </w:r>
+          </w:p>
+        </w:tc>
+      </w:tr>
     </w:tbl>
     <w:p>
       <w:pPr>
@@ -2557,9 +2607,10 @@
             </w:pPr>
             <w:r>
               <w:rPr>
-                <w:rStyle w:val="VerbatimChar"/>
-              </w:rPr>
-              <w:t xml:space="preserve">WathiqDocuments.DocumentTypes</w:t>
+                <w:iCs/>
+                <w:i/>
+              </w:rPr>
+              <w:t xml:space="preserve">anonymous (4.3)</w:t>
             </w:r>
           </w:p>
         </w:tc>
@@ -2583,7 +2634,10 @@
               <w:t xml:space="preserve">sortOrder</w:t>
             </w:r>
             <w:r>
-              <w:t xml:space="preserve">. Read-only (admin curation is</w:t>
+              <w:t xml:space="preserve"> </w:t>
+            </w:r>
+            <w:r>
+              <w:t xml:space="preserve">- public reference data, no PII. Read-only (admin curation is</w:t>
             </w:r>
             <w:r>
               <w:t xml:space="preserve"> </w:t>

</xml_diff>

<commit_message>
step(5.2): add Guide/GuideVersion/GuideStep with immutable publish workflow and seeded passport guide
Learned: publish-workflow modeling, identity vs content split, immutability enforced in the domain, circular FK with NoAction, seeding through the domain service, autoSave cross-aggregate ordering, ABP conventional route derivation

Co-Authored-By: Claude Fable 5 <noreply@anthropic.com>
Claude-Session: https://claude.ai/code/session_01XCaaD2oSfQhWv3vNENZDue
</commit_message>
<xml_diff>
--- a/docs/deliverables/out/Api.docx
+++ b/docs/deliverables/out/Api.docx
@@ -442,6 +442,56 @@
           </w:p>
         </w:tc>
       </w:tr>
+      <w:tr>
+        <w:tc>
+          <w:tcPr/>
+          <w:p>
+            <w:pPr>
+              <w:pStyle w:val="Compact"/>
+              <w:jc w:val="left"/>
+            </w:pPr>
+            <w:r>
+              <w:t xml:space="preserve">0.1.5</w:t>
+            </w:r>
+          </w:p>
+        </w:tc>
+        <w:tc>
+          <w:tcPr/>
+          <w:p>
+            <w:pPr>
+              <w:pStyle w:val="Compact"/>
+              <w:jc w:val="left"/>
+            </w:pPr>
+            <w:r>
+              <w:t xml:space="preserve">2026-09-03</w:t>
+            </w:r>
+          </w:p>
+        </w:tc>
+        <w:tc>
+          <w:tcPr/>
+          <w:p>
+            <w:pPr>
+              <w:pStyle w:val="Compact"/>
+              <w:jc w:val="left"/>
+            </w:pPr>
+            <w:r>
+              <w:t xml:space="preserve">Abdulsalam</w:t>
+            </w:r>
+          </w:p>
+        </w:tc>
+        <w:tc>
+          <w:tcPr/>
+          <w:p>
+            <w:pPr>
+              <w:pStyle w:val="Compact"/>
+              <w:jc w:val="left"/>
+            </w:pPr>
+            <w:r>
+              <w:t xml:space="preserve">§6 Guides module endpoints: public reading (anonymous by design) + admin authoring/publish, from the regenerated spec with live examples (roadmap step 5.2)</w:t>
+            </w:r>
+          </w:p>
+        </w:tc>
+      </w:tr>
     </w:tbl>
     <w:p>
       <w:pPr>
@@ -1798,6 +1848,57 @@
           </w:p>
         </w:tc>
       </w:tr>
+      <w:tr>
+        <w:tc>
+          <w:tcPr/>
+          <w:p>
+            <w:pPr>
+              <w:pStyle w:val="Compact"/>
+              <w:jc w:val="left"/>
+            </w:pPr>
+            <w:r>
+              <w:rPr>
+                <w:rStyle w:val="VerbatimChar"/>
+              </w:rPr>
+              <w:t xml:space="preserve">WathiqGuides.Manage</w:t>
+            </w:r>
+            <w:r>
+              <w:t xml:space="preserve"> </w:t>
+            </w:r>
+            <w:r>
+              <w:t xml:space="preserve">(authoring)</w:t>
+            </w:r>
+          </w:p>
+        </w:tc>
+        <w:tc>
+          <w:tcPr/>
+          <w:p>
+            <w:pPr>
+              <w:pStyle w:val="Compact"/>
+              <w:jc w:val="left"/>
+            </w:pPr>
+            <w:r>
+              <w:rPr>
+                <w:bCs/>
+                <w:b/>
+              </w:rPr>
+              <w:t xml:space="preserve">no</w:t>
+            </w:r>
+          </w:p>
+        </w:tc>
+        <w:tc>
+          <w:tcPr/>
+          <w:p>
+            <w:pPr>
+              <w:pStyle w:val="Compact"/>
+              <w:jc w:val="left"/>
+            </w:pPr>
+            <w:r>
+              <w:t xml:space="preserve">yes</w:t>
+            </w:r>
+          </w:p>
+        </w:tc>
+      </w:tr>
     </w:tbl>
     <w:p>
       <w:pPr>
@@ -6249,7 +6350,7 @@
       </w:r>
     </w:p>
     <w:bookmarkEnd w:id="39"/>
-    <w:bookmarkStart w:id="40" w:name="error-model"/>
+    <w:bookmarkStart w:id="42" w:name="guides-module-endpoints"/>
     <w:p>
       <w:pPr>
         <w:pStyle w:val="Heading1"/>
@@ -6264,7 +6365,7 @@
         <w:tab/>
       </w:r>
       <w:r>
-        <w:t xml:space="preserve">6. Error model</w:t>
+        <w:t xml:space="preserve">6. Guides module endpoints</w:t>
       </w:r>
     </w:p>
     <w:p>
@@ -6272,19 +6373,134 @@
         <w:pStyle w:val="FirstParagraph"/>
       </w:pPr>
       <w:r>
-        <w:t xml:space="preserve">Every error is the ABP envelope</w:t>
-      </w:r>
-      <w:r>
-        <w:t xml:space="preserve"> </w:t>
-      </w:r>
-      <w:r>
-        <w:rPr>
-          <w:rStyle w:val="VerbatimChar"/>
-        </w:rPr>
-        <w:t xml:space="preserve">{ "error": { code, message, details, data, validationErrors } }</w:t>
-      </w:r>
-      <w:r>
-        <w:t xml:space="preserve">.</w:t>
+        <w:t xml:space="preserve">Route root</w:t>
+      </w:r>
+      <w:r>
+        <w:t xml:space="preserve"> </w:t>
+      </w:r>
+      <w:r>
+        <w:rPr>
+          <w:rStyle w:val="VerbatimChar"/>
+        </w:rPr>
+        <w:t xml:space="preserve">/api/guides/*</w:t>
+      </w:r>
+      <w:r>
+        <w:t xml:space="preserve">. The access model is</w:t>
+      </w:r>
+      <w:r>
+        <w:t xml:space="preserve"> </w:t>
+      </w:r>
+      <w:r>
+        <w:rPr>
+          <w:bCs/>
+          <w:b/>
+        </w:rPr>
+        <w:t xml:space="preserve">asymmetric by design</w:t>
+      </w:r>
+      <w:r>
+        <w:t xml:space="preserve">: reading is anonymous</w:t>
+      </w:r>
+      <w:r>
+        <w:t xml:space="preserve"> </w:t>
+      </w:r>
+      <w:r>
+        <w:t xml:space="preserve">(guides are the public half of the service - no account, no token), authoring is admin-only</w:t>
+      </w:r>
+      <w:r>
+        <w:t xml:space="preserve"> </w:t>
+      </w:r>
+      <w:r>
+        <w:t xml:space="preserve">(</w:t>
+      </w:r>
+      <w:r>
+        <w:rPr>
+          <w:rStyle w:val="VerbatimChar"/>
+        </w:rPr>
+        <w:t xml:space="preserve">WathiqGuides.Manage</w:t>
+      </w:r>
+      <w:r>
+        <w:t xml:space="preserve">). A</w:t>
+      </w:r>
+      <w:r>
+        <w:t xml:space="preserve"> </w:t>
+      </w:r>
+      <w:r>
+        <w:rPr>
+          <w:bCs/>
+          <w:b/>
+        </w:rPr>
+        <w:t xml:space="preserve">published</w:t>
+      </w:r>
+      <w:r>
+        <w:rPr>
+          <w:bCs/>
+          <w:b/>
+        </w:rPr>
+        <w:t xml:space="preserve"> </w:t>
+      </w:r>
+      <w:r>
+        <w:rPr>
+          <w:rStyle w:val="VerbatimChar"/>
+          <w:bCs/>
+          <w:b/>
+        </w:rPr>
+        <w:t xml:space="preserve">GuideVersion</w:t>
+      </w:r>
+      <w:r>
+        <w:rPr>
+          <w:bCs/>
+          <w:b/>
+        </w:rPr>
+        <w:t xml:space="preserve"> </w:t>
+      </w:r>
+      <w:r>
+        <w:rPr>
+          <w:bCs/>
+          <w:b/>
+        </w:rPr>
+        <w:t xml:space="preserve">is immutable</w:t>
+      </w:r>
+      <w:r>
+        <w:t xml:space="preserve">; re-authoring means a new</w:t>
+      </w:r>
+      <w:r>
+        <w:t xml:space="preserve"> </w:t>
+      </w:r>
+      <w:r>
+        <w:t xml:space="preserve">draft version, and publishing re-points</w:t>
+      </w:r>
+      <w:r>
+        <w:t xml:space="preserve"> </w:t>
+      </w:r>
+      <w:r>
+        <w:rPr>
+          <w:rStyle w:val="VerbatimChar"/>
+        </w:rPr>
+        <w:t xml:space="preserve">Guide.publishedVersionId</w:t>
+      </w:r>
+      <w:r>
+        <w:t xml:space="preserve"> </w:t>
+      </w:r>
+      <w:r>
+        <w:t xml:space="preserve">(latest publish wins).</w:t>
+      </w:r>
+    </w:p>
+    <w:bookmarkStart w:id="40" w:name="public-reading-fr-gde-001"/>
+    <w:p>
+      <w:pPr>
+        <w:pStyle w:val="Heading2"/>
+      </w:pPr>
+      <w:r>
+        <w:rPr>
+          <w:rStyle w:val="SectionNumber"/>
+        </w:rPr>
+        <w:t xml:space="preserve">6.1</w:t>
+      </w:r>
+      <w:r>
+        <w:tab/>
+      </w:r>
+      <w:r>
+        <w:t xml:space="preserve">6.1 Public reading (FR-GDE-001)</w:t>
       </w:r>
     </w:p>
     <w:tbl>
@@ -6311,40 +6527,31 @@
               <w:jc w:val="left"/>
             </w:pPr>
             <w:r>
-              <w:t xml:space="preserve">HTTP</w:t>
-            </w:r>
-          </w:p>
-        </w:tc>
-        <w:tc>
-          <w:tcPr/>
-          <w:p>
-            <w:pPr>
-              <w:pStyle w:val="Compact"/>
-              <w:jc w:val="left"/>
-            </w:pPr>
-            <w:r>
-              <w:t xml:space="preserve">When</w:t>
-            </w:r>
-          </w:p>
-        </w:tc>
-        <w:tc>
-          <w:tcPr/>
-          <w:p>
-            <w:pPr>
-              <w:pStyle w:val="Compact"/>
-              <w:jc w:val="left"/>
-            </w:pPr>
-            <w:r>
-              <w:rPr>
-                <w:rStyle w:val="VerbatimChar"/>
-              </w:rPr>
-              <w:t xml:space="preserve">error.code</w:t>
-            </w:r>
-            <w:r>
-              <w:t xml:space="preserve"> </w:t>
-            </w:r>
-            <w:r>
-              <w:t xml:space="preserve">example</w:t>
+              <w:t xml:space="preserve">Method &amp; path</w:t>
+            </w:r>
+          </w:p>
+        </w:tc>
+        <w:tc>
+          <w:tcPr/>
+          <w:p>
+            <w:pPr>
+              <w:pStyle w:val="Compact"/>
+              <w:jc w:val="left"/>
+            </w:pPr>
+            <w:r>
+              <w:t xml:space="preserve">Permission</w:t>
+            </w:r>
+          </w:p>
+        </w:tc>
+        <w:tc>
+          <w:tcPr/>
+          <w:p>
+            <w:pPr>
+              <w:pStyle w:val="Compact"/>
+              <w:jc w:val="left"/>
+            </w:pPr>
+            <w:r>
+              <w:t xml:space="preserve">Description</w:t>
             </w:r>
           </w:p>
         </w:tc>
@@ -6358,19 +6565,38 @@
               <w:jc w:val="left"/>
             </w:pPr>
             <w:r>
-              <w:t xml:space="preserve">400</w:t>
-            </w:r>
-          </w:p>
-        </w:tc>
-        <w:tc>
-          <w:tcPr/>
-          <w:p>
-            <w:pPr>
-              <w:pStyle w:val="Compact"/>
-              <w:jc w:val="left"/>
-            </w:pPr>
-            <w:r>
-              <w:t xml:space="preserve">DTO validation (missing/too long fields) —</w:t>
+              <w:rPr>
+                <w:rStyle w:val="VerbatimChar"/>
+              </w:rPr>
+              <w:t xml:space="preserve">GET /api/guides/guide</w:t>
+            </w:r>
+          </w:p>
+        </w:tc>
+        <w:tc>
+          <w:tcPr/>
+          <w:p>
+            <w:pPr>
+              <w:pStyle w:val="Compact"/>
+              <w:jc w:val="left"/>
+            </w:pPr>
+            <w:r>
+              <w:rPr>
+                <w:iCs/>
+                <w:i/>
+              </w:rPr>
+              <w:t xml:space="preserve">anonymous</w:t>
+            </w:r>
+          </w:p>
+        </w:tc>
+        <w:tc>
+          <w:tcPr/>
+          <w:p>
+            <w:pPr>
+              <w:pStyle w:val="Compact"/>
+              <w:jc w:val="left"/>
+            </w:pPr>
+            <w:r>
+              <w:t xml:space="preserve">Active guides that have published content;</w:t>
             </w:r>
             <w:r>
               <w:t xml:space="preserve"> </w:t>
@@ -6379,25 +6605,7 @@
               <w:rPr>
                 <w:rStyle w:val="VerbatimChar"/>
               </w:rPr>
-              <w:t xml:space="preserve">validationErrors</w:t>
-            </w:r>
-            <w:r>
-              <w:t xml:space="preserve"> </w:t>
-            </w:r>
-            <w:r>
-              <w:t xml:space="preserve">lists each field</w:t>
-            </w:r>
-          </w:p>
-        </w:tc>
-        <w:tc>
-          <w:tcPr/>
-          <w:p>
-            <w:pPr>
-              <w:pStyle w:val="Compact"/>
-              <w:jc w:val="left"/>
-            </w:pPr>
-            <w:r>
-              <w:t xml:space="preserve">—</w:t>
+              <w:t xml:space="preserve">{items:[{id, slug, titleAr, titleEn}]}</w:t>
             </w:r>
           </w:p>
         </w:tc>
@@ -6411,98 +6619,38 @@
               <w:jc w:val="left"/>
             </w:pPr>
             <w:r>
-              <w:t xml:space="preserve">401</w:t>
-            </w:r>
-          </w:p>
-        </w:tc>
-        <w:tc>
-          <w:tcPr/>
-          <w:p>
-            <w:pPr>
-              <w:pStyle w:val="Compact"/>
-              <w:jc w:val="left"/>
-            </w:pPr>
-            <w:r>
-              <w:t xml:space="preserve">Missing/invalid token (JSON clients)</w:t>
-            </w:r>
-          </w:p>
-        </w:tc>
-        <w:tc>
-          <w:tcPr/>
-          <w:p>
-            <w:pPr>
-              <w:pStyle w:val="Compact"/>
-              <w:jc w:val="left"/>
-            </w:pPr>
-            <w:r>
-              <w:t xml:space="preserve">—</w:t>
-            </w:r>
-          </w:p>
-        </w:tc>
-      </w:tr>
-      <w:tr>
-        <w:tc>
-          <w:tcPr/>
-          <w:p>
-            <w:pPr>
-              <w:pStyle w:val="Compact"/>
-              <w:jc w:val="left"/>
-            </w:pPr>
-            <w:r>
-              <w:t xml:space="preserve">403</w:t>
-            </w:r>
-          </w:p>
-        </w:tc>
-        <w:tc>
-          <w:tcPr/>
-          <w:p>
-            <w:pPr>
-              <w:pStyle w:val="Compact"/>
-              <w:jc w:val="left"/>
-            </w:pPr>
-            <w:r>
-              <w:t xml:space="preserve">Permission denied, or a business rule rejected the request</w:t>
-            </w:r>
-          </w:p>
-        </w:tc>
-        <w:tc>
-          <w:tcPr/>
-          <w:p>
-            <w:pPr>
-              <w:pStyle w:val="Compact"/>
-              <w:jc w:val="left"/>
-            </w:pPr>
-            <w:r>
-              <w:rPr>
-                <w:rStyle w:val="VerbatimChar"/>
-              </w:rPr>
-              <w:t xml:space="preserve">Wathiq.Documents:ExpiryBeforeIssue</w:t>
-            </w:r>
-          </w:p>
-        </w:tc>
-      </w:tr>
-      <w:tr>
-        <w:tc>
-          <w:tcPr/>
-          <w:p>
-            <w:pPr>
-              <w:pStyle w:val="Compact"/>
-              <w:jc w:val="left"/>
-            </w:pPr>
-            <w:r>
-              <w:t xml:space="preserve">404</w:t>
-            </w:r>
-          </w:p>
-        </w:tc>
-        <w:tc>
-          <w:tcPr/>
-          <w:p>
-            <w:pPr>
-              <w:pStyle w:val="Compact"/>
-              <w:jc w:val="left"/>
-            </w:pPr>
-            <w:r>
-              <w:t xml:space="preserve">Row doesn’t exist</w:t>
+              <w:rPr>
+                <w:rStyle w:val="VerbatimChar"/>
+              </w:rPr>
+              <w:t xml:space="preserve">GET /api/guides/guide/by-slug?slug=…&amp;language=ar\|en</w:t>
+            </w:r>
+          </w:p>
+        </w:tc>
+        <w:tc>
+          <w:tcPr/>
+          <w:p>
+            <w:pPr>
+              <w:pStyle w:val="Compact"/>
+              <w:jc w:val="left"/>
+            </w:pPr>
+            <w:r>
+              <w:rPr>
+                <w:iCs/>
+                <w:i/>
+              </w:rPr>
+              <w:t xml:space="preserve">anonymous</w:t>
+            </w:r>
+          </w:p>
+        </w:tc>
+        <w:tc>
+          <w:tcPr/>
+          <w:p>
+            <w:pPr>
+              <w:pStyle w:val="Compact"/>
+              <w:jc w:val="left"/>
+            </w:pPr>
+            <w:r>
+              <w:t xml:space="preserve">Served content: latest</w:t>
             </w:r>
             <w:r>
               <w:t xml:space="preserve"> </w:t>
@@ -6512,19 +6660,34 @@
                 <w:bCs/>
                 <w:b/>
               </w:rPr>
-              <w:t xml:space="preserve">or belongs to another user</w:t>
-            </w:r>
-          </w:p>
-        </w:tc>
-        <w:tc>
-          <w:tcPr/>
-          <w:p>
-            <w:pPr>
-              <w:pStyle w:val="Compact"/>
-              <w:jc w:val="left"/>
-            </w:pPr>
-            <w:r>
-              <w:t xml:space="preserve">—</w:t>
+              <w:t xml:space="preserve">published</w:t>
+            </w:r>
+            <w:r>
+              <w:t xml:space="preserve"> </w:t>
+            </w:r>
+            <w:r>
+              <w:t xml:space="preserve">version in the requested language (default</w:t>
+            </w:r>
+            <w:r>
+              <w:t xml:space="preserve"> </w:t>
+            </w:r>
+            <w:r>
+              <w:rPr>
+                <w:rStyle w:val="VerbatimChar"/>
+              </w:rPr>
+              <w:t xml:space="preserve">ar</w:t>
+            </w:r>
+            <w:r>
+              <w:t xml:space="preserve">), falling back to the guide’s</w:t>
+            </w:r>
+            <w:r>
+              <w:t xml:space="preserve"> </w:t>
+            </w:r>
+            <w:r>
+              <w:rPr>
+                <w:rStyle w:val="VerbatimChar"/>
+              </w:rPr>
+              <w:t xml:space="preserve">publishedVersionId</w:t>
             </w:r>
           </w:p>
         </w:tc>
@@ -6535,16 +6698,22 @@
         <w:pStyle w:val="BodyText"/>
       </w:pPr>
       <w:r>
-        <w:t xml:space="preserve">Reminders business codes:</w:t>
-      </w:r>
-      <w:r>
-        <w:t xml:space="preserve"> </w:t>
-      </w:r>
-      <w:r>
-        <w:rPr>
-          <w:rStyle w:val="VerbatimChar"/>
-        </w:rPr>
-        <w:t xml:space="preserve">InvalidOffsets</w:t>
+        <w:rPr>
+          <w:rStyle w:val="VerbatimChar"/>
+        </w:rPr>
+        <w:t xml:space="preserve">GuideDetailDto.version</w:t>
+      </w:r>
+      <w:r>
+        <w:t xml:space="preserve">:</w:t>
+      </w:r>
+      <w:r>
+        <w:t xml:space="preserve"> </w:t>
+      </w:r>
+      <w:r>
+        <w:rPr>
+          <w:rStyle w:val="VerbatimChar"/>
+        </w:rPr>
+        <w:t xml:space="preserve">versionNo</w:t>
       </w:r>
       <w:r>
         <w:t xml:space="preserve">,</w:t>
@@ -6556,7 +6725,7 @@
         <w:rPr>
           <w:rStyle w:val="VerbatimChar"/>
         </w:rPr>
-        <w:t xml:space="preserve">QuietHoursIncomplete</w:t>
+        <w:t xml:space="preserve">language</w:t>
       </w:r>
       <w:r>
         <w:t xml:space="preserve">,</w:t>
@@ -6568,7 +6737,7 @@
         <w:rPr>
           <w:rStyle w:val="VerbatimChar"/>
         </w:rPr>
-        <w:t xml:space="preserve">UnknownTimeZone</w:t>
+        <w:t xml:space="preserve">bodyMarkdown</w:t>
       </w:r>
       <w:r>
         <w:t xml:space="preserve">,</w:t>
@@ -6580,430 +6749,130 @@
         <w:rPr>
           <w:rStyle w:val="VerbatimChar"/>
         </w:rPr>
-        <w:t xml:space="preserve">NoEmailAddress</w:t>
-      </w:r>
-      <w:r>
-        <w:t xml:space="preserve"> </w:t>
-      </w:r>
-      <w:r>
-        <w:t xml:space="preserve">— prefixed</w:t>
-      </w:r>
-      <w:r>
-        <w:t xml:space="preserve"> </w:t>
-      </w:r>
-      <w:r>
-        <w:rPr>
-          <w:rStyle w:val="VerbatimChar"/>
-        </w:rPr>
-        <w:t xml:space="preserve">Wathiq.Reminders:</w:t>
+        <w:t xml:space="preserve">requiredDocuments?</w:t>
+      </w:r>
+      <w:r>
+        <w:t xml:space="preserve">,</w:t>
+      </w:r>
+      <w:r>
+        <w:t xml:space="preserve"> </w:t>
+      </w:r>
+      <w:r>
+        <w:rPr>
+          <w:rStyle w:val="VerbatimChar"/>
+        </w:rPr>
+        <w:t xml:space="preserve">fees?</w:t>
+      </w:r>
+      <w:r>
+        <w:t xml:space="preserve">,</w:t>
+      </w:r>
+      <w:r>
+        <w:t xml:space="preserve"> </w:t>
+      </w:r>
+      <w:r>
+        <w:rPr>
+          <w:rStyle w:val="VerbatimChar"/>
+        </w:rPr>
+        <w:t xml:space="preserve">location?</w:t>
+      </w:r>
+      <w:r>
+        <w:t xml:space="preserve">,</w:t>
+      </w:r>
+      <w:r>
+        <w:t xml:space="preserve"> </w:t>
+      </w:r>
+      <w:r>
+        <w:rPr>
+          <w:rStyle w:val="VerbatimChar"/>
+          <w:bCs/>
+          <w:b/>
+        </w:rPr>
+        <w:t xml:space="preserve">lastVerifiedAt</w:t>
+      </w:r>
+      <w:r>
+        <w:t xml:space="preserve"> </w:t>
+      </w:r>
+      <w:r>
+        <w:t xml:space="preserve">(date - Vision R2: every read shows freshness),</w:t>
+      </w:r>
+      <w:r>
+        <w:t xml:space="preserve"> </w:t>
+      </w:r>
+      <w:r>
+        <w:rPr>
+          <w:rStyle w:val="VerbatimChar"/>
+        </w:rPr>
+        <w:t xml:space="preserve">publishedAt</w:t>
+      </w:r>
+      <w:r>
+        <w:t xml:space="preserve">,</w:t>
+      </w:r>
+      <w:r>
+        <w:t xml:space="preserve"> </w:t>
+      </w:r>
+      <w:r>
+        <w:rPr>
+          <w:rStyle w:val="VerbatimChar"/>
+        </w:rPr>
+        <w:t xml:space="preserve">steps</w:t>
+      </w:r>
+      <w:r>
+        <w:t xml:space="preserve"> </w:t>
+      </w:r>
+      <w:r>
+        <w:t xml:space="preserve">(ordered strings). Drafts are never served; a guide with no published</w:t>
+      </w:r>
+      <w:r>
+        <w:t xml:space="preserve"> </w:t>
+      </w:r>
+      <w:r>
+        <w:t xml:space="preserve">version is absent from the list and</w:t>
+      </w:r>
+      <w:r>
+        <w:t xml:space="preserve"> </w:t>
+      </w:r>
+      <w:r>
+        <w:rPr>
+          <w:rStyle w:val="VerbatimChar"/>
+        </w:rPr>
+        <w:t xml:space="preserve">by-slug</w:t>
+      </w:r>
+      <w:r>
+        <w:t xml:space="preserve"> </w:t>
+      </w:r>
+      <w:r>
+        <w:t xml:space="preserve">answers</w:t>
+      </w:r>
+      <w:r>
+        <w:t xml:space="preserve"> </w:t>
+      </w:r>
+      <w:r>
+        <w:rPr>
+          <w:rStyle w:val="VerbatimChar"/>
+        </w:rPr>
+        <w:t xml:space="preserve">Wathiq.Guides:GuideNotPublished</w:t>
       </w:r>
       <w:r>
         <w:t xml:space="preserve">.</w:t>
       </w:r>
     </w:p>
+    <w:bookmarkEnd w:id="40"/>
+    <w:bookmarkStart w:id="41" w:name="admin-authoring-fr-gde-002"/>
     <w:p>
       <w:pPr>
-        <w:pStyle w:val="BodyText"/>
+        <w:pStyle w:val="Heading2"/>
       </w:pPr>
       <w:r>
-        <w:t xml:space="preserve">Business error codes of the Documents module (message localized via</w:t>
-      </w:r>
-      <w:r>
-        <w:t xml:space="preserve"> </w:t>
-      </w:r>
-      <w:r>
-        <w:rPr>
-          <w:rStyle w:val="VerbatimChar"/>
-        </w:rPr>
-        <w:t xml:space="preserve">Accept-Language</w:t>
-      </w:r>
-      <w:r>
-        <w:t xml:space="preserve">):</w:t>
-      </w:r>
-      <w:r>
-        <w:t xml:space="preserve"> </w:t>
-      </w:r>
-      <w:r>
-        <w:rPr>
-          <w:rStyle w:val="VerbatimChar"/>
-        </w:rPr>
-        <w:t xml:space="preserve">ExpiryBeforeIssue</w:t>
-      </w:r>
-      <w:r>
-        <w:t xml:space="preserve">,</w:t>
-      </w:r>
-      <w:r>
-        <w:t xml:space="preserve"> </w:t>
-      </w:r>
-      <w:r>
-        <w:rPr>
-          <w:rStyle w:val="VerbatimChar"/>
-        </w:rPr>
-        <w:t xml:space="preserve">HolderNotOwned</w:t>
-      </w:r>
-      <w:r>
-        <w:t xml:space="preserve">,</w:t>
-      </w:r>
-      <w:r>
-        <w:t xml:space="preserve"> </w:t>
-      </w:r>
-      <w:r>
-        <w:rPr>
-          <w:rStyle w:val="VerbatimChar"/>
-        </w:rPr>
-        <w:t xml:space="preserve">DocumentTypeNotActive</w:t>
-      </w:r>
-      <w:r>
-        <w:t xml:space="preserve">,</w:t>
-      </w:r>
-      <w:r>
-        <w:t xml:space="preserve"> </w:t>
-      </w:r>
-      <w:r>
-        <w:rPr>
-          <w:rStyle w:val="VerbatimChar"/>
-        </w:rPr>
-        <w:t xml:space="preserve">SelfHolderIsAutomatic</w:t>
-      </w:r>
-      <w:r>
-        <w:t xml:space="preserve">,</w:t>
-      </w:r>
-      <w:r>
-        <w:t xml:space="preserve"> </w:t>
-      </w:r>
-      <w:r>
-        <w:rPr>
-          <w:rStyle w:val="VerbatimChar"/>
-        </w:rPr>
-        <w:t xml:space="preserve">CannotDeleteSelfHolder</w:t>
-      </w:r>
-      <w:r>
-        <w:t xml:space="preserve">,</w:t>
-      </w:r>
-      <w:r>
-        <w:t xml:space="preserve"> </w:t>
-      </w:r>
-      <w:r>
-        <w:rPr>
-          <w:rStyle w:val="VerbatimChar"/>
-        </w:rPr>
-        <w:t xml:space="preserve">HolderHasDocuments</w:t>
-      </w:r>
-      <w:r>
-        <w:t xml:space="preserve"> </w:t>
-      </w:r>
-      <w:r>
-        <w:t xml:space="preserve">— all prefixed</w:t>
-      </w:r>
-      <w:r>
-        <w:t xml:space="preserve"> </w:t>
-      </w:r>
-      <w:r>
-        <w:rPr>
-          <w:rStyle w:val="VerbatimChar"/>
-        </w:rPr>
-        <w:t xml:space="preserve">Wathiq.Documents:</w:t>
-      </w:r>
-      <w:r>
-        <w:t xml:space="preserve">.</w:t>
-      </w:r>
-    </w:p>
-    <w:p>
-      <w:pPr>
-        <w:pStyle w:val="BodyText"/>
-      </w:pPr>
-      <w:r>
-        <w:t xml:space="preserve">Live example (</w:t>
-      </w:r>
-      <w:r>
-        <w:rPr>
-          <w:rStyle w:val="VerbatimChar"/>
-        </w:rPr>
-        <w:t xml:space="preserve">Accept-Language: ar</w:t>
-      </w:r>
-      <w:r>
-        <w:t xml:space="preserve">, expiry before issue):</w:t>
-      </w:r>
-    </w:p>
-    <w:p>
-      <w:pPr>
-        <w:pStyle w:val="SourceCode"/>
-      </w:pPr>
-      <w:r>
-        <w:rPr>
-          <w:rStyle w:val="FunctionTok"/>
-        </w:rPr>
-        <w:t xml:space="preserve">{</w:t>
-      </w:r>
-      <w:r>
-        <w:rPr>
-          <w:rStyle w:val="NormalTok"/>
-        </w:rPr>
-        <w:t xml:space="preserve"> </w:t>
-      </w:r>
-      <w:r>
-        <w:rPr>
-          <w:rStyle w:val="DataTypeTok"/>
-        </w:rPr>
-        <w:t xml:space="preserve">"error"</w:t>
-      </w:r>
-      <w:r>
-        <w:rPr>
-          <w:rStyle w:val="FunctionTok"/>
-        </w:rPr>
-        <w:t xml:space="preserve">:</w:t>
-      </w:r>
-      <w:r>
-        <w:rPr>
-          <w:rStyle w:val="NormalTok"/>
-        </w:rPr>
-        <w:t xml:space="preserve"> </w:t>
-      </w:r>
-      <w:r>
-        <w:rPr>
-          <w:rStyle w:val="FunctionTok"/>
-        </w:rPr>
-        <w:t xml:space="preserve">{</w:t>
-      </w:r>
-      <w:r>
-        <w:br/>
-      </w:r>
-      <w:r>
-        <w:rPr>
-          <w:rStyle w:val="NormalTok"/>
-        </w:rPr>
-        <w:t xml:space="preserve">    </w:t>
-      </w:r>
-      <w:r>
-        <w:rPr>
-          <w:rStyle w:val="DataTypeTok"/>
-        </w:rPr>
-        <w:t xml:space="preserve">"code"</w:t>
-      </w:r>
-      <w:r>
-        <w:rPr>
-          <w:rStyle w:val="FunctionTok"/>
-        </w:rPr>
-        <w:t xml:space="preserve">:</w:t>
-      </w:r>
-      <w:r>
-        <w:rPr>
-          <w:rStyle w:val="NormalTok"/>
-        </w:rPr>
-        <w:t xml:space="preserve"> </w:t>
-      </w:r>
-      <w:r>
-        <w:rPr>
-          <w:rStyle w:val="StringTok"/>
-        </w:rPr>
-        <w:t xml:space="preserve">"Wathiq.Documents:ExpiryBeforeIssue"</w:t>
-      </w:r>
-      <w:r>
-        <w:rPr>
-          <w:rStyle w:val="FunctionTok"/>
-        </w:rPr>
-        <w:t xml:space="preserve">,</w:t>
-      </w:r>
-      <w:r>
-        <w:br/>
-      </w:r>
-      <w:r>
-        <w:rPr>
-          <w:rStyle w:val="NormalTok"/>
-        </w:rPr>
-        <w:t xml:space="preserve">    </w:t>
-      </w:r>
-      <w:r>
-        <w:rPr>
-          <w:rStyle w:val="DataTypeTok"/>
-        </w:rPr>
-        <w:t xml:space="preserve">"message"</w:t>
-      </w:r>
-      <w:r>
-        <w:rPr>
-          <w:rStyle w:val="FunctionTok"/>
-        </w:rPr>
-        <w:t xml:space="preserve">:</w:t>
-      </w:r>
-      <w:r>
-        <w:rPr>
-          <w:rStyle w:val="NormalTok"/>
-        </w:rPr>
-        <w:t xml:space="preserve"> </w:t>
-      </w:r>
-      <w:r>
-        <w:rPr>
-          <w:rStyle w:val="StringTok"/>
-        </w:rPr>
-        <w:t xml:space="preserve">"لا يمكن أن يكون تاريخ الانتهاء قبل تاريخ الإصدار."</w:t>
-      </w:r>
-      <w:r>
-        <w:rPr>
-          <w:rStyle w:val="FunctionTok"/>
-        </w:rPr>
-        <w:t xml:space="preserve">,</w:t>
-      </w:r>
-      <w:r>
-        <w:br/>
-      </w:r>
-      <w:r>
-        <w:rPr>
-          <w:rStyle w:val="NormalTok"/>
-        </w:rPr>
-        <w:t xml:space="preserve">    </w:t>
-      </w:r>
-      <w:r>
-        <w:rPr>
-          <w:rStyle w:val="DataTypeTok"/>
-        </w:rPr>
-        <w:t xml:space="preserve">"data"</w:t>
-      </w:r>
-      <w:r>
-        <w:rPr>
-          <w:rStyle w:val="FunctionTok"/>
-        </w:rPr>
-        <w:t xml:space="preserve">:</w:t>
-      </w:r>
-      <w:r>
-        <w:rPr>
-          <w:rStyle w:val="NormalTok"/>
-        </w:rPr>
-        <w:t xml:space="preserve"> </w:t>
-      </w:r>
-      <w:r>
-        <w:rPr>
-          <w:rStyle w:val="FunctionTok"/>
-        </w:rPr>
-        <w:t xml:space="preserve">{</w:t>
-      </w:r>
-      <w:r>
-        <w:rPr>
-          <w:rStyle w:val="NormalTok"/>
-        </w:rPr>
-        <w:t xml:space="preserve"> </w:t>
-      </w:r>
-      <w:r>
-        <w:rPr>
-          <w:rStyle w:val="DataTypeTok"/>
-        </w:rPr>
-        <w:t xml:space="preserve">"IssueDate"</w:t>
-      </w:r>
-      <w:r>
-        <w:rPr>
-          <w:rStyle w:val="FunctionTok"/>
-        </w:rPr>
-        <w:t xml:space="preserve">:</w:t>
-      </w:r>
-      <w:r>
-        <w:rPr>
-          <w:rStyle w:val="NormalTok"/>
-        </w:rPr>
-        <w:t xml:space="preserve"> </w:t>
-      </w:r>
-      <w:r>
-        <w:rPr>
-          <w:rStyle w:val="StringTok"/>
-        </w:rPr>
-        <w:t xml:space="preserve">"2030-01-01"</w:t>
-      </w:r>
-      <w:r>
-        <w:rPr>
-          <w:rStyle w:val="FunctionTok"/>
-        </w:rPr>
-        <w:t xml:space="preserve">,</w:t>
-      </w:r>
-      <w:r>
-        <w:rPr>
-          <w:rStyle w:val="NormalTok"/>
-        </w:rPr>
-        <w:t xml:space="preserve"> </w:t>
-      </w:r>
-      <w:r>
-        <w:rPr>
-          <w:rStyle w:val="DataTypeTok"/>
-        </w:rPr>
-        <w:t xml:space="preserve">"ExpiryDate"</w:t>
-      </w:r>
-      <w:r>
-        <w:rPr>
-          <w:rStyle w:val="FunctionTok"/>
-        </w:rPr>
-        <w:t xml:space="preserve">:</w:t>
-      </w:r>
-      <w:r>
-        <w:rPr>
-          <w:rStyle w:val="NormalTok"/>
-        </w:rPr>
-        <w:t xml:space="preserve"> </w:t>
-      </w:r>
-      <w:r>
-        <w:rPr>
-          <w:rStyle w:val="StringTok"/>
-        </w:rPr>
-        <w:t xml:space="preserve">"2020-01-01"</w:t>
-      </w:r>
-      <w:r>
-        <w:rPr>
-          <w:rStyle w:val="NormalTok"/>
-        </w:rPr>
-        <w:t xml:space="preserve"> </w:t>
-      </w:r>
-      <w:r>
-        <w:rPr>
-          <w:rStyle w:val="FunctionTok"/>
-        </w:rPr>
-        <w:t xml:space="preserve">}</w:t>
-      </w:r>
-      <w:r>
-        <w:rPr>
-          <w:rStyle w:val="NormalTok"/>
-        </w:rPr>
-        <w:t xml:space="preserve"> </w:t>
-      </w:r>
-      <w:r>
-        <w:rPr>
-          <w:rStyle w:val="FunctionTok"/>
-        </w:rPr>
-        <w:t xml:space="preserve">}</w:t>
-      </w:r>
-      <w:r>
-        <w:rPr>
-          <w:rStyle w:val="NormalTok"/>
-        </w:rPr>
-        <w:t xml:space="preserve"> </w:t>
-      </w:r>
-      <w:r>
-        <w:rPr>
-          <w:rStyle w:val="FunctionTok"/>
-        </w:rPr>
-        <w:t xml:space="preserve">}</w:t>
-      </w:r>
-    </w:p>
-    <w:bookmarkEnd w:id="40"/>
-    <w:bookmarkStart w:id="41" w:name="infrastructure-endpoints-abp-built-ins"/>
-    <w:p>
-      <w:pPr>
-        <w:pStyle w:val="Heading1"/>
-      </w:pPr>
-      <w:r>
         <w:rPr>
           <w:rStyle w:val="SectionNumber"/>
         </w:rPr>
-        <w:t xml:space="preserve">7</w:t>
+        <w:t xml:space="preserve">6.2</w:t>
       </w:r>
       <w:r>
         <w:tab/>
       </w:r>
       <w:r>
-        <w:t xml:space="preserve">7. Infrastructure endpoints (ABP built-ins)</w:t>
-      </w:r>
-    </w:p>
-    <w:p>
-      <w:pPr>
-        <w:pStyle w:val="FirstParagraph"/>
-      </w:pPr>
-      <w:r>
-        <w:t xml:space="preserve">Summarized — full detail is in Swagger. Admin-tagged groups require admin permissions.</w:t>
+        <w:t xml:space="preserve">6.2 Admin authoring (FR-GDE-002)</w:t>
       </w:r>
     </w:p>
     <w:tbl>
@@ -7030,31 +6899,31 @@
               <w:jc w:val="left"/>
             </w:pPr>
             <w:r>
-              <w:t xml:space="preserve">Area</w:t>
-            </w:r>
-          </w:p>
-        </w:tc>
-        <w:tc>
-          <w:tcPr/>
-          <w:p>
-            <w:pPr>
-              <w:pStyle w:val="Compact"/>
-              <w:jc w:val="left"/>
-            </w:pPr>
-            <w:r>
-              <w:t xml:space="preserve">Root</w:t>
-            </w:r>
-          </w:p>
-        </w:tc>
-        <w:tc>
-          <w:tcPr/>
-          <w:p>
-            <w:pPr>
-              <w:pStyle w:val="Compact"/>
-              <w:jc w:val="left"/>
-            </w:pPr>
-            <w:r>
-              <w:t xml:space="preserve">Notes</w:t>
+              <w:t xml:space="preserve">Method &amp; path</w:t>
+            </w:r>
+          </w:p>
+        </w:tc>
+        <w:tc>
+          <w:tcPr/>
+          <w:p>
+            <w:pPr>
+              <w:pStyle w:val="Compact"/>
+              <w:jc w:val="left"/>
+            </w:pPr>
+            <w:r>
+              <w:t xml:space="preserve">Permission</w:t>
+            </w:r>
+          </w:p>
+        </w:tc>
+        <w:tc>
+          <w:tcPr/>
+          <w:p>
+            <w:pPr>
+              <w:pStyle w:val="Compact"/>
+              <w:jc w:val="left"/>
+            </w:pPr>
+            <w:r>
+              <w:t xml:space="preserve">Description</w:t>
             </w:r>
           </w:p>
         </w:tc>
@@ -7068,34 +6937,67 @@
               <w:jc w:val="left"/>
             </w:pPr>
             <w:r>
-              <w:t xml:space="preserve">Account</w:t>
-            </w:r>
-          </w:p>
-        </w:tc>
-        <w:tc>
-          <w:tcPr/>
-          <w:p>
-            <w:pPr>
-              <w:pStyle w:val="Compact"/>
-              <w:jc w:val="left"/>
-            </w:pPr>
-            <w:r>
-              <w:rPr>
-                <w:rStyle w:val="VerbatimChar"/>
-              </w:rPr>
-              <w:t xml:space="preserve">/api/account/*</w:t>
-            </w:r>
-          </w:p>
-        </w:tc>
-        <w:tc>
-          <w:tcPr/>
-          <w:p>
-            <w:pPr>
-              <w:pStyle w:val="Compact"/>
-              <w:jc w:val="left"/>
-            </w:pPr>
-            <w:r>
-              <w:t xml:space="preserve">register, login/logout, reset-password, my-profile, change-password</w:t>
+              <w:rPr>
+                <w:rStyle w:val="VerbatimChar"/>
+              </w:rPr>
+              <w:t xml:space="preserve">POST /api/guides/guide-admin</w:t>
+            </w:r>
+          </w:p>
+        </w:tc>
+        <w:tc>
+          <w:tcPr/>
+          <w:p>
+            <w:pPr>
+              <w:pStyle w:val="Compact"/>
+              <w:jc w:val="left"/>
+            </w:pPr>
+            <w:r>
+              <w:rPr>
+                <w:rStyle w:val="VerbatimChar"/>
+              </w:rPr>
+              <w:t xml:space="preserve">WathiqGuides.Manage</w:t>
+            </w:r>
+          </w:p>
+        </w:tc>
+        <w:tc>
+          <w:tcPr/>
+          <w:p>
+            <w:pPr>
+              <w:pStyle w:val="Compact"/>
+              <w:jc w:val="left"/>
+            </w:pPr>
+            <w:r>
+              <w:t xml:space="preserve">Create a guide identity:</w:t>
+            </w:r>
+            <w:r>
+              <w:t xml:space="preserve"> </w:t>
+            </w:r>
+            <w:r>
+              <w:rPr>
+                <w:rStyle w:val="VerbatimChar"/>
+              </w:rPr>
+              <w:t xml:space="preserve">{slug, titleAr, titleEn}</w:t>
+            </w:r>
+            <w:r>
+              <w:t xml:space="preserve">; slug is URL-safe (</w:t>
+            </w:r>
+            <w:r>
+              <w:rPr>
+                <w:rStyle w:val="VerbatimChar"/>
+              </w:rPr>
+              <w:t xml:space="preserve">^[a-z0-9][a-z0-9-]*$</w:t>
+            </w:r>
+            <w:r>
+              <w:t xml:space="preserve">) and unique (</w:t>
+            </w:r>
+            <w:r>
+              <w:rPr>
+                <w:rStyle w:val="VerbatimChar"/>
+              </w:rPr>
+              <w:t xml:space="preserve">Wathiq.Guides:SlugAlreadyExists</w:t>
+            </w:r>
+            <w:r>
+              <w:t xml:space="preserve">)</w:t>
             </w:r>
           </w:p>
         </w:tc>
@@ -7109,46 +7011,80 @@
               <w:jc w:val="left"/>
             </w:pPr>
             <w:r>
-              <w:t xml:space="preserve">Identity admin</w:t>
-            </w:r>
-          </w:p>
-        </w:tc>
-        <w:tc>
-          <w:tcPr/>
-          <w:p>
-            <w:pPr>
-              <w:pStyle w:val="Compact"/>
-              <w:jc w:val="left"/>
-            </w:pPr>
-            <w:r>
-              <w:rPr>
-                <w:rStyle w:val="VerbatimChar"/>
-              </w:rPr>
-              <w:t xml:space="preserve">/api/identity/users</w:t>
-            </w:r>
-            <w:r>
-              <w:t xml:space="preserve">,</w:t>
+              <w:rPr>
+                <w:rStyle w:val="VerbatimChar"/>
+              </w:rPr>
+              <w:t xml:space="preserve">POST /api/guides/guide-admin/version</w:t>
+            </w:r>
+          </w:p>
+        </w:tc>
+        <w:tc>
+          <w:tcPr/>
+          <w:p>
+            <w:pPr>
+              <w:pStyle w:val="Compact"/>
+              <w:jc w:val="left"/>
+            </w:pPr>
+            <w:r>
+              <w:rPr>
+                <w:rStyle w:val="VerbatimChar"/>
+              </w:rPr>
+              <w:t xml:space="preserve">WathiqGuides.Manage</w:t>
+            </w:r>
+          </w:p>
+        </w:tc>
+        <w:tc>
+          <w:tcPr/>
+          <w:p>
+            <w:pPr>
+              <w:pStyle w:val="Compact"/>
+              <w:jc w:val="left"/>
+            </w:pPr>
+            <w:r>
+              <w:t xml:space="preserve">Add a</w:t>
             </w:r>
             <w:r>
               <w:t xml:space="preserve"> </w:t>
             </w:r>
             <w:r>
               <w:rPr>
-                <w:rStyle w:val="VerbatimChar"/>
-              </w:rPr>
-              <w:t xml:space="preserve">/api/identity/roles</w:t>
-            </w:r>
-          </w:p>
-        </w:tc>
-        <w:tc>
-          <w:tcPr/>
-          <w:p>
-            <w:pPr>
-              <w:pStyle w:val="Compact"/>
-              <w:jc w:val="left"/>
-            </w:pPr>
-            <w:r>
-              <w:t xml:space="preserve">user/role CRUD (admin)</w:t>
+                <w:bCs/>
+                <w:b/>
+              </w:rPr>
+              <w:t xml:space="preserve">draft</w:t>
+            </w:r>
+            <w:r>
+              <w:t xml:space="preserve"> </w:t>
+            </w:r>
+            <w:r>
+              <w:t xml:space="preserve">version:</w:t>
+            </w:r>
+            <w:r>
+              <w:t xml:space="preserve"> </w:t>
+            </w:r>
+            <w:r>
+              <w:rPr>
+                <w:rStyle w:val="VerbatimChar"/>
+              </w:rPr>
+              <w:t xml:space="preserve">{guideId, language (ar\|en), bodyMarkdown, lastVerifiedAt (required), requiredDocuments?, fees?, location?, steps[]}</w:t>
+            </w:r>
+            <w:r>
+              <w:t xml:space="preserve">;</w:t>
+            </w:r>
+            <w:r>
+              <w:t xml:space="preserve"> </w:t>
+            </w:r>
+            <w:r>
+              <w:rPr>
+                <w:rStyle w:val="VerbatimChar"/>
+              </w:rPr>
+              <w:t xml:space="preserve">versionNo</w:t>
+            </w:r>
+            <w:r>
+              <w:t xml:space="preserve"> </w:t>
+            </w:r>
+            <w:r>
+              <w:t xml:space="preserve">is assigned server-side (one timeline per guide)</w:t>
             </w:r>
           </w:p>
         </w:tc>
@@ -7162,34 +7098,46 @@
               <w:jc w:val="left"/>
             </w:pPr>
             <w:r>
-              <w:t xml:space="preserve">Permission management</w:t>
-            </w:r>
-          </w:p>
-        </w:tc>
-        <w:tc>
-          <w:tcPr/>
-          <w:p>
-            <w:pPr>
-              <w:pStyle w:val="Compact"/>
-              <w:jc w:val="left"/>
-            </w:pPr>
-            <w:r>
-              <w:rPr>
-                <w:rStyle w:val="VerbatimChar"/>
-              </w:rPr>
-              <w:t xml:space="preserve">/api/permission-management/permissions</w:t>
-            </w:r>
-          </w:p>
-        </w:tc>
-        <w:tc>
-          <w:tcPr/>
-          <w:p>
-            <w:pPr>
-              <w:pStyle w:val="Compact"/>
-              <w:jc w:val="left"/>
-            </w:pPr>
-            <w:r>
-              <w:t xml:space="preserve">read/update grants (admin)</w:t>
+              <w:rPr>
+                <w:rStyle w:val="VerbatimChar"/>
+              </w:rPr>
+              <w:t xml:space="preserve">PUT /api/guides/guide-admin/{id}/version</w:t>
+            </w:r>
+          </w:p>
+        </w:tc>
+        <w:tc>
+          <w:tcPr/>
+          <w:p>
+            <w:pPr>
+              <w:pStyle w:val="Compact"/>
+              <w:jc w:val="left"/>
+            </w:pPr>
+            <w:r>
+              <w:rPr>
+                <w:rStyle w:val="VerbatimChar"/>
+              </w:rPr>
+              <w:t xml:space="preserve">WathiqGuides.Manage</w:t>
+            </w:r>
+          </w:p>
+        </w:tc>
+        <w:tc>
+          <w:tcPr/>
+          <w:p>
+            <w:pPr>
+              <w:pStyle w:val="Compact"/>
+              <w:jc w:val="left"/>
+            </w:pPr>
+            <w:r>
+              <w:t xml:space="preserve">Edit a draft (body, freshness date, steps replaced as a unit). On a published version:</w:t>
+            </w:r>
+            <w:r>
+              <w:t xml:space="preserve"> </w:t>
+            </w:r>
+            <w:r>
+              <w:rPr>
+                <w:rStyle w:val="VerbatimChar"/>
+              </w:rPr>
+              <w:t xml:space="preserve">Wathiq.Guides:PublishedVersionIsImmutable</w:t>
             </w:r>
           </w:p>
         </w:tc>
@@ -7203,82 +7151,156 @@
               <w:jc w:val="left"/>
             </w:pPr>
             <w:r>
-              <w:t xml:space="preserve">App configuration</w:t>
-            </w:r>
-          </w:p>
-        </w:tc>
-        <w:tc>
-          <w:tcPr/>
-          <w:p>
-            <w:pPr>
-              <w:pStyle w:val="Compact"/>
-              <w:jc w:val="left"/>
-            </w:pPr>
-            <w:r>
-              <w:rPr>
-                <w:rStyle w:val="VerbatimChar"/>
-              </w:rPr>
-              <w:t xml:space="preserve">/api/abp/application-configuration</w:t>
-            </w:r>
-          </w:p>
-        </w:tc>
-        <w:tc>
-          <w:tcPr/>
-          <w:p>
-            <w:pPr>
-              <w:pStyle w:val="Compact"/>
-              <w:jc w:val="left"/>
-            </w:pPr>
-            <w:r>
-              <w:t xml:space="preserve">current user, permissions, localization — the client bootstrap call</w:t>
-            </w:r>
-          </w:p>
-        </w:tc>
-      </w:tr>
-      <w:tr>
-        <w:tc>
-          <w:tcPr/>
-          <w:p>
-            <w:pPr>
-              <w:pStyle w:val="Compact"/>
-              <w:jc w:val="left"/>
-            </w:pPr>
-            <w:r>
-              <w:t xml:space="preserve">Settings</w:t>
-            </w:r>
-          </w:p>
-        </w:tc>
-        <w:tc>
-          <w:tcPr/>
-          <w:p>
-            <w:pPr>
-              <w:pStyle w:val="Compact"/>
-              <w:jc w:val="left"/>
-            </w:pPr>
-            <w:r>
-              <w:rPr>
-                <w:rStyle w:val="VerbatimChar"/>
-              </w:rPr>
-              <w:t xml:space="preserve">/api/setting-management/*</w:t>
-            </w:r>
-          </w:p>
-        </w:tc>
-        <w:tc>
-          <w:tcPr/>
-          <w:p>
-            <w:pPr>
-              <w:pStyle w:val="Compact"/>
-              <w:jc w:val="left"/>
-            </w:pPr>
-            <w:r>
-              <w:t xml:space="preserve">emailing, timezone (admin)</w:t>
+              <w:rPr>
+                <w:rStyle w:val="VerbatimChar"/>
+              </w:rPr>
+              <w:t xml:space="preserve">POST /api/guides/guide-admin/{id}/publish</w:t>
+            </w:r>
+          </w:p>
+        </w:tc>
+        <w:tc>
+          <w:tcPr/>
+          <w:p>
+            <w:pPr>
+              <w:pStyle w:val="Compact"/>
+              <w:jc w:val="left"/>
+            </w:pPr>
+            <w:r>
+              <w:rPr>
+                <w:rStyle w:val="VerbatimChar"/>
+              </w:rPr>
+              <w:t xml:space="preserve">WathiqGuides.Manage</w:t>
+            </w:r>
+          </w:p>
+        </w:tc>
+        <w:tc>
+          <w:tcPr/>
+          <w:p>
+            <w:pPr>
+              <w:pStyle w:val="Compact"/>
+              <w:jc w:val="left"/>
+            </w:pPr>
+            <w:r>
+              <w:t xml:space="preserve">One-shot freeze: sets</w:t>
+            </w:r>
+            <w:r>
+              <w:t xml:space="preserve"> </w:t>
+            </w:r>
+            <w:r>
+              <w:rPr>
+                <w:rStyle w:val="VerbatimChar"/>
+              </w:rPr>
+              <w:t xml:space="preserve">publishedAt</w:t>
+            </w:r>
+            <w:r>
+              <w:t xml:space="preserve">, points the guide at this version. Repeat →</w:t>
+            </w:r>
+            <w:r>
+              <w:t xml:space="preserve"> </w:t>
+            </w:r>
+            <w:r>
+              <w:rPr>
+                <w:rStyle w:val="VerbatimChar"/>
+              </w:rPr>
+              <w:t xml:space="preserve">Wathiq.Guides:VersionAlreadyPublished</w:t>
             </w:r>
           </w:p>
         </w:tc>
       </w:tr>
     </w:tbl>
+    <w:p>
+      <w:pPr>
+        <w:pStyle w:val="BodyText"/>
+      </w:pPr>
+      <w:r>
+        <w:t xml:space="preserve">Live examples (recorded against the running host):</w:t>
+      </w:r>
+    </w:p>
+    <w:p>
+      <w:pPr>
+        <w:pStyle w:val="SourceCode"/>
+      </w:pPr>
+      <w:r>
+        <w:rPr>
+          <w:rStyle w:val="CommentTok"/>
+        </w:rPr>
+        <w:t xml:space="preserve"># Anonymous - no Authorization header at all:</w:t>
+      </w:r>
+      <w:r>
+        <w:br/>
+      </w:r>
+      <w:r>
+        <w:rPr>
+          <w:rStyle w:val="ExtensionTok"/>
+        </w:rPr>
+        <w:t xml:space="preserve">curl</w:t>
+      </w:r>
+      <w:r>
+        <w:rPr>
+          <w:rStyle w:val="NormalTok"/>
+        </w:rPr>
+        <w:t xml:space="preserve"> </w:t>
+      </w:r>
+      <w:r>
+        <w:rPr>
+          <w:rStyle w:val="StringTok"/>
+        </w:rPr>
+        <w:t xml:space="preserve">"https://localhost:44352/api/guides/guide/by-slug?slug=renew-passport&amp;language=ar"</w:t>
+      </w:r>
+      <w:r>
+        <w:br/>
+      </w:r>
+      <w:r>
+        <w:rPr>
+          <w:rStyle w:val="CommentTok"/>
+        </w:rPr>
+        <w:t xml:space="preserve"># → titleAr "تجديد جواز السفر", version.language "ar", lastVerifiedAt "2026-09-01", 6 steps</w:t>
+      </w:r>
+      <w:r>
+        <w:br/>
+      </w:r>
+      <w:r>
+        <w:br/>
+      </w:r>
+      <w:r>
+        <w:rPr>
+          <w:rStyle w:val="CommentTok"/>
+        </w:rPr>
+        <w:t xml:space="preserve"># Anonymous POST to authoring → denied (login challenge); with an admin bearer token → 200.</w:t>
+      </w:r>
+    </w:p>
+    <w:p>
+      <w:pPr>
+        <w:pStyle w:val="FirstParagraph"/>
+      </w:pPr>
+      <w:r>
+        <w:t xml:space="preserve">The seeded</w:t>
+      </w:r>
+      <w:r>
+        <w:t xml:space="preserve"> </w:t>
+      </w:r>
+      <w:r>
+        <w:rPr>
+          <w:rStyle w:val="VerbatimChar"/>
+        </w:rPr>
+        <w:t xml:space="preserve">renew-passport</w:t>
+      </w:r>
+      <w:r>
+        <w:t xml:space="preserve"> </w:t>
+      </w:r>
+      <w:r>
+        <w:t xml:space="preserve">guide (ar + en, both published) is the module’s reference content -</w:t>
+      </w:r>
+      <w:r>
+        <w:t xml:space="preserve"> </w:t>
+      </w:r>
+      <w:r>
+        <w:t xml:space="preserve">5.3 chunks it, 5.5 cites it.</w:t>
+      </w:r>
+    </w:p>
     <w:bookmarkEnd w:id="41"/>
-    <w:bookmarkStart w:id="42" w:name="planned"/>
+    <w:bookmarkEnd w:id="42"/>
+    <w:bookmarkStart w:id="43" w:name="error-model"/>
     <w:p>
       <w:pPr>
         <w:pStyle w:val="Heading1"/>
@@ -7287,13 +7309,1105 @@
         <w:rPr>
           <w:rStyle w:val="SectionNumber"/>
         </w:rPr>
+        <w:t xml:space="preserve">7</w:t>
+      </w:r>
+      <w:r>
+        <w:tab/>
+      </w:r>
+      <w:r>
+        <w:t xml:space="preserve">7. Error model</w:t>
+      </w:r>
+    </w:p>
+    <w:p>
+      <w:pPr>
+        <w:pStyle w:val="FirstParagraph"/>
+      </w:pPr>
+      <w:r>
+        <w:t xml:space="preserve">Every error is the ABP envelope</w:t>
+      </w:r>
+      <w:r>
+        <w:t xml:space="preserve"> </w:t>
+      </w:r>
+      <w:r>
+        <w:rPr>
+          <w:rStyle w:val="VerbatimChar"/>
+        </w:rPr>
+        <w:t xml:space="preserve">{ "error": { code, message, details, data, validationErrors } }</w:t>
+      </w:r>
+      <w:r>
+        <w:t xml:space="preserve">.</w:t>
+      </w:r>
+    </w:p>
+    <w:tbl>
+      <w:tblPr>
+        <w:tblStyle w:val="Table"/>
+        <w:tblW w:type="pct" w:w="5000"/>
+        <w:tblLook w:firstRow="1" w:lastRow="0" w:firstColumn="0" w:lastColumn="0" w:noHBand="0" w:noVBand="0" w:val="0020"/>
+        <w:jc w:val="start"/>
+      </w:tblPr>
+      <w:tblGrid>
+        <w:gridCol w:w="2640"/>
+        <w:gridCol w:w="2640"/>
+        <w:gridCol w:w="2640"/>
+      </w:tblGrid>
+      <w:tr>
+        <w:trPr>
+          <w:tblHeader w:val="true"/>
+        </w:trPr>
+        <w:tc>
+          <w:tcPr/>
+          <w:p>
+            <w:pPr>
+              <w:pStyle w:val="Compact"/>
+              <w:jc w:val="left"/>
+            </w:pPr>
+            <w:r>
+              <w:t xml:space="preserve">HTTP</w:t>
+            </w:r>
+          </w:p>
+        </w:tc>
+        <w:tc>
+          <w:tcPr/>
+          <w:p>
+            <w:pPr>
+              <w:pStyle w:val="Compact"/>
+              <w:jc w:val="left"/>
+            </w:pPr>
+            <w:r>
+              <w:t xml:space="preserve">When</w:t>
+            </w:r>
+          </w:p>
+        </w:tc>
+        <w:tc>
+          <w:tcPr/>
+          <w:p>
+            <w:pPr>
+              <w:pStyle w:val="Compact"/>
+              <w:jc w:val="left"/>
+            </w:pPr>
+            <w:r>
+              <w:rPr>
+                <w:rStyle w:val="VerbatimChar"/>
+              </w:rPr>
+              <w:t xml:space="preserve">error.code</w:t>
+            </w:r>
+            <w:r>
+              <w:t xml:space="preserve"> </w:t>
+            </w:r>
+            <w:r>
+              <w:t xml:space="preserve">example</w:t>
+            </w:r>
+          </w:p>
+        </w:tc>
+      </w:tr>
+      <w:tr>
+        <w:tc>
+          <w:tcPr/>
+          <w:p>
+            <w:pPr>
+              <w:pStyle w:val="Compact"/>
+              <w:jc w:val="left"/>
+            </w:pPr>
+            <w:r>
+              <w:t xml:space="preserve">400</w:t>
+            </w:r>
+          </w:p>
+        </w:tc>
+        <w:tc>
+          <w:tcPr/>
+          <w:p>
+            <w:pPr>
+              <w:pStyle w:val="Compact"/>
+              <w:jc w:val="left"/>
+            </w:pPr>
+            <w:r>
+              <w:t xml:space="preserve">DTO validation (missing/too long fields) —</w:t>
+            </w:r>
+            <w:r>
+              <w:t xml:space="preserve"> </w:t>
+            </w:r>
+            <w:r>
+              <w:rPr>
+                <w:rStyle w:val="VerbatimChar"/>
+              </w:rPr>
+              <w:t xml:space="preserve">validationErrors</w:t>
+            </w:r>
+            <w:r>
+              <w:t xml:space="preserve"> </w:t>
+            </w:r>
+            <w:r>
+              <w:t xml:space="preserve">lists each field</w:t>
+            </w:r>
+          </w:p>
+        </w:tc>
+        <w:tc>
+          <w:tcPr/>
+          <w:p>
+            <w:pPr>
+              <w:pStyle w:val="Compact"/>
+              <w:jc w:val="left"/>
+            </w:pPr>
+            <w:r>
+              <w:t xml:space="preserve">—</w:t>
+            </w:r>
+          </w:p>
+        </w:tc>
+      </w:tr>
+      <w:tr>
+        <w:tc>
+          <w:tcPr/>
+          <w:p>
+            <w:pPr>
+              <w:pStyle w:val="Compact"/>
+              <w:jc w:val="left"/>
+            </w:pPr>
+            <w:r>
+              <w:t xml:space="preserve">401</w:t>
+            </w:r>
+          </w:p>
+        </w:tc>
+        <w:tc>
+          <w:tcPr/>
+          <w:p>
+            <w:pPr>
+              <w:pStyle w:val="Compact"/>
+              <w:jc w:val="left"/>
+            </w:pPr>
+            <w:r>
+              <w:t xml:space="preserve">Missing/invalid token (JSON clients)</w:t>
+            </w:r>
+          </w:p>
+        </w:tc>
+        <w:tc>
+          <w:tcPr/>
+          <w:p>
+            <w:pPr>
+              <w:pStyle w:val="Compact"/>
+              <w:jc w:val="left"/>
+            </w:pPr>
+            <w:r>
+              <w:t xml:space="preserve">—</w:t>
+            </w:r>
+          </w:p>
+        </w:tc>
+      </w:tr>
+      <w:tr>
+        <w:tc>
+          <w:tcPr/>
+          <w:p>
+            <w:pPr>
+              <w:pStyle w:val="Compact"/>
+              <w:jc w:val="left"/>
+            </w:pPr>
+            <w:r>
+              <w:t xml:space="preserve">403</w:t>
+            </w:r>
+          </w:p>
+        </w:tc>
+        <w:tc>
+          <w:tcPr/>
+          <w:p>
+            <w:pPr>
+              <w:pStyle w:val="Compact"/>
+              <w:jc w:val="left"/>
+            </w:pPr>
+            <w:r>
+              <w:t xml:space="preserve">Permission denied, or a business rule rejected the request</w:t>
+            </w:r>
+          </w:p>
+        </w:tc>
+        <w:tc>
+          <w:tcPr/>
+          <w:p>
+            <w:pPr>
+              <w:pStyle w:val="Compact"/>
+              <w:jc w:val="left"/>
+            </w:pPr>
+            <w:r>
+              <w:rPr>
+                <w:rStyle w:val="VerbatimChar"/>
+              </w:rPr>
+              <w:t xml:space="preserve">Wathiq.Documents:ExpiryBeforeIssue</w:t>
+            </w:r>
+          </w:p>
+        </w:tc>
+      </w:tr>
+      <w:tr>
+        <w:tc>
+          <w:tcPr/>
+          <w:p>
+            <w:pPr>
+              <w:pStyle w:val="Compact"/>
+              <w:jc w:val="left"/>
+            </w:pPr>
+            <w:r>
+              <w:t xml:space="preserve">404</w:t>
+            </w:r>
+          </w:p>
+        </w:tc>
+        <w:tc>
+          <w:tcPr/>
+          <w:p>
+            <w:pPr>
+              <w:pStyle w:val="Compact"/>
+              <w:jc w:val="left"/>
+            </w:pPr>
+            <w:r>
+              <w:t xml:space="preserve">Row doesn’t exist</w:t>
+            </w:r>
+            <w:r>
+              <w:t xml:space="preserve"> </w:t>
+            </w:r>
+            <w:r>
+              <w:rPr>
+                <w:bCs/>
+                <w:b/>
+              </w:rPr>
+              <w:t xml:space="preserve">or belongs to another user</w:t>
+            </w:r>
+          </w:p>
+        </w:tc>
+        <w:tc>
+          <w:tcPr/>
+          <w:p>
+            <w:pPr>
+              <w:pStyle w:val="Compact"/>
+              <w:jc w:val="left"/>
+            </w:pPr>
+            <w:r>
+              <w:t xml:space="preserve">—</w:t>
+            </w:r>
+          </w:p>
+        </w:tc>
+      </w:tr>
+    </w:tbl>
+    <w:p>
+      <w:pPr>
+        <w:pStyle w:val="BodyText"/>
+      </w:pPr>
+      <w:r>
+        <w:t xml:space="preserve">Reminders business codes:</w:t>
+      </w:r>
+      <w:r>
+        <w:t xml:space="preserve"> </w:t>
+      </w:r>
+      <w:r>
+        <w:rPr>
+          <w:rStyle w:val="VerbatimChar"/>
+        </w:rPr>
+        <w:t xml:space="preserve">InvalidOffsets</w:t>
+      </w:r>
+      <w:r>
+        <w:t xml:space="preserve">,</w:t>
+      </w:r>
+      <w:r>
+        <w:t xml:space="preserve"> </w:t>
+      </w:r>
+      <w:r>
+        <w:rPr>
+          <w:rStyle w:val="VerbatimChar"/>
+        </w:rPr>
+        <w:t xml:space="preserve">QuietHoursIncomplete</w:t>
+      </w:r>
+      <w:r>
+        <w:t xml:space="preserve">,</w:t>
+      </w:r>
+      <w:r>
+        <w:t xml:space="preserve"> </w:t>
+      </w:r>
+      <w:r>
+        <w:rPr>
+          <w:rStyle w:val="VerbatimChar"/>
+        </w:rPr>
+        <w:t xml:space="preserve">UnknownTimeZone</w:t>
+      </w:r>
+      <w:r>
+        <w:t xml:space="preserve">,</w:t>
+      </w:r>
+      <w:r>
+        <w:t xml:space="preserve"> </w:t>
+      </w:r>
+      <w:r>
+        <w:rPr>
+          <w:rStyle w:val="VerbatimChar"/>
+        </w:rPr>
+        <w:t xml:space="preserve">NoEmailAddress</w:t>
+      </w:r>
+      <w:r>
+        <w:t xml:space="preserve"> </w:t>
+      </w:r>
+      <w:r>
+        <w:t xml:space="preserve">— prefixed</w:t>
+      </w:r>
+      <w:r>
+        <w:t xml:space="preserve"> </w:t>
+      </w:r>
+      <w:r>
+        <w:rPr>
+          <w:rStyle w:val="VerbatimChar"/>
+        </w:rPr>
+        <w:t xml:space="preserve">Wathiq.Reminders:</w:t>
+      </w:r>
+      <w:r>
+        <w:t xml:space="preserve">. Guides business codes:</w:t>
+      </w:r>
+      <w:r>
+        <w:t xml:space="preserve"> </w:t>
+      </w:r>
+      <w:r>
+        <w:rPr>
+          <w:rStyle w:val="VerbatimChar"/>
+        </w:rPr>
+        <w:t xml:space="preserve">SlugAlreadyExists</w:t>
+      </w:r>
+      <w:r>
+        <w:t xml:space="preserve">,</w:t>
+      </w:r>
+      <w:r>
+        <w:t xml:space="preserve"> </w:t>
+      </w:r>
+      <w:r>
+        <w:rPr>
+          <w:rStyle w:val="VerbatimChar"/>
+        </w:rPr>
+        <w:t xml:space="preserve">PublishedVersionIsImmutable</w:t>
+      </w:r>
+      <w:r>
+        <w:t xml:space="preserve">,</w:t>
+      </w:r>
+      <w:r>
+        <w:t xml:space="preserve"> </w:t>
+      </w:r>
+      <w:r>
+        <w:rPr>
+          <w:rStyle w:val="VerbatimChar"/>
+        </w:rPr>
+        <w:t xml:space="preserve">VersionAlreadyPublished</w:t>
+      </w:r>
+      <w:r>
+        <w:t xml:space="preserve">,</w:t>
+      </w:r>
+      <w:r>
+        <w:t xml:space="preserve"> </w:t>
+      </w:r>
+      <w:r>
+        <w:rPr>
+          <w:rStyle w:val="VerbatimChar"/>
+        </w:rPr>
+        <w:t xml:space="preserve">GuideNotPublished</w:t>
+      </w:r>
+      <w:r>
+        <w:t xml:space="preserve"> </w:t>
+      </w:r>
+      <w:r>
+        <w:t xml:space="preserve">— prefixed</w:t>
+      </w:r>
+      <w:r>
+        <w:t xml:space="preserve"> </w:t>
+      </w:r>
+      <w:r>
+        <w:rPr>
+          <w:rStyle w:val="VerbatimChar"/>
+        </w:rPr>
+        <w:t xml:space="preserve">Wathiq.Guides:</w:t>
+      </w:r>
+      <w:r>
+        <w:t xml:space="preserve">.</w:t>
+      </w:r>
+    </w:p>
+    <w:p>
+      <w:pPr>
+        <w:pStyle w:val="BodyText"/>
+      </w:pPr>
+      <w:r>
+        <w:t xml:space="preserve">Business error codes of the Documents module (message localized via</w:t>
+      </w:r>
+      <w:r>
+        <w:t xml:space="preserve"> </w:t>
+      </w:r>
+      <w:r>
+        <w:rPr>
+          <w:rStyle w:val="VerbatimChar"/>
+        </w:rPr>
+        <w:t xml:space="preserve">Accept-Language</w:t>
+      </w:r>
+      <w:r>
+        <w:t xml:space="preserve">):</w:t>
+      </w:r>
+      <w:r>
+        <w:t xml:space="preserve"> </w:t>
+      </w:r>
+      <w:r>
+        <w:rPr>
+          <w:rStyle w:val="VerbatimChar"/>
+        </w:rPr>
+        <w:t xml:space="preserve">ExpiryBeforeIssue</w:t>
+      </w:r>
+      <w:r>
+        <w:t xml:space="preserve">,</w:t>
+      </w:r>
+      <w:r>
+        <w:t xml:space="preserve"> </w:t>
+      </w:r>
+      <w:r>
+        <w:rPr>
+          <w:rStyle w:val="VerbatimChar"/>
+        </w:rPr>
+        <w:t xml:space="preserve">HolderNotOwned</w:t>
+      </w:r>
+      <w:r>
+        <w:t xml:space="preserve">,</w:t>
+      </w:r>
+      <w:r>
+        <w:t xml:space="preserve"> </w:t>
+      </w:r>
+      <w:r>
+        <w:rPr>
+          <w:rStyle w:val="VerbatimChar"/>
+        </w:rPr>
+        <w:t xml:space="preserve">DocumentTypeNotActive</w:t>
+      </w:r>
+      <w:r>
+        <w:t xml:space="preserve">,</w:t>
+      </w:r>
+      <w:r>
+        <w:t xml:space="preserve"> </w:t>
+      </w:r>
+      <w:r>
+        <w:rPr>
+          <w:rStyle w:val="VerbatimChar"/>
+        </w:rPr>
+        <w:t xml:space="preserve">SelfHolderIsAutomatic</w:t>
+      </w:r>
+      <w:r>
+        <w:t xml:space="preserve">,</w:t>
+      </w:r>
+      <w:r>
+        <w:t xml:space="preserve"> </w:t>
+      </w:r>
+      <w:r>
+        <w:rPr>
+          <w:rStyle w:val="VerbatimChar"/>
+        </w:rPr>
+        <w:t xml:space="preserve">CannotDeleteSelfHolder</w:t>
+      </w:r>
+      <w:r>
+        <w:t xml:space="preserve">,</w:t>
+      </w:r>
+      <w:r>
+        <w:t xml:space="preserve"> </w:t>
+      </w:r>
+      <w:r>
+        <w:rPr>
+          <w:rStyle w:val="VerbatimChar"/>
+        </w:rPr>
+        <w:t xml:space="preserve">HolderHasDocuments</w:t>
+      </w:r>
+      <w:r>
+        <w:t xml:space="preserve"> </w:t>
+      </w:r>
+      <w:r>
+        <w:t xml:space="preserve">— all prefixed</w:t>
+      </w:r>
+      <w:r>
+        <w:t xml:space="preserve"> </w:t>
+      </w:r>
+      <w:r>
+        <w:rPr>
+          <w:rStyle w:val="VerbatimChar"/>
+        </w:rPr>
+        <w:t xml:space="preserve">Wathiq.Documents:</w:t>
+      </w:r>
+      <w:r>
+        <w:t xml:space="preserve">.</w:t>
+      </w:r>
+    </w:p>
+    <w:p>
+      <w:pPr>
+        <w:pStyle w:val="BodyText"/>
+      </w:pPr>
+      <w:r>
+        <w:t xml:space="preserve">Live example (</w:t>
+      </w:r>
+      <w:r>
+        <w:rPr>
+          <w:rStyle w:val="VerbatimChar"/>
+        </w:rPr>
+        <w:t xml:space="preserve">Accept-Language: ar</w:t>
+      </w:r>
+      <w:r>
+        <w:t xml:space="preserve">, expiry before issue):</w:t>
+      </w:r>
+    </w:p>
+    <w:p>
+      <w:pPr>
+        <w:pStyle w:val="SourceCode"/>
+      </w:pPr>
+      <w:r>
+        <w:rPr>
+          <w:rStyle w:val="FunctionTok"/>
+        </w:rPr>
+        <w:t xml:space="preserve">{</w:t>
+      </w:r>
+      <w:r>
+        <w:rPr>
+          <w:rStyle w:val="NormalTok"/>
+        </w:rPr>
+        <w:t xml:space="preserve"> </w:t>
+      </w:r>
+      <w:r>
+        <w:rPr>
+          <w:rStyle w:val="DataTypeTok"/>
+        </w:rPr>
+        <w:t xml:space="preserve">"error"</w:t>
+      </w:r>
+      <w:r>
+        <w:rPr>
+          <w:rStyle w:val="FunctionTok"/>
+        </w:rPr>
+        <w:t xml:space="preserve">:</w:t>
+      </w:r>
+      <w:r>
+        <w:rPr>
+          <w:rStyle w:val="NormalTok"/>
+        </w:rPr>
+        <w:t xml:space="preserve"> </w:t>
+      </w:r>
+      <w:r>
+        <w:rPr>
+          <w:rStyle w:val="FunctionTok"/>
+        </w:rPr>
+        <w:t xml:space="preserve">{</w:t>
+      </w:r>
+      <w:r>
+        <w:br/>
+      </w:r>
+      <w:r>
+        <w:rPr>
+          <w:rStyle w:val="NormalTok"/>
+        </w:rPr>
+        <w:t xml:space="preserve">    </w:t>
+      </w:r>
+      <w:r>
+        <w:rPr>
+          <w:rStyle w:val="DataTypeTok"/>
+        </w:rPr>
+        <w:t xml:space="preserve">"code"</w:t>
+      </w:r>
+      <w:r>
+        <w:rPr>
+          <w:rStyle w:val="FunctionTok"/>
+        </w:rPr>
+        <w:t xml:space="preserve">:</w:t>
+      </w:r>
+      <w:r>
+        <w:rPr>
+          <w:rStyle w:val="NormalTok"/>
+        </w:rPr>
+        <w:t xml:space="preserve"> </w:t>
+      </w:r>
+      <w:r>
+        <w:rPr>
+          <w:rStyle w:val="StringTok"/>
+        </w:rPr>
+        <w:t xml:space="preserve">"Wathiq.Documents:ExpiryBeforeIssue"</w:t>
+      </w:r>
+      <w:r>
+        <w:rPr>
+          <w:rStyle w:val="FunctionTok"/>
+        </w:rPr>
+        <w:t xml:space="preserve">,</w:t>
+      </w:r>
+      <w:r>
+        <w:br/>
+      </w:r>
+      <w:r>
+        <w:rPr>
+          <w:rStyle w:val="NormalTok"/>
+        </w:rPr>
+        <w:t xml:space="preserve">    </w:t>
+      </w:r>
+      <w:r>
+        <w:rPr>
+          <w:rStyle w:val="DataTypeTok"/>
+        </w:rPr>
+        <w:t xml:space="preserve">"message"</w:t>
+      </w:r>
+      <w:r>
+        <w:rPr>
+          <w:rStyle w:val="FunctionTok"/>
+        </w:rPr>
+        <w:t xml:space="preserve">:</w:t>
+      </w:r>
+      <w:r>
+        <w:rPr>
+          <w:rStyle w:val="NormalTok"/>
+        </w:rPr>
+        <w:t xml:space="preserve"> </w:t>
+      </w:r>
+      <w:r>
+        <w:rPr>
+          <w:rStyle w:val="StringTok"/>
+        </w:rPr>
+        <w:t xml:space="preserve">"لا يمكن أن يكون تاريخ الانتهاء قبل تاريخ الإصدار."</w:t>
+      </w:r>
+      <w:r>
+        <w:rPr>
+          <w:rStyle w:val="FunctionTok"/>
+        </w:rPr>
+        <w:t xml:space="preserve">,</w:t>
+      </w:r>
+      <w:r>
+        <w:br/>
+      </w:r>
+      <w:r>
+        <w:rPr>
+          <w:rStyle w:val="NormalTok"/>
+        </w:rPr>
+        <w:t xml:space="preserve">    </w:t>
+      </w:r>
+      <w:r>
+        <w:rPr>
+          <w:rStyle w:val="DataTypeTok"/>
+        </w:rPr>
+        <w:t xml:space="preserve">"data"</w:t>
+      </w:r>
+      <w:r>
+        <w:rPr>
+          <w:rStyle w:val="FunctionTok"/>
+        </w:rPr>
+        <w:t xml:space="preserve">:</w:t>
+      </w:r>
+      <w:r>
+        <w:rPr>
+          <w:rStyle w:val="NormalTok"/>
+        </w:rPr>
+        <w:t xml:space="preserve"> </w:t>
+      </w:r>
+      <w:r>
+        <w:rPr>
+          <w:rStyle w:val="FunctionTok"/>
+        </w:rPr>
+        <w:t xml:space="preserve">{</w:t>
+      </w:r>
+      <w:r>
+        <w:rPr>
+          <w:rStyle w:val="NormalTok"/>
+        </w:rPr>
+        <w:t xml:space="preserve"> </w:t>
+      </w:r>
+      <w:r>
+        <w:rPr>
+          <w:rStyle w:val="DataTypeTok"/>
+        </w:rPr>
+        <w:t xml:space="preserve">"IssueDate"</w:t>
+      </w:r>
+      <w:r>
+        <w:rPr>
+          <w:rStyle w:val="FunctionTok"/>
+        </w:rPr>
+        <w:t xml:space="preserve">:</w:t>
+      </w:r>
+      <w:r>
+        <w:rPr>
+          <w:rStyle w:val="NormalTok"/>
+        </w:rPr>
+        <w:t xml:space="preserve"> </w:t>
+      </w:r>
+      <w:r>
+        <w:rPr>
+          <w:rStyle w:val="StringTok"/>
+        </w:rPr>
+        <w:t xml:space="preserve">"2030-01-01"</w:t>
+      </w:r>
+      <w:r>
+        <w:rPr>
+          <w:rStyle w:val="FunctionTok"/>
+        </w:rPr>
+        <w:t xml:space="preserve">,</w:t>
+      </w:r>
+      <w:r>
+        <w:rPr>
+          <w:rStyle w:val="NormalTok"/>
+        </w:rPr>
+        <w:t xml:space="preserve"> </w:t>
+      </w:r>
+      <w:r>
+        <w:rPr>
+          <w:rStyle w:val="DataTypeTok"/>
+        </w:rPr>
+        <w:t xml:space="preserve">"ExpiryDate"</w:t>
+      </w:r>
+      <w:r>
+        <w:rPr>
+          <w:rStyle w:val="FunctionTok"/>
+        </w:rPr>
+        <w:t xml:space="preserve">:</w:t>
+      </w:r>
+      <w:r>
+        <w:rPr>
+          <w:rStyle w:val="NormalTok"/>
+        </w:rPr>
+        <w:t xml:space="preserve"> </w:t>
+      </w:r>
+      <w:r>
+        <w:rPr>
+          <w:rStyle w:val="StringTok"/>
+        </w:rPr>
+        <w:t xml:space="preserve">"2020-01-01"</w:t>
+      </w:r>
+      <w:r>
+        <w:rPr>
+          <w:rStyle w:val="NormalTok"/>
+        </w:rPr>
+        <w:t xml:space="preserve"> </w:t>
+      </w:r>
+      <w:r>
+        <w:rPr>
+          <w:rStyle w:val="FunctionTok"/>
+        </w:rPr>
+        <w:t xml:space="preserve">}</w:t>
+      </w:r>
+      <w:r>
+        <w:rPr>
+          <w:rStyle w:val="NormalTok"/>
+        </w:rPr>
+        <w:t xml:space="preserve"> </w:t>
+      </w:r>
+      <w:r>
+        <w:rPr>
+          <w:rStyle w:val="FunctionTok"/>
+        </w:rPr>
+        <w:t xml:space="preserve">}</w:t>
+      </w:r>
+      <w:r>
+        <w:rPr>
+          <w:rStyle w:val="NormalTok"/>
+        </w:rPr>
+        <w:t xml:space="preserve"> </w:t>
+      </w:r>
+      <w:r>
+        <w:rPr>
+          <w:rStyle w:val="FunctionTok"/>
+        </w:rPr>
+        <w:t xml:space="preserve">}</w:t>
+      </w:r>
+    </w:p>
+    <w:bookmarkEnd w:id="43"/>
+    <w:bookmarkStart w:id="44" w:name="infrastructure-endpoints-abp-built-ins"/>
+    <w:p>
+      <w:pPr>
+        <w:pStyle w:val="Heading1"/>
+      </w:pPr>
+      <w:r>
+        <w:rPr>
+          <w:rStyle w:val="SectionNumber"/>
+        </w:rPr>
         <w:t xml:space="preserve">8</w:t>
       </w:r>
       <w:r>
         <w:tab/>
       </w:r>
       <w:r>
-        <w:t xml:space="preserve">8. Planned</w:t>
+        <w:t xml:space="preserve">8. Infrastructure endpoints (ABP built-ins)</w:t>
+      </w:r>
+    </w:p>
+    <w:p>
+      <w:pPr>
+        <w:pStyle w:val="FirstParagraph"/>
+      </w:pPr>
+      <w:r>
+        <w:t xml:space="preserve">Summarized — full detail is in Swagger. Admin-tagged groups require admin permissions.</w:t>
+      </w:r>
+    </w:p>
+    <w:tbl>
+      <w:tblPr>
+        <w:tblStyle w:val="Table"/>
+        <w:tblW w:type="pct" w:w="5000"/>
+        <w:tblLook w:firstRow="1" w:lastRow="0" w:firstColumn="0" w:lastColumn="0" w:noHBand="0" w:noVBand="0" w:val="0020"/>
+        <w:jc w:val="start"/>
+      </w:tblPr>
+      <w:tblGrid>
+        <w:gridCol w:w="2640"/>
+        <w:gridCol w:w="2640"/>
+        <w:gridCol w:w="2640"/>
+      </w:tblGrid>
+      <w:tr>
+        <w:trPr>
+          <w:tblHeader w:val="true"/>
+        </w:trPr>
+        <w:tc>
+          <w:tcPr/>
+          <w:p>
+            <w:pPr>
+              <w:pStyle w:val="Compact"/>
+              <w:jc w:val="left"/>
+            </w:pPr>
+            <w:r>
+              <w:t xml:space="preserve">Area</w:t>
+            </w:r>
+          </w:p>
+        </w:tc>
+        <w:tc>
+          <w:tcPr/>
+          <w:p>
+            <w:pPr>
+              <w:pStyle w:val="Compact"/>
+              <w:jc w:val="left"/>
+            </w:pPr>
+            <w:r>
+              <w:t xml:space="preserve">Root</w:t>
+            </w:r>
+          </w:p>
+        </w:tc>
+        <w:tc>
+          <w:tcPr/>
+          <w:p>
+            <w:pPr>
+              <w:pStyle w:val="Compact"/>
+              <w:jc w:val="left"/>
+            </w:pPr>
+            <w:r>
+              <w:t xml:space="preserve">Notes</w:t>
+            </w:r>
+          </w:p>
+        </w:tc>
+      </w:tr>
+      <w:tr>
+        <w:tc>
+          <w:tcPr/>
+          <w:p>
+            <w:pPr>
+              <w:pStyle w:val="Compact"/>
+              <w:jc w:val="left"/>
+            </w:pPr>
+            <w:r>
+              <w:t xml:space="preserve">Account</w:t>
+            </w:r>
+          </w:p>
+        </w:tc>
+        <w:tc>
+          <w:tcPr/>
+          <w:p>
+            <w:pPr>
+              <w:pStyle w:val="Compact"/>
+              <w:jc w:val="left"/>
+            </w:pPr>
+            <w:r>
+              <w:rPr>
+                <w:rStyle w:val="VerbatimChar"/>
+              </w:rPr>
+              <w:t xml:space="preserve">/api/account/*</w:t>
+            </w:r>
+          </w:p>
+        </w:tc>
+        <w:tc>
+          <w:tcPr/>
+          <w:p>
+            <w:pPr>
+              <w:pStyle w:val="Compact"/>
+              <w:jc w:val="left"/>
+            </w:pPr>
+            <w:r>
+              <w:t xml:space="preserve">register, login/logout, reset-password, my-profile, change-password</w:t>
+            </w:r>
+          </w:p>
+        </w:tc>
+      </w:tr>
+      <w:tr>
+        <w:tc>
+          <w:tcPr/>
+          <w:p>
+            <w:pPr>
+              <w:pStyle w:val="Compact"/>
+              <w:jc w:val="left"/>
+            </w:pPr>
+            <w:r>
+              <w:t xml:space="preserve">Identity admin</w:t>
+            </w:r>
+          </w:p>
+        </w:tc>
+        <w:tc>
+          <w:tcPr/>
+          <w:p>
+            <w:pPr>
+              <w:pStyle w:val="Compact"/>
+              <w:jc w:val="left"/>
+            </w:pPr>
+            <w:r>
+              <w:rPr>
+                <w:rStyle w:val="VerbatimChar"/>
+              </w:rPr>
+              <w:t xml:space="preserve">/api/identity/users</w:t>
+            </w:r>
+            <w:r>
+              <w:t xml:space="preserve">,</w:t>
+            </w:r>
+            <w:r>
+              <w:t xml:space="preserve"> </w:t>
+            </w:r>
+            <w:r>
+              <w:rPr>
+                <w:rStyle w:val="VerbatimChar"/>
+              </w:rPr>
+              <w:t xml:space="preserve">/api/identity/roles</w:t>
+            </w:r>
+          </w:p>
+        </w:tc>
+        <w:tc>
+          <w:tcPr/>
+          <w:p>
+            <w:pPr>
+              <w:pStyle w:val="Compact"/>
+              <w:jc w:val="left"/>
+            </w:pPr>
+            <w:r>
+              <w:t xml:space="preserve">user/role CRUD (admin)</w:t>
+            </w:r>
+          </w:p>
+        </w:tc>
+      </w:tr>
+      <w:tr>
+        <w:tc>
+          <w:tcPr/>
+          <w:p>
+            <w:pPr>
+              <w:pStyle w:val="Compact"/>
+              <w:jc w:val="left"/>
+            </w:pPr>
+            <w:r>
+              <w:t xml:space="preserve">Permission management</w:t>
+            </w:r>
+          </w:p>
+        </w:tc>
+        <w:tc>
+          <w:tcPr/>
+          <w:p>
+            <w:pPr>
+              <w:pStyle w:val="Compact"/>
+              <w:jc w:val="left"/>
+            </w:pPr>
+            <w:r>
+              <w:rPr>
+                <w:rStyle w:val="VerbatimChar"/>
+              </w:rPr>
+              <w:t xml:space="preserve">/api/permission-management/permissions</w:t>
+            </w:r>
+          </w:p>
+        </w:tc>
+        <w:tc>
+          <w:tcPr/>
+          <w:p>
+            <w:pPr>
+              <w:pStyle w:val="Compact"/>
+              <w:jc w:val="left"/>
+            </w:pPr>
+            <w:r>
+              <w:t xml:space="preserve">read/update grants (admin)</w:t>
+            </w:r>
+          </w:p>
+        </w:tc>
+      </w:tr>
+      <w:tr>
+        <w:tc>
+          <w:tcPr/>
+          <w:p>
+            <w:pPr>
+              <w:pStyle w:val="Compact"/>
+              <w:jc w:val="left"/>
+            </w:pPr>
+            <w:r>
+              <w:t xml:space="preserve">App configuration</w:t>
+            </w:r>
+          </w:p>
+        </w:tc>
+        <w:tc>
+          <w:tcPr/>
+          <w:p>
+            <w:pPr>
+              <w:pStyle w:val="Compact"/>
+              <w:jc w:val="left"/>
+            </w:pPr>
+            <w:r>
+              <w:rPr>
+                <w:rStyle w:val="VerbatimChar"/>
+              </w:rPr>
+              <w:t xml:space="preserve">/api/abp/application-configuration</w:t>
+            </w:r>
+          </w:p>
+        </w:tc>
+        <w:tc>
+          <w:tcPr/>
+          <w:p>
+            <w:pPr>
+              <w:pStyle w:val="Compact"/>
+              <w:jc w:val="left"/>
+            </w:pPr>
+            <w:r>
+              <w:t xml:space="preserve">current user, permissions, localization — the client bootstrap call</w:t>
+            </w:r>
+          </w:p>
+        </w:tc>
+      </w:tr>
+      <w:tr>
+        <w:tc>
+          <w:tcPr/>
+          <w:p>
+            <w:pPr>
+              <w:pStyle w:val="Compact"/>
+              <w:jc w:val="left"/>
+            </w:pPr>
+            <w:r>
+              <w:t xml:space="preserve">Settings</w:t>
+            </w:r>
+          </w:p>
+        </w:tc>
+        <w:tc>
+          <w:tcPr/>
+          <w:p>
+            <w:pPr>
+              <w:pStyle w:val="Compact"/>
+              <w:jc w:val="left"/>
+            </w:pPr>
+            <w:r>
+              <w:rPr>
+                <w:rStyle w:val="VerbatimChar"/>
+              </w:rPr>
+              <w:t xml:space="preserve">/api/setting-management/*</w:t>
+            </w:r>
+          </w:p>
+        </w:tc>
+        <w:tc>
+          <w:tcPr/>
+          <w:p>
+            <w:pPr>
+              <w:pStyle w:val="Compact"/>
+              <w:jc w:val="left"/>
+            </w:pPr>
+            <w:r>
+              <w:t xml:space="preserve">emailing, timezone (admin)</w:t>
+            </w:r>
+          </w:p>
+        </w:tc>
+      </w:tr>
+    </w:tbl>
+    <w:bookmarkEnd w:id="44"/>
+    <w:bookmarkStart w:id="45" w:name="planned"/>
+    <w:p>
+      <w:pPr>
+        <w:pStyle w:val="Heading1"/>
+      </w:pPr>
+      <w:r>
+        <w:rPr>
+          <w:rStyle w:val="SectionNumber"/>
+        </w:rPr>
+        <w:t xml:space="preserve">9</w:t>
+      </w:r>
+      <w:r>
+        <w:tab/>
+      </w:r>
+      <w:r>
+        <w:t xml:space="preserve">9. Planned</w:t>
       </w:r>
     </w:p>
     <w:tbl>
@@ -7380,40 +8494,28 @@
               <w:jc w:val="left"/>
             </w:pPr>
             <w:r>
-              <w:t xml:space="preserve">Guides + chat endpoints (</w:t>
-            </w:r>
-            <w:r>
-              <w:rPr>
-                <w:rStyle w:val="VerbatimChar"/>
-              </w:rPr>
-              <w:t xml:space="preserve">/api/guides/*</w:t>
-            </w:r>
-            <w:r>
-              <w:t xml:space="preserve">,</w:t>
-            </w:r>
-            <w:r>
-              <w:t xml:space="preserve"> </w:t>
-            </w:r>
-            <w:r>
-              <w:rPr>
-                <w:rStyle w:val="VerbatimChar"/>
-              </w:rPr>
-              <w:t xml:space="preserve">/api/ai/*</w:t>
-            </w:r>
-            <w:r>
-              <w:t xml:space="preserve">)</w:t>
-            </w:r>
-          </w:p>
-        </w:tc>
-        <w:tc>
-          <w:tcPr/>
-          <w:p>
-            <w:pPr>
-              <w:pStyle w:val="Compact"/>
-              <w:jc w:val="left"/>
-            </w:pPr>
-            <w:r>
-              <w:t xml:space="preserve">3–5</w:t>
+              <w:t xml:space="preserve">Guides grounded-chat endpoint (</w:t>
+            </w:r>
+            <w:r>
+              <w:rPr>
+                <w:rStyle w:val="VerbatimChar"/>
+              </w:rPr>
+              <w:t xml:space="preserve">/api/guides/chat</w:t>
+            </w:r>
+            <w:r>
+              <w:t xml:space="preserve">) + feedback</w:t>
+            </w:r>
+          </w:p>
+        </w:tc>
+        <w:tc>
+          <w:tcPr/>
+          <w:p>
+            <w:pPr>
+              <w:pStyle w:val="Compact"/>
+              <w:jc w:val="left"/>
+            </w:pPr>
+            <w:r>
+              <w:t xml:space="preserve">5</w:t>
             </w:r>
           </w:p>
         </w:tc>
@@ -7445,7 +8547,7 @@
         </w:tc>
       </w:tr>
     </w:tbl>
-    <w:bookmarkEnd w:id="42"/>
+    <w:bookmarkEnd w:id="45"/>
     <w:sectPr>
       <w:footnotePr>
         <w:numRestart w:val="eachSect"/>

</xml_diff>

<commit_message>
step(5.3): chunk and embed guide versions on publish via a background job
Learned: chunking strategies (heading-aware, overlap, dedicated facts/steps chunks), embeddings as storage (explicit endianness, exact column width, model provenance), IEmbeddingGenerator behind the module wall with a boot guard, post-commit enqueue fourth lap, delete-and-rebuild idempotency, manual replay lever for one-shot events

Co-Authored-By: Claude Fable 5 <noreply@anthropic.com>
Claude-Session: https://claude.ai/code/session_01XCaaD2oSfQhWv3vNENZDue
</commit_message>
<xml_diff>
--- a/docs/deliverables/out/Api.docx
+++ b/docs/deliverables/out/Api.docx
@@ -492,6 +492,56 @@
           </w:p>
         </w:tc>
       </w:tr>
+      <w:tr>
+        <w:tc>
+          <w:tcPr/>
+          <w:p>
+            <w:pPr>
+              <w:pStyle w:val="Compact"/>
+              <w:jc w:val="left"/>
+            </w:pPr>
+            <w:r>
+              <w:t xml:space="preserve">0.1.6</w:t>
+            </w:r>
+          </w:p>
+        </w:tc>
+        <w:tc>
+          <w:tcPr/>
+          <w:p>
+            <w:pPr>
+              <w:pStyle w:val="Compact"/>
+              <w:jc w:val="left"/>
+            </w:pPr>
+            <w:r>
+              <w:t xml:space="preserve">2026-09-03</w:t>
+            </w:r>
+          </w:p>
+        </w:tc>
+        <w:tc>
+          <w:tcPr/>
+          <w:p>
+            <w:pPr>
+              <w:pStyle w:val="Compact"/>
+              <w:jc w:val="left"/>
+            </w:pPr>
+            <w:r>
+              <w:t xml:space="preserve">Abdulsalam</w:t>
+            </w:r>
+          </w:p>
+        </w:tc>
+        <w:tc>
+          <w:tcPr/>
+          <w:p>
+            <w:pPr>
+              <w:pStyle w:val="Compact"/>
+              <w:jc w:val="left"/>
+            </w:pPr>
+            <w:r>
+              <w:t xml:space="preserve">§6.2 rebuild-embeddings endpoint (seeded/pre-pipeline versions, model swaps) (roadmap step 5.3)</w:t>
+            </w:r>
+          </w:p>
+        </w:tc>
+      </w:tr>
     </w:tbl>
     <w:p>
       <w:pPr>
@@ -7193,7 +7243,7 @@
               <w:t xml:space="preserve">publishedAt</w:t>
             </w:r>
             <w:r>
-              <w:t xml:space="preserve">, points the guide at this version. Repeat →</w:t>
+              <w:t xml:space="preserve">, points the guide at this version, and enqueues chunking+embedding. Repeat →</w:t>
             </w:r>
             <w:r>
               <w:t xml:space="preserve"> </w:t>
@@ -7203,6 +7253,75 @@
                 <w:rStyle w:val="VerbatimChar"/>
               </w:rPr>
               <w:t xml:space="preserve">Wathiq.Guides:VersionAlreadyPublished</w:t>
+            </w:r>
+          </w:p>
+        </w:tc>
+      </w:tr>
+      <w:tr>
+        <w:tc>
+          <w:tcPr/>
+          <w:p>
+            <w:pPr>
+              <w:pStyle w:val="Compact"/>
+              <w:jc w:val="left"/>
+            </w:pPr>
+            <w:r>
+              <w:rPr>
+                <w:rStyle w:val="VerbatimChar"/>
+              </w:rPr>
+              <w:t xml:space="preserve">POST /api/guides/guide-admin/{id}/rebuild-embeddings</w:t>
+            </w:r>
+          </w:p>
+        </w:tc>
+        <w:tc>
+          <w:tcPr/>
+          <w:p>
+            <w:pPr>
+              <w:pStyle w:val="Compact"/>
+              <w:jc w:val="left"/>
+            </w:pPr>
+            <w:r>
+              <w:rPr>
+                <w:rStyle w:val="VerbatimChar"/>
+              </w:rPr>
+              <w:t xml:space="preserve">WathiqGuides.Manage</w:t>
+            </w:r>
+          </w:p>
+        </w:tc>
+        <w:tc>
+          <w:tcPr/>
+          <w:p>
+            <w:pPr>
+              <w:pStyle w:val="Compact"/>
+              <w:jc w:val="left"/>
+            </w:pPr>
+            <w:r>
+              <w:t xml:space="preserve">Re-enqueue chunking+embedding for a</w:t>
+            </w:r>
+            <w:r>
+              <w:t xml:space="preserve"> </w:t>
+            </w:r>
+            <w:r>
+              <w:rPr>
+                <w:bCs/>
+                <w:b/>
+              </w:rPr>
+              <w:t xml:space="preserve">published</w:t>
+            </w:r>
+            <w:r>
+              <w:t xml:space="preserve"> </w:t>
+            </w:r>
+            <w:r>
+              <w:t xml:space="preserve">version (content published before the pipeline, or after an embedding-model change). Draft →</w:t>
+            </w:r>
+            <w:r>
+              <w:t xml:space="preserve"> </w:t>
+            </w:r>
+            <w:r>
+              <w:rPr>
+                <w:rStyle w:val="VerbatimChar"/>
+              </w:rPr>
+              <w:t xml:space="preserve">Wathiq.Guides:VersionNotPublished</w:t>
             </w:r>
           </w:p>
         </w:tc>

</xml_diff>

<commit_message>
step(5.5): answer guide questions grounded in retrieved chunks with validated citations
Learned: grounding prompts as versioned contracts, citation validation against the retrieved set, labels as an isolation boundary between model and ids, refusal as a feature with three converging paths, corpus-before-model ordering, the Shared-seam pattern replayed for RAG

Co-Authored-By: Claude Fable 5 <noreply@anthropic.com>
Claude-Session: https://claude.ai/code/session_01XCaaD2oSfQhWv3vNENZDue
</commit_message>
<xml_diff>
--- a/docs/deliverables/out/Api.docx
+++ b/docs/deliverables/out/Api.docx
@@ -542,6 +542,56 @@
           </w:p>
         </w:tc>
       </w:tr>
+      <w:tr>
+        <w:tc>
+          <w:tcPr/>
+          <w:p>
+            <w:pPr>
+              <w:pStyle w:val="Compact"/>
+              <w:jc w:val="left"/>
+            </w:pPr>
+            <w:r>
+              <w:t xml:space="preserve">0.1.7</w:t>
+            </w:r>
+          </w:p>
+        </w:tc>
+        <w:tc>
+          <w:tcPr/>
+          <w:p>
+            <w:pPr>
+              <w:pStyle w:val="Compact"/>
+              <w:jc w:val="left"/>
+            </w:pPr>
+            <w:r>
+              <w:t xml:space="preserve">2026-09-03</w:t>
+            </w:r>
+          </w:p>
+        </w:tc>
+        <w:tc>
+          <w:tcPr/>
+          <w:p>
+            <w:pPr>
+              <w:pStyle w:val="Compact"/>
+              <w:jc w:val="left"/>
+            </w:pPr>
+            <w:r>
+              <w:t xml:space="preserve">Abdulsalam</w:t>
+            </w:r>
+          </w:p>
+        </w:tc>
+        <w:tc>
+          <w:tcPr/>
+          <w:p>
+            <w:pPr>
+              <w:pStyle w:val="Compact"/>
+              <w:jc w:val="left"/>
+            </w:pPr>
+            <w:r>
+              <w:t xml:space="preserve">§6.3 grounded chat endpoint: validated citations, honest refusal, freshness on every answer; live refusal example (roadmap step 5.5)</w:t>
+            </w:r>
+          </w:p>
+        </w:tc>
+      </w:tr>
     </w:tbl>
     <w:p>
       <w:pPr>
@@ -6400,7 +6450,7 @@
       </w:r>
     </w:p>
     <w:bookmarkEnd w:id="39"/>
-    <w:bookmarkStart w:id="42" w:name="guides-module-endpoints"/>
+    <w:bookmarkStart w:id="43" w:name="guides-module-endpoints"/>
     <w:p>
       <w:pPr>
         <w:pStyle w:val="Heading1"/>
@@ -7418,43 +7468,22 @@
       </w:r>
     </w:p>
     <w:bookmarkEnd w:id="41"/>
-    <w:bookmarkEnd w:id="42"/>
-    <w:bookmarkStart w:id="43" w:name="error-model"/>
+    <w:bookmarkStart w:id="42" w:name="grounded-chat-fr-gde-004-fr-ai-003"/>
     <w:p>
       <w:pPr>
-        <w:pStyle w:val="Heading1"/>
+        <w:pStyle w:val="Heading2"/>
       </w:pPr>
       <w:r>
         <w:rPr>
           <w:rStyle w:val="SectionNumber"/>
         </w:rPr>
-        <w:t xml:space="preserve">7</w:t>
+        <w:t xml:space="preserve">6.3</w:t>
       </w:r>
       <w:r>
         <w:tab/>
       </w:r>
       <w:r>
-        <w:t xml:space="preserve">7. Error model</w:t>
-      </w:r>
-    </w:p>
-    <w:p>
-      <w:pPr>
-        <w:pStyle w:val="FirstParagraph"/>
-      </w:pPr>
-      <w:r>
-        <w:t xml:space="preserve">Every error is the ABP envelope</w:t>
-      </w:r>
-      <w:r>
-        <w:t xml:space="preserve"> </w:t>
-      </w:r>
-      <w:r>
-        <w:rPr>
-          <w:rStyle w:val="VerbatimChar"/>
-        </w:rPr>
-        <w:t xml:space="preserve">{ "error": { code, message, details, data, validationErrors } }</w:t>
-      </w:r>
-      <w:r>
-        <w:t xml:space="preserve">.</w:t>
+        <w:t xml:space="preserve">6.3 Grounded chat (FR-GDE-004, FR-AI-003)</w:t>
       </w:r>
     </w:p>
     <w:tbl>
@@ -7481,40 +7510,31 @@
               <w:jc w:val="left"/>
             </w:pPr>
             <w:r>
-              <w:t xml:space="preserve">HTTP</w:t>
-            </w:r>
-          </w:p>
-        </w:tc>
-        <w:tc>
-          <w:tcPr/>
-          <w:p>
-            <w:pPr>
-              <w:pStyle w:val="Compact"/>
-              <w:jc w:val="left"/>
-            </w:pPr>
-            <w:r>
-              <w:t xml:space="preserve">When</w:t>
-            </w:r>
-          </w:p>
-        </w:tc>
-        <w:tc>
-          <w:tcPr/>
-          <w:p>
-            <w:pPr>
-              <w:pStyle w:val="Compact"/>
-              <w:jc w:val="left"/>
-            </w:pPr>
-            <w:r>
-              <w:rPr>
-                <w:rStyle w:val="VerbatimChar"/>
-              </w:rPr>
-              <w:t xml:space="preserve">error.code</w:t>
-            </w:r>
-            <w:r>
-              <w:t xml:space="preserve"> </w:t>
-            </w:r>
-            <w:r>
-              <w:t xml:space="preserve">example</w:t>
+              <w:t xml:space="preserve">Method &amp; path</w:t>
+            </w:r>
+          </w:p>
+        </w:tc>
+        <w:tc>
+          <w:tcPr/>
+          <w:p>
+            <w:pPr>
+              <w:pStyle w:val="Compact"/>
+              <w:jc w:val="left"/>
+            </w:pPr>
+            <w:r>
+              <w:t xml:space="preserve">Permission</w:t>
+            </w:r>
+          </w:p>
+        </w:tc>
+        <w:tc>
+          <w:tcPr/>
+          <w:p>
+            <w:pPr>
+              <w:pStyle w:val="Compact"/>
+              <w:jc w:val="left"/>
+            </w:pPr>
+            <w:r>
+              <w:t xml:space="preserve">Description</w:t>
             </w:r>
           </w:p>
         </w:tc>
@@ -7528,173 +7548,53 @@
               <w:jc w:val="left"/>
             </w:pPr>
             <w:r>
-              <w:t xml:space="preserve">400</w:t>
-            </w:r>
-          </w:p>
-        </w:tc>
-        <w:tc>
-          <w:tcPr/>
-          <w:p>
-            <w:pPr>
-              <w:pStyle w:val="Compact"/>
-              <w:jc w:val="left"/>
-            </w:pPr>
-            <w:r>
-              <w:t xml:space="preserve">DTO validation (missing/too long fields) —</w:t>
+              <w:rPr>
+                <w:rStyle w:val="VerbatimChar"/>
+              </w:rPr>
+              <w:t xml:space="preserve">POST /api/guides/chat/ask</w:t>
+            </w:r>
+          </w:p>
+        </w:tc>
+        <w:tc>
+          <w:tcPr/>
+          <w:p>
+            <w:pPr>
+              <w:pStyle w:val="Compact"/>
+              <w:jc w:val="left"/>
+            </w:pPr>
+            <w:r>
+              <w:rPr>
+                <w:iCs/>
+                <w:i/>
+              </w:rPr>
+              <w:t xml:space="preserve">authenticated</w:t>
             </w:r>
             <w:r>
               <w:t xml:space="preserve"> </w:t>
             </w:r>
             <w:r>
-              <w:rPr>
-                <w:rStyle w:val="VerbatimChar"/>
-              </w:rPr>
-              <w:t xml:space="preserve">validationErrors</w:t>
+              <w:t xml:space="preserve">(any user)</w:t>
+            </w:r>
+          </w:p>
+        </w:tc>
+        <w:tc>
+          <w:tcPr/>
+          <w:p>
+            <w:pPr>
+              <w:pStyle w:val="Compact"/>
+              <w:jc w:val="left"/>
+            </w:pPr>
+            <w:r>
+              <w:rPr>
+                <w:rStyle w:val="VerbatimChar"/>
+              </w:rPr>
+              <w:t xml:space="preserve">{question}</w:t>
             </w:r>
             <w:r>
               <w:t xml:space="preserve"> </w:t>
             </w:r>
             <w:r>
-              <w:t xml:space="preserve">lists each field</w:t>
-            </w:r>
-          </w:p>
-        </w:tc>
-        <w:tc>
-          <w:tcPr/>
-          <w:p>
-            <w:pPr>
-              <w:pStyle w:val="Compact"/>
-              <w:jc w:val="left"/>
-            </w:pPr>
-            <w:r>
-              <w:t xml:space="preserve">—</w:t>
-            </w:r>
-          </w:p>
-        </w:tc>
-      </w:tr>
-      <w:tr>
-        <w:tc>
-          <w:tcPr/>
-          <w:p>
-            <w:pPr>
-              <w:pStyle w:val="Compact"/>
-              <w:jc w:val="left"/>
-            </w:pPr>
-            <w:r>
-              <w:t xml:space="preserve">401</w:t>
-            </w:r>
-          </w:p>
-        </w:tc>
-        <w:tc>
-          <w:tcPr/>
-          <w:p>
-            <w:pPr>
-              <w:pStyle w:val="Compact"/>
-              <w:jc w:val="left"/>
-            </w:pPr>
-            <w:r>
-              <w:t xml:space="preserve">Missing/invalid token (JSON clients)</w:t>
-            </w:r>
-          </w:p>
-        </w:tc>
-        <w:tc>
-          <w:tcPr/>
-          <w:p>
-            <w:pPr>
-              <w:pStyle w:val="Compact"/>
-              <w:jc w:val="left"/>
-            </w:pPr>
-            <w:r>
-              <w:t xml:space="preserve">—</w:t>
-            </w:r>
-          </w:p>
-        </w:tc>
-      </w:tr>
-      <w:tr>
-        <w:tc>
-          <w:tcPr/>
-          <w:p>
-            <w:pPr>
-              <w:pStyle w:val="Compact"/>
-              <w:jc w:val="left"/>
-            </w:pPr>
-            <w:r>
-              <w:t xml:space="preserve">403</w:t>
-            </w:r>
-          </w:p>
-        </w:tc>
-        <w:tc>
-          <w:tcPr/>
-          <w:p>
-            <w:pPr>
-              <w:pStyle w:val="Compact"/>
-              <w:jc w:val="left"/>
-            </w:pPr>
-            <w:r>
-              <w:t xml:space="preserve">Permission denied, or a business rule rejected the request</w:t>
-            </w:r>
-          </w:p>
-        </w:tc>
-        <w:tc>
-          <w:tcPr/>
-          <w:p>
-            <w:pPr>
-              <w:pStyle w:val="Compact"/>
-              <w:jc w:val="left"/>
-            </w:pPr>
-            <w:r>
-              <w:rPr>
-                <w:rStyle w:val="VerbatimChar"/>
-              </w:rPr>
-              <w:t xml:space="preserve">Wathiq.Documents:ExpiryBeforeIssue</w:t>
-            </w:r>
-          </w:p>
-        </w:tc>
-      </w:tr>
-      <w:tr>
-        <w:tc>
-          <w:tcPr/>
-          <w:p>
-            <w:pPr>
-              <w:pStyle w:val="Compact"/>
-              <w:jc w:val="left"/>
-            </w:pPr>
-            <w:r>
-              <w:t xml:space="preserve">404</w:t>
-            </w:r>
-          </w:p>
-        </w:tc>
-        <w:tc>
-          <w:tcPr/>
-          <w:p>
-            <w:pPr>
-              <w:pStyle w:val="Compact"/>
-              <w:jc w:val="left"/>
-            </w:pPr>
-            <w:r>
-              <w:t xml:space="preserve">Row doesn’t exist</w:t>
-            </w:r>
-            <w:r>
-              <w:t xml:space="preserve"> </w:t>
-            </w:r>
-            <w:r>
-              <w:rPr>
-                <w:bCs/>
-                <w:b/>
-              </w:rPr>
-              <w:t xml:space="preserve">or belongs to another user</w:t>
-            </w:r>
-          </w:p>
-        </w:tc>
-        <w:tc>
-          <w:tcPr/>
-          <w:p>
-            <w:pPr>
-              <w:pStyle w:val="Compact"/>
-              <w:jc w:val="left"/>
-            </w:pPr>
-            <w:r>
-              <w:t xml:space="preserve">—</w:t>
+              <w:t xml:space="preserve">(≤512 chars) → a grounded answer or an honest refusal</w:t>
             </w:r>
           </w:p>
         </w:tc>
@@ -7705,133 +7605,56 @@
         <w:pStyle w:val="BodyText"/>
       </w:pPr>
       <w:r>
-        <w:t xml:space="preserve">Reminders business codes:</w:t>
-      </w:r>
-      <w:r>
-        <w:t xml:space="preserve"> </w:t>
-      </w:r>
-      <w:r>
-        <w:rPr>
-          <w:rStyle w:val="VerbatimChar"/>
-        </w:rPr>
-        <w:t xml:space="preserve">InvalidOffsets</w:t>
-      </w:r>
-      <w:r>
-        <w:t xml:space="preserve">,</w:t>
-      </w:r>
-      <w:r>
-        <w:t xml:space="preserve"> </w:t>
-      </w:r>
-      <w:r>
-        <w:rPr>
-          <w:rStyle w:val="VerbatimChar"/>
-        </w:rPr>
-        <w:t xml:space="preserve">QuietHoursIncomplete</w:t>
-      </w:r>
-      <w:r>
-        <w:t xml:space="preserve">,</w:t>
-      </w:r>
-      <w:r>
-        <w:t xml:space="preserve"> </w:t>
-      </w:r>
-      <w:r>
-        <w:rPr>
-          <w:rStyle w:val="VerbatimChar"/>
-        </w:rPr>
-        <w:t xml:space="preserve">UnknownTimeZone</w:t>
-      </w:r>
-      <w:r>
-        <w:t xml:space="preserve">,</w:t>
-      </w:r>
-      <w:r>
-        <w:t xml:space="preserve"> </w:t>
-      </w:r>
-      <w:r>
-        <w:rPr>
-          <w:rStyle w:val="VerbatimChar"/>
-        </w:rPr>
-        <w:t xml:space="preserve">NoEmailAddress</w:t>
-      </w:r>
-      <w:r>
-        <w:t xml:space="preserve"> </w:t>
-      </w:r>
-      <w:r>
-        <w:t xml:space="preserve">— prefixed</w:t>
-      </w:r>
-      <w:r>
-        <w:t xml:space="preserve"> </w:t>
-      </w:r>
-      <w:r>
-        <w:rPr>
-          <w:rStyle w:val="VerbatimChar"/>
-        </w:rPr>
-        <w:t xml:space="preserve">Wathiq.Reminders:</w:t>
-      </w:r>
-      <w:r>
-        <w:t xml:space="preserve">. Guides business codes:</w:t>
-      </w:r>
-      <w:r>
-        <w:t xml:space="preserve"> </w:t>
-      </w:r>
-      <w:r>
-        <w:rPr>
-          <w:rStyle w:val="VerbatimChar"/>
-        </w:rPr>
-        <w:t xml:space="preserve">SlugAlreadyExists</w:t>
-      </w:r>
-      <w:r>
-        <w:t xml:space="preserve">,</w:t>
-      </w:r>
-      <w:r>
-        <w:t xml:space="preserve"> </w:t>
-      </w:r>
-      <w:r>
-        <w:rPr>
-          <w:rStyle w:val="VerbatimChar"/>
-        </w:rPr>
-        <w:t xml:space="preserve">PublishedVersionIsImmutable</w:t>
-      </w:r>
-      <w:r>
-        <w:t xml:space="preserve">,</w:t>
-      </w:r>
-      <w:r>
-        <w:t xml:space="preserve"> </w:t>
-      </w:r>
-      <w:r>
-        <w:rPr>
-          <w:rStyle w:val="VerbatimChar"/>
-        </w:rPr>
-        <w:t xml:space="preserve">VersionAlreadyPublished</w:t>
-      </w:r>
-      <w:r>
-        <w:t xml:space="preserve">,</w:t>
-      </w:r>
-      <w:r>
-        <w:t xml:space="preserve"> </w:t>
-      </w:r>
-      <w:r>
-        <w:rPr>
-          <w:rStyle w:val="VerbatimChar"/>
-        </w:rPr>
-        <w:t xml:space="preserve">GuideNotPublished</w:t>
-      </w:r>
-      <w:r>
-        <w:t xml:space="preserve"> </w:t>
-      </w:r>
-      <w:r>
-        <w:t xml:space="preserve">— prefixed</w:t>
-      </w:r>
-      <w:r>
-        <w:t xml:space="preserve"> </w:t>
-      </w:r>
-      <w:r>
-        <w:rPr>
-          <w:rStyle w:val="VerbatimChar"/>
-        </w:rPr>
-        <w:t xml:space="preserve">Wathiq.Guides:</w:t>
-      </w:r>
-      <w:r>
-        <w:t xml:space="preserve">.</w:t>
+        <w:t xml:space="preserve">Chat needs a</w:t>
+      </w:r>
+      <w:r>
+        <w:t xml:space="preserve"> </w:t>
+      </w:r>
+      <w:r>
+        <w:rPr>
+          <w:bCs/>
+          <w:b/>
+        </w:rPr>
+        <w:t xml:space="preserve">sign-in but no special grant</w:t>
+      </w:r>
+      <w:r>
+        <w:t xml:space="preserve">: reading guides stays anonymous, but chat spends</w:t>
+      </w:r>
+      <w:r>
+        <w:t xml:space="preserve"> </w:t>
+      </w:r>
+      <w:r>
+        <w:t xml:space="preserve">model time under the per-user daily cap (FR-AI-004, purpose</w:t>
+      </w:r>
+      <w:r>
+        <w:t xml:space="preserve"> </w:t>
+      </w:r>
+      <w:r>
+        <w:rPr>
+          <w:rStyle w:val="VerbatimChar"/>
+        </w:rPr>
+        <w:t xml:space="preserve">GuideChat</w:t>
+      </w:r>
+      <w:r>
+        <w:t xml:space="preserve"> </w:t>
+      </w:r>
+      <w:r>
+        <w:t xml:space="preserve">in the</w:t>
+      </w:r>
+      <w:r>
+        <w:t xml:space="preserve"> </w:t>
+      </w:r>
+      <w:r>
+        <w:rPr>
+          <w:rStyle w:val="VerbatimChar"/>
+        </w:rPr>
+        <w:t xml:space="preserve">ai.Usage</w:t>
+      </w:r>
+      <w:r>
+        <w:t xml:space="preserve"> </w:t>
+      </w:r>
+      <w:r>
+        <w:t xml:space="preserve">ledger), and a cap needs an identity.</w:t>
       </w:r>
     </w:p>
     <w:p>
@@ -7839,28 +7662,76 @@
         <w:pStyle w:val="BodyText"/>
       </w:pPr>
       <w:r>
-        <w:t xml:space="preserve">Business error codes of the Documents module (message localized via</w:t>
-      </w:r>
-      <w:r>
-        <w:t xml:space="preserve"> </w:t>
-      </w:r>
-      <w:r>
-        <w:rPr>
-          <w:rStyle w:val="VerbatimChar"/>
-        </w:rPr>
-        <w:t xml:space="preserve">Accept-Language</w:t>
+        <w:t xml:space="preserve">The response contract (</w:t>
+      </w:r>
+      <w:r>
+        <w:rPr>
+          <w:rStyle w:val="VerbatimChar"/>
+        </w:rPr>
+        <w:t xml:space="preserve">GuideChatResponseDto</w:t>
       </w:r>
       <w:r>
         <w:t xml:space="preserve">):</w:t>
       </w:r>
-      <w:r>
-        <w:t xml:space="preserve"> </w:t>
-      </w:r>
-      <w:r>
-        <w:rPr>
-          <w:rStyle w:val="VerbatimChar"/>
-        </w:rPr>
-        <w:t xml:space="preserve">ExpiryBeforeIssue</w:t>
+    </w:p>
+    <w:p>
+      <w:pPr>
+        <w:numPr>
+          <w:ilvl w:val="0"/>
+          <w:numId w:val="1003"/>
+        </w:numPr>
+        <w:pStyle w:val="Compact"/>
+      </w:pPr>
+      <w:r>
+        <w:rPr>
+          <w:rStyle w:val="VerbatimChar"/>
+        </w:rPr>
+        <w:t xml:space="preserve">answered: true</w:t>
+      </w:r>
+      <w:r>
+        <w:t xml:space="preserve"> </w:t>
+      </w:r>
+      <w:r>
+        <w:t xml:space="preserve">→</w:t>
+      </w:r>
+      <w:r>
+        <w:t xml:space="preserve"> </w:t>
+      </w:r>
+      <w:r>
+        <w:rPr>
+          <w:rStyle w:val="VerbatimChar"/>
+        </w:rPr>
+        <w:t xml:space="preserve">answer</w:t>
+      </w:r>
+      <w:r>
+        <w:t xml:space="preserve"> </w:t>
+      </w:r>
+      <w:r>
+        <w:t xml:space="preserve">plus</w:t>
+      </w:r>
+      <w:r>
+        <w:t xml:space="preserve"> </w:t>
+      </w:r>
+      <w:r>
+        <w:rPr>
+          <w:rStyle w:val="VerbatimChar"/>
+        </w:rPr>
+        <w:t xml:space="preserve">citations[]</w:t>
+      </w:r>
+      <w:r>
+        <w:t xml:space="preserve"> </w:t>
+      </w:r>
+      <w:r>
+        <w:t xml:space="preserve">— each citation carries</w:t>
+      </w:r>
+      <w:r>
+        <w:t xml:space="preserve"> </w:t>
+      </w:r>
+      <w:r>
+        <w:rPr>
+          <w:rStyle w:val="VerbatimChar"/>
+        </w:rPr>
+        <w:t xml:space="preserve">chunkId</w:t>
       </w:r>
       <w:r>
         <w:t xml:space="preserve">,</w:t>
@@ -7872,73 +7743,257 @@
         <w:rPr>
           <w:rStyle w:val="VerbatimChar"/>
         </w:rPr>
-        <w:t xml:space="preserve">HolderNotOwned</w:t>
-      </w:r>
-      <w:r>
-        <w:t xml:space="preserve">,</w:t>
-      </w:r>
-      <w:r>
-        <w:t xml:space="preserve"> </w:t>
-      </w:r>
-      <w:r>
-        <w:rPr>
-          <w:rStyle w:val="VerbatimChar"/>
-        </w:rPr>
-        <w:t xml:space="preserve">DocumentTypeNotActive</w:t>
-      </w:r>
-      <w:r>
-        <w:t xml:space="preserve">,</w:t>
-      </w:r>
-      <w:r>
-        <w:t xml:space="preserve"> </w:t>
-      </w:r>
-      <w:r>
-        <w:rPr>
-          <w:rStyle w:val="VerbatimChar"/>
-        </w:rPr>
-        <w:t xml:space="preserve">SelfHolderIsAutomatic</w:t>
-      </w:r>
-      <w:r>
-        <w:t xml:space="preserve">,</w:t>
-      </w:r>
-      <w:r>
-        <w:t xml:space="preserve"> </w:t>
-      </w:r>
-      <w:r>
-        <w:rPr>
-          <w:rStyle w:val="VerbatimChar"/>
-        </w:rPr>
-        <w:t xml:space="preserve">CannotDeleteSelfHolder</w:t>
-      </w:r>
-      <w:r>
-        <w:t xml:space="preserve">,</w:t>
-      </w:r>
-      <w:r>
-        <w:t xml:space="preserve"> </w:t>
-      </w:r>
-      <w:r>
-        <w:rPr>
-          <w:rStyle w:val="VerbatimChar"/>
-        </w:rPr>
-        <w:t xml:space="preserve">HolderHasDocuments</w:t>
-      </w:r>
-      <w:r>
-        <w:t xml:space="preserve"> </w:t>
-      </w:r>
-      <w:r>
-        <w:t xml:space="preserve">— all prefixed</w:t>
-      </w:r>
-      <w:r>
-        <w:t xml:space="preserve"> </w:t>
-      </w:r>
-      <w:r>
-        <w:rPr>
-          <w:rStyle w:val="VerbatimChar"/>
-        </w:rPr>
-        <w:t xml:space="preserve">Wathiq.Documents:</w:t>
-      </w:r>
-      <w:r>
-        <w:t xml:space="preserve">.</w:t>
+        <w:t xml:space="preserve">guideVersionId</w:t>
+      </w:r>
+      <w:r>
+        <w:t xml:space="preserve"> </w:t>
+      </w:r>
+      <w:r>
+        <w:t xml:space="preserve">(the immutable anchor),</w:t>
+      </w:r>
+      <w:r>
+        <w:t xml:space="preserve"> </w:t>
+      </w:r>
+      <w:r>
+        <w:rPr>
+          <w:rStyle w:val="VerbatimChar"/>
+        </w:rPr>
+        <w:t xml:space="preserve">guideSlug</w:t>
+      </w:r>
+      <w:r>
+        <w:t xml:space="preserve">, both titles, a</w:t>
+      </w:r>
+      <w:r>
+        <w:t xml:space="preserve"> </w:t>
+      </w:r>
+      <w:r>
+        <w:rPr>
+          <w:rStyle w:val="VerbatimChar"/>
+        </w:rPr>
+        <w:t xml:space="preserve">snippet</w:t>
+      </w:r>
+      <w:r>
+        <w:t xml:space="preserve"> </w:t>
+      </w:r>
+      <w:r>
+        <w:t xml:space="preserve">and that</w:t>
+      </w:r>
+      <w:r>
+        <w:t xml:space="preserve"> </w:t>
+      </w:r>
+      <w:r>
+        <w:t xml:space="preserve">source’s</w:t>
+      </w:r>
+      <w:r>
+        <w:t xml:space="preserve"> </w:t>
+      </w:r>
+      <w:r>
+        <w:rPr>
+          <w:rStyle w:val="VerbatimChar"/>
+        </w:rPr>
+        <w:t xml:space="preserve">lastVerifiedAt</w:t>
+      </w:r>
+      <w:r>
+        <w:t xml:space="preserve">; the top-level</w:t>
+      </w:r>
+      <w:r>
+        <w:t xml:space="preserve"> </w:t>
+      </w:r>
+      <w:r>
+        <w:rPr>
+          <w:rStyle w:val="VerbatimChar"/>
+        </w:rPr>
+        <w:t xml:space="preserve">lastVerifiedAt</w:t>
+      </w:r>
+      <w:r>
+        <w:t xml:space="preserve"> </w:t>
+      </w:r>
+      <w:r>
+        <w:t xml:space="preserve">is the</w:t>
+      </w:r>
+      <w:r>
+        <w:t xml:space="preserve"> </w:t>
+      </w:r>
+      <w:r>
+        <w:rPr>
+          <w:bCs/>
+          <w:b/>
+        </w:rPr>
+        <w:t xml:space="preserve">oldest</w:t>
+      </w:r>
+      <w:r>
+        <w:t xml:space="preserve"> </w:t>
+      </w:r>
+      <w:r>
+        <w:t xml:space="preserve">cited source</w:t>
+      </w:r>
+      <w:r>
+        <w:t xml:space="preserve"> </w:t>
+      </w:r>
+      <w:r>
+        <w:t xml:space="preserve">(conservative freshness, Vision R2).</w:t>
+      </w:r>
+    </w:p>
+    <w:p>
+      <w:pPr>
+        <w:numPr>
+          <w:ilvl w:val="0"/>
+          <w:numId w:val="1003"/>
+        </w:numPr>
+        <w:pStyle w:val="Compact"/>
+      </w:pPr>
+      <w:r>
+        <w:rPr>
+          <w:rStyle w:val="VerbatimChar"/>
+        </w:rPr>
+        <w:t xml:space="preserve">answered: false</w:t>
+      </w:r>
+      <w:r>
+        <w:t xml:space="preserve"> </w:t>
+      </w:r>
+      <w:r>
+        <w:t xml:space="preserve">→</w:t>
+      </w:r>
+      <w:r>
+        <w:t xml:space="preserve"> </w:t>
+      </w:r>
+      <w:r>
+        <w:rPr>
+          <w:rStyle w:val="VerbatimChar"/>
+        </w:rPr>
+        <w:t xml:space="preserve">message</w:t>
+      </w:r>
+      <w:r>
+        <w:t xml:space="preserve"> </w:t>
+      </w:r>
+      <w:r>
+        <w:t xml:space="preserve">(localized) points the user at the guide list. Produced when</w:t>
+      </w:r>
+      <w:r>
+        <w:t xml:space="preserve"> </w:t>
+      </w:r>
+      <w:r>
+        <w:t xml:space="preserve">retrieval finds nothing above the similarity floor, when the model declines (or returns</w:t>
+      </w:r>
+      <w:r>
+        <w:t xml:space="preserve"> </w:t>
+      </w:r>
+      <w:r>
+        <w:t xml:space="preserve">unparseable output), and when</w:t>
+      </w:r>
+      <w:r>
+        <w:t xml:space="preserve"> </w:t>
+      </w:r>
+      <w:r>
+        <w:rPr>
+          <w:bCs/>
+          <w:b/>
+        </w:rPr>
+        <w:t xml:space="preserve">every</w:t>
+      </w:r>
+      <w:r>
+        <w:t xml:space="preserve"> </w:t>
+      </w:r>
+      <w:r>
+        <w:t xml:space="preserve">citation the model offered was invented.</w:t>
+      </w:r>
+    </w:p>
+    <w:p>
+      <w:pPr>
+        <w:numPr>
+          <w:ilvl w:val="0"/>
+          <w:numId w:val="1003"/>
+        </w:numPr>
+        <w:pStyle w:val="Compact"/>
+      </w:pPr>
+      <w:r>
+        <w:rPr>
+          <w:rStyle w:val="VerbatimChar"/>
+        </w:rPr>
+        <w:t xml:space="preserve">hallucinatedCitationsDropped: true</w:t>
+      </w:r>
+      <w:r>
+        <w:t xml:space="preserve"> </w:t>
+      </w:r>
+      <w:r>
+        <w:t xml:space="preserve">→ the model cited excerpts that were never retrieved;</w:t>
+      </w:r>
+      <w:r>
+        <w:t xml:space="preserve"> </w:t>
+      </w:r>
+      <w:r>
+        <w:t xml:space="preserve">invalid citations are dropped (FR-AI-003’s posture for RAG), and an answer left with none is</w:t>
+      </w:r>
+      <w:r>
+        <w:t xml:space="preserve"> </w:t>
+      </w:r>
+      <w:r>
+        <w:t xml:space="preserve">refused whole.</w:t>
+      </w:r>
+    </w:p>
+    <w:p>
+      <w:pPr>
+        <w:pStyle w:val="FirstParagraph"/>
+      </w:pPr>
+      <w:r>
+        <w:t xml:space="preserve">Grounding chain: retrieval (5.4) supplies excerpts labeled</w:t>
+      </w:r>
+      <w:r>
+        <w:t xml:space="preserve"> </w:t>
+      </w:r>
+      <w:r>
+        <w:rPr>
+          <w:rStyle w:val="VerbatimChar"/>
+        </w:rPr>
+        <w:t xml:space="preserve">C1..Cn</w:t>
+      </w:r>
+      <w:r>
+        <w:t xml:space="preserve">; the model (versioned</w:t>
+      </w:r>
+      <w:r>
+        <w:t xml:space="preserve"> </w:t>
+      </w:r>
+      <w:r>
+        <w:t xml:space="preserve">prompt</w:t>
+      </w:r>
+      <w:r>
+        <w:t xml:space="preserve"> </w:t>
+      </w:r>
+      <w:r>
+        <w:rPr>
+          <w:rStyle w:val="VerbatimChar"/>
+        </w:rPr>
+        <w:t xml:space="preserve">guides-chat@v1</w:t>
+      </w:r>
+      <w:r>
+        <w:t xml:space="preserve">, Ai module, keyed</w:t>
+      </w:r>
+      <w:r>
+        <w:t xml:space="preserve"> </w:t>
+      </w:r>
+      <w:r>
+        <w:rPr>
+          <w:rStyle w:val="VerbatimChar"/>
+        </w:rPr>
+        <w:t xml:space="preserve">guides</w:t>
+      </w:r>
+      <w:r>
+        <w:t xml:space="preserve"> </w:t>
+      </w:r>
+      <w:r>
+        <w:t xml:space="preserve">client) sees labels and text only - never</w:t>
+      </w:r>
+      <w:r>
+        <w:t xml:space="preserve"> </w:t>
+      </w:r>
+      <w:r>
+        <w:t xml:space="preserve">real ids; the service maps cited labels back to retrieved chunks, so every served citation</w:t>
+      </w:r>
+      <w:r>
+        <w:t xml:space="preserve"> </w:t>
+      </w:r>
+      <w:r>
+        <w:t xml:space="preserve">provably references content the answer was grounded on.</w:t>
       </w:r>
     </w:p>
     <w:p>
@@ -7946,7 +8001,10 @@
         <w:pStyle w:val="BodyText"/>
       </w:pPr>
       <w:r>
-        <w:t xml:space="preserve">Live example (</w:t>
+        <w:t xml:space="preserve">Live example (recorded,</w:t>
+      </w:r>
+      <w:r>
+        <w:t xml:space="preserve"> </w:t>
       </w:r>
       <w:r>
         <w:rPr>
@@ -7955,7 +8013,13 @@
         <w:t xml:space="preserve">Accept-Language: ar</w:t>
       </w:r>
       <w:r>
-        <w:t xml:space="preserve">, expiry before issue):</w:t>
+        <w:t xml:space="preserve">, corpus without embedded chunks - the fresh-install</w:t>
+      </w:r>
+      <w:r>
+        <w:t xml:space="preserve"> </w:t>
+      </w:r>
+      <w:r>
+        <w:t xml:space="preserve">path): anonymous → login challenge; authenticated →</w:t>
       </w:r>
     </w:p>
     <w:p>
@@ -7970,15 +8034,45 @@
       </w:r>
       <w:r>
         <w:rPr>
+          <w:rStyle w:val="DataTypeTok"/>
+        </w:rPr>
+        <w:t xml:space="preserve">"answered"</w:t>
+      </w:r>
+      <w:r>
+        <w:rPr>
+          <w:rStyle w:val="FunctionTok"/>
+        </w:rPr>
+        <w:t xml:space="preserve">:</w:t>
+      </w:r>
+      <w:r>
+        <w:rPr>
           <w:rStyle w:val="NormalTok"/>
         </w:rPr>
         <w:t xml:space="preserve"> </w:t>
       </w:r>
       <w:r>
         <w:rPr>
+          <w:rStyle w:val="KeywordTok"/>
+        </w:rPr>
+        <w:t xml:space="preserve">false</w:t>
+      </w:r>
+      <w:r>
+        <w:rPr>
+          <w:rStyle w:val="FunctionTok"/>
+        </w:rPr>
+        <w:t xml:space="preserve">,</w:t>
+      </w:r>
+      <w:r>
+        <w:rPr>
+          <w:rStyle w:val="NormalTok"/>
+        </w:rPr>
+        <w:t xml:space="preserve"> </w:t>
+      </w:r>
+      <w:r>
+        <w:rPr>
           <w:rStyle w:val="DataTypeTok"/>
         </w:rPr>
-        <w:t xml:space="preserve">"error"</w:t>
+        <w:t xml:space="preserve">"answer"</w:t>
       </w:r>
       <w:r>
         <w:rPr>
@@ -7994,9 +8088,15 @@
       </w:r>
       <w:r>
         <w:rPr>
+          <w:rStyle w:val="KeywordTok"/>
+        </w:rPr>
+        <w:t xml:space="preserve">null</w:t>
+      </w:r>
+      <w:r>
+        <w:rPr>
           <w:rStyle w:val="FunctionTok"/>
         </w:rPr>
-        <w:t xml:space="preserve">{</w:t>
+        <w:t xml:space="preserve">,</w:t>
       </w:r>
       <w:r>
         <w:br/>
@@ -8005,13 +8105,13 @@
         <w:rPr>
           <w:rStyle w:val="NormalTok"/>
         </w:rPr>
-        <w:t xml:space="preserve">    </w:t>
+        <w:t xml:space="preserve"> </w:t>
       </w:r>
       <w:r>
         <w:rPr>
           <w:rStyle w:val="DataTypeTok"/>
         </w:rPr>
-        <w:t xml:space="preserve">"code"</w:t>
+        <w:t xml:space="preserve">"message"</w:t>
       </w:r>
       <w:r>
         <w:rPr>
@@ -8029,7 +8129,7 @@
         <w:rPr>
           <w:rStyle w:val="StringTok"/>
         </w:rPr>
-        <w:t xml:space="preserve">"Wathiq.Documents:ExpiryBeforeIssue"</w:t>
+        <w:t xml:space="preserve">"لم أجد إجابة موثوقة في الأدلة المنشورة. تصفّح قائمة الأدلة من فضلك — الإجابة من خارج الأدلة قد تكون خاطئة."</w:t>
       </w:r>
       <w:r>
         <w:rPr>
@@ -8044,13 +8144,13 @@
         <w:rPr>
           <w:rStyle w:val="NormalTok"/>
         </w:rPr>
-        <w:t xml:space="preserve">    </w:t>
+        <w:t xml:space="preserve"> </w:t>
       </w:r>
       <w:r>
         <w:rPr>
           <w:rStyle w:val="DataTypeTok"/>
         </w:rPr>
-        <w:t xml:space="preserve">"message"</w:t>
+        <w:t xml:space="preserve">"citations"</w:t>
       </w:r>
       <w:r>
         <w:rPr>
@@ -8066,9 +8166,9 @@
       </w:r>
       <w:r>
         <w:rPr>
-          <w:rStyle w:val="StringTok"/>
-        </w:rPr>
-        <w:t xml:space="preserve">"لا يمكن أن يكون تاريخ الانتهاء قبل تاريخ الإصدار."</w:t>
+          <w:rStyle w:val="OtherTok"/>
+        </w:rPr>
+        <w:t xml:space="preserve">[]</w:t>
       </w:r>
       <w:r>
         <w:rPr>
@@ -8077,19 +8177,16 @@
         <w:t xml:space="preserve">,</w:t>
       </w:r>
       <w:r>
-        <w:br/>
-      </w:r>
-      <w:r>
         <w:rPr>
           <w:rStyle w:val="NormalTok"/>
         </w:rPr>
-        <w:t xml:space="preserve">    </w:t>
+        <w:t xml:space="preserve"> </w:t>
       </w:r>
       <w:r>
         <w:rPr>
           <w:rStyle w:val="DataTypeTok"/>
         </w:rPr>
-        <w:t xml:space="preserve">"data"</w:t>
+        <w:t xml:space="preserve">"lastVerifiedAt"</w:t>
       </w:r>
       <w:r>
         <w:rPr>
@@ -8105,9 +8202,15 @@
       </w:r>
       <w:r>
         <w:rPr>
+          <w:rStyle w:val="KeywordTok"/>
+        </w:rPr>
+        <w:t xml:space="preserve">null</w:t>
+      </w:r>
+      <w:r>
+        <w:rPr>
           <w:rStyle w:val="FunctionTok"/>
         </w:rPr>
-        <w:t xml:space="preserve">{</w:t>
+        <w:t xml:space="preserve">,</w:t>
       </w:r>
       <w:r>
         <w:rPr>
@@ -8119,7 +8222,7 @@
         <w:rPr>
           <w:rStyle w:val="DataTypeTok"/>
         </w:rPr>
-        <w:t xml:space="preserve">"IssueDate"</w:t>
+        <w:t xml:space="preserve">"hallucinatedCitationsDropped"</w:t>
       </w:r>
       <w:r>
         <w:rPr>
@@ -8135,85 +8238,20 @@
       </w:r>
       <w:r>
         <w:rPr>
-          <w:rStyle w:val="StringTok"/>
-        </w:rPr>
-        <w:t xml:space="preserve">"2030-01-01"</w:t>
+          <w:rStyle w:val="KeywordTok"/>
+        </w:rPr>
+        <w:t xml:space="preserve">false</w:t>
       </w:r>
       <w:r>
         <w:rPr>
           <w:rStyle w:val="FunctionTok"/>
         </w:rPr>
-        <w:t xml:space="preserve">,</w:t>
-      </w:r>
-      <w:r>
-        <w:rPr>
-          <w:rStyle w:val="NormalTok"/>
-        </w:rPr>
-        <w:t xml:space="preserve"> </w:t>
-      </w:r>
-      <w:r>
-        <w:rPr>
-          <w:rStyle w:val="DataTypeTok"/>
-        </w:rPr>
-        <w:t xml:space="preserve">"ExpiryDate"</w:t>
-      </w:r>
-      <w:r>
-        <w:rPr>
-          <w:rStyle w:val="FunctionTok"/>
-        </w:rPr>
-        <w:t xml:space="preserve">:</w:t>
-      </w:r>
-      <w:r>
-        <w:rPr>
-          <w:rStyle w:val="NormalTok"/>
-        </w:rPr>
-        <w:t xml:space="preserve"> </w:t>
-      </w:r>
-      <w:r>
-        <w:rPr>
-          <w:rStyle w:val="StringTok"/>
-        </w:rPr>
-        <w:t xml:space="preserve">"2020-01-01"</w:t>
-      </w:r>
-      <w:r>
-        <w:rPr>
-          <w:rStyle w:val="NormalTok"/>
-        </w:rPr>
-        <w:t xml:space="preserve"> </w:t>
-      </w:r>
-      <w:r>
-        <w:rPr>
-          <w:rStyle w:val="FunctionTok"/>
-        </w:rPr>
         <w:t xml:space="preserve">}</w:t>
       </w:r>
-      <w:r>
-        <w:rPr>
-          <w:rStyle w:val="NormalTok"/>
-        </w:rPr>
-        <w:t xml:space="preserve"> </w:t>
-      </w:r>
-      <w:r>
-        <w:rPr>
-          <w:rStyle w:val="FunctionTok"/>
-        </w:rPr>
-        <w:t xml:space="preserve">}</w:t>
-      </w:r>
-      <w:r>
-        <w:rPr>
-          <w:rStyle w:val="NormalTok"/>
-        </w:rPr>
-        <w:t xml:space="preserve"> </w:t>
-      </w:r>
-      <w:r>
-        <w:rPr>
-          <w:rStyle w:val="FunctionTok"/>
-        </w:rPr>
-        <w:t xml:space="preserve">}</w:t>
-      </w:r>
     </w:p>
+    <w:bookmarkEnd w:id="42"/>
     <w:bookmarkEnd w:id="43"/>
-    <w:bookmarkStart w:id="44" w:name="infrastructure-endpoints-abp-built-ins"/>
+    <w:bookmarkStart w:id="44" w:name="error-model"/>
     <w:p>
       <w:pPr>
         <w:pStyle w:val="Heading1"/>
@@ -8222,13 +8260,13 @@
         <w:rPr>
           <w:rStyle w:val="SectionNumber"/>
         </w:rPr>
-        <w:t xml:space="preserve">8</w:t>
+        <w:t xml:space="preserve">7</w:t>
       </w:r>
       <w:r>
         <w:tab/>
       </w:r>
       <w:r>
-        <w:t xml:space="preserve">8. Infrastructure endpoints (ABP built-ins)</w:t>
+        <w:t xml:space="preserve">7. Error model</w:t>
       </w:r>
     </w:p>
     <w:p>
@@ -8236,7 +8274,19 @@
         <w:pStyle w:val="FirstParagraph"/>
       </w:pPr>
       <w:r>
-        <w:t xml:space="preserve">Summarized — full detail is in Swagger. Admin-tagged groups require admin permissions.</w:t>
+        <w:t xml:space="preserve">Every error is the ABP envelope</w:t>
+      </w:r>
+      <w:r>
+        <w:t xml:space="preserve"> </w:t>
+      </w:r>
+      <w:r>
+        <w:rPr>
+          <w:rStyle w:val="VerbatimChar"/>
+        </w:rPr>
+        <w:t xml:space="preserve">{ "error": { code, message, details, data, validationErrors } }</w:t>
+      </w:r>
+      <w:r>
+        <w:t xml:space="preserve">.</w:t>
       </w:r>
     </w:p>
     <w:tbl>
@@ -8263,31 +8313,40 @@
               <w:jc w:val="left"/>
             </w:pPr>
             <w:r>
-              <w:t xml:space="preserve">Area</w:t>
-            </w:r>
-          </w:p>
-        </w:tc>
-        <w:tc>
-          <w:tcPr/>
-          <w:p>
-            <w:pPr>
-              <w:pStyle w:val="Compact"/>
-              <w:jc w:val="left"/>
-            </w:pPr>
-            <w:r>
-              <w:t xml:space="preserve">Root</w:t>
-            </w:r>
-          </w:p>
-        </w:tc>
-        <w:tc>
-          <w:tcPr/>
-          <w:p>
-            <w:pPr>
-              <w:pStyle w:val="Compact"/>
-              <w:jc w:val="left"/>
-            </w:pPr>
-            <w:r>
-              <w:t xml:space="preserve">Notes</w:t>
+              <w:t xml:space="preserve">HTTP</w:t>
+            </w:r>
+          </w:p>
+        </w:tc>
+        <w:tc>
+          <w:tcPr/>
+          <w:p>
+            <w:pPr>
+              <w:pStyle w:val="Compact"/>
+              <w:jc w:val="left"/>
+            </w:pPr>
+            <w:r>
+              <w:t xml:space="preserve">When</w:t>
+            </w:r>
+          </w:p>
+        </w:tc>
+        <w:tc>
+          <w:tcPr/>
+          <w:p>
+            <w:pPr>
+              <w:pStyle w:val="Compact"/>
+              <w:jc w:val="left"/>
+            </w:pPr>
+            <w:r>
+              <w:rPr>
+                <w:rStyle w:val="VerbatimChar"/>
+              </w:rPr>
+              <w:t xml:space="preserve">error.code</w:t>
+            </w:r>
+            <w:r>
+              <w:t xml:space="preserve"> </w:t>
+            </w:r>
+            <w:r>
+              <w:t xml:space="preserve">example</w:t>
             </w:r>
           </w:p>
         </w:tc>
@@ -8301,34 +8360,46 @@
               <w:jc w:val="left"/>
             </w:pPr>
             <w:r>
-              <w:t xml:space="preserve">Account</w:t>
-            </w:r>
-          </w:p>
-        </w:tc>
-        <w:tc>
-          <w:tcPr/>
-          <w:p>
-            <w:pPr>
-              <w:pStyle w:val="Compact"/>
-              <w:jc w:val="left"/>
-            </w:pPr>
-            <w:r>
-              <w:rPr>
-                <w:rStyle w:val="VerbatimChar"/>
-              </w:rPr>
-              <w:t xml:space="preserve">/api/account/*</w:t>
-            </w:r>
-          </w:p>
-        </w:tc>
-        <w:tc>
-          <w:tcPr/>
-          <w:p>
-            <w:pPr>
-              <w:pStyle w:val="Compact"/>
-              <w:jc w:val="left"/>
-            </w:pPr>
-            <w:r>
-              <w:t xml:space="preserve">register, login/logout, reset-password, my-profile, change-password</w:t>
+              <w:t xml:space="preserve">400</w:t>
+            </w:r>
+          </w:p>
+        </w:tc>
+        <w:tc>
+          <w:tcPr/>
+          <w:p>
+            <w:pPr>
+              <w:pStyle w:val="Compact"/>
+              <w:jc w:val="left"/>
+            </w:pPr>
+            <w:r>
+              <w:t xml:space="preserve">DTO validation (missing/too long fields) —</w:t>
+            </w:r>
+            <w:r>
+              <w:t xml:space="preserve"> </w:t>
+            </w:r>
+            <w:r>
+              <w:rPr>
+                <w:rStyle w:val="VerbatimChar"/>
+              </w:rPr>
+              <w:t xml:space="preserve">validationErrors</w:t>
+            </w:r>
+            <w:r>
+              <w:t xml:space="preserve"> </w:t>
+            </w:r>
+            <w:r>
+              <w:t xml:space="preserve">lists each field</w:t>
+            </w:r>
+          </w:p>
+        </w:tc>
+        <w:tc>
+          <w:tcPr/>
+          <w:p>
+            <w:pPr>
+              <w:pStyle w:val="Compact"/>
+              <w:jc w:val="left"/>
+            </w:pPr>
+            <w:r>
+              <w:t xml:space="preserve">—</w:t>
             </w:r>
           </w:p>
         </w:tc>
@@ -8342,46 +8413,31 @@
               <w:jc w:val="left"/>
             </w:pPr>
             <w:r>
-              <w:t xml:space="preserve">Identity admin</w:t>
-            </w:r>
-          </w:p>
-        </w:tc>
-        <w:tc>
-          <w:tcPr/>
-          <w:p>
-            <w:pPr>
-              <w:pStyle w:val="Compact"/>
-              <w:jc w:val="left"/>
-            </w:pPr>
-            <w:r>
-              <w:rPr>
-                <w:rStyle w:val="VerbatimChar"/>
-              </w:rPr>
-              <w:t xml:space="preserve">/api/identity/users</w:t>
-            </w:r>
-            <w:r>
-              <w:t xml:space="preserve">,</w:t>
-            </w:r>
-            <w:r>
-              <w:t xml:space="preserve"> </w:t>
-            </w:r>
-            <w:r>
-              <w:rPr>
-                <w:rStyle w:val="VerbatimChar"/>
-              </w:rPr>
-              <w:t xml:space="preserve">/api/identity/roles</w:t>
-            </w:r>
-          </w:p>
-        </w:tc>
-        <w:tc>
-          <w:tcPr/>
-          <w:p>
-            <w:pPr>
-              <w:pStyle w:val="Compact"/>
-              <w:jc w:val="left"/>
-            </w:pPr>
-            <w:r>
-              <w:t xml:space="preserve">user/role CRUD (admin)</w:t>
+              <w:t xml:space="preserve">401</w:t>
+            </w:r>
+          </w:p>
+        </w:tc>
+        <w:tc>
+          <w:tcPr/>
+          <w:p>
+            <w:pPr>
+              <w:pStyle w:val="Compact"/>
+              <w:jc w:val="left"/>
+            </w:pPr>
+            <w:r>
+              <w:t xml:space="preserve">Missing/invalid token (JSON clients)</w:t>
+            </w:r>
+          </w:p>
+        </w:tc>
+        <w:tc>
+          <w:tcPr/>
+          <w:p>
+            <w:pPr>
+              <w:pStyle w:val="Compact"/>
+              <w:jc w:val="left"/>
+            </w:pPr>
+            <w:r>
+              <w:t xml:space="preserve">—</w:t>
             </w:r>
           </w:p>
         </w:tc>
@@ -8395,34 +8451,34 @@
               <w:jc w:val="left"/>
             </w:pPr>
             <w:r>
-              <w:t xml:space="preserve">Permission management</w:t>
-            </w:r>
-          </w:p>
-        </w:tc>
-        <w:tc>
-          <w:tcPr/>
-          <w:p>
-            <w:pPr>
-              <w:pStyle w:val="Compact"/>
-              <w:jc w:val="left"/>
-            </w:pPr>
-            <w:r>
-              <w:rPr>
-                <w:rStyle w:val="VerbatimChar"/>
-              </w:rPr>
-              <w:t xml:space="preserve">/api/permission-management/permissions</w:t>
-            </w:r>
-          </w:p>
-        </w:tc>
-        <w:tc>
-          <w:tcPr/>
-          <w:p>
-            <w:pPr>
-              <w:pStyle w:val="Compact"/>
-              <w:jc w:val="left"/>
-            </w:pPr>
-            <w:r>
-              <w:t xml:space="preserve">read/update grants (admin)</w:t>
+              <w:t xml:space="preserve">403</w:t>
+            </w:r>
+          </w:p>
+        </w:tc>
+        <w:tc>
+          <w:tcPr/>
+          <w:p>
+            <w:pPr>
+              <w:pStyle w:val="Compact"/>
+              <w:jc w:val="left"/>
+            </w:pPr>
+            <w:r>
+              <w:t xml:space="preserve">Permission denied, or a business rule rejected the request</w:t>
+            </w:r>
+          </w:p>
+        </w:tc>
+        <w:tc>
+          <w:tcPr/>
+          <w:p>
+            <w:pPr>
+              <w:pStyle w:val="Compact"/>
+              <w:jc w:val="left"/>
+            </w:pPr>
+            <w:r>
+              <w:rPr>
+                <w:rStyle w:val="VerbatimChar"/>
+              </w:rPr>
+              <w:t xml:space="preserve">Wathiq.Documents:ExpiryBeforeIssue</w:t>
             </w:r>
           </w:p>
         </w:tc>
@@ -8436,34 +8492,634 @@
               <w:jc w:val="left"/>
             </w:pPr>
             <w:r>
-              <w:t xml:space="preserve">App configuration</w:t>
-            </w:r>
-          </w:p>
-        </w:tc>
-        <w:tc>
-          <w:tcPr/>
-          <w:p>
-            <w:pPr>
-              <w:pStyle w:val="Compact"/>
-              <w:jc w:val="left"/>
-            </w:pPr>
-            <w:r>
-              <w:rPr>
-                <w:rStyle w:val="VerbatimChar"/>
-              </w:rPr>
-              <w:t xml:space="preserve">/api/abp/application-configuration</w:t>
-            </w:r>
-          </w:p>
-        </w:tc>
-        <w:tc>
-          <w:tcPr/>
-          <w:p>
-            <w:pPr>
-              <w:pStyle w:val="Compact"/>
-              <w:jc w:val="left"/>
-            </w:pPr>
-            <w:r>
-              <w:t xml:space="preserve">current user, permissions, localization — the client bootstrap call</w:t>
+              <w:t xml:space="preserve">404</w:t>
+            </w:r>
+          </w:p>
+        </w:tc>
+        <w:tc>
+          <w:tcPr/>
+          <w:p>
+            <w:pPr>
+              <w:pStyle w:val="Compact"/>
+              <w:jc w:val="left"/>
+            </w:pPr>
+            <w:r>
+              <w:t xml:space="preserve">Row doesn’t exist</w:t>
+            </w:r>
+            <w:r>
+              <w:t xml:space="preserve"> </w:t>
+            </w:r>
+            <w:r>
+              <w:rPr>
+                <w:bCs/>
+                <w:b/>
+              </w:rPr>
+              <w:t xml:space="preserve">or belongs to another user</w:t>
+            </w:r>
+          </w:p>
+        </w:tc>
+        <w:tc>
+          <w:tcPr/>
+          <w:p>
+            <w:pPr>
+              <w:pStyle w:val="Compact"/>
+              <w:jc w:val="left"/>
+            </w:pPr>
+            <w:r>
+              <w:t xml:space="preserve">—</w:t>
+            </w:r>
+          </w:p>
+        </w:tc>
+      </w:tr>
+    </w:tbl>
+    <w:p>
+      <w:pPr>
+        <w:pStyle w:val="BodyText"/>
+      </w:pPr>
+      <w:r>
+        <w:t xml:space="preserve">Reminders business codes:</w:t>
+      </w:r>
+      <w:r>
+        <w:t xml:space="preserve"> </w:t>
+      </w:r>
+      <w:r>
+        <w:rPr>
+          <w:rStyle w:val="VerbatimChar"/>
+        </w:rPr>
+        <w:t xml:space="preserve">InvalidOffsets</w:t>
+      </w:r>
+      <w:r>
+        <w:t xml:space="preserve">,</w:t>
+      </w:r>
+      <w:r>
+        <w:t xml:space="preserve"> </w:t>
+      </w:r>
+      <w:r>
+        <w:rPr>
+          <w:rStyle w:val="VerbatimChar"/>
+        </w:rPr>
+        <w:t xml:space="preserve">QuietHoursIncomplete</w:t>
+      </w:r>
+      <w:r>
+        <w:t xml:space="preserve">,</w:t>
+      </w:r>
+      <w:r>
+        <w:t xml:space="preserve"> </w:t>
+      </w:r>
+      <w:r>
+        <w:rPr>
+          <w:rStyle w:val="VerbatimChar"/>
+        </w:rPr>
+        <w:t xml:space="preserve">UnknownTimeZone</w:t>
+      </w:r>
+      <w:r>
+        <w:t xml:space="preserve">,</w:t>
+      </w:r>
+      <w:r>
+        <w:t xml:space="preserve"> </w:t>
+      </w:r>
+      <w:r>
+        <w:rPr>
+          <w:rStyle w:val="VerbatimChar"/>
+        </w:rPr>
+        <w:t xml:space="preserve">NoEmailAddress</w:t>
+      </w:r>
+      <w:r>
+        <w:t xml:space="preserve"> </w:t>
+      </w:r>
+      <w:r>
+        <w:t xml:space="preserve">— prefixed</w:t>
+      </w:r>
+      <w:r>
+        <w:t xml:space="preserve"> </w:t>
+      </w:r>
+      <w:r>
+        <w:rPr>
+          <w:rStyle w:val="VerbatimChar"/>
+        </w:rPr>
+        <w:t xml:space="preserve">Wathiq.Reminders:</w:t>
+      </w:r>
+      <w:r>
+        <w:t xml:space="preserve">. Guides business codes:</w:t>
+      </w:r>
+      <w:r>
+        <w:t xml:space="preserve"> </w:t>
+      </w:r>
+      <w:r>
+        <w:rPr>
+          <w:rStyle w:val="VerbatimChar"/>
+        </w:rPr>
+        <w:t xml:space="preserve">SlugAlreadyExists</w:t>
+      </w:r>
+      <w:r>
+        <w:t xml:space="preserve">,</w:t>
+      </w:r>
+      <w:r>
+        <w:t xml:space="preserve"> </w:t>
+      </w:r>
+      <w:r>
+        <w:rPr>
+          <w:rStyle w:val="VerbatimChar"/>
+        </w:rPr>
+        <w:t xml:space="preserve">PublishedVersionIsImmutable</w:t>
+      </w:r>
+      <w:r>
+        <w:t xml:space="preserve">,</w:t>
+      </w:r>
+      <w:r>
+        <w:t xml:space="preserve"> </w:t>
+      </w:r>
+      <w:r>
+        <w:rPr>
+          <w:rStyle w:val="VerbatimChar"/>
+        </w:rPr>
+        <w:t xml:space="preserve">VersionAlreadyPublished</w:t>
+      </w:r>
+      <w:r>
+        <w:t xml:space="preserve">,</w:t>
+      </w:r>
+      <w:r>
+        <w:t xml:space="preserve"> </w:t>
+      </w:r>
+      <w:r>
+        <w:rPr>
+          <w:rStyle w:val="VerbatimChar"/>
+        </w:rPr>
+        <w:t xml:space="preserve">GuideNotPublished</w:t>
+      </w:r>
+      <w:r>
+        <w:t xml:space="preserve"> </w:t>
+      </w:r>
+      <w:r>
+        <w:t xml:space="preserve">— prefixed</w:t>
+      </w:r>
+      <w:r>
+        <w:t xml:space="preserve"> </w:t>
+      </w:r>
+      <w:r>
+        <w:rPr>
+          <w:rStyle w:val="VerbatimChar"/>
+        </w:rPr>
+        <w:t xml:space="preserve">Wathiq.Guides:</w:t>
+      </w:r>
+      <w:r>
+        <w:t xml:space="preserve">.</w:t>
+      </w:r>
+    </w:p>
+    <w:p>
+      <w:pPr>
+        <w:pStyle w:val="BodyText"/>
+      </w:pPr>
+      <w:r>
+        <w:t xml:space="preserve">Business error codes of the Documents module (message localized via</w:t>
+      </w:r>
+      <w:r>
+        <w:t xml:space="preserve"> </w:t>
+      </w:r>
+      <w:r>
+        <w:rPr>
+          <w:rStyle w:val="VerbatimChar"/>
+        </w:rPr>
+        <w:t xml:space="preserve">Accept-Language</w:t>
+      </w:r>
+      <w:r>
+        <w:t xml:space="preserve">):</w:t>
+      </w:r>
+      <w:r>
+        <w:t xml:space="preserve"> </w:t>
+      </w:r>
+      <w:r>
+        <w:rPr>
+          <w:rStyle w:val="VerbatimChar"/>
+        </w:rPr>
+        <w:t xml:space="preserve">ExpiryBeforeIssue</w:t>
+      </w:r>
+      <w:r>
+        <w:t xml:space="preserve">,</w:t>
+      </w:r>
+      <w:r>
+        <w:t xml:space="preserve"> </w:t>
+      </w:r>
+      <w:r>
+        <w:rPr>
+          <w:rStyle w:val="VerbatimChar"/>
+        </w:rPr>
+        <w:t xml:space="preserve">HolderNotOwned</w:t>
+      </w:r>
+      <w:r>
+        <w:t xml:space="preserve">,</w:t>
+      </w:r>
+      <w:r>
+        <w:t xml:space="preserve"> </w:t>
+      </w:r>
+      <w:r>
+        <w:rPr>
+          <w:rStyle w:val="VerbatimChar"/>
+        </w:rPr>
+        <w:t xml:space="preserve">DocumentTypeNotActive</w:t>
+      </w:r>
+      <w:r>
+        <w:t xml:space="preserve">,</w:t>
+      </w:r>
+      <w:r>
+        <w:t xml:space="preserve"> </w:t>
+      </w:r>
+      <w:r>
+        <w:rPr>
+          <w:rStyle w:val="VerbatimChar"/>
+        </w:rPr>
+        <w:t xml:space="preserve">SelfHolderIsAutomatic</w:t>
+      </w:r>
+      <w:r>
+        <w:t xml:space="preserve">,</w:t>
+      </w:r>
+      <w:r>
+        <w:t xml:space="preserve"> </w:t>
+      </w:r>
+      <w:r>
+        <w:rPr>
+          <w:rStyle w:val="VerbatimChar"/>
+        </w:rPr>
+        <w:t xml:space="preserve">CannotDeleteSelfHolder</w:t>
+      </w:r>
+      <w:r>
+        <w:t xml:space="preserve">,</w:t>
+      </w:r>
+      <w:r>
+        <w:t xml:space="preserve"> </w:t>
+      </w:r>
+      <w:r>
+        <w:rPr>
+          <w:rStyle w:val="VerbatimChar"/>
+        </w:rPr>
+        <w:t xml:space="preserve">HolderHasDocuments</w:t>
+      </w:r>
+      <w:r>
+        <w:t xml:space="preserve"> </w:t>
+      </w:r>
+      <w:r>
+        <w:t xml:space="preserve">— all prefixed</w:t>
+      </w:r>
+      <w:r>
+        <w:t xml:space="preserve"> </w:t>
+      </w:r>
+      <w:r>
+        <w:rPr>
+          <w:rStyle w:val="VerbatimChar"/>
+        </w:rPr>
+        <w:t xml:space="preserve">Wathiq.Documents:</w:t>
+      </w:r>
+      <w:r>
+        <w:t xml:space="preserve">.</w:t>
+      </w:r>
+    </w:p>
+    <w:p>
+      <w:pPr>
+        <w:pStyle w:val="BodyText"/>
+      </w:pPr>
+      <w:r>
+        <w:t xml:space="preserve">Live example (</w:t>
+      </w:r>
+      <w:r>
+        <w:rPr>
+          <w:rStyle w:val="VerbatimChar"/>
+        </w:rPr>
+        <w:t xml:space="preserve">Accept-Language: ar</w:t>
+      </w:r>
+      <w:r>
+        <w:t xml:space="preserve">, expiry before issue):</w:t>
+      </w:r>
+    </w:p>
+    <w:p>
+      <w:pPr>
+        <w:pStyle w:val="SourceCode"/>
+      </w:pPr>
+      <w:r>
+        <w:rPr>
+          <w:rStyle w:val="FunctionTok"/>
+        </w:rPr>
+        <w:t xml:space="preserve">{</w:t>
+      </w:r>
+      <w:r>
+        <w:rPr>
+          <w:rStyle w:val="NormalTok"/>
+        </w:rPr>
+        <w:t xml:space="preserve"> </w:t>
+      </w:r>
+      <w:r>
+        <w:rPr>
+          <w:rStyle w:val="DataTypeTok"/>
+        </w:rPr>
+        <w:t xml:space="preserve">"error"</w:t>
+      </w:r>
+      <w:r>
+        <w:rPr>
+          <w:rStyle w:val="FunctionTok"/>
+        </w:rPr>
+        <w:t xml:space="preserve">:</w:t>
+      </w:r>
+      <w:r>
+        <w:rPr>
+          <w:rStyle w:val="NormalTok"/>
+        </w:rPr>
+        <w:t xml:space="preserve"> </w:t>
+      </w:r>
+      <w:r>
+        <w:rPr>
+          <w:rStyle w:val="FunctionTok"/>
+        </w:rPr>
+        <w:t xml:space="preserve">{</w:t>
+      </w:r>
+      <w:r>
+        <w:br/>
+      </w:r>
+      <w:r>
+        <w:rPr>
+          <w:rStyle w:val="NormalTok"/>
+        </w:rPr>
+        <w:t xml:space="preserve">    </w:t>
+      </w:r>
+      <w:r>
+        <w:rPr>
+          <w:rStyle w:val="DataTypeTok"/>
+        </w:rPr>
+        <w:t xml:space="preserve">"code"</w:t>
+      </w:r>
+      <w:r>
+        <w:rPr>
+          <w:rStyle w:val="FunctionTok"/>
+        </w:rPr>
+        <w:t xml:space="preserve">:</w:t>
+      </w:r>
+      <w:r>
+        <w:rPr>
+          <w:rStyle w:val="NormalTok"/>
+        </w:rPr>
+        <w:t xml:space="preserve"> </w:t>
+      </w:r>
+      <w:r>
+        <w:rPr>
+          <w:rStyle w:val="StringTok"/>
+        </w:rPr>
+        <w:t xml:space="preserve">"Wathiq.Documents:ExpiryBeforeIssue"</w:t>
+      </w:r>
+      <w:r>
+        <w:rPr>
+          <w:rStyle w:val="FunctionTok"/>
+        </w:rPr>
+        <w:t xml:space="preserve">,</w:t>
+      </w:r>
+      <w:r>
+        <w:br/>
+      </w:r>
+      <w:r>
+        <w:rPr>
+          <w:rStyle w:val="NormalTok"/>
+        </w:rPr>
+        <w:t xml:space="preserve">    </w:t>
+      </w:r>
+      <w:r>
+        <w:rPr>
+          <w:rStyle w:val="DataTypeTok"/>
+        </w:rPr>
+        <w:t xml:space="preserve">"message"</w:t>
+      </w:r>
+      <w:r>
+        <w:rPr>
+          <w:rStyle w:val="FunctionTok"/>
+        </w:rPr>
+        <w:t xml:space="preserve">:</w:t>
+      </w:r>
+      <w:r>
+        <w:rPr>
+          <w:rStyle w:val="NormalTok"/>
+        </w:rPr>
+        <w:t xml:space="preserve"> </w:t>
+      </w:r>
+      <w:r>
+        <w:rPr>
+          <w:rStyle w:val="StringTok"/>
+        </w:rPr>
+        <w:t xml:space="preserve">"لا يمكن أن يكون تاريخ الانتهاء قبل تاريخ الإصدار."</w:t>
+      </w:r>
+      <w:r>
+        <w:rPr>
+          <w:rStyle w:val="FunctionTok"/>
+        </w:rPr>
+        <w:t xml:space="preserve">,</w:t>
+      </w:r>
+      <w:r>
+        <w:br/>
+      </w:r>
+      <w:r>
+        <w:rPr>
+          <w:rStyle w:val="NormalTok"/>
+        </w:rPr>
+        <w:t xml:space="preserve">    </w:t>
+      </w:r>
+      <w:r>
+        <w:rPr>
+          <w:rStyle w:val="DataTypeTok"/>
+        </w:rPr>
+        <w:t xml:space="preserve">"data"</w:t>
+      </w:r>
+      <w:r>
+        <w:rPr>
+          <w:rStyle w:val="FunctionTok"/>
+        </w:rPr>
+        <w:t xml:space="preserve">:</w:t>
+      </w:r>
+      <w:r>
+        <w:rPr>
+          <w:rStyle w:val="NormalTok"/>
+        </w:rPr>
+        <w:t xml:space="preserve"> </w:t>
+      </w:r>
+      <w:r>
+        <w:rPr>
+          <w:rStyle w:val="FunctionTok"/>
+        </w:rPr>
+        <w:t xml:space="preserve">{</w:t>
+      </w:r>
+      <w:r>
+        <w:rPr>
+          <w:rStyle w:val="NormalTok"/>
+        </w:rPr>
+        <w:t xml:space="preserve"> </w:t>
+      </w:r>
+      <w:r>
+        <w:rPr>
+          <w:rStyle w:val="DataTypeTok"/>
+        </w:rPr>
+        <w:t xml:space="preserve">"IssueDate"</w:t>
+      </w:r>
+      <w:r>
+        <w:rPr>
+          <w:rStyle w:val="FunctionTok"/>
+        </w:rPr>
+        <w:t xml:space="preserve">:</w:t>
+      </w:r>
+      <w:r>
+        <w:rPr>
+          <w:rStyle w:val="NormalTok"/>
+        </w:rPr>
+        <w:t xml:space="preserve"> </w:t>
+      </w:r>
+      <w:r>
+        <w:rPr>
+          <w:rStyle w:val="StringTok"/>
+        </w:rPr>
+        <w:t xml:space="preserve">"2030-01-01"</w:t>
+      </w:r>
+      <w:r>
+        <w:rPr>
+          <w:rStyle w:val="FunctionTok"/>
+        </w:rPr>
+        <w:t xml:space="preserve">,</w:t>
+      </w:r>
+      <w:r>
+        <w:rPr>
+          <w:rStyle w:val="NormalTok"/>
+        </w:rPr>
+        <w:t xml:space="preserve"> </w:t>
+      </w:r>
+      <w:r>
+        <w:rPr>
+          <w:rStyle w:val="DataTypeTok"/>
+        </w:rPr>
+        <w:t xml:space="preserve">"ExpiryDate"</w:t>
+      </w:r>
+      <w:r>
+        <w:rPr>
+          <w:rStyle w:val="FunctionTok"/>
+        </w:rPr>
+        <w:t xml:space="preserve">:</w:t>
+      </w:r>
+      <w:r>
+        <w:rPr>
+          <w:rStyle w:val="NormalTok"/>
+        </w:rPr>
+        <w:t xml:space="preserve"> </w:t>
+      </w:r>
+      <w:r>
+        <w:rPr>
+          <w:rStyle w:val="StringTok"/>
+        </w:rPr>
+        <w:t xml:space="preserve">"2020-01-01"</w:t>
+      </w:r>
+      <w:r>
+        <w:rPr>
+          <w:rStyle w:val="NormalTok"/>
+        </w:rPr>
+        <w:t xml:space="preserve"> </w:t>
+      </w:r>
+      <w:r>
+        <w:rPr>
+          <w:rStyle w:val="FunctionTok"/>
+        </w:rPr>
+        <w:t xml:space="preserve">}</w:t>
+      </w:r>
+      <w:r>
+        <w:rPr>
+          <w:rStyle w:val="NormalTok"/>
+        </w:rPr>
+        <w:t xml:space="preserve"> </w:t>
+      </w:r>
+      <w:r>
+        <w:rPr>
+          <w:rStyle w:val="FunctionTok"/>
+        </w:rPr>
+        <w:t xml:space="preserve">}</w:t>
+      </w:r>
+      <w:r>
+        <w:rPr>
+          <w:rStyle w:val="NormalTok"/>
+        </w:rPr>
+        <w:t xml:space="preserve"> </w:t>
+      </w:r>
+      <w:r>
+        <w:rPr>
+          <w:rStyle w:val="FunctionTok"/>
+        </w:rPr>
+        <w:t xml:space="preserve">}</w:t>
+      </w:r>
+    </w:p>
+    <w:bookmarkEnd w:id="44"/>
+    <w:bookmarkStart w:id="45" w:name="infrastructure-endpoints-abp-built-ins"/>
+    <w:p>
+      <w:pPr>
+        <w:pStyle w:val="Heading1"/>
+      </w:pPr>
+      <w:r>
+        <w:rPr>
+          <w:rStyle w:val="SectionNumber"/>
+        </w:rPr>
+        <w:t xml:space="preserve">8</w:t>
+      </w:r>
+      <w:r>
+        <w:tab/>
+      </w:r>
+      <w:r>
+        <w:t xml:space="preserve">8. Infrastructure endpoints (ABP built-ins)</w:t>
+      </w:r>
+    </w:p>
+    <w:p>
+      <w:pPr>
+        <w:pStyle w:val="FirstParagraph"/>
+      </w:pPr>
+      <w:r>
+        <w:t xml:space="preserve">Summarized — full detail is in Swagger. Admin-tagged groups require admin permissions.</w:t>
+      </w:r>
+    </w:p>
+    <w:tbl>
+      <w:tblPr>
+        <w:tblStyle w:val="Table"/>
+        <w:tblW w:type="pct" w:w="5000"/>
+        <w:tblLook w:firstRow="1" w:lastRow="0" w:firstColumn="0" w:lastColumn="0" w:noHBand="0" w:noVBand="0" w:val="0020"/>
+        <w:jc w:val="start"/>
+      </w:tblPr>
+      <w:tblGrid>
+        <w:gridCol w:w="2640"/>
+        <w:gridCol w:w="2640"/>
+        <w:gridCol w:w="2640"/>
+      </w:tblGrid>
+      <w:tr>
+        <w:trPr>
+          <w:tblHeader w:val="true"/>
+        </w:trPr>
+        <w:tc>
+          <w:tcPr/>
+          <w:p>
+            <w:pPr>
+              <w:pStyle w:val="Compact"/>
+              <w:jc w:val="left"/>
+            </w:pPr>
+            <w:r>
+              <w:t xml:space="preserve">Area</w:t>
+            </w:r>
+          </w:p>
+        </w:tc>
+        <w:tc>
+          <w:tcPr/>
+          <w:p>
+            <w:pPr>
+              <w:pStyle w:val="Compact"/>
+              <w:jc w:val="left"/>
+            </w:pPr>
+            <w:r>
+              <w:t xml:space="preserve">Root</w:t>
+            </w:r>
+          </w:p>
+        </w:tc>
+        <w:tc>
+          <w:tcPr/>
+          <w:p>
+            <w:pPr>
+              <w:pStyle w:val="Compact"/>
+              <w:jc w:val="left"/>
+            </w:pPr>
+            <w:r>
+              <w:t xml:space="preserve">Notes</w:t>
             </w:r>
           </w:p>
         </w:tc>
@@ -8477,6 +9133,182 @@
               <w:jc w:val="left"/>
             </w:pPr>
             <w:r>
+              <w:t xml:space="preserve">Account</w:t>
+            </w:r>
+          </w:p>
+        </w:tc>
+        <w:tc>
+          <w:tcPr/>
+          <w:p>
+            <w:pPr>
+              <w:pStyle w:val="Compact"/>
+              <w:jc w:val="left"/>
+            </w:pPr>
+            <w:r>
+              <w:rPr>
+                <w:rStyle w:val="VerbatimChar"/>
+              </w:rPr>
+              <w:t xml:space="preserve">/api/account/*</w:t>
+            </w:r>
+          </w:p>
+        </w:tc>
+        <w:tc>
+          <w:tcPr/>
+          <w:p>
+            <w:pPr>
+              <w:pStyle w:val="Compact"/>
+              <w:jc w:val="left"/>
+            </w:pPr>
+            <w:r>
+              <w:t xml:space="preserve">register, login/logout, reset-password, my-profile, change-password</w:t>
+            </w:r>
+          </w:p>
+        </w:tc>
+      </w:tr>
+      <w:tr>
+        <w:tc>
+          <w:tcPr/>
+          <w:p>
+            <w:pPr>
+              <w:pStyle w:val="Compact"/>
+              <w:jc w:val="left"/>
+            </w:pPr>
+            <w:r>
+              <w:t xml:space="preserve">Identity admin</w:t>
+            </w:r>
+          </w:p>
+        </w:tc>
+        <w:tc>
+          <w:tcPr/>
+          <w:p>
+            <w:pPr>
+              <w:pStyle w:val="Compact"/>
+              <w:jc w:val="left"/>
+            </w:pPr>
+            <w:r>
+              <w:rPr>
+                <w:rStyle w:val="VerbatimChar"/>
+              </w:rPr>
+              <w:t xml:space="preserve">/api/identity/users</w:t>
+            </w:r>
+            <w:r>
+              <w:t xml:space="preserve">,</w:t>
+            </w:r>
+            <w:r>
+              <w:t xml:space="preserve"> </w:t>
+            </w:r>
+            <w:r>
+              <w:rPr>
+                <w:rStyle w:val="VerbatimChar"/>
+              </w:rPr>
+              <w:t xml:space="preserve">/api/identity/roles</w:t>
+            </w:r>
+          </w:p>
+        </w:tc>
+        <w:tc>
+          <w:tcPr/>
+          <w:p>
+            <w:pPr>
+              <w:pStyle w:val="Compact"/>
+              <w:jc w:val="left"/>
+            </w:pPr>
+            <w:r>
+              <w:t xml:space="preserve">user/role CRUD (admin)</w:t>
+            </w:r>
+          </w:p>
+        </w:tc>
+      </w:tr>
+      <w:tr>
+        <w:tc>
+          <w:tcPr/>
+          <w:p>
+            <w:pPr>
+              <w:pStyle w:val="Compact"/>
+              <w:jc w:val="left"/>
+            </w:pPr>
+            <w:r>
+              <w:t xml:space="preserve">Permission management</w:t>
+            </w:r>
+          </w:p>
+        </w:tc>
+        <w:tc>
+          <w:tcPr/>
+          <w:p>
+            <w:pPr>
+              <w:pStyle w:val="Compact"/>
+              <w:jc w:val="left"/>
+            </w:pPr>
+            <w:r>
+              <w:rPr>
+                <w:rStyle w:val="VerbatimChar"/>
+              </w:rPr>
+              <w:t xml:space="preserve">/api/permission-management/permissions</w:t>
+            </w:r>
+          </w:p>
+        </w:tc>
+        <w:tc>
+          <w:tcPr/>
+          <w:p>
+            <w:pPr>
+              <w:pStyle w:val="Compact"/>
+              <w:jc w:val="left"/>
+            </w:pPr>
+            <w:r>
+              <w:t xml:space="preserve">read/update grants (admin)</w:t>
+            </w:r>
+          </w:p>
+        </w:tc>
+      </w:tr>
+      <w:tr>
+        <w:tc>
+          <w:tcPr/>
+          <w:p>
+            <w:pPr>
+              <w:pStyle w:val="Compact"/>
+              <w:jc w:val="left"/>
+            </w:pPr>
+            <w:r>
+              <w:t xml:space="preserve">App configuration</w:t>
+            </w:r>
+          </w:p>
+        </w:tc>
+        <w:tc>
+          <w:tcPr/>
+          <w:p>
+            <w:pPr>
+              <w:pStyle w:val="Compact"/>
+              <w:jc w:val="left"/>
+            </w:pPr>
+            <w:r>
+              <w:rPr>
+                <w:rStyle w:val="VerbatimChar"/>
+              </w:rPr>
+              <w:t xml:space="preserve">/api/abp/application-configuration</w:t>
+            </w:r>
+          </w:p>
+        </w:tc>
+        <w:tc>
+          <w:tcPr/>
+          <w:p>
+            <w:pPr>
+              <w:pStyle w:val="Compact"/>
+              <w:jc w:val="left"/>
+            </w:pPr>
+            <w:r>
+              <w:t xml:space="preserve">current user, permissions, localization — the client bootstrap call</w:t>
+            </w:r>
+          </w:p>
+        </w:tc>
+      </w:tr>
+      <w:tr>
+        <w:tc>
+          <w:tcPr/>
+          <w:p>
+            <w:pPr>
+              <w:pStyle w:val="Compact"/>
+              <w:jc w:val="left"/>
+            </w:pPr>
+            <w:r>
               <w:t xml:space="preserve">Settings</w:t>
             </w:r>
           </w:p>
@@ -8510,8 +9342,8 @@
         </w:tc>
       </w:tr>
     </w:tbl>
-    <w:bookmarkEnd w:id="44"/>
-    <w:bookmarkStart w:id="45" w:name="planned"/>
+    <w:bookmarkEnd w:id="45"/>
+    <w:bookmarkStart w:id="46" w:name="planned"/>
     <w:p>
       <w:pPr>
         <w:pStyle w:val="Heading1"/>
@@ -8613,16 +9445,22 @@
               <w:jc w:val="left"/>
             </w:pPr>
             <w:r>
-              <w:t xml:space="preserve">Guides grounded-chat endpoint (</w:t>
-            </w:r>
-            <w:r>
-              <w:rPr>
-                <w:rStyle w:val="VerbatimChar"/>
-              </w:rPr>
-              <w:t xml:space="preserve">/api/guides/chat</w:t>
-            </w:r>
-            <w:r>
-              <w:t xml:space="preserve">) + feedback</w:t>
+              <w:t xml:space="preserve">Guide feedback endpoint (</w:t>
+            </w:r>
+            <w:r>
+              <w:t xml:space="preserve">“</w:t>
+            </w:r>
+            <w:r>
+              <w:t xml:space="preserve">outdated?</w:t>
+            </w:r>
+            <w:r>
+              <w:t xml:space="preserve">”</w:t>
+            </w:r>
+            <w:r>
+              <w:t xml:space="preserve"> </w:t>
+            </w:r>
+            <w:r>
+              <w:t xml:space="preserve">reports)</w:t>
             </w:r>
           </w:p>
         </w:tc>
@@ -8666,7 +9504,7 @@
         </w:tc>
       </w:tr>
     </w:tbl>
-    <w:bookmarkEnd w:id="45"/>
+    <w:bookmarkEnd w:id="46"/>
     <w:sectPr>
       <w:footnotePr>
         <w:numRestart w:val="eachSect"/>
@@ -8860,6 +9698,9 @@
     <w:abstractNumId w:val="991"/>
   </w:num>
   <w:num w:numId="1002">
+    <w:abstractNumId w:val="991"/>
+  </w:num>
+  <w:num w:numId="1003">
     <w:abstractNumId w:val="991"/>
   </w:num>
 </w:numbering>

</xml_diff>